<commit_message>
docs: incorpora trazabilidad de mejoras, VIII.e en informe final F4
</commit_message>
<xml_diff>
--- a/docs/f4_s03_evaluacion_entregable_grupo2.docx
+++ b/docs/f4_s03_evaluacion_entregable_grupo2.docx
@@ -4,6 +4,9 @@
   <w:body>
     <w:p>
       <w:r>
+        <w:rPr>
+          <w:noProof/>
+        </w:rPr>
         <w:drawing>
           <wp:inline distT="0" distB="0" distL="0" distR="0" wp14:anchorId="5725E8ED" wp14:editId="6465C388">
             <wp:extent cx="790255" cy="638175"/>
@@ -48,6 +51,7 @@
       </w:r>
       <w:r>
         <w:rPr>
+          <w:noProof/>
           <w:spacing w:val="63"/>
         </w:rPr>
         <mc:AlternateContent>
@@ -792,7 +796,7 @@
               </wp:inline>
             </w:drawing>
           </mc:Choice>
-          <mc:Fallback xmlns:pic="http://schemas.openxmlformats.org/drawingml/2006/picture" xmlns:a="http://schemas.openxmlformats.org/drawingml/2006/main">
+          <mc:Fallback xmlns:a="http://schemas.openxmlformats.org/drawingml/2006/main" xmlns:pic="http://schemas.openxmlformats.org/drawingml/2006/picture">
             <w:pict>
               <v:group id="Group 2" style="width:85.45pt;height:51.55pt;mso-position-horizontal-relative:char;mso-position-vertical-relative:line" coordsize="10852,6546" o:spid="_x0000_s1026" w14:anchorId="42076BD7" o:gfxdata="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">
                 <v:shape id="Graphic 3" style="position:absolute;left:122;top:167;width:2101;height:3099;visibility:visible;mso-wrap-style:square;v-text-anchor:top" coordsize="210185,309880" o:spid="_x0000_s1027" fillcolor="#c6c4c4" stroked="f" path="m209791,l188086,r,184061l181850,232548r-17516,33480l137327,285432r-34712,6261l71098,285811,45396,267038,28085,233684,21742,184061,21742,,,,,185381r8392,58937l30862,282681r32483,20806l101777,309753r41068,-6762l177287,281095r23690,-39451l209791,182219,209791,xe" o:gfxdata="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">
@@ -1016,35 +1020,17 @@
     </w:p>
     <w:p>
       <w:r>
-        <w:t>Durán Cisterna</w:t>
-      </w:r>
-      <w:r>
-        <w:t>,</w:t>
-      </w:r>
-      <w:r>
-        <w:t xml:space="preserve"> Verónica</w:t>
-      </w:r>
-    </w:p>
-    <w:p>
-      <w:r>
-        <w:t>Moya Arriagada</w:t>
-      </w:r>
-      <w:r>
-        <w:t xml:space="preserve">, </w:t>
-      </w:r>
-      <w:r>
-        <w:t xml:space="preserve">Raúl </w:t>
-      </w:r>
-    </w:p>
-    <w:p>
-      <w:r>
-        <w:t xml:space="preserve">Rojas Vilches </w:t>
-      </w:r>
-      <w:r>
-        <w:t xml:space="preserve">, </w:t>
-      </w:r>
-      <w:r>
-        <w:t xml:space="preserve">Daniela </w:t>
+        <w:t>Durán Cisterna, Verónica</w:t>
+      </w:r>
+    </w:p>
+    <w:p>
+      <w:r>
+        <w:t xml:space="preserve">Moya Arriagada, Raúl </w:t>
+      </w:r>
+    </w:p>
+    <w:p>
+      <w:r>
+        <w:t xml:space="preserve">Rojas Vilches , Daniela </w:t>
       </w:r>
     </w:p>
     <w:p>
@@ -1055,13 +1041,7 @@
         </w:rPr>
       </w:pPr>
       <w:r>
-        <w:t>Sánchez Cárcamo</w:t>
-      </w:r>
-      <w:r>
-        <w:t xml:space="preserve">, </w:t>
-      </w:r>
-      <w:r>
-        <w:t>Manuel</w:t>
+        <w:t>Sánchez Cárcamo, Manuel</w:t>
       </w:r>
     </w:p>
     <w:p>
@@ -1204,6 +1184,13 @@
     </w:p>
     <w:sdt>
       <w:sdtPr>
+        <w:rPr>
+          <w:rFonts w:ascii="Arial" w:eastAsia="Arial" w:hAnsi="Arial" w:cstheme="minorBidi"/>
+          <w:color w:val="auto"/>
+          <w:sz w:val="22"/>
+          <w:szCs w:val="22"/>
+          <w:lang w:eastAsia="en-US"/>
+        </w:rPr>
         <w:id w:val="-1670479029"/>
         <w:docPartObj>
           <w:docPartGallery w:val="Table of Contents"/>
@@ -1212,13 +1199,8 @@
       </w:sdtPr>
       <w:sdtEndPr>
         <w:rPr>
-          <w:rFonts w:ascii="Arial" w:eastAsia="Arial" w:hAnsi="Arial" w:cstheme="minorBidi"/>
           <w:b/>
           <w:bCs/>
-          <w:color w:val="auto"/>
-          <w:sz w:val="22"/>
-          <w:szCs w:val="22"/>
-          <w:lang w:eastAsia="en-US"/>
         </w:rPr>
       </w:sdtEndPr>
       <w:sdtContent>
@@ -3466,15 +3448,7 @@
         <w:jc w:val="left"/>
       </w:pPr>
       <w:r>
-        <w:t xml:space="preserve">Preprocesamiento y transformación del </w:t>
-      </w:r>
-      <w:proofErr w:type="spellStart"/>
-      <w:r>
-        <w:t>dataset</w:t>
-      </w:r>
-      <w:proofErr w:type="spellEnd"/>
-      <w:r>
-        <w:t>.</w:t>
+        <w:t>Preprocesamiento y transformación del dataset.</w:t>
       </w:r>
     </w:p>
     <w:p>
@@ -3799,55 +3773,24 @@
     </w:p>
     <w:p>
       <w:r>
-        <w:t xml:space="preserve">La necesidad técnica del proyecto surge de la estructura y volumen de los registros. La fuente original contiene 359.891 filas y 33 columnas, mientras que el subconjunto definido para el estudio corresponde a 729 registros en formato ancho. Para facilitar el análisis temporal, los datos fueron transformados a formato largo, obteniéndose un </w:t>
-      </w:r>
-      <w:proofErr w:type="spellStart"/>
-      <w:r>
-        <w:t>dataset</w:t>
-      </w:r>
-      <w:proofErr w:type="spellEnd"/>
-      <w:r>
-        <w:t xml:space="preserve"> analítico de 17.496 observaciones y 13 variables, donde cada fila representa una combinación de central, fecha y hora. Este proceso exige programación para automatizar la preparación, validación y análisis de los datos de manera reproducible.</w:t>
-      </w:r>
-    </w:p>
-    <w:p>
-      <w:r>
-        <w:t xml:space="preserve">El objetivo general es caracterizar los patrones temporales de generación eléctrica de las tres centrales mediante un proceso reproducible de preparación, validación y análisis. El alcance se mantiene deliberadamente descriptivo: los registros iguales a 0 </w:t>
-      </w:r>
-      <w:proofErr w:type="spellStart"/>
-      <w:r>
-        <w:t>MWh</w:t>
-      </w:r>
-      <w:proofErr w:type="spellEnd"/>
-      <w:r>
-        <w:t xml:space="preserve"> se conservan y analizan como parte de los datos publicados, pero no se atribuyen a fallas, detenciones, mantenimiento u otras causas operacionales que no puedan verificarse con la información disponible.</w:t>
-      </w:r>
-    </w:p>
-    <w:p>
-      <w:r>
-        <w:t xml:space="preserve">El desarrollo se articula en cuatro fases. F1 definió la problemática, los objetivos, el alcance y el entorno reproducible; F2 implementó la preparación, transformación y validación del </w:t>
-      </w:r>
-      <w:proofErr w:type="spellStart"/>
-      <w:r>
-        <w:t>dataset</w:t>
-      </w:r>
-      <w:proofErr w:type="spellEnd"/>
-      <w:r>
-        <w:t>; F3 consolidó el núcleo algorítmico, incorporó mediciones de eficiencia, recursividad y Programación Orientada a Objetos; y F4 integra los resultados, construye las visualizaciones finales, documenta la trazabilidad de mejoras y comunica las conclusiones del proyecto. Esta progresión permite relacionar decisiones técnicas, código, evidencias y resultados dentro de un único flujo reproducible.</w:t>
-      </w:r>
-    </w:p>
-    <w:p>
-      <w:pPr>
-        <w:pStyle w:val="F4Heading1"/>
-        <w:rPr>
-          <w:lang w:val="es-CL"/>
-        </w:rPr>
-      </w:pPr>
-      <w:r>
-        <w:rPr>
-          <w:rFonts w:eastAsia="Arial"/>
-          <w:lang w:val="es-CL"/>
-        </w:rPr>
+        <w:t>La necesidad técnica del proyecto surge de la estructura y volumen de los registros. La fuente original contiene 359.891 filas y 33 columnas, mientras que el subconjunto definido para el estudio corresponde a 729 registros en formato ancho. Para facilitar el análisis temporal, los datos fueron transformados a formato largo, obteniéndose un dataset analítico de 17.496 observaciones y 13 variables, donde cada fila representa una combinación de central, fecha y hora. Este proceso exige programación para automatizar la preparación, validación y análisis de los datos de manera reproducible.</w:t>
+      </w:r>
+    </w:p>
+    <w:p>
+      <w:r>
+        <w:t>El objetivo general es caracterizar los patrones temporales de generación eléctrica de las tres centrales mediante un proceso reproducible de preparación, validación y análisis. El alcance se mantiene deliberadamente descriptivo: los registros iguales a 0 MWh se conservan y analizan como parte de los datos publicados, pero no se atribuyen a fallas, detenciones, mantenimiento u otras causas operacionales que no puedan verificarse con la información disponible.</w:t>
+      </w:r>
+    </w:p>
+    <w:p>
+      <w:r>
+        <w:t>El desarrollo se articula en cuatro fases. F1 definió la problemática, los objetivos, el alcance y el entorno reproducible; F2 implementó la preparación, transformación y validación del dataset; F3 consolidó el núcleo algorítmico, incorporó mediciones de eficiencia, recursividad y Programación Orientada a Objetos; y F4 integra los resultados, construye las visualizaciones finales, documenta la trazabilidad de mejoras y comunica las conclusiones del proyecto. Esta progresión permite relacionar decisiones técnicas, código, evidencias y resultados dentro de un único flujo reproducible.</w:t>
+      </w:r>
+    </w:p>
+    <w:p>
+      <w:pPr>
+        <w:pStyle w:val="Ttulo1"/>
+      </w:pPr>
+      <w:r>
         <w:t>III. Definición de la problemática y objetivos del proyecto</w:t>
       </w:r>
     </w:p>
@@ -3969,23 +3912,7 @@
           <w:rFonts w:eastAsia="Arial"/>
           <w:lang w:val="es-CL"/>
         </w:rPr>
-        <w:t xml:space="preserve">Analizar la frecuencia y la distribución temporal de los registros con generación igual a 0 </w:t>
-      </w:r>
-      <w:proofErr w:type="spellStart"/>
-      <w:r>
-        <w:rPr>
-          <w:rFonts w:eastAsia="Arial"/>
-          <w:lang w:val="es-CL"/>
-        </w:rPr>
-        <w:t>MWh</w:t>
-      </w:r>
-      <w:proofErr w:type="spellEnd"/>
-      <w:r>
-        <w:rPr>
-          <w:rFonts w:eastAsia="Arial"/>
-          <w:lang w:val="es-CL"/>
-        </w:rPr>
-        <w:t>, sin atribuirles causas operacionales que no estén respaldadas por la fuente.</w:t>
+        <w:t>Analizar la frecuencia y la distribución temporal de los registros con generación igual a 0 MWh, sin atribuirles causas operacionales que no estén respaldadas por la fuente.</w:t>
       </w:r>
     </w:p>
     <w:p>
@@ -4053,23 +3980,7 @@
           <w:rFonts w:eastAsia="Arial"/>
           <w:lang w:val="es-CL"/>
         </w:rPr>
-        <w:t xml:space="preserve">Se utilizan exclusivamente datos públicos de Generación Real del CEN y se conserva la escala original de generación en </w:t>
-      </w:r>
-      <w:proofErr w:type="spellStart"/>
-      <w:r>
-        <w:rPr>
-          <w:rFonts w:eastAsia="Arial"/>
-          <w:lang w:val="es-CL"/>
-        </w:rPr>
-        <w:t>MWh</w:t>
-      </w:r>
-      <w:proofErr w:type="spellEnd"/>
-      <w:r>
-        <w:rPr>
-          <w:rFonts w:eastAsia="Arial"/>
-          <w:lang w:val="es-CL"/>
-        </w:rPr>
-        <w:t>.</w:t>
+        <w:t>Se utilizan exclusivamente datos públicos de Generación Real del CEN y se conserva la escala original de generación en MWh.</w:t>
       </w:r>
     </w:p>
     <w:p>
@@ -4107,23 +4018,7 @@
           <w:rFonts w:eastAsia="Arial"/>
           <w:lang w:val="es-CL"/>
         </w:rPr>
-        <w:t xml:space="preserve">Los registros de 0 </w:t>
-      </w:r>
-      <w:proofErr w:type="spellStart"/>
-      <w:r>
-        <w:rPr>
-          <w:rFonts w:eastAsia="Arial"/>
-          <w:lang w:val="es-CL"/>
-        </w:rPr>
-        <w:t>MWh</w:t>
-      </w:r>
-      <w:proofErr w:type="spellEnd"/>
-      <w:r>
-        <w:rPr>
-          <w:rFonts w:eastAsia="Arial"/>
-          <w:lang w:val="es-CL"/>
-        </w:rPr>
-        <w:t xml:space="preserve"> se conservan como observaciones válidas mientras no exista evidencia suficiente para clasificarlos como errores.</w:t>
+        <w:t>Los registros de 0 MWh se conservan como observaciones válidas mientras no exista evidencia suficiente para clasificarlos como errores.</w:t>
       </w:r>
     </w:p>
     <w:p>
@@ -4148,7 +4043,6 @@
     <w:p>
       <w:pPr>
         <w:pStyle w:val="Ttulo2"/>
-        <w:jc w:val="center"/>
       </w:pPr>
       <w:bookmarkStart w:id="5" w:name="_Toc241854665"/>
       <w:r>
@@ -4158,6 +4052,7 @@
     </w:p>
     <w:tbl>
       <w:tblPr>
+        <w:tblStyle w:val="Tablaconcuadrcula4-nfasis1"/>
         <w:tblW w:w="9493" w:type="dxa"/>
         <w:jc w:val="center"/>
         <w:tblLayout w:type="fixed"/>
@@ -4170,19 +4065,13 @@
       </w:tblGrid>
       <w:tr>
         <w:trPr>
+          <w:cnfStyle w:val="100000000000" w:firstRow="1" w:lastRow="0" w:firstColumn="0" w:lastColumn="0" w:oddVBand="0" w:evenVBand="0" w:oddHBand="0" w:evenHBand="0" w:firstRowFirstColumn="0" w:firstRowLastColumn="0" w:lastRowFirstColumn="0" w:lastRowLastColumn="0"/>
           <w:jc w:val="center"/>
         </w:trPr>
         <w:tc>
           <w:tcPr>
+            <w:cnfStyle w:val="001000000000" w:firstRow="0" w:lastRow="0" w:firstColumn="1" w:lastColumn="0" w:oddVBand="0" w:evenVBand="0" w:oddHBand="0" w:evenHBand="0" w:firstRowFirstColumn="0" w:firstRowLastColumn="0" w:lastRowFirstColumn="0" w:lastRowLastColumn="0"/>
             <w:tcW w:w="945" w:type="dxa"/>
-            <w:tcBorders>
-              <w:top w:val="single" w:sz="4" w:space="0" w:color="B7C9DA"/>
-              <w:left w:val="single" w:sz="4" w:space="0" w:color="B7C9DA"/>
-              <w:bottom w:val="single" w:sz="4" w:space="0" w:color="B7C9DA"/>
-              <w:right w:val="single" w:sz="4" w:space="0" w:color="B7C9DA"/>
-            </w:tcBorders>
-            <w:shd w:val="clear" w:color="auto" w:fill="D9EAF7"/>
-            <w:vAlign w:val="center"/>
           </w:tcPr>
           <w:p>
             <w:pPr>
@@ -4199,14 +4088,6 @@
         <w:tc>
           <w:tcPr>
             <w:tcW w:w="4437" w:type="dxa"/>
-            <w:tcBorders>
-              <w:top w:val="single" w:sz="4" w:space="0" w:color="B7C9DA"/>
-              <w:left w:val="single" w:sz="4" w:space="0" w:color="B7C9DA"/>
-              <w:bottom w:val="single" w:sz="4" w:space="0" w:color="B7C9DA"/>
-              <w:right w:val="single" w:sz="4" w:space="0" w:color="B7C9DA"/>
-            </w:tcBorders>
-            <w:shd w:val="clear" w:color="auto" w:fill="D9EAF7"/>
-            <w:vAlign w:val="center"/>
           </w:tcPr>
           <w:p>
             <w:pPr>
@@ -4214,6 +4095,7 @@
               <w:spacing w:after="0" w:line="240" w:lineRule="auto"/>
               <w:ind w:firstLine="0"/>
               <w:jc w:val="left"/>
+              <w:cnfStyle w:val="100000000000" w:firstRow="1" w:lastRow="0" w:firstColumn="0" w:lastColumn="0" w:oddVBand="0" w:evenVBand="0" w:oddHBand="0" w:evenHBand="0" w:firstRowFirstColumn="0" w:firstRowLastColumn="0" w:lastRowFirstColumn="0" w:lastRowLastColumn="0"/>
             </w:pPr>
             <w:r>
               <w:t>Aporte principal</w:t>
@@ -4223,14 +4105,6 @@
         <w:tc>
           <w:tcPr>
             <w:tcW w:w="4111" w:type="dxa"/>
-            <w:tcBorders>
-              <w:top w:val="single" w:sz="4" w:space="0" w:color="B7C9DA"/>
-              <w:left w:val="single" w:sz="4" w:space="0" w:color="B7C9DA"/>
-              <w:bottom w:val="single" w:sz="4" w:space="0" w:color="B7C9DA"/>
-              <w:right w:val="single" w:sz="4" w:space="0" w:color="B7C9DA"/>
-            </w:tcBorders>
-            <w:shd w:val="clear" w:color="auto" w:fill="D9EAF7"/>
-            <w:vAlign w:val="center"/>
           </w:tcPr>
           <w:p>
             <w:pPr>
@@ -4238,9 +4112,67 @@
               <w:spacing w:after="0" w:line="240" w:lineRule="auto"/>
               <w:ind w:hanging="6"/>
               <w:jc w:val="left"/>
+              <w:cnfStyle w:val="100000000000" w:firstRow="1" w:lastRow="0" w:firstColumn="0" w:lastColumn="0" w:oddVBand="0" w:evenVBand="0" w:oddHBand="0" w:evenHBand="0" w:firstRowFirstColumn="0" w:firstRowLastColumn="0" w:lastRowFirstColumn="0" w:lastRowLastColumn="0"/>
             </w:pPr>
             <w:r>
               <w:t>Evidencia</w:t>
+            </w:r>
+          </w:p>
+        </w:tc>
+      </w:tr>
+      <w:tr>
+        <w:trPr>
+          <w:cnfStyle w:val="000000100000" w:firstRow="0" w:lastRow="0" w:firstColumn="0" w:lastColumn="0" w:oddVBand="0" w:evenVBand="0" w:oddHBand="1" w:evenHBand="0" w:firstRowFirstColumn="0" w:firstRowLastColumn="0" w:lastRowFirstColumn="0" w:lastRowLastColumn="0"/>
+          <w:jc w:val="center"/>
+        </w:trPr>
+        <w:tc>
+          <w:tcPr>
+            <w:cnfStyle w:val="001000000000" w:firstRow="0" w:lastRow="0" w:firstColumn="1" w:lastColumn="0" w:oddVBand="0" w:evenVBand="0" w:oddHBand="0" w:evenHBand="0" w:firstRowFirstColumn="0" w:firstRowLastColumn="0" w:lastRowFirstColumn="0" w:lastRowLastColumn="0"/>
+            <w:tcW w:w="945" w:type="dxa"/>
+          </w:tcPr>
+          <w:p>
+            <w:pPr>
+              <w:widowControl/>
+              <w:spacing w:after="0" w:line="240" w:lineRule="auto"/>
+              <w:ind w:firstLine="0"/>
+              <w:jc w:val="center"/>
+            </w:pPr>
+            <w:r>
+              <w:t>F1</w:t>
+            </w:r>
+          </w:p>
+        </w:tc>
+        <w:tc>
+          <w:tcPr>
+            <w:tcW w:w="4437" w:type="dxa"/>
+          </w:tcPr>
+          <w:p>
+            <w:pPr>
+              <w:widowControl/>
+              <w:spacing w:after="0" w:line="240" w:lineRule="auto"/>
+              <w:ind w:firstLine="0"/>
+              <w:jc w:val="left"/>
+              <w:cnfStyle w:val="000000100000" w:firstRow="0" w:lastRow="0" w:firstColumn="0" w:lastColumn="0" w:oddVBand="0" w:evenVBand="0" w:oddHBand="1" w:evenHBand="0" w:firstRowFirstColumn="0" w:firstRowLastColumn="0" w:lastRowFirstColumn="0" w:lastRowLastColumn="0"/>
+            </w:pPr>
+            <w:r>
+              <w:t>Definición del problema, objetivos, alcance y entorno reproducible.</w:t>
+            </w:r>
+          </w:p>
+        </w:tc>
+        <w:tc>
+          <w:tcPr>
+            <w:tcW w:w="4111" w:type="dxa"/>
+          </w:tcPr>
+          <w:p>
+            <w:pPr>
+              <w:widowControl/>
+              <w:spacing w:after="0" w:line="240" w:lineRule="auto"/>
+              <w:ind w:hanging="6"/>
+              <w:jc w:val="left"/>
+              <w:cnfStyle w:val="000000100000" w:firstRow="0" w:lastRow="0" w:firstColumn="0" w:lastColumn="0" w:oddVBand="0" w:evenVBand="0" w:oddHBand="1" w:evenHBand="0" w:firstRowFirstColumn="0" w:firstRowLastColumn="0" w:lastRowFirstColumn="0" w:lastRowLastColumn="0"/>
+            </w:pPr>
+            <w:r>
+              <w:t>F1/F1_definicion.ipynb</w:t>
             </w:r>
           </w:p>
         </w:tc>
@@ -4251,14 +4183,8 @@
         </w:trPr>
         <w:tc>
           <w:tcPr>
+            <w:cnfStyle w:val="001000000000" w:firstRow="0" w:lastRow="0" w:firstColumn="1" w:lastColumn="0" w:oddVBand="0" w:evenVBand="0" w:oddHBand="0" w:evenHBand="0" w:firstRowFirstColumn="0" w:firstRowLastColumn="0" w:lastRowFirstColumn="0" w:lastRowLastColumn="0"/>
             <w:tcW w:w="945" w:type="dxa"/>
-            <w:tcBorders>
-              <w:top w:val="single" w:sz="4" w:space="0" w:color="B7C9DA"/>
-              <w:left w:val="single" w:sz="4" w:space="0" w:color="B7C9DA"/>
-              <w:bottom w:val="single" w:sz="4" w:space="0" w:color="B7C9DA"/>
-              <w:right w:val="single" w:sz="4" w:space="0" w:color="B7C9DA"/>
-            </w:tcBorders>
-            <w:vAlign w:val="center"/>
           </w:tcPr>
           <w:p>
             <w:pPr>
@@ -4268,20 +4194,13 @@
               <w:jc w:val="center"/>
             </w:pPr>
             <w:r>
-              <w:t>F1</w:t>
+              <w:t>F2</w:t>
             </w:r>
           </w:p>
         </w:tc>
         <w:tc>
           <w:tcPr>
             <w:tcW w:w="4437" w:type="dxa"/>
-            <w:tcBorders>
-              <w:top w:val="single" w:sz="4" w:space="0" w:color="B7C9DA"/>
-              <w:left w:val="single" w:sz="4" w:space="0" w:color="B7C9DA"/>
-              <w:bottom w:val="single" w:sz="4" w:space="0" w:color="B7C9DA"/>
-              <w:right w:val="single" w:sz="4" w:space="0" w:color="B7C9DA"/>
-            </w:tcBorders>
-            <w:vAlign w:val="center"/>
           </w:tcPr>
           <w:p>
             <w:pPr>
@@ -4289,22 +4208,16 @@
               <w:spacing w:after="0" w:line="240" w:lineRule="auto"/>
               <w:ind w:firstLine="0"/>
               <w:jc w:val="left"/>
+              <w:cnfStyle w:val="000000000000" w:firstRow="0" w:lastRow="0" w:firstColumn="0" w:lastColumn="0" w:oddVBand="0" w:evenVBand="0" w:oddHBand="0" w:evenHBand="0" w:firstRowFirstColumn="0" w:firstRowLastColumn="0" w:lastRowFirstColumn="0" w:lastRowLastColumn="0"/>
             </w:pPr>
             <w:r>
-              <w:t>Definición del problema, objetivos, alcance y entorno reproducible.</w:t>
+              <w:t>Carga, transformación, validación y dataset analítico en formato largo.</w:t>
             </w:r>
           </w:p>
         </w:tc>
         <w:tc>
           <w:tcPr>
             <w:tcW w:w="4111" w:type="dxa"/>
-            <w:tcBorders>
-              <w:top w:val="single" w:sz="4" w:space="0" w:color="B7C9DA"/>
-              <w:left w:val="single" w:sz="4" w:space="0" w:color="B7C9DA"/>
-              <w:bottom w:val="single" w:sz="4" w:space="0" w:color="B7C9DA"/>
-              <w:right w:val="single" w:sz="4" w:space="0" w:color="B7C9DA"/>
-            </w:tcBorders>
-            <w:vAlign w:val="center"/>
           </w:tcPr>
           <w:p>
             <w:pPr>
@@ -4312,9 +4225,67 @@
               <w:spacing w:after="0" w:line="240" w:lineRule="auto"/>
               <w:ind w:hanging="6"/>
               <w:jc w:val="left"/>
+              <w:cnfStyle w:val="000000000000" w:firstRow="0" w:lastRow="0" w:firstColumn="0" w:lastColumn="0" w:oddVBand="0" w:evenVBand="0" w:oddHBand="0" w:evenHBand="0" w:firstRowFirstColumn="0" w:firstRowLastColumn="0" w:lastRowFirstColumn="0" w:lastRowLastColumn="0"/>
             </w:pPr>
             <w:r>
-              <w:t>F1/F1_definicion.ipynb</w:t>
+              <w:t>F2/F2_preparacion_datos.ipynb; src/</w:t>
+            </w:r>
+          </w:p>
+        </w:tc>
+      </w:tr>
+      <w:tr>
+        <w:trPr>
+          <w:cnfStyle w:val="000000100000" w:firstRow="0" w:lastRow="0" w:firstColumn="0" w:lastColumn="0" w:oddVBand="0" w:evenVBand="0" w:oddHBand="1" w:evenHBand="0" w:firstRowFirstColumn="0" w:firstRowLastColumn="0" w:lastRowFirstColumn="0" w:lastRowLastColumn="0"/>
+          <w:jc w:val="center"/>
+        </w:trPr>
+        <w:tc>
+          <w:tcPr>
+            <w:cnfStyle w:val="001000000000" w:firstRow="0" w:lastRow="0" w:firstColumn="1" w:lastColumn="0" w:oddVBand="0" w:evenVBand="0" w:oddHBand="0" w:evenHBand="0" w:firstRowFirstColumn="0" w:firstRowLastColumn="0" w:lastRowFirstColumn="0" w:lastRowLastColumn="0"/>
+            <w:tcW w:w="945" w:type="dxa"/>
+          </w:tcPr>
+          <w:p>
+            <w:pPr>
+              <w:widowControl/>
+              <w:spacing w:after="0" w:line="240" w:lineRule="auto"/>
+              <w:ind w:firstLine="0"/>
+              <w:jc w:val="center"/>
+            </w:pPr>
+            <w:r>
+              <w:t>F3</w:t>
+            </w:r>
+          </w:p>
+        </w:tc>
+        <w:tc>
+          <w:tcPr>
+            <w:tcW w:w="4437" w:type="dxa"/>
+          </w:tcPr>
+          <w:p>
+            <w:pPr>
+              <w:widowControl/>
+              <w:spacing w:after="0" w:line="240" w:lineRule="auto"/>
+              <w:ind w:firstLine="0"/>
+              <w:jc w:val="left"/>
+              <w:cnfStyle w:val="000000100000" w:firstRow="0" w:lastRow="0" w:firstColumn="0" w:lastColumn="0" w:oddVBand="0" w:evenVBand="0" w:oddHBand="1" w:evenHBand="0" w:firstRowFirstColumn="0" w:firstRowLastColumn="0" w:lastRowFirstColumn="0" w:lastRowLastColumn="0"/>
+            </w:pPr>
+            <w:r>
+              <w:t>Núcleo algorítmico, eficiencia, recursividad y arquitectura POO.</w:t>
+            </w:r>
+          </w:p>
+        </w:tc>
+        <w:tc>
+          <w:tcPr>
+            <w:tcW w:w="4111" w:type="dxa"/>
+          </w:tcPr>
+          <w:p>
+            <w:pPr>
+              <w:widowControl/>
+              <w:spacing w:after="0" w:line="240" w:lineRule="auto"/>
+              <w:ind w:hanging="6"/>
+              <w:jc w:val="left"/>
+              <w:cnfStyle w:val="000000100000" w:firstRow="0" w:lastRow="0" w:firstColumn="0" w:lastColumn="0" w:oddVBand="0" w:evenVBand="0" w:oddHBand="1" w:evenHBand="0" w:firstRowFirstColumn="0" w:firstRowLastColumn="0" w:lastRowFirstColumn="0" w:lastRowLastColumn="0"/>
+            </w:pPr>
+            <w:r>
+              <w:t>F3/F3_nucleo_algoritmico.ipynb; src/nucleo_poo.py</w:t>
             </w:r>
           </w:p>
         </w:tc>
@@ -4325,14 +4296,8 @@
         </w:trPr>
         <w:tc>
           <w:tcPr>
+            <w:cnfStyle w:val="001000000000" w:firstRow="0" w:lastRow="0" w:firstColumn="1" w:lastColumn="0" w:oddVBand="0" w:evenVBand="0" w:oddHBand="0" w:evenHBand="0" w:firstRowFirstColumn="0" w:firstRowLastColumn="0" w:lastRowFirstColumn="0" w:lastRowLastColumn="0"/>
             <w:tcW w:w="945" w:type="dxa"/>
-            <w:tcBorders>
-              <w:top w:val="single" w:sz="4" w:space="0" w:color="B7C9DA"/>
-              <w:left w:val="single" w:sz="4" w:space="0" w:color="B7C9DA"/>
-              <w:bottom w:val="single" w:sz="4" w:space="0" w:color="B7C9DA"/>
-              <w:right w:val="single" w:sz="4" w:space="0" w:color="B7C9DA"/>
-            </w:tcBorders>
-            <w:vAlign w:val="center"/>
           </w:tcPr>
           <w:p>
             <w:pPr>
@@ -4342,20 +4307,13 @@
               <w:jc w:val="center"/>
             </w:pPr>
             <w:r>
-              <w:t>F2</w:t>
+              <w:t>F4</w:t>
             </w:r>
           </w:p>
         </w:tc>
         <w:tc>
           <w:tcPr>
             <w:tcW w:w="4437" w:type="dxa"/>
-            <w:tcBorders>
-              <w:top w:val="single" w:sz="4" w:space="0" w:color="B7C9DA"/>
-              <w:left w:val="single" w:sz="4" w:space="0" w:color="B7C9DA"/>
-              <w:bottom w:val="single" w:sz="4" w:space="0" w:color="B7C9DA"/>
-              <w:right w:val="single" w:sz="4" w:space="0" w:color="B7C9DA"/>
-            </w:tcBorders>
-            <w:vAlign w:val="center"/>
           </w:tcPr>
           <w:p>
             <w:pPr>
@@ -4363,30 +4321,16 @@
               <w:spacing w:after="0" w:line="240" w:lineRule="auto"/>
               <w:ind w:firstLine="0"/>
               <w:jc w:val="left"/>
+              <w:cnfStyle w:val="000000000000" w:firstRow="0" w:lastRow="0" w:firstColumn="0" w:lastColumn="0" w:oddVBand="0" w:evenVBand="0" w:oddHBand="0" w:evenHBand="0" w:firstRowFirstColumn="0" w:firstRowLastColumn="0" w:lastRowFirstColumn="0" w:lastRowLastColumn="0"/>
             </w:pPr>
             <w:r>
-              <w:t xml:space="preserve">Carga, transformación, validación y </w:t>
-            </w:r>
-            <w:proofErr w:type="spellStart"/>
-            <w:r>
-              <w:t>dataset</w:t>
-            </w:r>
-            <w:proofErr w:type="spellEnd"/>
-            <w:r>
-              <w:t xml:space="preserve"> analítico en formato largo.</w:t>
+              <w:t>Integración de resultados, visualizaciones, discusión, conclusiones y trazabilidad.</w:t>
             </w:r>
           </w:p>
         </w:tc>
         <w:tc>
           <w:tcPr>
             <w:tcW w:w="4111" w:type="dxa"/>
-            <w:tcBorders>
-              <w:top w:val="single" w:sz="4" w:space="0" w:color="B7C9DA"/>
-              <w:left w:val="single" w:sz="4" w:space="0" w:color="B7C9DA"/>
-              <w:bottom w:val="single" w:sz="4" w:space="0" w:color="B7C9DA"/>
-              <w:right w:val="single" w:sz="4" w:space="0" w:color="B7C9DA"/>
-            </w:tcBorders>
-            <w:vAlign w:val="center"/>
           </w:tcPr>
           <w:p>
             <w:pPr>
@@ -4394,157 +4338,1070 @@
               <w:spacing w:after="0" w:line="240" w:lineRule="auto"/>
               <w:ind w:hanging="6"/>
               <w:jc w:val="left"/>
+              <w:cnfStyle w:val="000000000000" w:firstRow="0" w:lastRow="0" w:firstColumn="0" w:lastColumn="0" w:oddVBand="0" w:evenVBand="0" w:oddHBand="0" w:evenHBand="0" w:firstRowFirstColumn="0" w:firstRowLastColumn="0" w:lastRowFirstColumn="0" w:lastRowLastColumn="0"/>
             </w:pPr>
             <w:r>
-              <w:t>F2/F2_preparacion_datos.ipynb; src/</w:t>
+              <w:t>F4/F4_Consolidado_Proyecto.ipynb; changelog.md</w:t>
+            </w:r>
+          </w:p>
+        </w:tc>
+      </w:tr>
+    </w:tbl>
+    <w:p>
+      <w:pPr>
+        <w:pStyle w:val="Ttulo1"/>
+      </w:pPr>
+      <w:r>
+        <w:lastRenderedPageBreak/>
+        <w:t>IV. Aplicación de herramientas científicas</w:t>
+      </w:r>
+    </w:p>
+    <w:p>
+      <w:pPr>
+        <w:pStyle w:val="Ttulo2"/>
+        <w:ind w:left="720"/>
+      </w:pPr>
+      <w:bookmarkStart w:id="6" w:name="_Toc241854666"/>
+      <w:r>
+        <w:t>a. Reproducibilidad técnica</w:t>
+      </w:r>
+      <w:bookmarkEnd w:id="6"/>
+    </w:p>
+    <w:p>
+      <w:pPr>
+        <w:pStyle w:val="Ttulo2"/>
+        <w:ind w:left="720"/>
+      </w:pPr>
+      <w:bookmarkStart w:id="7" w:name="_Toc241854667"/>
+      <w:r>
+        <w:t>b. Control de versiones</w:t>
+      </w:r>
+      <w:bookmarkEnd w:id="7"/>
+    </w:p>
+    <w:p>
+      <w:pPr>
+        <w:pStyle w:val="Ttulo2"/>
+        <w:ind w:left="720"/>
+      </w:pPr>
+      <w:bookmarkStart w:id="8" w:name="_Toc241854668"/>
+      <w:r>
+        <w:t>c. Documentación del proceso</w:t>
+      </w:r>
+      <w:bookmarkEnd w:id="8"/>
+    </w:p>
+    <w:p>
+      <w:pPr>
+        <w:pStyle w:val="Ttulo2"/>
+        <w:ind w:left="720"/>
+      </w:pPr>
+      <w:bookmarkStart w:id="9" w:name="_Toc241854669"/>
+      <w:r>
+        <w:t>d. Repositorio GitHub actualizado</w:t>
+      </w:r>
+      <w:bookmarkEnd w:id="9"/>
+    </w:p>
+    <w:p>
+      <w:pPr>
+        <w:pStyle w:val="F4DraftNote"/>
+        <w:ind w:left="720"/>
+        <w:rPr>
+          <w:lang w:val="es-CL"/>
+        </w:rPr>
+      </w:pPr>
+      <w:r>
+        <w:rPr>
+          <w:rFonts w:eastAsia="Arial"/>
+          <w:lang w:val="es-CL"/>
+        </w:rPr>
+        <w:t>Sección preparada para integración en la siguiente versión del informe final.</w:t>
+      </w:r>
+    </w:p>
+    <w:p>
+      <w:pPr>
+        <w:pStyle w:val="Ttulo1"/>
+      </w:pPr>
+      <w:bookmarkStart w:id="10" w:name="_Toc241854670"/>
+      <w:r>
+        <w:t>V. Diseño de soluciones algorítmicas eficientes</w:t>
+      </w:r>
+      <w:bookmarkEnd w:id="10"/>
+    </w:p>
+    <w:p>
+      <w:pPr>
+        <w:pStyle w:val="Ttulo2"/>
+        <w:ind w:left="720"/>
+      </w:pPr>
+      <w:bookmarkStart w:id="11" w:name="_Toc241854671"/>
+      <w:r>
+        <w:t>a. Codificación funcional</w:t>
+      </w:r>
+      <w:bookmarkEnd w:id="11"/>
+    </w:p>
+    <w:p>
+      <w:pPr>
+        <w:pStyle w:val="Ttulo2"/>
+        <w:ind w:left="720"/>
+      </w:pPr>
+      <w:bookmarkStart w:id="12" w:name="_Toc241854672"/>
+      <w:r>
+        <w:t>b. Preprocesamiento y transformación del dataset</w:t>
+      </w:r>
+      <w:bookmarkEnd w:id="12"/>
+    </w:p>
+    <w:p>
+      <w:pPr>
+        <w:pStyle w:val="Ttulo2"/>
+        <w:ind w:left="720"/>
+      </w:pPr>
+      <w:bookmarkStart w:id="13" w:name="_Toc241854673"/>
+      <w:r>
+        <w:t>c. Validación técnica y verificación del código</w:t>
+      </w:r>
+      <w:bookmarkEnd w:id="13"/>
+    </w:p>
+    <w:p>
+      <w:pPr>
+        <w:pStyle w:val="Ttulo2"/>
+        <w:ind w:left="720"/>
+      </w:pPr>
+      <w:bookmarkStart w:id="14" w:name="_Toc241854674"/>
+      <w:r>
+        <w:t>d. Eficiencia y optimización</w:t>
+      </w:r>
+      <w:bookmarkEnd w:id="14"/>
+    </w:p>
+    <w:p>
+      <w:pPr>
+        <w:pStyle w:val="Ttulo2"/>
+        <w:ind w:left="720"/>
+      </w:pPr>
+      <w:bookmarkStart w:id="15" w:name="_Toc241854675"/>
+      <w:r>
+        <w:t>e. Diseño estructurado del código</w:t>
+      </w:r>
+      <w:bookmarkEnd w:id="15"/>
+    </w:p>
+    <w:p>
+      <w:pPr>
+        <w:pStyle w:val="Ttulo2"/>
+        <w:ind w:left="720"/>
+      </w:pPr>
+      <w:bookmarkStart w:id="16" w:name="_Toc241854676"/>
+      <w:r>
+        <w:t>f. Notebook final ejecutado y documentado</w:t>
+      </w:r>
+      <w:bookmarkEnd w:id="16"/>
+    </w:p>
+    <w:p>
+      <w:pPr>
+        <w:pStyle w:val="F4DraftNote"/>
+        <w:ind w:left="720"/>
+        <w:rPr>
+          <w:lang w:val="es-CL"/>
+        </w:rPr>
+      </w:pPr>
+      <w:r>
+        <w:rPr>
+          <w:rFonts w:eastAsia="Arial"/>
+          <w:lang w:val="es-CL"/>
+        </w:rPr>
+        <w:t>Sección preparada para integración en la siguiente versión del informe final.</w:t>
+      </w:r>
+    </w:p>
+    <w:p>
+      <w:pPr>
+        <w:pStyle w:val="Ttulo1"/>
+      </w:pPr>
+      <w:bookmarkStart w:id="17" w:name="_Toc241854677"/>
+      <w:r>
+        <w:t>VI. Implementación de código modular y robusto</w:t>
+      </w:r>
+      <w:bookmarkEnd w:id="17"/>
+    </w:p>
+    <w:p>
+      <w:pPr>
+        <w:pStyle w:val="Ttulo2"/>
+        <w:ind w:left="720"/>
+      </w:pPr>
+      <w:bookmarkStart w:id="18" w:name="_Toc241854678"/>
+      <w:r>
+        <w:t>a. Programación orientada a objetos</w:t>
+      </w:r>
+      <w:bookmarkEnd w:id="18"/>
+    </w:p>
+    <w:p>
+      <w:pPr>
+        <w:pStyle w:val="Ttulo2"/>
+        <w:ind w:left="720"/>
+      </w:pPr>
+      <w:bookmarkStart w:id="19" w:name="_Toc241854679"/>
+      <w:r>
+        <w:t>b. Documentación de arquitectura</w:t>
+      </w:r>
+      <w:bookmarkEnd w:id="19"/>
+    </w:p>
+    <w:p>
+      <w:pPr>
+        <w:pStyle w:val="F4DraftNote"/>
+        <w:ind w:left="720"/>
+        <w:rPr>
+          <w:lang w:val="es-CL"/>
+        </w:rPr>
+      </w:pPr>
+      <w:r>
+        <w:rPr>
+          <w:rFonts w:eastAsia="Arial"/>
+          <w:lang w:val="es-CL"/>
+        </w:rPr>
+        <w:t>Sección preparada para integración en la siguiente versión del informe final.</w:t>
+      </w:r>
+    </w:p>
+    <w:p>
+      <w:pPr>
+        <w:pStyle w:val="Ttulo1"/>
+      </w:pPr>
+      <w:bookmarkStart w:id="20" w:name="_Toc241854680"/>
+      <w:r>
+        <w:t>VII. Construcción de visualizaciones de datos efectivas</w:t>
+      </w:r>
+      <w:bookmarkEnd w:id="20"/>
+    </w:p>
+    <w:p>
+      <w:pPr>
+        <w:pStyle w:val="Ttulo2"/>
+        <w:ind w:left="720"/>
+      </w:pPr>
+      <w:bookmarkStart w:id="21" w:name="_Toc241854681"/>
+      <w:r>
+        <w:t>a. Preprocesamiento y transformación de datos</w:t>
+      </w:r>
+      <w:bookmarkEnd w:id="21"/>
+    </w:p>
+    <w:p>
+      <w:pPr>
+        <w:pStyle w:val="Ttulo2"/>
+        <w:ind w:left="720"/>
+      </w:pPr>
+      <w:bookmarkStart w:id="22" w:name="_Toc241854682"/>
+      <w:r>
+        <w:t>b. Visualizaciones analíticas</w:t>
+      </w:r>
+      <w:bookmarkEnd w:id="22"/>
+    </w:p>
+    <w:p>
+      <w:pPr>
+        <w:pStyle w:val="F4DraftNote"/>
+        <w:ind w:left="720"/>
+        <w:rPr>
+          <w:lang w:val="es-CL"/>
+        </w:rPr>
+      </w:pPr>
+      <w:r>
+        <w:rPr>
+          <w:rFonts w:eastAsia="Arial"/>
+          <w:lang w:val="es-CL"/>
+        </w:rPr>
+        <w:t>Sección preparada para integración en la siguiente versión del informe final.</w:t>
+      </w:r>
+    </w:p>
+    <w:p>
+      <w:pPr>
+        <w:pStyle w:val="Ttulo1"/>
+      </w:pPr>
+      <w:bookmarkStart w:id="23" w:name="_Toc241854683"/>
+      <w:r>
+        <w:t>VIII. Metodología del desarrollo técnico</w:t>
+      </w:r>
+      <w:bookmarkEnd w:id="23"/>
+    </w:p>
+    <w:p>
+      <w:pPr>
+        <w:pStyle w:val="Ttulo2"/>
+        <w:ind w:left="720"/>
+      </w:pPr>
+      <w:bookmarkStart w:id="24" w:name="_Toc241854684"/>
+      <w:r>
+        <w:t>a. Validación y reflexión técnica</w:t>
+      </w:r>
+      <w:bookmarkEnd w:id="24"/>
+    </w:p>
+    <w:p>
+      <w:pPr>
+        <w:pStyle w:val="Ttulo2"/>
+        <w:ind w:left="720"/>
+      </w:pPr>
+      <w:bookmarkStart w:id="25" w:name="_Toc241854685"/>
+      <w:r>
+        <w:t>b. Resultados</w:t>
+      </w:r>
+      <w:bookmarkEnd w:id="25"/>
+    </w:p>
+    <w:p>
+      <w:pPr>
+        <w:pStyle w:val="Ttulo2"/>
+        <w:ind w:left="720"/>
+      </w:pPr>
+      <w:bookmarkStart w:id="26" w:name="_Toc241854686"/>
+      <w:r>
+        <w:t>c. Discusión</w:t>
+      </w:r>
+      <w:bookmarkEnd w:id="26"/>
+    </w:p>
+    <w:p>
+      <w:pPr>
+        <w:pStyle w:val="Ttulo2"/>
+        <w:ind w:left="720"/>
+      </w:pPr>
+      <w:bookmarkStart w:id="27" w:name="_Toc241854687"/>
+      <w:r>
+        <w:t>d. Conclusiones</w:t>
+      </w:r>
+      <w:bookmarkEnd w:id="27"/>
+    </w:p>
+    <w:p>
+      <w:pPr>
+        <w:pStyle w:val="Ttulo2"/>
+        <w:ind w:left="720"/>
+      </w:pPr>
+      <w:bookmarkStart w:id="28" w:name="_Toc241854688"/>
+      <w:r>
+        <w:t>e. Trazabilidad de mejoras</w:t>
+      </w:r>
+      <w:bookmarkEnd w:id="28"/>
+    </w:p>
+    <w:p>
+      <w:pPr>
+        <w:ind w:left="720"/>
+      </w:pPr>
+      <w:r>
+        <w:t>El proyecto se desarrolló de manera iterativa, incorporando observaciones recibidas durante las evaluaciones anteriores y registrando los cambios mediante Git/GitHub. La trazabilidad de estas mejoras permite relacionar la retroalimentación recibida con acciones concretas sobre el código, los notebooks y la documentación.</w:t>
+      </w:r>
+    </w:p>
+    <w:p>
+      <w:pPr>
+        <w:ind w:left="720"/>
+      </w:pPr>
+      <w:r>
+        <w:lastRenderedPageBreak/>
+        <w:t>En la primera evaluación se identificaron, entre otros aspectos, una modularización incompleta del pipeline, validaciones concentradas en una única función, inconsistencias en las identidades registradas por Git y falta de evidencia suficiente de ejecución reproducible de</w:t>
+      </w:r>
+      <w:r>
+        <w:t>l</w:t>
+      </w:r>
+      <w:r>
+        <w:t xml:space="preserve"> notebook. También se solicitó documentar con mayor claridad el impacto de las transformaciones y profundizar el análisis temporal de los registros de generación igual a 0 MWh. </w:t>
+      </w:r>
+    </w:p>
+    <w:p>
+      <w:pPr>
+        <w:ind w:left="720"/>
+      </w:pPr>
+      <w:r>
+        <w:t>Estas observaciones fueron abordadas durante la Fase 3. El propio feedback posterior confirmó que la modularización fue ampliada, las reglas de validación se parametrizaron y separaron, las identidades de Git se consolidaron mediante .mailmap y los notebooks comenzaron a ejecutarse desde kernel limpio.</w:t>
+      </w:r>
+    </w:p>
+    <w:p>
+      <w:pPr>
+        <w:ind w:left="720" w:hanging="11"/>
+        <w:rPr>
+          <w:b/>
+          <w:bCs/>
+        </w:rPr>
+      </w:pPr>
+      <w:r>
+        <w:rPr>
+          <w:b/>
+          <w:bCs/>
+        </w:rPr>
+        <w:t>Tabla</w:t>
+      </w:r>
+      <w:r>
+        <w:rPr>
+          <w:b/>
+          <w:bCs/>
+          <w:color w:val="EE0000"/>
+        </w:rPr>
+        <w:t xml:space="preserve"> X</w:t>
+      </w:r>
+      <w:r>
+        <w:rPr>
+          <w:b/>
+          <w:bCs/>
+        </w:rPr>
+        <w:t>. Trazabilidad de observaciones y acciones de mejora</w:t>
+      </w:r>
+    </w:p>
+    <w:p>
+      <w:pPr>
+        <w:spacing w:after="0" w:line="240" w:lineRule="auto"/>
+        <w:ind w:firstLine="0"/>
+        <w:jc w:val="center"/>
+      </w:pPr>
+    </w:p>
+    <w:tbl>
+      <w:tblPr>
+        <w:tblStyle w:val="Tablaconcuadrcula4-nfasis1"/>
+        <w:tblW w:w="9634" w:type="dxa"/>
+        <w:tblInd w:w="567" w:type="dxa"/>
+        <w:tblLook w:val="04A0" w:firstRow="1" w:lastRow="0" w:firstColumn="1" w:lastColumn="0" w:noHBand="0" w:noVBand="1"/>
+      </w:tblPr>
+      <w:tblGrid>
+        <w:gridCol w:w="1969"/>
+        <w:gridCol w:w="2380"/>
+        <w:gridCol w:w="1953"/>
+        <w:gridCol w:w="3332"/>
+      </w:tblGrid>
+      <w:tr>
+        <w:trPr>
+          <w:cnfStyle w:val="100000000000" w:firstRow="1" w:lastRow="0" w:firstColumn="0" w:lastColumn="0" w:oddVBand="0" w:evenVBand="0" w:oddHBand="0" w:evenHBand="0" w:firstRowFirstColumn="0" w:firstRowLastColumn="0" w:lastRowFirstColumn="0" w:lastRowLastColumn="0"/>
+          <w:tblHeader/>
+        </w:trPr>
+        <w:tc>
+          <w:tcPr>
+            <w:cnfStyle w:val="001000000000" w:firstRow="0" w:lastRow="0" w:firstColumn="1" w:lastColumn="0" w:oddVBand="0" w:evenVBand="0" w:oddHBand="0" w:evenHBand="0" w:firstRowFirstColumn="0" w:firstRowLastColumn="0" w:lastRowFirstColumn="0" w:lastRowLastColumn="0"/>
+            <w:tcW w:w="1969" w:type="dxa"/>
+            <w:vAlign w:val="center"/>
+            <w:hideMark/>
+          </w:tcPr>
+          <w:p>
+            <w:pPr>
+              <w:ind w:left="30" w:hanging="11"/>
+            </w:pPr>
+            <w:r>
+              <w:t>Observación recibida</w:t>
+            </w:r>
+          </w:p>
+        </w:tc>
+        <w:tc>
+          <w:tcPr>
+            <w:tcW w:w="2380" w:type="dxa"/>
+            <w:vAlign w:val="center"/>
+            <w:hideMark/>
+          </w:tcPr>
+          <w:p>
+            <w:pPr>
+              <w:ind w:left="43" w:hanging="11"/>
+              <w:jc w:val="center"/>
+              <w:cnfStyle w:val="100000000000" w:firstRow="1" w:lastRow="0" w:firstColumn="0" w:lastColumn="0" w:oddVBand="0" w:evenVBand="0" w:oddHBand="0" w:evenHBand="0" w:firstRowFirstColumn="0" w:firstRowLastColumn="0" w:lastRowFirstColumn="0" w:lastRowLastColumn="0"/>
+            </w:pPr>
+            <w:r>
+              <w:t>Acción realizada</w:t>
+            </w:r>
+          </w:p>
+        </w:tc>
+        <w:tc>
+          <w:tcPr>
+            <w:tcW w:w="1953" w:type="dxa"/>
+            <w:vAlign w:val="center"/>
+            <w:hideMark/>
+          </w:tcPr>
+          <w:p>
+            <w:pPr>
+              <w:ind w:left="78" w:hanging="11"/>
+              <w:jc w:val="center"/>
+              <w:cnfStyle w:val="100000000000" w:firstRow="1" w:lastRow="0" w:firstColumn="0" w:lastColumn="0" w:oddVBand="0" w:evenVBand="0" w:oddHBand="0" w:evenHBand="0" w:firstRowFirstColumn="0" w:firstRowLastColumn="0" w:lastRowFirstColumn="0" w:lastRowLastColumn="0"/>
+            </w:pPr>
+            <w:r>
+              <w:t>Evidencia / commit</w:t>
+            </w:r>
+          </w:p>
+        </w:tc>
+        <w:tc>
+          <w:tcPr>
+            <w:tcW w:w="3332" w:type="dxa"/>
+            <w:vAlign w:val="center"/>
+            <w:hideMark/>
+          </w:tcPr>
+          <w:p>
+            <w:pPr>
+              <w:ind w:left="118" w:hanging="11"/>
+              <w:jc w:val="center"/>
+              <w:cnfStyle w:val="100000000000" w:firstRow="1" w:lastRow="0" w:firstColumn="0" w:lastColumn="0" w:oddVBand="0" w:evenVBand="0" w:oddHBand="0" w:evenHBand="0" w:firstRowFirstColumn="0" w:firstRowLastColumn="0" w:lastRowFirstColumn="0" w:lastRowLastColumn="0"/>
+            </w:pPr>
+            <w:r>
+              <w:t>Impacto técnico</w:t>
             </w:r>
           </w:p>
         </w:tc>
       </w:tr>
       <w:tr>
         <w:trPr>
-          <w:jc w:val="center"/>
+          <w:cnfStyle w:val="000000100000" w:firstRow="0" w:lastRow="0" w:firstColumn="0" w:lastColumn="0" w:oddVBand="0" w:evenVBand="0" w:oddHBand="1" w:evenHBand="0" w:firstRowFirstColumn="0" w:firstRowLastColumn="0" w:lastRowFirstColumn="0" w:lastRowLastColumn="0"/>
         </w:trPr>
         <w:tc>
           <w:tcPr>
-            <w:tcW w:w="945" w:type="dxa"/>
-            <w:tcBorders>
-              <w:top w:val="single" w:sz="4" w:space="0" w:color="B7C9DA"/>
-              <w:left w:val="single" w:sz="4" w:space="0" w:color="B7C9DA"/>
-              <w:bottom w:val="single" w:sz="4" w:space="0" w:color="B7C9DA"/>
-              <w:right w:val="single" w:sz="4" w:space="0" w:color="B7C9DA"/>
-            </w:tcBorders>
+            <w:cnfStyle w:val="001000000000" w:firstRow="0" w:lastRow="0" w:firstColumn="1" w:lastColumn="0" w:oddVBand="0" w:evenVBand="0" w:oddHBand="0" w:evenHBand="0" w:firstRowFirstColumn="0" w:firstRowLastColumn="0" w:lastRowFirstColumn="0" w:lastRowLastColumn="0"/>
+            <w:tcW w:w="1969" w:type="dxa"/>
             <w:vAlign w:val="center"/>
+            <w:hideMark/>
           </w:tcPr>
           <w:p>
             <w:pPr>
-              <w:widowControl/>
-              <w:spacing w:after="0" w:line="240" w:lineRule="auto"/>
-              <w:ind w:firstLine="0"/>
-              <w:jc w:val="center"/>
+              <w:ind w:left="30" w:hanging="11"/>
+              <w:jc w:val="left"/>
             </w:pPr>
             <w:r>
-              <w:t>F3</w:t>
+              <w:t>Modularización insuficiente del pipeline</w:t>
             </w:r>
           </w:p>
         </w:tc>
         <w:tc>
           <w:tcPr>
-            <w:tcW w:w="4437" w:type="dxa"/>
-            <w:tcBorders>
-              <w:top w:val="single" w:sz="4" w:space="0" w:color="B7C9DA"/>
-              <w:left w:val="single" w:sz="4" w:space="0" w:color="B7C9DA"/>
-              <w:bottom w:val="single" w:sz="4" w:space="0" w:color="B7C9DA"/>
-              <w:right w:val="single" w:sz="4" w:space="0" w:color="B7C9DA"/>
-            </w:tcBorders>
+            <w:tcW w:w="2380" w:type="dxa"/>
             <w:vAlign w:val="center"/>
+            <w:hideMark/>
           </w:tcPr>
           <w:p>
             <w:pPr>
-              <w:widowControl/>
-              <w:spacing w:after="0" w:line="240" w:lineRule="auto"/>
-              <w:ind w:firstLine="0"/>
+              <w:ind w:left="43" w:hanging="11"/>
               <w:jc w:val="left"/>
+              <w:cnfStyle w:val="000000100000" w:firstRow="0" w:lastRow="0" w:firstColumn="0" w:lastColumn="0" w:oddVBand="0" w:evenVBand="0" w:oddHBand="1" w:evenHBand="0" w:firstRowFirstColumn="0" w:firstRowLastColumn="0" w:lastRowFirstColumn="0" w:lastRowLastColumn="0"/>
             </w:pPr>
             <w:r>
-              <w:t>Núcleo algorítmico, eficiencia, recursividad y arquitectura POO.</w:t>
+              <w:t>Se trasladó lógica reutilizable desde los notebooks hacia módulos especializados y se amplió la arquitectura de src/</w:t>
             </w:r>
           </w:p>
         </w:tc>
         <w:tc>
           <w:tcPr>
-            <w:tcW w:w="4111" w:type="dxa"/>
-            <w:tcBorders>
-              <w:top w:val="single" w:sz="4" w:space="0" w:color="B7C9DA"/>
-              <w:left w:val="single" w:sz="4" w:space="0" w:color="B7C9DA"/>
-              <w:bottom w:val="single" w:sz="4" w:space="0" w:color="B7C9DA"/>
-              <w:right w:val="single" w:sz="4" w:space="0" w:color="B7C9DA"/>
-            </w:tcBorders>
+            <w:tcW w:w="1953" w:type="dxa"/>
             <w:vAlign w:val="center"/>
+            <w:hideMark/>
           </w:tcPr>
           <w:p>
             <w:pPr>
-              <w:widowControl/>
-              <w:spacing w:after="0" w:line="240" w:lineRule="auto"/>
-              <w:ind w:hanging="6"/>
+              <w:ind w:left="78" w:hanging="11"/>
+              <w:jc w:val="center"/>
+              <w:cnfStyle w:val="000000100000" w:firstRow="0" w:lastRow="0" w:firstColumn="0" w:lastColumn="0" w:oddVBand="0" w:evenVBand="0" w:oddHBand="1" w:evenHBand="0" w:firstRowFirstColumn="0" w:firstRowLastColumn="0" w:lastRowFirstColumn="0" w:lastRowLastColumn="0"/>
+            </w:pPr>
+            <w:r>
+              <w:t>550cfc6, 2a7372f</w:t>
+            </w:r>
+          </w:p>
+        </w:tc>
+        <w:tc>
+          <w:tcPr>
+            <w:tcW w:w="3332" w:type="dxa"/>
+            <w:vAlign w:val="center"/>
+            <w:hideMark/>
+          </w:tcPr>
+          <w:p>
+            <w:pPr>
+              <w:ind w:left="118" w:hanging="11"/>
+              <w:jc w:val="left"/>
+              <w:cnfStyle w:val="000000100000" w:firstRow="0" w:lastRow="0" w:firstColumn="0" w:lastColumn="0" w:oddVBand="0" w:evenVBand="0" w:oddHBand="1" w:evenHBand="0" w:firstRowFirstColumn="0" w:firstRowLastColumn="0" w:lastRowFirstColumn="0" w:lastRowLastColumn="0"/>
+            </w:pPr>
+            <w:r>
+              <w:t>Menor duplicación, mejor separación de responsabilidades y mayor mantenibilidad</w:t>
+            </w:r>
+          </w:p>
+        </w:tc>
+      </w:tr>
+      <w:tr>
+        <w:tc>
+          <w:tcPr>
+            <w:cnfStyle w:val="001000000000" w:firstRow="0" w:lastRow="0" w:firstColumn="1" w:lastColumn="0" w:oddVBand="0" w:evenVBand="0" w:oddHBand="0" w:evenHBand="0" w:firstRowFirstColumn="0" w:firstRowLastColumn="0" w:lastRowFirstColumn="0" w:lastRowLastColumn="0"/>
+            <w:tcW w:w="1969" w:type="dxa"/>
+            <w:vAlign w:val="center"/>
+            <w:hideMark/>
+          </w:tcPr>
+          <w:p>
+            <w:pPr>
+              <w:ind w:left="30" w:firstLine="0"/>
               <w:jc w:val="left"/>
             </w:pPr>
             <w:r>
-              <w:t>F3/F3_nucleo_algoritmico.ipynb; src/nucleo_poo.py</w:t>
+              <w:t>Validación concentrada y con valores rígidos</w:t>
+            </w:r>
+          </w:p>
+        </w:tc>
+        <w:tc>
+          <w:tcPr>
+            <w:tcW w:w="2380" w:type="dxa"/>
+            <w:vAlign w:val="center"/>
+            <w:hideMark/>
+          </w:tcPr>
+          <w:p>
+            <w:pPr>
+              <w:ind w:left="43" w:firstLine="0"/>
+              <w:jc w:val="left"/>
+              <w:cnfStyle w:val="000000000000" w:firstRow="0" w:lastRow="0" w:firstColumn="0" w:lastColumn="0" w:oddVBand="0" w:evenVBand="0" w:oddHBand="0" w:evenHBand="0" w:firstRowFirstColumn="0" w:firstRowLastColumn="0" w:lastRowFirstColumn="0" w:lastRowLastColumn="0"/>
+            </w:pPr>
+            <w:r>
+              <w:t>Se refactorizó validacion.py en reglas atómicas y parametrizadas</w:t>
+            </w:r>
+          </w:p>
+        </w:tc>
+        <w:tc>
+          <w:tcPr>
+            <w:tcW w:w="1953" w:type="dxa"/>
+            <w:vAlign w:val="center"/>
+            <w:hideMark/>
+          </w:tcPr>
+          <w:p>
+            <w:pPr>
+              <w:ind w:left="78" w:firstLine="0"/>
+              <w:jc w:val="center"/>
+              <w:cnfStyle w:val="000000000000" w:firstRow="0" w:lastRow="0" w:firstColumn="0" w:lastColumn="0" w:oddVBand="0" w:evenVBand="0" w:oddHBand="0" w:evenHBand="0" w:firstRowFirstColumn="0" w:firstRowLastColumn="0" w:lastRowFirstColumn="0" w:lastRowLastColumn="0"/>
+            </w:pPr>
+            <w:r>
+              <w:t>a4e655d</w:t>
+            </w:r>
+          </w:p>
+        </w:tc>
+        <w:tc>
+          <w:tcPr>
+            <w:tcW w:w="3332" w:type="dxa"/>
+            <w:vAlign w:val="center"/>
+            <w:hideMark/>
+          </w:tcPr>
+          <w:p>
+            <w:pPr>
+              <w:ind w:left="118" w:firstLine="0"/>
+              <w:jc w:val="left"/>
+              <w:cnfStyle w:val="000000000000" w:firstRow="0" w:lastRow="0" w:firstColumn="0" w:lastColumn="0" w:oddVBand="0" w:evenVBand="0" w:oddHBand="0" w:evenHBand="0" w:firstRowFirstColumn="0" w:firstRowLastColumn="0" w:lastRowFirstColumn="0" w:lastRowLastColumn="0"/>
+            </w:pPr>
+            <w:r>
+              <w:t>Cada regla puede probarse de forma independiente y reutilizarse con distintos períodos o conjuntos de datos</w:t>
             </w:r>
           </w:p>
         </w:tc>
       </w:tr>
       <w:tr>
         <w:trPr>
-          <w:jc w:val="center"/>
+          <w:cnfStyle w:val="000000100000" w:firstRow="0" w:lastRow="0" w:firstColumn="0" w:lastColumn="0" w:oddVBand="0" w:evenVBand="0" w:oddHBand="1" w:evenHBand="0" w:firstRowFirstColumn="0" w:firstRowLastColumn="0" w:lastRowFirstColumn="0" w:lastRowLastColumn="0"/>
         </w:trPr>
         <w:tc>
           <w:tcPr>
-            <w:tcW w:w="945" w:type="dxa"/>
-            <w:tcBorders>
-              <w:top w:val="single" w:sz="4" w:space="0" w:color="B7C9DA"/>
-              <w:left w:val="single" w:sz="4" w:space="0" w:color="B7C9DA"/>
-              <w:bottom w:val="single" w:sz="4" w:space="0" w:color="B7C9DA"/>
-              <w:right w:val="single" w:sz="4" w:space="0" w:color="B7C9DA"/>
-            </w:tcBorders>
+            <w:cnfStyle w:val="001000000000" w:firstRow="0" w:lastRow="0" w:firstColumn="1" w:lastColumn="0" w:oddVBand="0" w:evenVBand="0" w:oddHBand="0" w:evenHBand="0" w:firstRowFirstColumn="0" w:firstRowLastColumn="0" w:lastRowFirstColumn="0" w:lastRowLastColumn="0"/>
+            <w:tcW w:w="1969" w:type="dxa"/>
             <w:vAlign w:val="center"/>
+            <w:hideMark/>
           </w:tcPr>
           <w:p>
             <w:pPr>
-              <w:widowControl/>
-              <w:spacing w:after="0" w:line="240" w:lineRule="auto"/>
-              <w:ind w:firstLine="0"/>
-              <w:jc w:val="center"/>
+              <w:ind w:left="30" w:firstLine="0"/>
+              <w:jc w:val="left"/>
             </w:pPr>
             <w:r>
-              <w:t>F4</w:t>
+              <w:t>Identidades Git inconsistentes</w:t>
             </w:r>
           </w:p>
         </w:tc>
         <w:tc>
           <w:tcPr>
-            <w:tcW w:w="4437" w:type="dxa"/>
-            <w:tcBorders>
-              <w:top w:val="single" w:sz="4" w:space="0" w:color="B7C9DA"/>
-              <w:left w:val="single" w:sz="4" w:space="0" w:color="B7C9DA"/>
-              <w:bottom w:val="single" w:sz="4" w:space="0" w:color="B7C9DA"/>
-              <w:right w:val="single" w:sz="4" w:space="0" w:color="B7C9DA"/>
-            </w:tcBorders>
+            <w:tcW w:w="2380" w:type="dxa"/>
             <w:vAlign w:val="center"/>
+            <w:hideMark/>
           </w:tcPr>
           <w:p>
             <w:pPr>
-              <w:widowControl/>
-              <w:spacing w:after="0" w:line="240" w:lineRule="auto"/>
-              <w:ind w:firstLine="0"/>
+              <w:ind w:left="43" w:firstLine="0"/>
               <w:jc w:val="left"/>
+              <w:cnfStyle w:val="000000100000" w:firstRow="0" w:lastRow="0" w:firstColumn="0" w:lastColumn="0" w:oddVBand="0" w:evenVBand="0" w:oddHBand="1" w:evenHBand="0" w:firstRowFirstColumn="0" w:firstRowLastColumn="0" w:lastRowFirstColumn="0" w:lastRowLastColumn="0"/>
             </w:pPr>
             <w:r>
-              <w:t>Integración de resultados, visualizaciones, discusión, conclusiones y trazabilidad.</w:t>
+              <w:t>Se incorporó y corrigió .mailmap para consolidar las identidades del equipo</w:t>
             </w:r>
           </w:p>
         </w:tc>
         <w:tc>
           <w:tcPr>
-            <w:tcW w:w="4111" w:type="dxa"/>
-            <w:tcBorders>
-              <w:top w:val="single" w:sz="4" w:space="0" w:color="B7C9DA"/>
-              <w:left w:val="single" w:sz="4" w:space="0" w:color="B7C9DA"/>
-              <w:bottom w:val="single" w:sz="4" w:space="0" w:color="B7C9DA"/>
-              <w:right w:val="single" w:sz="4" w:space="0" w:color="B7C9DA"/>
-            </w:tcBorders>
+            <w:tcW w:w="1953" w:type="dxa"/>
             <w:vAlign w:val="center"/>
+            <w:hideMark/>
           </w:tcPr>
           <w:p>
             <w:pPr>
-              <w:widowControl/>
-              <w:spacing w:after="0" w:line="240" w:lineRule="auto"/>
-              <w:ind w:hanging="6"/>
+              <w:ind w:left="78" w:firstLine="0"/>
+              <w:jc w:val="center"/>
+              <w:cnfStyle w:val="000000100000" w:firstRow="0" w:lastRow="0" w:firstColumn="0" w:lastColumn="0" w:oddVBand="0" w:evenVBand="0" w:oddHBand="1" w:evenHBand="0" w:firstRowFirstColumn="0" w:firstRowLastColumn="0" w:lastRowFirstColumn="0" w:lastRowLastColumn="0"/>
+            </w:pPr>
+            <w:r>
+              <w:t>5e60e7f, ce134a7</w:t>
+            </w:r>
+          </w:p>
+        </w:tc>
+        <w:tc>
+          <w:tcPr>
+            <w:tcW w:w="3332" w:type="dxa"/>
+            <w:vAlign w:val="center"/>
+            <w:hideMark/>
+          </w:tcPr>
+          <w:p>
+            <w:pPr>
+              <w:ind w:left="118" w:firstLine="0"/>
+              <w:jc w:val="left"/>
+              <w:cnfStyle w:val="000000100000" w:firstRow="0" w:lastRow="0" w:firstColumn="0" w:lastColumn="0" w:oddVBand="0" w:evenVBand="0" w:oddHBand="1" w:evenHBand="0" w:firstRowFirstColumn="0" w:firstRowLastColumn="0" w:lastRowFirstColumn="0" w:lastRowLastColumn="0"/>
+            </w:pPr>
+            <w:r>
+              <w:t>Mejora la atribución y trazabilidad de las contribuciones</w:t>
+            </w:r>
+          </w:p>
+        </w:tc>
+      </w:tr>
+      <w:tr>
+        <w:tc>
+          <w:tcPr>
+            <w:cnfStyle w:val="001000000000" w:firstRow="0" w:lastRow="0" w:firstColumn="1" w:lastColumn="0" w:oddVBand="0" w:evenVBand="0" w:oddHBand="0" w:evenHBand="0" w:firstRowFirstColumn="0" w:firstRowLastColumn="0" w:lastRowFirstColumn="0" w:lastRowLastColumn="0"/>
+            <w:tcW w:w="1969" w:type="dxa"/>
+            <w:vAlign w:val="center"/>
+            <w:hideMark/>
+          </w:tcPr>
+          <w:p>
+            <w:pPr>
+              <w:ind w:left="30" w:firstLine="0"/>
               <w:jc w:val="left"/>
             </w:pPr>
             <w:r>
-              <w:t>F4/F4_Consolidado_Proyecto.ipynb; changelog.md</w:t>
+              <w:t>Notebooks sin evidencia completa de ejecución desde kernel limpio</w:t>
+            </w:r>
+          </w:p>
+        </w:tc>
+        <w:tc>
+          <w:tcPr>
+            <w:tcW w:w="2380" w:type="dxa"/>
+            <w:vAlign w:val="center"/>
+            <w:hideMark/>
+          </w:tcPr>
+          <w:p>
+            <w:pPr>
+              <w:ind w:left="43" w:firstLine="0"/>
+              <w:jc w:val="left"/>
+              <w:cnfStyle w:val="000000000000" w:firstRow="0" w:lastRow="0" w:firstColumn="0" w:lastColumn="0" w:oddVBand="0" w:evenVBand="0" w:oddHBand="0" w:evenHBand="0" w:firstRowFirstColumn="0" w:firstRowLastColumn="0" w:lastRowFirstColumn="0" w:lastRowLastColumn="0"/>
+            </w:pPr>
+            <w:r>
+              <w:t>Se corrigió y verificó la ejecución reproducible de F1 y F2; posteriormente F3 también fue validado desde kernel reiniciado</w:t>
+            </w:r>
+          </w:p>
+        </w:tc>
+        <w:tc>
+          <w:tcPr>
+            <w:tcW w:w="1953" w:type="dxa"/>
+            <w:vAlign w:val="center"/>
+            <w:hideMark/>
+          </w:tcPr>
+          <w:p>
+            <w:pPr>
+              <w:ind w:left="78" w:firstLine="0"/>
+              <w:jc w:val="center"/>
+              <w:cnfStyle w:val="000000000000" w:firstRow="0" w:lastRow="0" w:firstColumn="0" w:lastColumn="0" w:oddVBand="0" w:evenVBand="0" w:oddHBand="0" w:evenHBand="0" w:firstRowFirstColumn="0" w:firstRowLastColumn="0" w:lastRowFirstColumn="0" w:lastRowLastColumn="0"/>
+            </w:pPr>
+            <w:r>
+              <w:t>fd08c0f</w:t>
+            </w:r>
+          </w:p>
+        </w:tc>
+        <w:tc>
+          <w:tcPr>
+            <w:tcW w:w="3332" w:type="dxa"/>
+            <w:vAlign w:val="center"/>
+            <w:hideMark/>
+          </w:tcPr>
+          <w:p>
+            <w:pPr>
+              <w:ind w:left="118" w:firstLine="0"/>
+              <w:jc w:val="left"/>
+              <w:cnfStyle w:val="000000000000" w:firstRow="0" w:lastRow="0" w:firstColumn="0" w:lastColumn="0" w:oddVBand="0" w:evenVBand="0" w:oddHBand="0" w:evenHBand="0" w:firstRowFirstColumn="0" w:firstRowLastColumn="0" w:lastRowFirstColumn="0" w:lastRowLastColumn="0"/>
+            </w:pPr>
+            <w:r>
+              <w:t>Mayor consistencia entre lo declarado en el informe y los artefactos versionados</w:t>
+            </w:r>
+          </w:p>
+        </w:tc>
+      </w:tr>
+      <w:tr>
+        <w:trPr>
+          <w:cnfStyle w:val="000000100000" w:firstRow="0" w:lastRow="0" w:firstColumn="0" w:lastColumn="0" w:oddVBand="0" w:evenVBand="0" w:oddHBand="1" w:evenHBand="0" w:firstRowFirstColumn="0" w:firstRowLastColumn="0" w:lastRowFirstColumn="0" w:lastRowLastColumn="0"/>
+        </w:trPr>
+        <w:tc>
+          <w:tcPr>
+            <w:cnfStyle w:val="001000000000" w:firstRow="0" w:lastRow="0" w:firstColumn="1" w:lastColumn="0" w:oddVBand="0" w:evenVBand="0" w:oddHBand="0" w:evenHBand="0" w:firstRowFirstColumn="0" w:firstRowLastColumn="0" w:lastRowFirstColumn="0" w:lastRowLastColumn="0"/>
+            <w:tcW w:w="1969" w:type="dxa"/>
+            <w:vAlign w:val="center"/>
+            <w:hideMark/>
+          </w:tcPr>
+          <w:p>
+            <w:pPr>
+              <w:ind w:left="30" w:firstLine="0"/>
+              <w:jc w:val="left"/>
+            </w:pPr>
+            <w:r>
+              <w:t>Falta de análisis de eficiencia</w:t>
+            </w:r>
+          </w:p>
+        </w:tc>
+        <w:tc>
+          <w:tcPr>
+            <w:tcW w:w="2380" w:type="dxa"/>
+            <w:vAlign w:val="center"/>
+            <w:hideMark/>
+          </w:tcPr>
+          <w:p>
+            <w:pPr>
+              <w:ind w:left="43" w:firstLine="0"/>
+              <w:jc w:val="left"/>
+              <w:cnfStyle w:val="000000100000" w:firstRow="0" w:lastRow="0" w:firstColumn="0" w:lastColumn="0" w:oddVBand="0" w:evenVBand="0" w:oddHBand="1" w:evenHBand="0" w:firstRowFirstColumn="0" w:firstRowLastColumn="0" w:lastRowFirstColumn="0" w:lastRowLastColumn="0"/>
+            </w:pPr>
+            <w:r>
+              <w:t>Se incorporaron benchmarks y comparación entre implementaciones</w:t>
+            </w:r>
+          </w:p>
+        </w:tc>
+        <w:tc>
+          <w:tcPr>
+            <w:tcW w:w="1953" w:type="dxa"/>
+            <w:vAlign w:val="center"/>
+            <w:hideMark/>
+          </w:tcPr>
+          <w:p>
+            <w:pPr>
+              <w:ind w:left="78" w:firstLine="0"/>
+              <w:jc w:val="center"/>
+              <w:cnfStyle w:val="000000100000" w:firstRow="0" w:lastRow="0" w:firstColumn="0" w:lastColumn="0" w:oddVBand="0" w:evenVBand="0" w:oddHBand="1" w:evenHBand="0" w:firstRowFirstColumn="0" w:firstRowLastColumn="0" w:lastRowFirstColumn="0" w:lastRowLastColumn="0"/>
+            </w:pPr>
+            <w:r>
+              <w:t>1d67d9b</w:t>
+            </w:r>
+          </w:p>
+        </w:tc>
+        <w:tc>
+          <w:tcPr>
+            <w:tcW w:w="3332" w:type="dxa"/>
+            <w:vAlign w:val="center"/>
+            <w:hideMark/>
+          </w:tcPr>
+          <w:p>
+            <w:pPr>
+              <w:ind w:left="118" w:firstLine="0"/>
+              <w:jc w:val="left"/>
+              <w:cnfStyle w:val="000000100000" w:firstRow="0" w:lastRow="0" w:firstColumn="0" w:lastColumn="0" w:oddVBand="0" w:evenVBand="0" w:oddHBand="1" w:evenHBand="0" w:firstRowFirstColumn="0" w:firstRowLastColumn="0" w:lastRowFirstColumn="0" w:lastRowLastColumn="0"/>
+            </w:pPr>
+            <w:r>
+              <w:t>Las decisiones algorítmicas quedan sustentadas con evidencia empírica</w:t>
+            </w:r>
+          </w:p>
+        </w:tc>
+      </w:tr>
+      <w:tr>
+        <w:tc>
+          <w:tcPr>
+            <w:cnfStyle w:val="001000000000" w:firstRow="0" w:lastRow="0" w:firstColumn="1" w:lastColumn="0" w:oddVBand="0" w:evenVBand="0" w:oddHBand="0" w:evenHBand="0" w:firstRowFirstColumn="0" w:firstRowLastColumn="0" w:lastRowFirstColumn="0" w:lastRowLastColumn="0"/>
+            <w:tcW w:w="1969" w:type="dxa"/>
+            <w:vAlign w:val="center"/>
+            <w:hideMark/>
+          </w:tcPr>
+          <w:p>
+            <w:pPr>
+              <w:ind w:left="30" w:firstLine="0"/>
+              <w:jc w:val="left"/>
+            </w:pPr>
+            <w:r>
+              <w:t xml:space="preserve">Necesidad de integrar la lógica previa </w:t>
+            </w:r>
+            <w:r>
+              <w:lastRenderedPageBreak/>
+              <w:t>bajo POO</w:t>
+            </w:r>
+          </w:p>
+        </w:tc>
+        <w:tc>
+          <w:tcPr>
+            <w:tcW w:w="2380" w:type="dxa"/>
+            <w:vAlign w:val="center"/>
+            <w:hideMark/>
+          </w:tcPr>
+          <w:p>
+            <w:pPr>
+              <w:ind w:left="43" w:firstLine="0"/>
+              <w:jc w:val="left"/>
+              <w:cnfStyle w:val="000000000000" w:firstRow="0" w:lastRow="0" w:firstColumn="0" w:lastColumn="0" w:oddVBand="0" w:evenVBand="0" w:oddHBand="0" w:evenHBand="0" w:firstRowFirstColumn="0" w:firstRowLastColumn="0" w:lastRowFirstColumn="0" w:lastRowLastColumn="0"/>
+            </w:pPr>
+            <w:r>
+              <w:lastRenderedPageBreak/>
+              <w:t xml:space="preserve">Se refactorizó el pipeline e incorporó filtrado temporal dentro de la </w:t>
+            </w:r>
+            <w:r>
+              <w:lastRenderedPageBreak/>
+              <w:t>arquitectura orientada a objetos</w:t>
+            </w:r>
+          </w:p>
+        </w:tc>
+        <w:tc>
+          <w:tcPr>
+            <w:tcW w:w="1953" w:type="dxa"/>
+            <w:vAlign w:val="center"/>
+            <w:hideMark/>
+          </w:tcPr>
+          <w:p>
+            <w:pPr>
+              <w:ind w:left="78" w:firstLine="0"/>
+              <w:jc w:val="center"/>
+              <w:cnfStyle w:val="000000000000" w:firstRow="0" w:lastRow="0" w:firstColumn="0" w:lastColumn="0" w:oddVBand="0" w:evenVBand="0" w:oddHBand="0" w:evenHBand="0" w:firstRowFirstColumn="0" w:firstRowLastColumn="0" w:lastRowFirstColumn="0" w:lastRowLastColumn="0"/>
+            </w:pPr>
+            <w:r>
+              <w:lastRenderedPageBreak/>
+              <w:t>2a7372f</w:t>
+            </w:r>
+          </w:p>
+        </w:tc>
+        <w:tc>
+          <w:tcPr>
+            <w:tcW w:w="3332" w:type="dxa"/>
+            <w:vAlign w:val="center"/>
+            <w:hideMark/>
+          </w:tcPr>
+          <w:p>
+            <w:pPr>
+              <w:ind w:left="118" w:firstLine="0"/>
+              <w:jc w:val="left"/>
+              <w:cnfStyle w:val="000000000000" w:firstRow="0" w:lastRow="0" w:firstColumn="0" w:lastColumn="0" w:oddVBand="0" w:evenVBand="0" w:oddHBand="0" w:evenHBand="0" w:firstRowFirstColumn="0" w:firstRowLastColumn="0" w:lastRowFirstColumn="0" w:lastRowLastColumn="0"/>
+            </w:pPr>
+            <w:r>
+              <w:t>Mayor cohesión, extensibilidad y reutilización del flujo</w:t>
+            </w:r>
+          </w:p>
+        </w:tc>
+      </w:tr>
+      <w:tr>
+        <w:trPr>
+          <w:cnfStyle w:val="000000100000" w:firstRow="0" w:lastRow="0" w:firstColumn="0" w:lastColumn="0" w:oddVBand="0" w:evenVBand="0" w:oddHBand="1" w:evenHBand="0" w:firstRowFirstColumn="0" w:firstRowLastColumn="0" w:lastRowFirstColumn="0" w:lastRowLastColumn="0"/>
+        </w:trPr>
+        <w:tc>
+          <w:tcPr>
+            <w:cnfStyle w:val="001000000000" w:firstRow="0" w:lastRow="0" w:firstColumn="1" w:lastColumn="0" w:oddVBand="0" w:evenVBand="0" w:oddHBand="0" w:evenHBand="0" w:firstRowFirstColumn="0" w:firstRowLastColumn="0" w:lastRowFirstColumn="0" w:lastRowLastColumn="0"/>
+            <w:tcW w:w="1969" w:type="dxa"/>
+            <w:vAlign w:val="center"/>
+            <w:hideMark/>
+          </w:tcPr>
+          <w:p>
+            <w:pPr>
+              <w:ind w:left="30" w:firstLine="0"/>
+              <w:jc w:val="left"/>
+            </w:pPr>
+            <w:r>
+              <w:t>Falta de trazabilidad consolidada entre fases</w:t>
+            </w:r>
+          </w:p>
+        </w:tc>
+        <w:tc>
+          <w:tcPr>
+            <w:tcW w:w="2380" w:type="dxa"/>
+            <w:vAlign w:val="center"/>
+            <w:hideMark/>
+          </w:tcPr>
+          <w:p>
+            <w:pPr>
+              <w:ind w:left="43" w:firstLine="0"/>
+              <w:jc w:val="left"/>
+              <w:cnfStyle w:val="000000100000" w:firstRow="0" w:lastRow="0" w:firstColumn="0" w:lastColumn="0" w:oddVBand="0" w:evenVBand="0" w:oddHBand="1" w:evenHBand="0" w:firstRowFirstColumn="0" w:firstRowLastColumn="0" w:lastRowFirstColumn="0" w:lastRowLastColumn="0"/>
+            </w:pPr>
+            <w:r>
+              <w:t>Se creó changelog.md con fecha, descripción, commit, justificación e impacto</w:t>
+            </w:r>
+          </w:p>
+        </w:tc>
+        <w:tc>
+          <w:tcPr>
+            <w:tcW w:w="1953" w:type="dxa"/>
+            <w:vAlign w:val="center"/>
+            <w:hideMark/>
+          </w:tcPr>
+          <w:p>
+            <w:pPr>
+              <w:ind w:left="78" w:firstLine="0"/>
+              <w:jc w:val="center"/>
+              <w:cnfStyle w:val="000000100000" w:firstRow="0" w:lastRow="0" w:firstColumn="0" w:lastColumn="0" w:oddVBand="0" w:evenVBand="0" w:oddHBand="1" w:evenHBand="0" w:firstRowFirstColumn="0" w:firstRowLastColumn="0" w:lastRowFirstColumn="0" w:lastRowLastColumn="0"/>
+            </w:pPr>
+            <w:r>
+              <w:t>8f9f73e</w:t>
+            </w:r>
+          </w:p>
+        </w:tc>
+        <w:tc>
+          <w:tcPr>
+            <w:tcW w:w="3332" w:type="dxa"/>
+            <w:vAlign w:val="center"/>
+            <w:hideMark/>
+          </w:tcPr>
+          <w:p>
+            <w:pPr>
+              <w:ind w:left="118" w:firstLine="0"/>
+              <w:jc w:val="left"/>
+              <w:cnfStyle w:val="000000100000" w:firstRow="0" w:lastRow="0" w:firstColumn="0" w:lastColumn="0" w:oddVBand="0" w:evenVBand="0" w:oddHBand="1" w:evenHBand="0" w:firstRowFirstColumn="0" w:firstRowLastColumn="0" w:lastRowFirstColumn="0" w:lastRowLastColumn="0"/>
+            </w:pPr>
+            <w:r>
+              <w:t>Permite reconstruir la evolución técnica del proyecto entre F1 y F4</w:t>
+            </w:r>
+          </w:p>
+        </w:tc>
+      </w:tr>
+      <w:tr>
+        <w:tc>
+          <w:tcPr>
+            <w:cnfStyle w:val="001000000000" w:firstRow="0" w:lastRow="0" w:firstColumn="1" w:lastColumn="0" w:oddVBand="0" w:evenVBand="0" w:oddHBand="0" w:evenHBand="0" w:firstRowFirstColumn="0" w:firstRowLastColumn="0" w:lastRowFirstColumn="0" w:lastRowLastColumn="0"/>
+            <w:tcW w:w="1969" w:type="dxa"/>
+            <w:vAlign w:val="center"/>
+            <w:hideMark/>
+          </w:tcPr>
+          <w:p>
+            <w:pPr>
+              <w:ind w:left="30" w:firstLine="0"/>
+              <w:jc w:val="left"/>
+            </w:pPr>
+            <w:r>
+              <w:t>Visualizaciones finales sin fuente e interpretación explícita</w:t>
+            </w:r>
+          </w:p>
+        </w:tc>
+        <w:tc>
+          <w:tcPr>
+            <w:tcW w:w="2380" w:type="dxa"/>
+            <w:vAlign w:val="center"/>
+            <w:hideMark/>
+          </w:tcPr>
+          <w:p>
+            <w:pPr>
+              <w:ind w:left="43" w:firstLine="0"/>
+              <w:jc w:val="left"/>
+              <w:cnfStyle w:val="000000000000" w:firstRow="0" w:lastRow="0" w:firstColumn="0" w:lastColumn="0" w:oddVBand="0" w:evenVBand="0" w:oddHBand="0" w:evenHBand="0" w:firstRowFirstColumn="0" w:firstRowLastColumn="0" w:lastRowFirstColumn="0" w:lastRowLastColumn="0"/>
+            </w:pPr>
+            <w:r>
+              <w:t>Se documentaron individualmente las tres figuras finales con fuente e interpretación analítica</w:t>
+            </w:r>
+          </w:p>
+        </w:tc>
+        <w:tc>
+          <w:tcPr>
+            <w:tcW w:w="1953" w:type="dxa"/>
+            <w:vAlign w:val="center"/>
+            <w:hideMark/>
+          </w:tcPr>
+          <w:p>
+            <w:pPr>
+              <w:ind w:left="78" w:firstLine="0"/>
+              <w:jc w:val="center"/>
+              <w:cnfStyle w:val="000000000000" w:firstRow="0" w:lastRow="0" w:firstColumn="0" w:lastColumn="0" w:oddVBand="0" w:evenVBand="0" w:oddHBand="0" w:evenHBand="0" w:firstRowFirstColumn="0" w:firstRowLastColumn="0" w:lastRowFirstColumn="0" w:lastRowLastColumn="0"/>
+            </w:pPr>
+            <w:r>
+              <w:t>9158bda, c7aaee2, 9cdf8c7</w:t>
+            </w:r>
+          </w:p>
+        </w:tc>
+        <w:tc>
+          <w:tcPr>
+            <w:tcW w:w="3332" w:type="dxa"/>
+            <w:vAlign w:val="center"/>
+            <w:hideMark/>
+          </w:tcPr>
+          <w:p>
+            <w:pPr>
+              <w:ind w:left="118" w:firstLine="0"/>
+              <w:jc w:val="left"/>
+              <w:cnfStyle w:val="000000000000" w:firstRow="0" w:lastRow="0" w:firstColumn="0" w:lastColumn="0" w:oddVBand="0" w:evenVBand="0" w:oddHBand="0" w:evenHBand="0" w:firstRowFirstColumn="0" w:firstRowLastColumn="0" w:lastRowFirstColumn="0" w:lastRowLastColumn="0"/>
+            </w:pPr>
+            <w:r>
+              <w:t>Mejora la comunicación de resultados y la relación entre cada figura y los objetivos del proyecto</w:t>
             </w:r>
           </w:p>
         </w:tc>
@@ -4552,68 +5409,40 @@
     </w:tbl>
     <w:p>
       <w:pPr>
-        <w:pStyle w:val="F4Heading1"/>
-        <w:rPr>
-          <w:lang w:val="es-CL"/>
-        </w:rPr>
-      </w:pPr>
-      <w:r>
-        <w:rPr>
-          <w:rFonts w:eastAsia="Arial"/>
-          <w:lang w:val="es-CL"/>
-        </w:rPr>
-        <w:lastRenderedPageBreak/>
-        <w:t>IV. Aplicación de herramientas científicas</w:t>
-      </w:r>
-    </w:p>
-    <w:p>
-      <w:pPr>
-        <w:pStyle w:val="Ttulo2"/>
         <w:ind w:left="720"/>
       </w:pPr>
-      <w:bookmarkStart w:id="6" w:name="_Toc241854666"/>
-      <w:r>
-        <w:t>a. Reproducibilidad técnica</w:t>
-      </w:r>
-      <w:bookmarkEnd w:id="6"/>
-    </w:p>
-    <w:p>
-      <w:pPr>
-        <w:pStyle w:val="Ttulo2"/>
+    </w:p>
+    <w:p>
+      <w:pPr>
         <w:ind w:left="720"/>
       </w:pPr>
-      <w:bookmarkStart w:id="7" w:name="_Toc241854667"/>
-      <w:r>
-        <w:t>b. Control de versiones</w:t>
-      </w:r>
-      <w:bookmarkEnd w:id="7"/>
-    </w:p>
-    <w:p>
-      <w:pPr>
-        <w:pStyle w:val="Ttulo2"/>
+      <w:r>
+        <w:t>Los commits asociados a estas mejoras son verificables en el historial del repositorio. Por ejemplo, la refactorización de validaciones se registró en a4e655d, la mejora del pipeline POO y del filtrado temporal en 2a7372f, y la consolidación de la trazabilidad F1–F4 en 8f9f73e.</w:t>
+      </w:r>
+    </w:p>
+    <w:p>
+      <w:pPr>
         <w:ind w:left="720"/>
       </w:pPr>
-      <w:bookmarkStart w:id="8" w:name="_Toc241854668"/>
-      <w:r>
-        <w:t>c. Documentación del proceso</w:t>
-      </w:r>
-      <w:bookmarkEnd w:id="8"/>
-    </w:p>
-    <w:p>
-      <w:pPr>
-        <w:pStyle w:val="Ttulo2"/>
-        <w:ind w:left="720"/>
-      </w:pPr>
-      <w:bookmarkStart w:id="9" w:name="_Toc241854669"/>
-      <w:r>
-        <w:t>d. Repositorio GitHub actualizado</w:t>
-      </w:r>
-      <w:bookmarkEnd w:id="9"/>
+      <w:r>
+        <w:t>En conjunto, estas acciones permitieron que el proyecto evolucionara desde una primera arquitectura funcional pero todavía incompleta hacia una solución más modular, reproducible y trazable. La mejora afectó directamente la estructura del código, la capacidad de prueba de las funciones, la confiabilidad de la ejecución y la calidad de la documentación técnica. La retroalimentación de la Fase 3 confirma este avance y señala que los principales problemas identificados previamente fueron corregidos antes de la entrega final.</w:t>
+      </w:r>
+    </w:p>
+    <w:p/>
+    <w:p>
+      <w:pPr>
+        <w:pStyle w:val="Ttulo1"/>
+      </w:pPr>
+      <w:bookmarkStart w:id="29" w:name="_Toc241854689"/>
+      <w:r>
+        <w:t>IX. Presentación Audiovisual</w:t>
+      </w:r>
+      <w:bookmarkEnd w:id="29"/>
     </w:p>
     <w:p>
       <w:pPr>
         <w:pStyle w:val="F4DraftNote"/>
-        <w:ind w:left="720"/>
+        <w:ind w:firstLine="720"/>
         <w:rPr>
           <w:lang w:val="es-CL"/>
         </w:rPr>
@@ -4630,309 +5459,8 @@
       <w:pPr>
         <w:pStyle w:val="Ttulo1"/>
       </w:pPr>
-      <w:bookmarkStart w:id="10" w:name="_Toc241854670"/>
-      <w:r>
-        <w:t>V. Diseño de soluciones algorítmicas eficientes</w:t>
-      </w:r>
-      <w:bookmarkEnd w:id="10"/>
-    </w:p>
-    <w:p>
-      <w:pPr>
-        <w:pStyle w:val="Ttulo2"/>
-        <w:ind w:left="720"/>
-      </w:pPr>
-      <w:bookmarkStart w:id="11" w:name="_Toc241854671"/>
-      <w:r>
-        <w:t>a. Codificación funcional</w:t>
-      </w:r>
-      <w:bookmarkEnd w:id="11"/>
-    </w:p>
-    <w:p>
-      <w:pPr>
-        <w:pStyle w:val="Ttulo2"/>
-        <w:ind w:left="720"/>
-      </w:pPr>
-      <w:bookmarkStart w:id="12" w:name="_Toc241854672"/>
-      <w:r>
-        <w:t xml:space="preserve">b. Preprocesamiento y transformación del </w:t>
-      </w:r>
-      <w:proofErr w:type="spellStart"/>
-      <w:r>
-        <w:t>dataset</w:t>
-      </w:r>
-      <w:bookmarkEnd w:id="12"/>
-      <w:proofErr w:type="spellEnd"/>
-    </w:p>
-    <w:p>
-      <w:pPr>
-        <w:pStyle w:val="Ttulo2"/>
-        <w:ind w:left="720"/>
-      </w:pPr>
-      <w:bookmarkStart w:id="13" w:name="_Toc241854673"/>
-      <w:r>
-        <w:t>c. Validación técnica y verificación del código</w:t>
-      </w:r>
-      <w:bookmarkEnd w:id="13"/>
-    </w:p>
-    <w:p>
-      <w:pPr>
-        <w:pStyle w:val="Ttulo2"/>
-        <w:ind w:left="720"/>
-      </w:pPr>
-      <w:bookmarkStart w:id="14" w:name="_Toc241854674"/>
-      <w:r>
-        <w:t>d. Eficiencia y optimización</w:t>
-      </w:r>
-      <w:bookmarkEnd w:id="14"/>
-    </w:p>
-    <w:p>
-      <w:pPr>
-        <w:pStyle w:val="Ttulo2"/>
-        <w:ind w:left="720"/>
-      </w:pPr>
-      <w:bookmarkStart w:id="15" w:name="_Toc241854675"/>
-      <w:r>
-        <w:t>e. Diseño estructurado del código</w:t>
-      </w:r>
-      <w:bookmarkEnd w:id="15"/>
-    </w:p>
-    <w:p>
-      <w:pPr>
-        <w:pStyle w:val="Ttulo2"/>
-        <w:ind w:left="720"/>
-      </w:pPr>
-      <w:bookmarkStart w:id="16" w:name="_Toc241854676"/>
-      <w:r>
-        <w:t>f. Notebook final ejecutado y documentado</w:t>
-      </w:r>
-      <w:bookmarkEnd w:id="16"/>
-    </w:p>
-    <w:p>
-      <w:pPr>
-        <w:pStyle w:val="F4DraftNote"/>
-        <w:ind w:left="720"/>
-        <w:rPr>
-          <w:lang w:val="es-CL"/>
-        </w:rPr>
-      </w:pPr>
-      <w:r>
-        <w:rPr>
-          <w:rFonts w:eastAsia="Arial"/>
-          <w:lang w:val="es-CL"/>
-        </w:rPr>
-        <w:t>Sección preparada para integración en la siguiente versión del informe final.</w:t>
-      </w:r>
-    </w:p>
-    <w:p>
-      <w:pPr>
-        <w:pStyle w:val="Ttulo1"/>
-      </w:pPr>
-      <w:bookmarkStart w:id="17" w:name="_Toc241854677"/>
-      <w:r>
-        <w:t>VI. Implementación de código modular y robusto</w:t>
-      </w:r>
-      <w:bookmarkEnd w:id="17"/>
-    </w:p>
-    <w:p>
-      <w:pPr>
-        <w:pStyle w:val="Ttulo2"/>
-        <w:ind w:left="720"/>
-      </w:pPr>
-      <w:bookmarkStart w:id="18" w:name="_Toc241854678"/>
-      <w:r>
-        <w:t>a. Programación orientada a objetos</w:t>
-      </w:r>
-      <w:bookmarkEnd w:id="18"/>
-    </w:p>
-    <w:p>
-      <w:pPr>
-        <w:pStyle w:val="Ttulo2"/>
-        <w:ind w:left="720"/>
-      </w:pPr>
-      <w:bookmarkStart w:id="19" w:name="_Toc241854679"/>
-      <w:r>
-        <w:t>b. Documentación de arquitectura</w:t>
-      </w:r>
-      <w:bookmarkEnd w:id="19"/>
-    </w:p>
-    <w:p>
-      <w:pPr>
-        <w:pStyle w:val="F4DraftNote"/>
-        <w:ind w:left="720"/>
-        <w:rPr>
-          <w:lang w:val="es-CL"/>
-        </w:rPr>
-      </w:pPr>
-      <w:r>
-        <w:rPr>
-          <w:rFonts w:eastAsia="Arial"/>
-          <w:lang w:val="es-CL"/>
-        </w:rPr>
-        <w:t>Sección preparada para integración en la siguiente versión del informe final.</w:t>
-      </w:r>
-    </w:p>
-    <w:p>
-      <w:pPr>
-        <w:pStyle w:val="Ttulo1"/>
-      </w:pPr>
-      <w:bookmarkStart w:id="20" w:name="_Toc241854680"/>
-      <w:r>
-        <w:t>VII. Construcción de visualizaciones de datos efectivas</w:t>
-      </w:r>
-      <w:bookmarkEnd w:id="20"/>
-    </w:p>
-    <w:p>
-      <w:pPr>
-        <w:pStyle w:val="Ttulo2"/>
-        <w:ind w:left="720"/>
-      </w:pPr>
-      <w:bookmarkStart w:id="21" w:name="_Toc241854681"/>
-      <w:r>
-        <w:t>a. Preprocesamiento y transformación de datos</w:t>
-      </w:r>
-      <w:bookmarkEnd w:id="21"/>
-    </w:p>
-    <w:p>
-      <w:pPr>
-        <w:pStyle w:val="Ttulo2"/>
-        <w:ind w:left="720"/>
-      </w:pPr>
-      <w:bookmarkStart w:id="22" w:name="_Toc241854682"/>
-      <w:r>
-        <w:t>b. Visualizaciones analíticas</w:t>
-      </w:r>
-      <w:bookmarkEnd w:id="22"/>
-    </w:p>
-    <w:p>
-      <w:pPr>
-        <w:pStyle w:val="F4DraftNote"/>
-        <w:ind w:left="720"/>
-        <w:rPr>
-          <w:lang w:val="es-CL"/>
-        </w:rPr>
-      </w:pPr>
-      <w:r>
-        <w:rPr>
-          <w:rFonts w:eastAsia="Arial"/>
-          <w:lang w:val="es-CL"/>
-        </w:rPr>
-        <w:t>Sección preparada para integración en la siguiente versión del informe final.</w:t>
-      </w:r>
-    </w:p>
-    <w:p>
-      <w:pPr>
-        <w:pStyle w:val="Ttulo1"/>
-      </w:pPr>
-      <w:bookmarkStart w:id="23" w:name="_Toc241854683"/>
-      <w:r>
-        <w:t>VIII. Metodología del desarrollo técnico</w:t>
-      </w:r>
-      <w:bookmarkEnd w:id="23"/>
-    </w:p>
-    <w:p>
-      <w:pPr>
-        <w:pStyle w:val="Ttulo2"/>
-        <w:ind w:left="720"/>
-      </w:pPr>
-      <w:bookmarkStart w:id="24" w:name="_Toc241854684"/>
-      <w:r>
-        <w:t>a. Validación y reflexión técnica</w:t>
-      </w:r>
-      <w:bookmarkEnd w:id="24"/>
-    </w:p>
-    <w:p>
-      <w:pPr>
-        <w:pStyle w:val="Ttulo2"/>
-        <w:ind w:left="720"/>
-      </w:pPr>
-      <w:bookmarkStart w:id="25" w:name="_Toc241854685"/>
-      <w:r>
-        <w:t>b. Resultados</w:t>
-      </w:r>
-      <w:bookmarkEnd w:id="25"/>
-    </w:p>
-    <w:p>
-      <w:pPr>
-        <w:pStyle w:val="Ttulo2"/>
-        <w:ind w:left="720"/>
-      </w:pPr>
-      <w:bookmarkStart w:id="26" w:name="_Toc241854686"/>
-      <w:r>
-        <w:t>c. Discusión</w:t>
-      </w:r>
-      <w:bookmarkEnd w:id="26"/>
-    </w:p>
-    <w:p>
-      <w:pPr>
-        <w:pStyle w:val="Ttulo2"/>
-        <w:ind w:left="720"/>
-      </w:pPr>
-      <w:bookmarkStart w:id="27" w:name="_Toc241854687"/>
-      <w:r>
-        <w:t>d. Conclusiones</w:t>
-      </w:r>
-      <w:bookmarkEnd w:id="27"/>
-    </w:p>
-    <w:p>
-      <w:pPr>
-        <w:pStyle w:val="Ttulo2"/>
-        <w:ind w:left="720"/>
-      </w:pPr>
-      <w:bookmarkStart w:id="28" w:name="_Toc241854688"/>
-      <w:r>
-        <w:t>e. Trazabilidad de mejoras</w:t>
-      </w:r>
-      <w:bookmarkEnd w:id="28"/>
-    </w:p>
-    <w:p>
-      <w:pPr>
-        <w:pStyle w:val="F4DraftNote"/>
-        <w:ind w:left="720"/>
-        <w:rPr>
-          <w:lang w:val="es-CL"/>
-        </w:rPr>
-      </w:pPr>
-      <w:r>
-        <w:rPr>
-          <w:rFonts w:eastAsia="Arial"/>
-          <w:lang w:val="es-CL"/>
-        </w:rPr>
-        <w:t>Sección preparada para integración en la siguiente versión del informe final.</w:t>
-      </w:r>
-    </w:p>
-    <w:p>
-      <w:pPr>
-        <w:pStyle w:val="Ttulo1"/>
-      </w:pPr>
-      <w:bookmarkStart w:id="29" w:name="_Toc241854689"/>
-      <w:r>
-        <w:t>IX. Presentación Audiovisual</w:t>
-      </w:r>
-      <w:bookmarkEnd w:id="29"/>
-    </w:p>
-    <w:p>
-      <w:pPr>
-        <w:pStyle w:val="F4DraftNote"/>
-        <w:ind w:firstLine="720"/>
-        <w:rPr>
-          <w:lang w:val="es-CL"/>
-        </w:rPr>
-      </w:pPr>
-      <w:r>
-        <w:rPr>
-          <w:rFonts w:eastAsia="Arial"/>
-          <w:lang w:val="es-CL"/>
-        </w:rPr>
-        <w:t>Sección preparada para integración en la siguiente versión del informe final.</w:t>
-      </w:r>
-    </w:p>
-    <w:p>
-      <w:pPr>
-        <w:pStyle w:val="Ttulo1"/>
-      </w:pPr>
       <w:bookmarkStart w:id="30" w:name="_Toc241854690"/>
       <w:r>
-        <w:lastRenderedPageBreak/>
         <w:t>X. Bibliografía</w:t>
       </w:r>
       <w:bookmarkEnd w:id="30"/>
@@ -5025,6 +5553,9 @@
       </w:rPr>
     </w:pPr>
     <w:r>
+      <w:rPr>
+        <w:noProof/>
+      </w:rPr>
       <w:drawing>
         <wp:anchor distT="0" distB="0" distL="0" distR="0" simplePos="0" relativeHeight="487502336" behindDoc="1" locked="0" layoutInCell="1" allowOverlap="1" wp14:anchorId="48AD0833" wp14:editId="3120761A">
           <wp:simplePos x="0" y="0"/>
@@ -5070,6 +5601,9 @@
       </w:drawing>
     </w:r>
     <w:r>
+      <w:rPr>
+        <w:noProof/>
+      </w:rPr>
       <mc:AlternateContent>
         <mc:Choice Requires="wps">
           <w:drawing>
@@ -5135,7 +5669,7 @@
             </wp:anchor>
           </w:drawing>
         </mc:Choice>
-        <mc:Fallback xmlns:pic="http://schemas.openxmlformats.org/drawingml/2006/picture" xmlns:a="http://schemas.openxmlformats.org/drawingml/2006/main">
+        <mc:Fallback xmlns:a="http://schemas.openxmlformats.org/drawingml/2006/main" xmlns:pic="http://schemas.openxmlformats.org/drawingml/2006/picture">
           <w:pict>
             <v:shape id="Graphic 17" style="position:absolute;margin-left:42.5pt;margin-top:739.9pt;width:218.15pt;height:.1pt;z-index:-15813632;visibility:visible;mso-wrap-style:square;mso-wrap-distance-left:0;mso-wrap-distance-top:0;mso-wrap-distance-right:0;mso-wrap-distance-bottom:0;mso-position-horizontal:absolute;mso-position-horizontal-relative:page;mso-position-vertical:absolute;mso-position-vertical-relative:page;v-text-anchor:top" coordsize="2770505,1270" o:spid="_x0000_s1026" filled="f" strokecolor="#1d4b63" path="m,l2770204,e" o:gfxdata="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" w14:anchorId="0747A2B0">
               <v:path arrowok="t"/>
@@ -5146,6 +5680,9 @@
       </mc:AlternateContent>
     </w:r>
     <w:r>
+      <w:rPr>
+        <w:noProof/>
+      </w:rPr>
       <mc:AlternateContent>
         <mc:Choice Requires="wps">
           <w:drawing>
@@ -5211,7 +5748,7 @@
             </wp:anchor>
           </w:drawing>
         </mc:Choice>
-        <mc:Fallback xmlns:pic="http://schemas.openxmlformats.org/drawingml/2006/picture" xmlns:a="http://schemas.openxmlformats.org/drawingml/2006/main">
+        <mc:Fallback xmlns:a="http://schemas.openxmlformats.org/drawingml/2006/main" xmlns:pic="http://schemas.openxmlformats.org/drawingml/2006/picture">
           <w:pict>
             <v:shape id="Graphic 18" style="position:absolute;margin-left:371.35pt;margin-top:739.9pt;width:198.15pt;height:.1pt;z-index:-15813120;visibility:visible;mso-wrap-style:square;mso-wrap-distance-left:0;mso-wrap-distance-top:0;mso-wrap-distance-right:0;mso-wrap-distance-bottom:0;mso-position-horizontal:absolute;mso-position-horizontal-relative:page;mso-position-vertical:absolute;mso-position-vertical-relative:page;v-text-anchor:top" coordsize="2516505,1270" o:spid="_x0000_s1026" filled="f" strokecolor="#1d4b63" path="m,l2516399,e" o:gfxdata="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" w14:anchorId="3C0EE5FF">
               <v:path arrowok="t"/>
@@ -5254,6 +5791,9 @@
       </w:rPr>
     </w:pPr>
     <w:r>
+      <w:rPr>
+        <w:noProof/>
+      </w:rPr>
       <mc:AlternateContent>
         <mc:Choice Requires="wpg">
           <w:drawing>
@@ -5352,7 +5892,7 @@
             </wp:anchor>
           </w:drawing>
         </mc:Choice>
-        <mc:Fallback xmlns:pic="http://schemas.openxmlformats.org/drawingml/2006/picture" xmlns:a="http://schemas.openxmlformats.org/drawingml/2006/main">
+        <mc:Fallback xmlns:a="http://schemas.openxmlformats.org/drawingml/2006/main" xmlns:pic="http://schemas.openxmlformats.org/drawingml/2006/picture">
           <w:pict>
             <v:group id="Group 12" style="position:absolute;margin-left:42.5pt;margin-top:37.85pt;width:527pt;height:9.1pt;z-index:-15815168;mso-wrap-distance-left:0;mso-wrap-distance-right:0;mso-position-horizontal-relative:page;mso-position-vertical-relative:page" coordsize="66929,1155" o:spid="_x0000_s1026" w14:anchorId="58BDBA3A" o:gfxdata="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">
               <v:shape id="Graphic 13" style="position:absolute;left:539;top:551;width:66390;height:13;visibility:visible;mso-wrap-style:square;v-text-anchor:top" coordsize="6638925,1270" o:spid="_x0000_s1027" filled="f" strokecolor="#1d4b63" path="m,l6638404,e" o:gfxdata="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">
@@ -5387,6 +5927,9 @@
       </mc:AlternateContent>
     </w:r>
     <w:r>
+      <w:rPr>
+        <w:noProof/>
+      </w:rPr>
       <mc:AlternateContent>
         <mc:Choice Requires="wps">
           <w:drawing>
@@ -7771,6 +8314,95 @@
       <w:spacing w:after="100"/>
     </w:pPr>
   </w:style>
+  <w:style w:type="table" w:styleId="Tablaconcuadrcula">
+    <w:name w:val="Table Grid"/>
+    <w:basedOn w:val="Tablanormal"/>
+    <w:uiPriority w:val="39"/>
+    <w:rsid w:val="0015658B"/>
+    <w:tblPr>
+      <w:tblBorders>
+        <w:top w:val="single" w:sz="4" w:space="0" w:color="auto"/>
+        <w:left w:val="single" w:sz="4" w:space="0" w:color="auto"/>
+        <w:bottom w:val="single" w:sz="4" w:space="0" w:color="auto"/>
+        <w:right w:val="single" w:sz="4" w:space="0" w:color="auto"/>
+        <w:insideH w:val="single" w:sz="4" w:space="0" w:color="auto"/>
+        <w:insideV w:val="single" w:sz="4" w:space="0" w:color="auto"/>
+      </w:tblBorders>
+    </w:tblPr>
+  </w:style>
+  <w:style w:type="table" w:styleId="Tablaconcuadrcula4-nfasis1">
+    <w:name w:val="Grid Table 4 Accent 1"/>
+    <w:basedOn w:val="Tablanormal"/>
+    <w:uiPriority w:val="49"/>
+    <w:rsid w:val="0015658B"/>
+    <w:tblPr>
+      <w:tblStyleRowBandSize w:val="1"/>
+      <w:tblStyleColBandSize w:val="1"/>
+      <w:tblBorders>
+        <w:top w:val="single" w:sz="4" w:space="0" w:color="95B3D7" w:themeColor="accent1" w:themeTint="99"/>
+        <w:left w:val="single" w:sz="4" w:space="0" w:color="95B3D7" w:themeColor="accent1" w:themeTint="99"/>
+        <w:bottom w:val="single" w:sz="4" w:space="0" w:color="95B3D7" w:themeColor="accent1" w:themeTint="99"/>
+        <w:right w:val="single" w:sz="4" w:space="0" w:color="95B3D7" w:themeColor="accent1" w:themeTint="99"/>
+        <w:insideH w:val="single" w:sz="4" w:space="0" w:color="95B3D7" w:themeColor="accent1" w:themeTint="99"/>
+        <w:insideV w:val="single" w:sz="4" w:space="0" w:color="95B3D7" w:themeColor="accent1" w:themeTint="99"/>
+      </w:tblBorders>
+    </w:tblPr>
+    <w:tblStylePr w:type="firstRow">
+      <w:rPr>
+        <w:b/>
+        <w:bCs/>
+        <w:color w:val="FFFFFF" w:themeColor="background1"/>
+      </w:rPr>
+      <w:tblPr/>
+      <w:tcPr>
+        <w:tcBorders>
+          <w:top w:val="single" w:sz="4" w:space="0" w:color="4F81BD" w:themeColor="accent1"/>
+          <w:left w:val="single" w:sz="4" w:space="0" w:color="4F81BD" w:themeColor="accent1"/>
+          <w:bottom w:val="single" w:sz="4" w:space="0" w:color="4F81BD" w:themeColor="accent1"/>
+          <w:right w:val="single" w:sz="4" w:space="0" w:color="4F81BD" w:themeColor="accent1"/>
+          <w:insideH w:val="nil"/>
+          <w:insideV w:val="nil"/>
+        </w:tcBorders>
+        <w:shd w:val="clear" w:color="auto" w:fill="4F81BD" w:themeFill="accent1"/>
+      </w:tcPr>
+    </w:tblStylePr>
+    <w:tblStylePr w:type="lastRow">
+      <w:rPr>
+        <w:b/>
+        <w:bCs/>
+      </w:rPr>
+      <w:tblPr/>
+      <w:tcPr>
+        <w:tcBorders>
+          <w:top w:val="double" w:sz="4" w:space="0" w:color="4F81BD" w:themeColor="accent1"/>
+        </w:tcBorders>
+      </w:tcPr>
+    </w:tblStylePr>
+    <w:tblStylePr w:type="firstCol">
+      <w:rPr>
+        <w:b/>
+        <w:bCs/>
+      </w:rPr>
+    </w:tblStylePr>
+    <w:tblStylePr w:type="lastCol">
+      <w:rPr>
+        <w:b/>
+        <w:bCs/>
+      </w:rPr>
+    </w:tblStylePr>
+    <w:tblStylePr w:type="band1Vert">
+      <w:tblPr/>
+      <w:tcPr>
+        <w:shd w:val="clear" w:color="auto" w:fill="DBE5F1" w:themeFill="accent1" w:themeFillTint="33"/>
+      </w:tcPr>
+    </w:tblStylePr>
+    <w:tblStylePr w:type="band1Horz">
+      <w:tblPr/>
+      <w:tcPr>
+        <w:shd w:val="clear" w:color="auto" w:fill="DBE5F1" w:themeFill="accent1" w:themeFillTint="33"/>
+      </w:tcPr>
+    </w:tblStylePr>
+  </w:style>
 </w:styles>
 </file>
 
@@ -8058,6 +8690,10 @@
 </file>
 
 <file path=customXml/item1.xml><?xml version="1.0" encoding="utf-8"?>
+<b:Sources xmlns:b="http://schemas.openxmlformats.org/officeDocument/2006/bibliography" xmlns="http://schemas.openxmlformats.org/officeDocument/2006/bibliography" SelectedStyle="\APASixthEditionOfficeOnline.xsl" StyleName="APA" Version="6"/>
+</file>
+
+<file path=customXml/item2.xml><?xml version="1.0" encoding="utf-8"?>
 <p:properties xmlns:p="http://schemas.microsoft.com/office/2006/metadata/properties" xmlns:xsi="http://www.w3.org/2001/XMLSchema-instance" xmlns:pc="http://schemas.microsoft.com/office/infopath/2007/PartnerControls">
   <documentManagement>
     <_ApprovalAssignedTo xmlns="0a2fff00-f002-44e7-b50c-b90cb65110b9">
@@ -8079,20 +8715,7 @@
 </p:properties>
 </file>
 
-<file path=customXml/item2.xml><?xml version="1.0" encoding="utf-8"?>
-<b:Sources xmlns:b="http://schemas.openxmlformats.org/officeDocument/2006/bibliography" xmlns="http://schemas.openxmlformats.org/officeDocument/2006/bibliography" SelectedStyle="\APASixthEditionOfficeOnline.xsl" StyleName="APA" Version="6"/>
-</file>
-
 <file path=customXml/item3.xml><?xml version="1.0" encoding="utf-8"?>
-<?mso-contentType ?>
-<FormTemplates xmlns="http://schemas.microsoft.com/sharepoint/v3/contenttype/forms">
-  <Display>DocumentLibraryForm</Display>
-  <Edit>DocumentLibraryForm</Edit>
-  <New>DocumentLibraryForm</New>
-</FormTemplates>
-</file>
-
-<file path=customXml/item4.xml><?xml version="1.0" encoding="utf-8"?>
 <ct:contentTypeSchema xmlns:ct="http://schemas.microsoft.com/office/2006/metadata/contentType" xmlns:ma="http://schemas.microsoft.com/office/2006/metadata/properties/metaAttributes" ct:_="" ma:_="" ma:contentTypeName="Documento" ma:contentTypeID="0x010100E4D0EA28D091FE4192BEFA8519B37564" ma:contentTypeVersion="11" ma:contentTypeDescription="Crear nuevo documento." ma:contentTypeScope="" ma:versionID="03233efde1029e2378ce26f68e4e04a7">
   <xsd:schema xmlns:xsd="http://www.w3.org/2001/XMLSchema" xmlns:xs="http://www.w3.org/2001/XMLSchema" xmlns:p="http://schemas.microsoft.com/office/2006/metadata/properties" xmlns:ns2="0a2fff00-f002-44e7-b50c-b90cb65110b9" targetNamespace="http://schemas.microsoft.com/office/2006/metadata/properties" ma:root="true" ma:fieldsID="0c61ffaedf55a65463b0f7398d7e3f83" ns2:_="">
     <xsd:import namespace="0a2fff00-f002-44e7-b50c-b90cb65110b9"/>
@@ -8320,7 +8943,24 @@
 </ct:contentTypeSchema>
 </file>
 
+<file path=customXml/item4.xml><?xml version="1.0" encoding="utf-8"?>
+<?mso-contentType ?>
+<FormTemplates xmlns="http://schemas.microsoft.com/sharepoint/v3/contenttype/forms">
+  <Display>DocumentLibraryForm</Display>
+  <Edit>DocumentLibraryForm</Edit>
+  <New>DocumentLibraryForm</New>
+</FormTemplates>
+</file>
+
 <file path=customXml/itemProps1.xml><?xml version="1.0" encoding="utf-8"?>
+<ds:datastoreItem xmlns:ds="http://schemas.openxmlformats.org/officeDocument/2006/customXml" ds:itemID="{FACB83BB-458E-4CCB-91D7-35CFBA93934D}">
+  <ds:schemaRefs>
+    <ds:schemaRef ds:uri="http://schemas.openxmlformats.org/officeDocument/2006/bibliography"/>
+  </ds:schemaRefs>
+</ds:datastoreItem>
+</file>
+
+<file path=customXml/itemProps2.xml><?xml version="1.0" encoding="utf-8"?>
 <ds:datastoreItem xmlns:ds="http://schemas.openxmlformats.org/officeDocument/2006/customXml" ds:itemID="{662F60C8-4BC5-4139-BE63-6954D22D77BD}">
   <ds:schemaRefs>
     <ds:schemaRef ds:uri="http://schemas.microsoft.com/office/2006/metadata/properties"/>
@@ -8330,23 +8970,7 @@
 </ds:datastoreItem>
 </file>
 
-<file path=customXml/itemProps2.xml><?xml version="1.0" encoding="utf-8"?>
-<ds:datastoreItem xmlns:ds="http://schemas.openxmlformats.org/officeDocument/2006/customXml" ds:itemID="{FACB83BB-458E-4CCB-91D7-35CFBA93934D}">
-  <ds:schemaRefs>
-    <ds:schemaRef ds:uri="http://schemas.openxmlformats.org/officeDocument/2006/bibliography"/>
-  </ds:schemaRefs>
-</ds:datastoreItem>
-</file>
-
 <file path=customXml/itemProps3.xml><?xml version="1.0" encoding="utf-8"?>
-<ds:datastoreItem xmlns:ds="http://schemas.openxmlformats.org/officeDocument/2006/customXml" ds:itemID="{084C26D9-49C9-4ADB-A387-DA6079798921}">
-  <ds:schemaRefs>
-    <ds:schemaRef ds:uri="http://schemas.microsoft.com/sharepoint/v3/contenttype/forms"/>
-  </ds:schemaRefs>
-</ds:datastoreItem>
-</file>
-
-<file path=customXml/itemProps4.xml><?xml version="1.0" encoding="utf-8"?>
 <ds:datastoreItem xmlns:ds="http://schemas.openxmlformats.org/officeDocument/2006/customXml" ds:itemID="{23546E79-64AE-4765-BD79-8F86E2CE885D}">
   <ds:schemaRefs>
     <ds:schemaRef ds:uri="http://schemas.microsoft.com/office/2006/metadata/contentType"/>
@@ -8362,4 +8986,12 @@
     <ds:schemaRef ds:uri="http://schemas.microsoft.com/internal/obd"/>
   </ds:schemaRefs>
 </ds:datastoreItem>
+</file>
+
+<file path=customXml/itemProps4.xml><?xml version="1.0" encoding="utf-8"?>
+<ds:datastoreItem xmlns:ds="http://schemas.openxmlformats.org/officeDocument/2006/customXml" ds:itemID="{084C26D9-49C9-4ADB-A387-DA6079798921}">
+  <ds:schemaRefs>
+    <ds:schemaRef ds:uri="http://schemas.microsoft.com/sharepoint/v3/contenttype/forms"/>
+  </ds:schemaRefs>
+</ds:datastoreItem>
 </file>
</xml_diff>

<commit_message>
docs: ajusta problematica y delimitacion del proyecto en informe F4
</commit_message>
<xml_diff>
--- a/docs/f4_s03_evaluacion_entregable_grupo2.docx
+++ b/docs/f4_s03_evaluacion_entregable_grupo2.docx
@@ -796,7 +796,7 @@
               </wp:inline>
             </w:drawing>
           </mc:Choice>
-          <mc:Fallback xmlns:a="http://schemas.openxmlformats.org/drawingml/2006/main" xmlns:pic="http://schemas.openxmlformats.org/drawingml/2006/picture">
+          <mc:Fallback xmlns:pic="http://schemas.openxmlformats.org/drawingml/2006/picture" xmlns:a="http://schemas.openxmlformats.org/drawingml/2006/main">
             <w:pict>
               <v:group id="Group 2" style="width:85.45pt;height:51.55pt;mso-position-horizontal-relative:char;mso-position-vertical-relative:line" coordsize="10852,6546" o:spid="_x0000_s1026" w14:anchorId="42076BD7" o:gfxdata="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">
                 <v:shape id="Graphic 3" style="position:absolute;left:122;top:167;width:2101;height:3099;visibility:visible;mso-wrap-style:square;v-text-anchor:top" coordsize="210185,309880" o:spid="_x0000_s1027" fillcolor="#c6c4c4" stroked="f" path="m209791,l188086,r,184061l181850,232548r-17516,33480l137327,285432r-34712,6261l71098,285811,45396,267038,28085,233684,21742,184061,21742,,,,,185381r8392,58937l30862,282681r32483,20806l101777,309753r41068,-6762l177287,281095r23690,-39451l209791,182219,209791,xe" o:gfxdata="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">
@@ -1221,6 +1221,7 @@
             </w:tabs>
             <w:rPr>
               <w:rFonts w:asciiTheme="minorHAnsi" w:eastAsiaTheme="minorEastAsia" w:hAnsiTheme="minorHAnsi"/>
+              <w:noProof/>
               <w:kern w:val="2"/>
               <w:sz w:val="24"/>
               <w:szCs w:val="24"/>
@@ -1237,50 +1238,146 @@
           <w:r>
             <w:fldChar w:fldCharType="separate"/>
           </w:r>
-          <w:hyperlink w:anchor="_Toc241854660" w:history="1">
+          <w:hyperlink w:anchor="_Toc241865062" w:history="1">
             <w:r>
               <w:rPr>
                 <w:rStyle w:val="Hipervnculo"/>
+                <w:noProof/>
               </w:rPr>
               <w:t>II. Introducción y contextualización</w:t>
             </w:r>
             <w:r>
               <w:rPr>
+                <w:noProof/>
                 <w:webHidden/>
               </w:rPr>
               <w:tab/>
             </w:r>
             <w:r>
               <w:rPr>
+                <w:noProof/>
                 <w:webHidden/>
               </w:rPr>
               <w:fldChar w:fldCharType="begin"/>
             </w:r>
             <w:r>
               <w:rPr>
-                <w:webHidden/>
-              </w:rPr>
-              <w:instrText xml:space="preserve"> PAGEREF _Toc241854660 \h </w:instrText>
-            </w:r>
-            <w:r>
-              <w:rPr>
-                <w:webHidden/>
-              </w:rPr>
-            </w:r>
-            <w:r>
-              <w:rPr>
+                <w:noProof/>
+                <w:webHidden/>
+              </w:rPr>
+              <w:instrText xml:space="preserve"> PAGEREF _Toc241865062 \h </w:instrText>
+            </w:r>
+            <w:r>
+              <w:rPr>
+                <w:noProof/>
+                <w:webHidden/>
+              </w:rPr>
+            </w:r>
+            <w:r>
+              <w:rPr>
+                <w:noProof/>
                 <w:webHidden/>
               </w:rPr>
               <w:fldChar w:fldCharType="separate"/>
             </w:r>
             <w:r>
               <w:rPr>
-                <w:webHidden/>
-              </w:rPr>
-              <w:t>4</w:t>
-            </w:r>
-            <w:r>
-              <w:rPr>
+                <w:noProof/>
+                <w:webHidden/>
+              </w:rPr>
+              <w:t>5</w:t>
+            </w:r>
+            <w:r>
+              <w:rPr>
+                <w:noProof/>
+                <w:webHidden/>
+              </w:rPr>
+              <w:fldChar w:fldCharType="end"/>
+            </w:r>
+          </w:hyperlink>
+        </w:p>
+        <w:p>
+          <w:pPr>
+            <w:pStyle w:val="TDC1"/>
+            <w:tabs>
+              <w:tab w:val="right" w:leader="dot" w:pos="10370"/>
+            </w:tabs>
+            <w:rPr>
+              <w:rFonts w:asciiTheme="minorHAnsi" w:eastAsiaTheme="minorEastAsia" w:hAnsiTheme="minorHAnsi"/>
+              <w:noProof/>
+              <w:kern w:val="2"/>
+              <w:sz w:val="24"/>
+              <w:szCs w:val="24"/>
+              <w:lang w:eastAsia="es-CL"/>
+              <w14:ligatures w14:val="standardContextual"/>
+            </w:rPr>
+          </w:pPr>
+          <w:hyperlink w:anchor="_Toc241865063" w:history="1">
+            <w:r>
+              <w:rPr>
+                <w:rStyle w:val="Hipervnculo"/>
+                <w:noProof/>
+              </w:rPr>
+              <w:t>III. Definición de la problemátic</w:t>
+            </w:r>
+            <w:r>
+              <w:rPr>
+                <w:rStyle w:val="Hipervnculo"/>
+                <w:noProof/>
+              </w:rPr>
+              <w:t>a</w:t>
+            </w:r>
+            <w:r>
+              <w:rPr>
+                <w:rStyle w:val="Hipervnculo"/>
+                <w:noProof/>
+              </w:rPr>
+              <w:t xml:space="preserve"> y objetivos del proyecto</w:t>
+            </w:r>
+            <w:r>
+              <w:rPr>
+                <w:noProof/>
+                <w:webHidden/>
+              </w:rPr>
+              <w:tab/>
+            </w:r>
+            <w:r>
+              <w:rPr>
+                <w:noProof/>
+                <w:webHidden/>
+              </w:rPr>
+              <w:fldChar w:fldCharType="begin"/>
+            </w:r>
+            <w:r>
+              <w:rPr>
+                <w:noProof/>
+                <w:webHidden/>
+              </w:rPr>
+              <w:instrText xml:space="preserve"> PAGEREF _Toc241865063 \h </w:instrText>
+            </w:r>
+            <w:r>
+              <w:rPr>
+                <w:noProof/>
+                <w:webHidden/>
+              </w:rPr>
+            </w:r>
+            <w:r>
+              <w:rPr>
+                <w:noProof/>
+                <w:webHidden/>
+              </w:rPr>
+              <w:fldChar w:fldCharType="separate"/>
+            </w:r>
+            <w:r>
+              <w:rPr>
+                <w:noProof/>
+                <w:webHidden/>
+              </w:rPr>
+              <w:t>5</w:t>
+            </w:r>
+            <w:r>
+              <w:rPr>
+                <w:noProof/>
                 <w:webHidden/>
               </w:rPr>
               <w:fldChar w:fldCharType="end"/>
@@ -1295,6 +1392,7 @@
             </w:tabs>
             <w:rPr>
               <w:rFonts w:asciiTheme="minorHAnsi" w:eastAsiaTheme="minorEastAsia" w:hAnsiTheme="minorHAnsi"/>
+              <w:noProof/>
               <w:kern w:val="2"/>
               <w:sz w:val="24"/>
               <w:szCs w:val="24"/>
@@ -1302,50 +1400,58 @@
               <w14:ligatures w14:val="standardContextual"/>
             </w:rPr>
           </w:pPr>
-          <w:hyperlink w:anchor="_Toc241854661" w:history="1">
+          <w:hyperlink w:anchor="_Toc241865064" w:history="1">
             <w:r>
               <w:rPr>
                 <w:rStyle w:val="Hipervnculo"/>
+                <w:noProof/>
               </w:rPr>
               <w:t>3.1 Problemática y pregunta de investigación</w:t>
             </w:r>
             <w:r>
               <w:rPr>
+                <w:noProof/>
                 <w:webHidden/>
               </w:rPr>
               <w:tab/>
             </w:r>
             <w:r>
               <w:rPr>
+                <w:noProof/>
                 <w:webHidden/>
               </w:rPr>
               <w:fldChar w:fldCharType="begin"/>
             </w:r>
             <w:r>
               <w:rPr>
-                <w:webHidden/>
-              </w:rPr>
-              <w:instrText xml:space="preserve"> PAGEREF _Toc241854661 \h </w:instrText>
-            </w:r>
-            <w:r>
-              <w:rPr>
-                <w:webHidden/>
-              </w:rPr>
-            </w:r>
-            <w:r>
-              <w:rPr>
+                <w:noProof/>
+                <w:webHidden/>
+              </w:rPr>
+              <w:instrText xml:space="preserve"> PAGEREF _Toc241865064 \h </w:instrText>
+            </w:r>
+            <w:r>
+              <w:rPr>
+                <w:noProof/>
+                <w:webHidden/>
+              </w:rPr>
+            </w:r>
+            <w:r>
+              <w:rPr>
+                <w:noProof/>
                 <w:webHidden/>
               </w:rPr>
               <w:fldChar w:fldCharType="separate"/>
             </w:r>
             <w:r>
               <w:rPr>
-                <w:webHidden/>
-              </w:rPr>
-              <w:t>4</w:t>
-            </w:r>
-            <w:r>
-              <w:rPr>
+                <w:noProof/>
+                <w:webHidden/>
+              </w:rPr>
+              <w:t>5</w:t>
+            </w:r>
+            <w:r>
+              <w:rPr>
+                <w:noProof/>
                 <w:webHidden/>
               </w:rPr>
               <w:fldChar w:fldCharType="end"/>
@@ -1360,6 +1466,7 @@
             </w:tabs>
             <w:rPr>
               <w:rFonts w:asciiTheme="minorHAnsi" w:eastAsiaTheme="minorEastAsia" w:hAnsiTheme="minorHAnsi"/>
+              <w:noProof/>
               <w:kern w:val="2"/>
               <w:sz w:val="24"/>
               <w:szCs w:val="24"/>
@@ -1367,50 +1474,58 @@
               <w14:ligatures w14:val="standardContextual"/>
             </w:rPr>
           </w:pPr>
-          <w:hyperlink w:anchor="_Toc241854662" w:history="1">
+          <w:hyperlink w:anchor="_Toc241865065" w:history="1">
             <w:r>
               <w:rPr>
                 <w:rStyle w:val="Hipervnculo"/>
+                <w:noProof/>
               </w:rPr>
               <w:t>3.2 Objetivo general</w:t>
             </w:r>
             <w:r>
               <w:rPr>
+                <w:noProof/>
                 <w:webHidden/>
               </w:rPr>
               <w:tab/>
             </w:r>
             <w:r>
               <w:rPr>
+                <w:noProof/>
                 <w:webHidden/>
               </w:rPr>
               <w:fldChar w:fldCharType="begin"/>
             </w:r>
             <w:r>
               <w:rPr>
-                <w:webHidden/>
-              </w:rPr>
-              <w:instrText xml:space="preserve"> PAGEREF _Toc241854662 \h </w:instrText>
-            </w:r>
-            <w:r>
-              <w:rPr>
-                <w:webHidden/>
-              </w:rPr>
-            </w:r>
-            <w:r>
-              <w:rPr>
+                <w:noProof/>
+                <w:webHidden/>
+              </w:rPr>
+              <w:instrText xml:space="preserve"> PAGEREF _Toc241865065 \h </w:instrText>
+            </w:r>
+            <w:r>
+              <w:rPr>
+                <w:noProof/>
+                <w:webHidden/>
+              </w:rPr>
+            </w:r>
+            <w:r>
+              <w:rPr>
+                <w:noProof/>
                 <w:webHidden/>
               </w:rPr>
               <w:fldChar w:fldCharType="separate"/>
             </w:r>
             <w:r>
               <w:rPr>
-                <w:webHidden/>
-              </w:rPr>
-              <w:t>5</w:t>
-            </w:r>
-            <w:r>
-              <w:rPr>
+                <w:noProof/>
+                <w:webHidden/>
+              </w:rPr>
+              <w:t>6</w:t>
+            </w:r>
+            <w:r>
+              <w:rPr>
+                <w:noProof/>
                 <w:webHidden/>
               </w:rPr>
               <w:fldChar w:fldCharType="end"/>
@@ -1425,6 +1540,7 @@
             </w:tabs>
             <w:rPr>
               <w:rFonts w:asciiTheme="minorHAnsi" w:eastAsiaTheme="minorEastAsia" w:hAnsiTheme="minorHAnsi"/>
+              <w:noProof/>
               <w:kern w:val="2"/>
               <w:sz w:val="24"/>
               <w:szCs w:val="24"/>
@@ -1432,50 +1548,58 @@
               <w14:ligatures w14:val="standardContextual"/>
             </w:rPr>
           </w:pPr>
-          <w:hyperlink w:anchor="_Toc241854663" w:history="1">
+          <w:hyperlink w:anchor="_Toc241865066" w:history="1">
             <w:r>
               <w:rPr>
                 <w:rStyle w:val="Hipervnculo"/>
+                <w:noProof/>
               </w:rPr>
               <w:t>3.3 Objetivos específicos</w:t>
             </w:r>
             <w:r>
               <w:rPr>
+                <w:noProof/>
                 <w:webHidden/>
               </w:rPr>
               <w:tab/>
             </w:r>
             <w:r>
               <w:rPr>
+                <w:noProof/>
                 <w:webHidden/>
               </w:rPr>
               <w:fldChar w:fldCharType="begin"/>
             </w:r>
             <w:r>
               <w:rPr>
-                <w:webHidden/>
-              </w:rPr>
-              <w:instrText xml:space="preserve"> PAGEREF _Toc241854663 \h </w:instrText>
-            </w:r>
-            <w:r>
-              <w:rPr>
-                <w:webHidden/>
-              </w:rPr>
-            </w:r>
-            <w:r>
-              <w:rPr>
+                <w:noProof/>
+                <w:webHidden/>
+              </w:rPr>
+              <w:instrText xml:space="preserve"> PAGEREF _Toc241865066 \h </w:instrText>
+            </w:r>
+            <w:r>
+              <w:rPr>
+                <w:noProof/>
+                <w:webHidden/>
+              </w:rPr>
+            </w:r>
+            <w:r>
+              <w:rPr>
+                <w:noProof/>
                 <w:webHidden/>
               </w:rPr>
               <w:fldChar w:fldCharType="separate"/>
             </w:r>
             <w:r>
               <w:rPr>
-                <w:webHidden/>
-              </w:rPr>
-              <w:t>5</w:t>
-            </w:r>
-            <w:r>
-              <w:rPr>
+                <w:noProof/>
+                <w:webHidden/>
+              </w:rPr>
+              <w:t>6</w:t>
+            </w:r>
+            <w:r>
+              <w:rPr>
+                <w:noProof/>
                 <w:webHidden/>
               </w:rPr>
               <w:fldChar w:fldCharType="end"/>
@@ -1490,6 +1614,7 @@
             </w:tabs>
             <w:rPr>
               <w:rFonts w:asciiTheme="minorHAnsi" w:eastAsiaTheme="minorEastAsia" w:hAnsiTheme="minorHAnsi"/>
+              <w:noProof/>
               <w:kern w:val="2"/>
               <w:sz w:val="24"/>
               <w:szCs w:val="24"/>
@@ -1497,50 +1622,58 @@
               <w14:ligatures w14:val="standardContextual"/>
             </w:rPr>
           </w:pPr>
-          <w:hyperlink w:anchor="_Toc241854664" w:history="1">
+          <w:hyperlink w:anchor="_Toc241865067" w:history="1">
             <w:r>
               <w:rPr>
                 <w:rStyle w:val="Hipervnculo"/>
+                <w:noProof/>
               </w:rPr>
               <w:t>3.4 Alcance, restricciones y supuestos</w:t>
             </w:r>
             <w:r>
               <w:rPr>
+                <w:noProof/>
                 <w:webHidden/>
               </w:rPr>
               <w:tab/>
             </w:r>
             <w:r>
               <w:rPr>
+                <w:noProof/>
                 <w:webHidden/>
               </w:rPr>
               <w:fldChar w:fldCharType="begin"/>
             </w:r>
             <w:r>
               <w:rPr>
-                <w:webHidden/>
-              </w:rPr>
-              <w:instrText xml:space="preserve"> PAGEREF _Toc241854664 \h </w:instrText>
-            </w:r>
-            <w:r>
-              <w:rPr>
-                <w:webHidden/>
-              </w:rPr>
-            </w:r>
-            <w:r>
-              <w:rPr>
+                <w:noProof/>
+                <w:webHidden/>
+              </w:rPr>
+              <w:instrText xml:space="preserve"> PAGEREF _Toc241865067 \h </w:instrText>
+            </w:r>
+            <w:r>
+              <w:rPr>
+                <w:noProof/>
+                <w:webHidden/>
+              </w:rPr>
+            </w:r>
+            <w:r>
+              <w:rPr>
+                <w:noProof/>
                 <w:webHidden/>
               </w:rPr>
               <w:fldChar w:fldCharType="separate"/>
             </w:r>
             <w:r>
               <w:rPr>
-                <w:webHidden/>
-              </w:rPr>
-              <w:t>5</w:t>
-            </w:r>
-            <w:r>
-              <w:rPr>
+                <w:noProof/>
+                <w:webHidden/>
+              </w:rPr>
+              <w:t>6</w:t>
+            </w:r>
+            <w:r>
+              <w:rPr>
+                <w:noProof/>
                 <w:webHidden/>
               </w:rPr>
               <w:fldChar w:fldCharType="end"/>
@@ -1555,6 +1688,7 @@
             </w:tabs>
             <w:rPr>
               <w:rFonts w:asciiTheme="minorHAnsi" w:eastAsiaTheme="minorEastAsia" w:hAnsiTheme="minorHAnsi"/>
+              <w:noProof/>
               <w:kern w:val="2"/>
               <w:sz w:val="24"/>
               <w:szCs w:val="24"/>
@@ -1562,50 +1696,132 @@
               <w14:ligatures w14:val="standardContextual"/>
             </w:rPr>
           </w:pPr>
-          <w:hyperlink w:anchor="_Toc241854665" w:history="1">
+          <w:hyperlink w:anchor="_Toc241865068" w:history="1">
             <w:r>
               <w:rPr>
                 <w:rStyle w:val="Hipervnculo"/>
+                <w:noProof/>
               </w:rPr>
               <w:t>3.5 Articulación con las fases F1–F4</w:t>
             </w:r>
             <w:r>
               <w:rPr>
+                <w:noProof/>
                 <w:webHidden/>
               </w:rPr>
               <w:tab/>
             </w:r>
             <w:r>
               <w:rPr>
+                <w:noProof/>
                 <w:webHidden/>
               </w:rPr>
               <w:fldChar w:fldCharType="begin"/>
             </w:r>
             <w:r>
               <w:rPr>
-                <w:webHidden/>
-              </w:rPr>
-              <w:instrText xml:space="preserve"> PAGEREF _Toc241854665 \h </w:instrText>
-            </w:r>
-            <w:r>
-              <w:rPr>
-                <w:webHidden/>
-              </w:rPr>
-            </w:r>
-            <w:r>
-              <w:rPr>
+                <w:noProof/>
+                <w:webHidden/>
+              </w:rPr>
+              <w:instrText xml:space="preserve"> PAGEREF _Toc241865068 \h </w:instrText>
+            </w:r>
+            <w:r>
+              <w:rPr>
+                <w:noProof/>
+                <w:webHidden/>
+              </w:rPr>
+            </w:r>
+            <w:r>
+              <w:rPr>
+                <w:noProof/>
                 <w:webHidden/>
               </w:rPr>
               <w:fldChar w:fldCharType="separate"/>
             </w:r>
             <w:r>
               <w:rPr>
-                <w:webHidden/>
-              </w:rPr>
-              <w:t>5</w:t>
-            </w:r>
-            <w:r>
-              <w:rPr>
+                <w:noProof/>
+                <w:webHidden/>
+              </w:rPr>
+              <w:t>6</w:t>
+            </w:r>
+            <w:r>
+              <w:rPr>
+                <w:noProof/>
+                <w:webHidden/>
+              </w:rPr>
+              <w:fldChar w:fldCharType="end"/>
+            </w:r>
+          </w:hyperlink>
+        </w:p>
+        <w:p>
+          <w:pPr>
+            <w:pStyle w:val="TDC1"/>
+            <w:tabs>
+              <w:tab w:val="right" w:leader="dot" w:pos="10370"/>
+            </w:tabs>
+            <w:rPr>
+              <w:rFonts w:asciiTheme="minorHAnsi" w:eastAsiaTheme="minorEastAsia" w:hAnsiTheme="minorHAnsi"/>
+              <w:noProof/>
+              <w:kern w:val="2"/>
+              <w:sz w:val="24"/>
+              <w:szCs w:val="24"/>
+              <w:lang w:eastAsia="es-CL"/>
+              <w14:ligatures w14:val="standardContextual"/>
+            </w:rPr>
+          </w:pPr>
+          <w:hyperlink w:anchor="_Toc241865069" w:history="1">
+            <w:r>
+              <w:rPr>
+                <w:rStyle w:val="Hipervnculo"/>
+                <w:noProof/>
+              </w:rPr>
+              <w:t>IV. Aplicación de herramientas científicas</w:t>
+            </w:r>
+            <w:r>
+              <w:rPr>
+                <w:noProof/>
+                <w:webHidden/>
+              </w:rPr>
+              <w:tab/>
+            </w:r>
+            <w:r>
+              <w:rPr>
+                <w:noProof/>
+                <w:webHidden/>
+              </w:rPr>
+              <w:fldChar w:fldCharType="begin"/>
+            </w:r>
+            <w:r>
+              <w:rPr>
+                <w:noProof/>
+                <w:webHidden/>
+              </w:rPr>
+              <w:instrText xml:space="preserve"> PAGEREF _Toc241865069 \h </w:instrText>
+            </w:r>
+            <w:r>
+              <w:rPr>
+                <w:noProof/>
+                <w:webHidden/>
+              </w:rPr>
+            </w:r>
+            <w:r>
+              <w:rPr>
+                <w:noProof/>
+                <w:webHidden/>
+              </w:rPr>
+              <w:fldChar w:fldCharType="separate"/>
+            </w:r>
+            <w:r>
+              <w:rPr>
+                <w:noProof/>
+                <w:webHidden/>
+              </w:rPr>
+              <w:t>7</w:t>
+            </w:r>
+            <w:r>
+              <w:rPr>
+                <w:noProof/>
                 <w:webHidden/>
               </w:rPr>
               <w:fldChar w:fldCharType="end"/>
@@ -1620,6 +1836,7 @@
             </w:tabs>
             <w:rPr>
               <w:rFonts w:asciiTheme="minorHAnsi" w:eastAsiaTheme="minorEastAsia" w:hAnsiTheme="minorHAnsi"/>
+              <w:noProof/>
               <w:kern w:val="2"/>
               <w:sz w:val="24"/>
               <w:szCs w:val="24"/>
@@ -1627,50 +1844,58 @@
               <w14:ligatures w14:val="standardContextual"/>
             </w:rPr>
           </w:pPr>
-          <w:hyperlink w:anchor="_Toc241854666" w:history="1">
+          <w:hyperlink w:anchor="_Toc241865070" w:history="1">
             <w:r>
               <w:rPr>
                 <w:rStyle w:val="Hipervnculo"/>
+                <w:noProof/>
               </w:rPr>
               <w:t>a. Reproducibilidad técnica</w:t>
             </w:r>
             <w:r>
               <w:rPr>
+                <w:noProof/>
                 <w:webHidden/>
               </w:rPr>
               <w:tab/>
             </w:r>
             <w:r>
               <w:rPr>
+                <w:noProof/>
                 <w:webHidden/>
               </w:rPr>
               <w:fldChar w:fldCharType="begin"/>
             </w:r>
             <w:r>
               <w:rPr>
-                <w:webHidden/>
-              </w:rPr>
-              <w:instrText xml:space="preserve"> PAGEREF _Toc241854666 \h </w:instrText>
-            </w:r>
-            <w:r>
-              <w:rPr>
-                <w:webHidden/>
-              </w:rPr>
-            </w:r>
-            <w:r>
-              <w:rPr>
+                <w:noProof/>
+                <w:webHidden/>
+              </w:rPr>
+              <w:instrText xml:space="preserve"> PAGEREF _Toc241865070 \h </w:instrText>
+            </w:r>
+            <w:r>
+              <w:rPr>
+                <w:noProof/>
+                <w:webHidden/>
+              </w:rPr>
+            </w:r>
+            <w:r>
+              <w:rPr>
+                <w:noProof/>
                 <w:webHidden/>
               </w:rPr>
               <w:fldChar w:fldCharType="separate"/>
             </w:r>
             <w:r>
               <w:rPr>
-                <w:webHidden/>
-              </w:rPr>
-              <w:t>6</w:t>
-            </w:r>
-            <w:r>
-              <w:rPr>
+                <w:noProof/>
+                <w:webHidden/>
+              </w:rPr>
+              <w:t>7</w:t>
+            </w:r>
+            <w:r>
+              <w:rPr>
+                <w:noProof/>
                 <w:webHidden/>
               </w:rPr>
               <w:fldChar w:fldCharType="end"/>
@@ -1685,6 +1910,7 @@
             </w:tabs>
             <w:rPr>
               <w:rFonts w:asciiTheme="minorHAnsi" w:eastAsiaTheme="minorEastAsia" w:hAnsiTheme="minorHAnsi"/>
+              <w:noProof/>
               <w:kern w:val="2"/>
               <w:sz w:val="24"/>
               <w:szCs w:val="24"/>
@@ -1692,50 +1918,58 @@
               <w14:ligatures w14:val="standardContextual"/>
             </w:rPr>
           </w:pPr>
-          <w:hyperlink w:anchor="_Toc241854667" w:history="1">
+          <w:hyperlink w:anchor="_Toc241865071" w:history="1">
             <w:r>
               <w:rPr>
                 <w:rStyle w:val="Hipervnculo"/>
+                <w:noProof/>
               </w:rPr>
               <w:t>b. Control de versiones</w:t>
             </w:r>
             <w:r>
               <w:rPr>
+                <w:noProof/>
                 <w:webHidden/>
               </w:rPr>
               <w:tab/>
             </w:r>
             <w:r>
               <w:rPr>
+                <w:noProof/>
                 <w:webHidden/>
               </w:rPr>
               <w:fldChar w:fldCharType="begin"/>
             </w:r>
             <w:r>
               <w:rPr>
-                <w:webHidden/>
-              </w:rPr>
-              <w:instrText xml:space="preserve"> PAGEREF _Toc241854667 \h </w:instrText>
-            </w:r>
-            <w:r>
-              <w:rPr>
-                <w:webHidden/>
-              </w:rPr>
-            </w:r>
-            <w:r>
-              <w:rPr>
+                <w:noProof/>
+                <w:webHidden/>
+              </w:rPr>
+              <w:instrText xml:space="preserve"> PAGEREF _Toc241865071 \h </w:instrText>
+            </w:r>
+            <w:r>
+              <w:rPr>
+                <w:noProof/>
+                <w:webHidden/>
+              </w:rPr>
+            </w:r>
+            <w:r>
+              <w:rPr>
+                <w:noProof/>
                 <w:webHidden/>
               </w:rPr>
               <w:fldChar w:fldCharType="separate"/>
             </w:r>
             <w:r>
               <w:rPr>
-                <w:webHidden/>
-              </w:rPr>
-              <w:t>6</w:t>
-            </w:r>
-            <w:r>
-              <w:rPr>
+                <w:noProof/>
+                <w:webHidden/>
+              </w:rPr>
+              <w:t>7</w:t>
+            </w:r>
+            <w:r>
+              <w:rPr>
+                <w:noProof/>
                 <w:webHidden/>
               </w:rPr>
               <w:fldChar w:fldCharType="end"/>
@@ -1750,6 +1984,7 @@
             </w:tabs>
             <w:rPr>
               <w:rFonts w:asciiTheme="minorHAnsi" w:eastAsiaTheme="minorEastAsia" w:hAnsiTheme="minorHAnsi"/>
+              <w:noProof/>
               <w:kern w:val="2"/>
               <w:sz w:val="24"/>
               <w:szCs w:val="24"/>
@@ -1757,50 +1992,58 @@
               <w14:ligatures w14:val="standardContextual"/>
             </w:rPr>
           </w:pPr>
-          <w:hyperlink w:anchor="_Toc241854668" w:history="1">
+          <w:hyperlink w:anchor="_Toc241865072" w:history="1">
             <w:r>
               <w:rPr>
                 <w:rStyle w:val="Hipervnculo"/>
+                <w:noProof/>
               </w:rPr>
               <w:t>c. Documentación del proceso</w:t>
             </w:r>
             <w:r>
               <w:rPr>
+                <w:noProof/>
                 <w:webHidden/>
               </w:rPr>
               <w:tab/>
             </w:r>
             <w:r>
               <w:rPr>
+                <w:noProof/>
                 <w:webHidden/>
               </w:rPr>
               <w:fldChar w:fldCharType="begin"/>
             </w:r>
             <w:r>
               <w:rPr>
-                <w:webHidden/>
-              </w:rPr>
-              <w:instrText xml:space="preserve"> PAGEREF _Toc241854668 \h </w:instrText>
-            </w:r>
-            <w:r>
-              <w:rPr>
-                <w:webHidden/>
-              </w:rPr>
-            </w:r>
-            <w:r>
-              <w:rPr>
+                <w:noProof/>
+                <w:webHidden/>
+              </w:rPr>
+              <w:instrText xml:space="preserve"> PAGEREF _Toc241865072 \h </w:instrText>
+            </w:r>
+            <w:r>
+              <w:rPr>
+                <w:noProof/>
+                <w:webHidden/>
+              </w:rPr>
+            </w:r>
+            <w:r>
+              <w:rPr>
+                <w:noProof/>
                 <w:webHidden/>
               </w:rPr>
               <w:fldChar w:fldCharType="separate"/>
             </w:r>
             <w:r>
               <w:rPr>
-                <w:webHidden/>
-              </w:rPr>
-              <w:t>6</w:t>
-            </w:r>
-            <w:r>
-              <w:rPr>
+                <w:noProof/>
+                <w:webHidden/>
+              </w:rPr>
+              <w:t>7</w:t>
+            </w:r>
+            <w:r>
+              <w:rPr>
+                <w:noProof/>
                 <w:webHidden/>
               </w:rPr>
               <w:fldChar w:fldCharType="end"/>
@@ -1815,6 +2058,7 @@
             </w:tabs>
             <w:rPr>
               <w:rFonts w:asciiTheme="minorHAnsi" w:eastAsiaTheme="minorEastAsia" w:hAnsiTheme="minorHAnsi"/>
+              <w:noProof/>
               <w:kern w:val="2"/>
               <w:sz w:val="24"/>
               <w:szCs w:val="24"/>
@@ -1822,50 +2066,58 @@
               <w14:ligatures w14:val="standardContextual"/>
             </w:rPr>
           </w:pPr>
-          <w:hyperlink w:anchor="_Toc241854669" w:history="1">
+          <w:hyperlink w:anchor="_Toc241865073" w:history="1">
             <w:r>
               <w:rPr>
                 <w:rStyle w:val="Hipervnculo"/>
+                <w:noProof/>
               </w:rPr>
               <w:t>d. Repositorio GitHub actualizado</w:t>
             </w:r>
             <w:r>
               <w:rPr>
+                <w:noProof/>
                 <w:webHidden/>
               </w:rPr>
               <w:tab/>
             </w:r>
             <w:r>
               <w:rPr>
+                <w:noProof/>
                 <w:webHidden/>
               </w:rPr>
               <w:fldChar w:fldCharType="begin"/>
             </w:r>
             <w:r>
               <w:rPr>
-                <w:webHidden/>
-              </w:rPr>
-              <w:instrText xml:space="preserve"> PAGEREF _Toc241854669 \h </w:instrText>
-            </w:r>
-            <w:r>
-              <w:rPr>
-                <w:webHidden/>
-              </w:rPr>
-            </w:r>
-            <w:r>
-              <w:rPr>
+                <w:noProof/>
+                <w:webHidden/>
+              </w:rPr>
+              <w:instrText xml:space="preserve"> PAGEREF _Toc241865073 \h </w:instrText>
+            </w:r>
+            <w:r>
+              <w:rPr>
+                <w:noProof/>
+                <w:webHidden/>
+              </w:rPr>
+            </w:r>
+            <w:r>
+              <w:rPr>
+                <w:noProof/>
                 <w:webHidden/>
               </w:rPr>
               <w:fldChar w:fldCharType="separate"/>
             </w:r>
             <w:r>
               <w:rPr>
-                <w:webHidden/>
-              </w:rPr>
-              <w:t>6</w:t>
-            </w:r>
-            <w:r>
-              <w:rPr>
+                <w:noProof/>
+                <w:webHidden/>
+              </w:rPr>
+              <w:t>7</w:t>
+            </w:r>
+            <w:r>
+              <w:rPr>
+                <w:noProof/>
                 <w:webHidden/>
               </w:rPr>
               <w:fldChar w:fldCharType="end"/>
@@ -1880,6 +2132,7 @@
             </w:tabs>
             <w:rPr>
               <w:rFonts w:asciiTheme="minorHAnsi" w:eastAsiaTheme="minorEastAsia" w:hAnsiTheme="minorHAnsi"/>
+              <w:noProof/>
               <w:kern w:val="2"/>
               <w:sz w:val="24"/>
               <w:szCs w:val="24"/>
@@ -1887,50 +2140,58 @@
               <w14:ligatures w14:val="standardContextual"/>
             </w:rPr>
           </w:pPr>
-          <w:hyperlink w:anchor="_Toc241854670" w:history="1">
+          <w:hyperlink w:anchor="_Toc241865074" w:history="1">
             <w:r>
               <w:rPr>
                 <w:rStyle w:val="Hipervnculo"/>
+                <w:noProof/>
               </w:rPr>
               <w:t>V. Diseño de soluciones algorítmicas eficientes</w:t>
             </w:r>
             <w:r>
               <w:rPr>
+                <w:noProof/>
                 <w:webHidden/>
               </w:rPr>
               <w:tab/>
             </w:r>
             <w:r>
               <w:rPr>
+                <w:noProof/>
                 <w:webHidden/>
               </w:rPr>
               <w:fldChar w:fldCharType="begin"/>
             </w:r>
             <w:r>
               <w:rPr>
-                <w:webHidden/>
-              </w:rPr>
-              <w:instrText xml:space="preserve"> PAGEREF _Toc241854670 \h </w:instrText>
-            </w:r>
-            <w:r>
-              <w:rPr>
-                <w:webHidden/>
-              </w:rPr>
-            </w:r>
-            <w:r>
-              <w:rPr>
+                <w:noProof/>
+                <w:webHidden/>
+              </w:rPr>
+              <w:instrText xml:space="preserve"> PAGEREF _Toc241865074 \h </w:instrText>
+            </w:r>
+            <w:r>
+              <w:rPr>
+                <w:noProof/>
+                <w:webHidden/>
+              </w:rPr>
+            </w:r>
+            <w:r>
+              <w:rPr>
+                <w:noProof/>
                 <w:webHidden/>
               </w:rPr>
               <w:fldChar w:fldCharType="separate"/>
             </w:r>
             <w:r>
               <w:rPr>
-                <w:webHidden/>
-              </w:rPr>
-              <w:t>6</w:t>
-            </w:r>
-            <w:r>
-              <w:rPr>
+                <w:noProof/>
+                <w:webHidden/>
+              </w:rPr>
+              <w:t>7</w:t>
+            </w:r>
+            <w:r>
+              <w:rPr>
+                <w:noProof/>
                 <w:webHidden/>
               </w:rPr>
               <w:fldChar w:fldCharType="end"/>
@@ -1945,6 +2206,7 @@
             </w:tabs>
             <w:rPr>
               <w:rFonts w:asciiTheme="minorHAnsi" w:eastAsiaTheme="minorEastAsia" w:hAnsiTheme="minorHAnsi"/>
+              <w:noProof/>
               <w:kern w:val="2"/>
               <w:sz w:val="24"/>
               <w:szCs w:val="24"/>
@@ -1952,50 +2214,58 @@
               <w14:ligatures w14:val="standardContextual"/>
             </w:rPr>
           </w:pPr>
-          <w:hyperlink w:anchor="_Toc241854671" w:history="1">
+          <w:hyperlink w:anchor="_Toc241865075" w:history="1">
             <w:r>
               <w:rPr>
                 <w:rStyle w:val="Hipervnculo"/>
+                <w:noProof/>
               </w:rPr>
               <w:t>a. Codificación funcional</w:t>
             </w:r>
             <w:r>
               <w:rPr>
+                <w:noProof/>
                 <w:webHidden/>
               </w:rPr>
               <w:tab/>
             </w:r>
             <w:r>
               <w:rPr>
+                <w:noProof/>
                 <w:webHidden/>
               </w:rPr>
               <w:fldChar w:fldCharType="begin"/>
             </w:r>
             <w:r>
               <w:rPr>
-                <w:webHidden/>
-              </w:rPr>
-              <w:instrText xml:space="preserve"> PAGEREF _Toc241854671 \h </w:instrText>
-            </w:r>
-            <w:r>
-              <w:rPr>
-                <w:webHidden/>
-              </w:rPr>
-            </w:r>
-            <w:r>
-              <w:rPr>
+                <w:noProof/>
+                <w:webHidden/>
+              </w:rPr>
+              <w:instrText xml:space="preserve"> PAGEREF _Toc241865075 \h </w:instrText>
+            </w:r>
+            <w:r>
+              <w:rPr>
+                <w:noProof/>
+                <w:webHidden/>
+              </w:rPr>
+            </w:r>
+            <w:r>
+              <w:rPr>
+                <w:noProof/>
                 <w:webHidden/>
               </w:rPr>
               <w:fldChar w:fldCharType="separate"/>
             </w:r>
             <w:r>
               <w:rPr>
-                <w:webHidden/>
-              </w:rPr>
-              <w:t>6</w:t>
-            </w:r>
-            <w:r>
-              <w:rPr>
+                <w:noProof/>
+                <w:webHidden/>
+              </w:rPr>
+              <w:t>7</w:t>
+            </w:r>
+            <w:r>
+              <w:rPr>
+                <w:noProof/>
                 <w:webHidden/>
               </w:rPr>
               <w:fldChar w:fldCharType="end"/>
@@ -2010,6 +2280,7 @@
             </w:tabs>
             <w:rPr>
               <w:rFonts w:asciiTheme="minorHAnsi" w:eastAsiaTheme="minorEastAsia" w:hAnsiTheme="minorHAnsi"/>
+              <w:noProof/>
               <w:kern w:val="2"/>
               <w:sz w:val="24"/>
               <w:szCs w:val="24"/>
@@ -2017,50 +2288,58 @@
               <w14:ligatures w14:val="standardContextual"/>
             </w:rPr>
           </w:pPr>
-          <w:hyperlink w:anchor="_Toc241854672" w:history="1">
+          <w:hyperlink w:anchor="_Toc241865076" w:history="1">
             <w:r>
               <w:rPr>
                 <w:rStyle w:val="Hipervnculo"/>
+                <w:noProof/>
               </w:rPr>
               <w:t>b. Preprocesamiento y transformación del dataset</w:t>
             </w:r>
             <w:r>
               <w:rPr>
+                <w:noProof/>
                 <w:webHidden/>
               </w:rPr>
               <w:tab/>
             </w:r>
             <w:r>
               <w:rPr>
+                <w:noProof/>
                 <w:webHidden/>
               </w:rPr>
               <w:fldChar w:fldCharType="begin"/>
             </w:r>
             <w:r>
               <w:rPr>
-                <w:webHidden/>
-              </w:rPr>
-              <w:instrText xml:space="preserve"> PAGEREF _Toc241854672 \h </w:instrText>
-            </w:r>
-            <w:r>
-              <w:rPr>
-                <w:webHidden/>
-              </w:rPr>
-            </w:r>
-            <w:r>
-              <w:rPr>
+                <w:noProof/>
+                <w:webHidden/>
+              </w:rPr>
+              <w:instrText xml:space="preserve"> PAGEREF _Toc241865076 \h </w:instrText>
+            </w:r>
+            <w:r>
+              <w:rPr>
+                <w:noProof/>
+                <w:webHidden/>
+              </w:rPr>
+            </w:r>
+            <w:r>
+              <w:rPr>
+                <w:noProof/>
                 <w:webHidden/>
               </w:rPr>
               <w:fldChar w:fldCharType="separate"/>
             </w:r>
             <w:r>
               <w:rPr>
-                <w:webHidden/>
-              </w:rPr>
-              <w:t>6</w:t>
-            </w:r>
-            <w:r>
-              <w:rPr>
+                <w:noProof/>
+                <w:webHidden/>
+              </w:rPr>
+              <w:t>7</w:t>
+            </w:r>
+            <w:r>
+              <w:rPr>
+                <w:noProof/>
                 <w:webHidden/>
               </w:rPr>
               <w:fldChar w:fldCharType="end"/>
@@ -2075,6 +2354,7 @@
             </w:tabs>
             <w:rPr>
               <w:rFonts w:asciiTheme="minorHAnsi" w:eastAsiaTheme="minorEastAsia" w:hAnsiTheme="minorHAnsi"/>
+              <w:noProof/>
               <w:kern w:val="2"/>
               <w:sz w:val="24"/>
               <w:szCs w:val="24"/>
@@ -2082,50 +2362,58 @@
               <w14:ligatures w14:val="standardContextual"/>
             </w:rPr>
           </w:pPr>
-          <w:hyperlink w:anchor="_Toc241854673" w:history="1">
+          <w:hyperlink w:anchor="_Toc241865077" w:history="1">
             <w:r>
               <w:rPr>
                 <w:rStyle w:val="Hipervnculo"/>
+                <w:noProof/>
               </w:rPr>
               <w:t>c. Validación técnica y verificación del código</w:t>
             </w:r>
             <w:r>
               <w:rPr>
+                <w:noProof/>
                 <w:webHidden/>
               </w:rPr>
               <w:tab/>
             </w:r>
             <w:r>
               <w:rPr>
+                <w:noProof/>
                 <w:webHidden/>
               </w:rPr>
               <w:fldChar w:fldCharType="begin"/>
             </w:r>
             <w:r>
               <w:rPr>
-                <w:webHidden/>
-              </w:rPr>
-              <w:instrText xml:space="preserve"> PAGEREF _Toc241854673 \h </w:instrText>
-            </w:r>
-            <w:r>
-              <w:rPr>
-                <w:webHidden/>
-              </w:rPr>
-            </w:r>
-            <w:r>
-              <w:rPr>
+                <w:noProof/>
+                <w:webHidden/>
+              </w:rPr>
+              <w:instrText xml:space="preserve"> PAGEREF _Toc241865077 \h </w:instrText>
+            </w:r>
+            <w:r>
+              <w:rPr>
+                <w:noProof/>
+                <w:webHidden/>
+              </w:rPr>
+            </w:r>
+            <w:r>
+              <w:rPr>
+                <w:noProof/>
                 <w:webHidden/>
               </w:rPr>
               <w:fldChar w:fldCharType="separate"/>
             </w:r>
             <w:r>
               <w:rPr>
-                <w:webHidden/>
-              </w:rPr>
-              <w:t>6</w:t>
-            </w:r>
-            <w:r>
-              <w:rPr>
+                <w:noProof/>
+                <w:webHidden/>
+              </w:rPr>
+              <w:t>7</w:t>
+            </w:r>
+            <w:r>
+              <w:rPr>
+                <w:noProof/>
                 <w:webHidden/>
               </w:rPr>
               <w:fldChar w:fldCharType="end"/>
@@ -2140,6 +2428,7 @@
             </w:tabs>
             <w:rPr>
               <w:rFonts w:asciiTheme="minorHAnsi" w:eastAsiaTheme="minorEastAsia" w:hAnsiTheme="minorHAnsi"/>
+              <w:noProof/>
               <w:kern w:val="2"/>
               <w:sz w:val="24"/>
               <w:szCs w:val="24"/>
@@ -2147,50 +2436,58 @@
               <w14:ligatures w14:val="standardContextual"/>
             </w:rPr>
           </w:pPr>
-          <w:hyperlink w:anchor="_Toc241854674" w:history="1">
+          <w:hyperlink w:anchor="_Toc241865078" w:history="1">
             <w:r>
               <w:rPr>
                 <w:rStyle w:val="Hipervnculo"/>
+                <w:noProof/>
               </w:rPr>
               <w:t>d. Eficiencia y optimización</w:t>
             </w:r>
             <w:r>
               <w:rPr>
+                <w:noProof/>
                 <w:webHidden/>
               </w:rPr>
               <w:tab/>
             </w:r>
             <w:r>
               <w:rPr>
+                <w:noProof/>
                 <w:webHidden/>
               </w:rPr>
               <w:fldChar w:fldCharType="begin"/>
             </w:r>
             <w:r>
               <w:rPr>
-                <w:webHidden/>
-              </w:rPr>
-              <w:instrText xml:space="preserve"> PAGEREF _Toc241854674 \h </w:instrText>
-            </w:r>
-            <w:r>
-              <w:rPr>
-                <w:webHidden/>
-              </w:rPr>
-            </w:r>
-            <w:r>
-              <w:rPr>
+                <w:noProof/>
+                <w:webHidden/>
+              </w:rPr>
+              <w:instrText xml:space="preserve"> PAGEREF _Toc241865078 \h </w:instrText>
+            </w:r>
+            <w:r>
+              <w:rPr>
+                <w:noProof/>
+                <w:webHidden/>
+              </w:rPr>
+            </w:r>
+            <w:r>
+              <w:rPr>
+                <w:noProof/>
                 <w:webHidden/>
               </w:rPr>
               <w:fldChar w:fldCharType="separate"/>
             </w:r>
             <w:r>
               <w:rPr>
-                <w:webHidden/>
-              </w:rPr>
-              <w:t>6</w:t>
-            </w:r>
-            <w:r>
-              <w:rPr>
+                <w:noProof/>
+                <w:webHidden/>
+              </w:rPr>
+              <w:t>7</w:t>
+            </w:r>
+            <w:r>
+              <w:rPr>
+                <w:noProof/>
                 <w:webHidden/>
               </w:rPr>
               <w:fldChar w:fldCharType="end"/>
@@ -2205,6 +2502,7 @@
             </w:tabs>
             <w:rPr>
               <w:rFonts w:asciiTheme="minorHAnsi" w:eastAsiaTheme="minorEastAsia" w:hAnsiTheme="minorHAnsi"/>
+              <w:noProof/>
               <w:kern w:val="2"/>
               <w:sz w:val="24"/>
               <w:szCs w:val="24"/>
@@ -2212,50 +2510,58 @@
               <w14:ligatures w14:val="standardContextual"/>
             </w:rPr>
           </w:pPr>
-          <w:hyperlink w:anchor="_Toc241854675" w:history="1">
+          <w:hyperlink w:anchor="_Toc241865079" w:history="1">
             <w:r>
               <w:rPr>
                 <w:rStyle w:val="Hipervnculo"/>
+                <w:noProof/>
               </w:rPr>
               <w:t>e. Diseño estructurado del código</w:t>
             </w:r>
             <w:r>
               <w:rPr>
+                <w:noProof/>
                 <w:webHidden/>
               </w:rPr>
               <w:tab/>
             </w:r>
             <w:r>
               <w:rPr>
+                <w:noProof/>
                 <w:webHidden/>
               </w:rPr>
               <w:fldChar w:fldCharType="begin"/>
             </w:r>
             <w:r>
               <w:rPr>
-                <w:webHidden/>
-              </w:rPr>
-              <w:instrText xml:space="preserve"> PAGEREF _Toc241854675 \h </w:instrText>
-            </w:r>
-            <w:r>
-              <w:rPr>
-                <w:webHidden/>
-              </w:rPr>
-            </w:r>
-            <w:r>
-              <w:rPr>
+                <w:noProof/>
+                <w:webHidden/>
+              </w:rPr>
+              <w:instrText xml:space="preserve"> PAGEREF _Toc241865079 \h </w:instrText>
+            </w:r>
+            <w:r>
+              <w:rPr>
+                <w:noProof/>
+                <w:webHidden/>
+              </w:rPr>
+            </w:r>
+            <w:r>
+              <w:rPr>
+                <w:noProof/>
                 <w:webHidden/>
               </w:rPr>
               <w:fldChar w:fldCharType="separate"/>
             </w:r>
             <w:r>
               <w:rPr>
-                <w:webHidden/>
-              </w:rPr>
-              <w:t>6</w:t>
-            </w:r>
-            <w:r>
-              <w:rPr>
+                <w:noProof/>
+                <w:webHidden/>
+              </w:rPr>
+              <w:t>7</w:t>
+            </w:r>
+            <w:r>
+              <w:rPr>
+                <w:noProof/>
                 <w:webHidden/>
               </w:rPr>
               <w:fldChar w:fldCharType="end"/>
@@ -2270,6 +2576,7 @@
             </w:tabs>
             <w:rPr>
               <w:rFonts w:asciiTheme="minorHAnsi" w:eastAsiaTheme="minorEastAsia" w:hAnsiTheme="minorHAnsi"/>
+              <w:noProof/>
               <w:kern w:val="2"/>
               <w:sz w:val="24"/>
               <w:szCs w:val="24"/>
@@ -2277,50 +2584,58 @@
               <w14:ligatures w14:val="standardContextual"/>
             </w:rPr>
           </w:pPr>
-          <w:hyperlink w:anchor="_Toc241854676" w:history="1">
+          <w:hyperlink w:anchor="_Toc241865080" w:history="1">
             <w:r>
               <w:rPr>
                 <w:rStyle w:val="Hipervnculo"/>
+                <w:noProof/>
               </w:rPr>
               <w:t>f. Notebook final ejecutado y documentado</w:t>
             </w:r>
             <w:r>
               <w:rPr>
+                <w:noProof/>
                 <w:webHidden/>
               </w:rPr>
               <w:tab/>
             </w:r>
             <w:r>
               <w:rPr>
+                <w:noProof/>
                 <w:webHidden/>
               </w:rPr>
               <w:fldChar w:fldCharType="begin"/>
             </w:r>
             <w:r>
               <w:rPr>
-                <w:webHidden/>
-              </w:rPr>
-              <w:instrText xml:space="preserve"> PAGEREF _Toc241854676 \h </w:instrText>
-            </w:r>
-            <w:r>
-              <w:rPr>
-                <w:webHidden/>
-              </w:rPr>
-            </w:r>
-            <w:r>
-              <w:rPr>
+                <w:noProof/>
+                <w:webHidden/>
+              </w:rPr>
+              <w:instrText xml:space="preserve"> PAGEREF _Toc241865080 \h </w:instrText>
+            </w:r>
+            <w:r>
+              <w:rPr>
+                <w:noProof/>
+                <w:webHidden/>
+              </w:rPr>
+            </w:r>
+            <w:r>
+              <w:rPr>
+                <w:noProof/>
                 <w:webHidden/>
               </w:rPr>
               <w:fldChar w:fldCharType="separate"/>
             </w:r>
             <w:r>
               <w:rPr>
-                <w:webHidden/>
-              </w:rPr>
-              <w:t>6</w:t>
-            </w:r>
-            <w:r>
-              <w:rPr>
+                <w:noProof/>
+                <w:webHidden/>
+              </w:rPr>
+              <w:t>7</w:t>
+            </w:r>
+            <w:r>
+              <w:rPr>
+                <w:noProof/>
                 <w:webHidden/>
               </w:rPr>
               <w:fldChar w:fldCharType="end"/>
@@ -2335,6 +2650,7 @@
             </w:tabs>
             <w:rPr>
               <w:rFonts w:asciiTheme="minorHAnsi" w:eastAsiaTheme="minorEastAsia" w:hAnsiTheme="minorHAnsi"/>
+              <w:noProof/>
               <w:kern w:val="2"/>
               <w:sz w:val="24"/>
               <w:szCs w:val="24"/>
@@ -2342,50 +2658,58 @@
               <w14:ligatures w14:val="standardContextual"/>
             </w:rPr>
           </w:pPr>
-          <w:hyperlink w:anchor="_Toc241854677" w:history="1">
+          <w:hyperlink w:anchor="_Toc241865081" w:history="1">
             <w:r>
               <w:rPr>
                 <w:rStyle w:val="Hipervnculo"/>
+                <w:noProof/>
               </w:rPr>
               <w:t>VI. Implementación de código modular y robusto</w:t>
             </w:r>
             <w:r>
               <w:rPr>
+                <w:noProof/>
                 <w:webHidden/>
               </w:rPr>
               <w:tab/>
             </w:r>
             <w:r>
               <w:rPr>
+                <w:noProof/>
                 <w:webHidden/>
               </w:rPr>
               <w:fldChar w:fldCharType="begin"/>
             </w:r>
             <w:r>
               <w:rPr>
-                <w:webHidden/>
-              </w:rPr>
-              <w:instrText xml:space="preserve"> PAGEREF _Toc241854677 \h </w:instrText>
-            </w:r>
-            <w:r>
-              <w:rPr>
-                <w:webHidden/>
-              </w:rPr>
-            </w:r>
-            <w:r>
-              <w:rPr>
+                <w:noProof/>
+                <w:webHidden/>
+              </w:rPr>
+              <w:instrText xml:space="preserve"> PAGEREF _Toc241865081 \h </w:instrText>
+            </w:r>
+            <w:r>
+              <w:rPr>
+                <w:noProof/>
+                <w:webHidden/>
+              </w:rPr>
+            </w:r>
+            <w:r>
+              <w:rPr>
+                <w:noProof/>
                 <w:webHidden/>
               </w:rPr>
               <w:fldChar w:fldCharType="separate"/>
             </w:r>
             <w:r>
               <w:rPr>
-                <w:webHidden/>
-              </w:rPr>
-              <w:t>6</w:t>
-            </w:r>
-            <w:r>
-              <w:rPr>
+                <w:noProof/>
+                <w:webHidden/>
+              </w:rPr>
+              <w:t>7</w:t>
+            </w:r>
+            <w:r>
+              <w:rPr>
+                <w:noProof/>
                 <w:webHidden/>
               </w:rPr>
               <w:fldChar w:fldCharType="end"/>
@@ -2400,6 +2724,7 @@
             </w:tabs>
             <w:rPr>
               <w:rFonts w:asciiTheme="minorHAnsi" w:eastAsiaTheme="minorEastAsia" w:hAnsiTheme="minorHAnsi"/>
+              <w:noProof/>
               <w:kern w:val="2"/>
               <w:sz w:val="24"/>
               <w:szCs w:val="24"/>
@@ -2407,50 +2732,58 @@
               <w14:ligatures w14:val="standardContextual"/>
             </w:rPr>
           </w:pPr>
-          <w:hyperlink w:anchor="_Toc241854678" w:history="1">
+          <w:hyperlink w:anchor="_Toc241865082" w:history="1">
             <w:r>
               <w:rPr>
                 <w:rStyle w:val="Hipervnculo"/>
+                <w:noProof/>
               </w:rPr>
               <w:t>a. Programación orientada a objetos</w:t>
             </w:r>
             <w:r>
               <w:rPr>
+                <w:noProof/>
                 <w:webHidden/>
               </w:rPr>
               <w:tab/>
             </w:r>
             <w:r>
               <w:rPr>
+                <w:noProof/>
                 <w:webHidden/>
               </w:rPr>
               <w:fldChar w:fldCharType="begin"/>
             </w:r>
             <w:r>
               <w:rPr>
-                <w:webHidden/>
-              </w:rPr>
-              <w:instrText xml:space="preserve"> PAGEREF _Toc241854678 \h </w:instrText>
-            </w:r>
-            <w:r>
-              <w:rPr>
-                <w:webHidden/>
-              </w:rPr>
-            </w:r>
-            <w:r>
-              <w:rPr>
+                <w:noProof/>
+                <w:webHidden/>
+              </w:rPr>
+              <w:instrText xml:space="preserve"> PAGEREF _Toc241865082 \h </w:instrText>
+            </w:r>
+            <w:r>
+              <w:rPr>
+                <w:noProof/>
+                <w:webHidden/>
+              </w:rPr>
+            </w:r>
+            <w:r>
+              <w:rPr>
+                <w:noProof/>
                 <w:webHidden/>
               </w:rPr>
               <w:fldChar w:fldCharType="separate"/>
             </w:r>
             <w:r>
               <w:rPr>
-                <w:webHidden/>
-              </w:rPr>
-              <w:t>6</w:t>
-            </w:r>
-            <w:r>
-              <w:rPr>
+                <w:noProof/>
+                <w:webHidden/>
+              </w:rPr>
+              <w:t>7</w:t>
+            </w:r>
+            <w:r>
+              <w:rPr>
+                <w:noProof/>
                 <w:webHidden/>
               </w:rPr>
               <w:fldChar w:fldCharType="end"/>
@@ -2465,6 +2798,7 @@
             </w:tabs>
             <w:rPr>
               <w:rFonts w:asciiTheme="minorHAnsi" w:eastAsiaTheme="minorEastAsia" w:hAnsiTheme="minorHAnsi"/>
+              <w:noProof/>
               <w:kern w:val="2"/>
               <w:sz w:val="24"/>
               <w:szCs w:val="24"/>
@@ -2472,50 +2806,58 @@
               <w14:ligatures w14:val="standardContextual"/>
             </w:rPr>
           </w:pPr>
-          <w:hyperlink w:anchor="_Toc241854679" w:history="1">
+          <w:hyperlink w:anchor="_Toc241865083" w:history="1">
             <w:r>
               <w:rPr>
                 <w:rStyle w:val="Hipervnculo"/>
+                <w:noProof/>
               </w:rPr>
               <w:t>b. Documentación de arquitectura</w:t>
             </w:r>
             <w:r>
               <w:rPr>
+                <w:noProof/>
                 <w:webHidden/>
               </w:rPr>
               <w:tab/>
             </w:r>
             <w:r>
               <w:rPr>
+                <w:noProof/>
                 <w:webHidden/>
               </w:rPr>
               <w:fldChar w:fldCharType="begin"/>
             </w:r>
             <w:r>
               <w:rPr>
-                <w:webHidden/>
-              </w:rPr>
-              <w:instrText xml:space="preserve"> PAGEREF _Toc241854679 \h </w:instrText>
-            </w:r>
-            <w:r>
-              <w:rPr>
-                <w:webHidden/>
-              </w:rPr>
-            </w:r>
-            <w:r>
-              <w:rPr>
+                <w:noProof/>
+                <w:webHidden/>
+              </w:rPr>
+              <w:instrText xml:space="preserve"> PAGEREF _Toc241865083 \h </w:instrText>
+            </w:r>
+            <w:r>
+              <w:rPr>
+                <w:noProof/>
+                <w:webHidden/>
+              </w:rPr>
+            </w:r>
+            <w:r>
+              <w:rPr>
+                <w:noProof/>
                 <w:webHidden/>
               </w:rPr>
               <w:fldChar w:fldCharType="separate"/>
             </w:r>
             <w:r>
               <w:rPr>
-                <w:webHidden/>
-              </w:rPr>
-              <w:t>6</w:t>
-            </w:r>
-            <w:r>
-              <w:rPr>
+                <w:noProof/>
+                <w:webHidden/>
+              </w:rPr>
+              <w:t>7</w:t>
+            </w:r>
+            <w:r>
+              <w:rPr>
+                <w:noProof/>
                 <w:webHidden/>
               </w:rPr>
               <w:fldChar w:fldCharType="end"/>
@@ -2530,6 +2872,7 @@
             </w:tabs>
             <w:rPr>
               <w:rFonts w:asciiTheme="minorHAnsi" w:eastAsiaTheme="minorEastAsia" w:hAnsiTheme="minorHAnsi"/>
+              <w:noProof/>
               <w:kern w:val="2"/>
               <w:sz w:val="24"/>
               <w:szCs w:val="24"/>
@@ -2537,50 +2880,58 @@
               <w14:ligatures w14:val="standardContextual"/>
             </w:rPr>
           </w:pPr>
-          <w:hyperlink w:anchor="_Toc241854680" w:history="1">
+          <w:hyperlink w:anchor="_Toc241865084" w:history="1">
             <w:r>
               <w:rPr>
                 <w:rStyle w:val="Hipervnculo"/>
+                <w:noProof/>
               </w:rPr>
               <w:t>VII. Construcción de visualizaciones de datos efectivas</w:t>
             </w:r>
             <w:r>
               <w:rPr>
+                <w:noProof/>
                 <w:webHidden/>
               </w:rPr>
               <w:tab/>
             </w:r>
             <w:r>
               <w:rPr>
+                <w:noProof/>
                 <w:webHidden/>
               </w:rPr>
               <w:fldChar w:fldCharType="begin"/>
             </w:r>
             <w:r>
               <w:rPr>
-                <w:webHidden/>
-              </w:rPr>
-              <w:instrText xml:space="preserve"> PAGEREF _Toc241854680 \h </w:instrText>
-            </w:r>
-            <w:r>
-              <w:rPr>
-                <w:webHidden/>
-              </w:rPr>
-            </w:r>
-            <w:r>
-              <w:rPr>
+                <w:noProof/>
+                <w:webHidden/>
+              </w:rPr>
+              <w:instrText xml:space="preserve"> PAGEREF _Toc241865084 \h </w:instrText>
+            </w:r>
+            <w:r>
+              <w:rPr>
+                <w:noProof/>
+                <w:webHidden/>
+              </w:rPr>
+            </w:r>
+            <w:r>
+              <w:rPr>
+                <w:noProof/>
                 <w:webHidden/>
               </w:rPr>
               <w:fldChar w:fldCharType="separate"/>
             </w:r>
             <w:r>
               <w:rPr>
-                <w:webHidden/>
-              </w:rPr>
-              <w:t>6</w:t>
-            </w:r>
-            <w:r>
-              <w:rPr>
+                <w:noProof/>
+                <w:webHidden/>
+              </w:rPr>
+              <w:t>7</w:t>
+            </w:r>
+            <w:r>
+              <w:rPr>
+                <w:noProof/>
                 <w:webHidden/>
               </w:rPr>
               <w:fldChar w:fldCharType="end"/>
@@ -2595,6 +2946,7 @@
             </w:tabs>
             <w:rPr>
               <w:rFonts w:asciiTheme="minorHAnsi" w:eastAsiaTheme="minorEastAsia" w:hAnsiTheme="minorHAnsi"/>
+              <w:noProof/>
               <w:kern w:val="2"/>
               <w:sz w:val="24"/>
               <w:szCs w:val="24"/>
@@ -2602,50 +2954,58 @@
               <w14:ligatures w14:val="standardContextual"/>
             </w:rPr>
           </w:pPr>
-          <w:hyperlink w:anchor="_Toc241854681" w:history="1">
+          <w:hyperlink w:anchor="_Toc241865085" w:history="1">
             <w:r>
               <w:rPr>
                 <w:rStyle w:val="Hipervnculo"/>
+                <w:noProof/>
               </w:rPr>
               <w:t>a. Preprocesamiento y transformación de datos</w:t>
             </w:r>
             <w:r>
               <w:rPr>
+                <w:noProof/>
                 <w:webHidden/>
               </w:rPr>
               <w:tab/>
             </w:r>
             <w:r>
               <w:rPr>
+                <w:noProof/>
                 <w:webHidden/>
               </w:rPr>
               <w:fldChar w:fldCharType="begin"/>
             </w:r>
             <w:r>
               <w:rPr>
-                <w:webHidden/>
-              </w:rPr>
-              <w:instrText xml:space="preserve"> PAGEREF _Toc241854681 \h </w:instrText>
-            </w:r>
-            <w:r>
-              <w:rPr>
-                <w:webHidden/>
-              </w:rPr>
-            </w:r>
-            <w:r>
-              <w:rPr>
+                <w:noProof/>
+                <w:webHidden/>
+              </w:rPr>
+              <w:instrText xml:space="preserve"> PAGEREF _Toc241865085 \h </w:instrText>
+            </w:r>
+            <w:r>
+              <w:rPr>
+                <w:noProof/>
+                <w:webHidden/>
+              </w:rPr>
+            </w:r>
+            <w:r>
+              <w:rPr>
+                <w:noProof/>
                 <w:webHidden/>
               </w:rPr>
               <w:fldChar w:fldCharType="separate"/>
             </w:r>
             <w:r>
               <w:rPr>
-                <w:webHidden/>
-              </w:rPr>
-              <w:t>6</w:t>
-            </w:r>
-            <w:r>
-              <w:rPr>
+                <w:noProof/>
+                <w:webHidden/>
+              </w:rPr>
+              <w:t>7</w:t>
+            </w:r>
+            <w:r>
+              <w:rPr>
+                <w:noProof/>
                 <w:webHidden/>
               </w:rPr>
               <w:fldChar w:fldCharType="end"/>
@@ -2660,6 +3020,7 @@
             </w:tabs>
             <w:rPr>
               <w:rFonts w:asciiTheme="minorHAnsi" w:eastAsiaTheme="minorEastAsia" w:hAnsiTheme="minorHAnsi"/>
+              <w:noProof/>
               <w:kern w:val="2"/>
               <w:sz w:val="24"/>
               <w:szCs w:val="24"/>
@@ -2667,50 +3028,58 @@
               <w14:ligatures w14:val="standardContextual"/>
             </w:rPr>
           </w:pPr>
-          <w:hyperlink w:anchor="_Toc241854682" w:history="1">
+          <w:hyperlink w:anchor="_Toc241865086" w:history="1">
             <w:r>
               <w:rPr>
                 <w:rStyle w:val="Hipervnculo"/>
+                <w:noProof/>
               </w:rPr>
               <w:t>b. Visualizaciones analíticas</w:t>
             </w:r>
             <w:r>
               <w:rPr>
+                <w:noProof/>
                 <w:webHidden/>
               </w:rPr>
               <w:tab/>
             </w:r>
             <w:r>
               <w:rPr>
+                <w:noProof/>
                 <w:webHidden/>
               </w:rPr>
               <w:fldChar w:fldCharType="begin"/>
             </w:r>
             <w:r>
               <w:rPr>
-                <w:webHidden/>
-              </w:rPr>
-              <w:instrText xml:space="preserve"> PAGEREF _Toc241854682 \h </w:instrText>
-            </w:r>
-            <w:r>
-              <w:rPr>
-                <w:webHidden/>
-              </w:rPr>
-            </w:r>
-            <w:r>
-              <w:rPr>
+                <w:noProof/>
+                <w:webHidden/>
+              </w:rPr>
+              <w:instrText xml:space="preserve"> PAGEREF _Toc241865086 \h </w:instrText>
+            </w:r>
+            <w:r>
+              <w:rPr>
+                <w:noProof/>
+                <w:webHidden/>
+              </w:rPr>
+            </w:r>
+            <w:r>
+              <w:rPr>
+                <w:noProof/>
                 <w:webHidden/>
               </w:rPr>
               <w:fldChar w:fldCharType="separate"/>
             </w:r>
             <w:r>
               <w:rPr>
-                <w:webHidden/>
-              </w:rPr>
-              <w:t>6</w:t>
-            </w:r>
-            <w:r>
-              <w:rPr>
+                <w:noProof/>
+                <w:webHidden/>
+              </w:rPr>
+              <w:t>7</w:t>
+            </w:r>
+            <w:r>
+              <w:rPr>
+                <w:noProof/>
                 <w:webHidden/>
               </w:rPr>
               <w:fldChar w:fldCharType="end"/>
@@ -2725,6 +3094,7 @@
             </w:tabs>
             <w:rPr>
               <w:rFonts w:asciiTheme="minorHAnsi" w:eastAsiaTheme="minorEastAsia" w:hAnsiTheme="minorHAnsi"/>
+              <w:noProof/>
               <w:kern w:val="2"/>
               <w:sz w:val="24"/>
               <w:szCs w:val="24"/>
@@ -2732,50 +3102,58 @@
               <w14:ligatures w14:val="standardContextual"/>
             </w:rPr>
           </w:pPr>
-          <w:hyperlink w:anchor="_Toc241854683" w:history="1">
+          <w:hyperlink w:anchor="_Toc241865087" w:history="1">
             <w:r>
               <w:rPr>
                 <w:rStyle w:val="Hipervnculo"/>
+                <w:noProof/>
               </w:rPr>
               <w:t>VIII. Metodología del desarrollo técnico</w:t>
             </w:r>
             <w:r>
               <w:rPr>
+                <w:noProof/>
                 <w:webHidden/>
               </w:rPr>
               <w:tab/>
             </w:r>
             <w:r>
               <w:rPr>
+                <w:noProof/>
                 <w:webHidden/>
               </w:rPr>
               <w:fldChar w:fldCharType="begin"/>
             </w:r>
             <w:r>
               <w:rPr>
-                <w:webHidden/>
-              </w:rPr>
-              <w:instrText xml:space="preserve"> PAGEREF _Toc241854683 \h </w:instrText>
-            </w:r>
-            <w:r>
-              <w:rPr>
-                <w:webHidden/>
-              </w:rPr>
-            </w:r>
-            <w:r>
-              <w:rPr>
+                <w:noProof/>
+                <w:webHidden/>
+              </w:rPr>
+              <w:instrText xml:space="preserve"> PAGEREF _Toc241865087 \h </w:instrText>
+            </w:r>
+            <w:r>
+              <w:rPr>
+                <w:noProof/>
+                <w:webHidden/>
+              </w:rPr>
+            </w:r>
+            <w:r>
+              <w:rPr>
+                <w:noProof/>
                 <w:webHidden/>
               </w:rPr>
               <w:fldChar w:fldCharType="separate"/>
             </w:r>
             <w:r>
               <w:rPr>
-                <w:webHidden/>
-              </w:rPr>
-              <w:t>6</w:t>
-            </w:r>
-            <w:r>
-              <w:rPr>
+                <w:noProof/>
+                <w:webHidden/>
+              </w:rPr>
+              <w:t>7</w:t>
+            </w:r>
+            <w:r>
+              <w:rPr>
+                <w:noProof/>
                 <w:webHidden/>
               </w:rPr>
               <w:fldChar w:fldCharType="end"/>
@@ -2790,6 +3168,7 @@
             </w:tabs>
             <w:rPr>
               <w:rFonts w:asciiTheme="minorHAnsi" w:eastAsiaTheme="minorEastAsia" w:hAnsiTheme="minorHAnsi"/>
+              <w:noProof/>
               <w:kern w:val="2"/>
               <w:sz w:val="24"/>
               <w:szCs w:val="24"/>
@@ -2797,50 +3176,58 @@
               <w14:ligatures w14:val="standardContextual"/>
             </w:rPr>
           </w:pPr>
-          <w:hyperlink w:anchor="_Toc241854684" w:history="1">
+          <w:hyperlink w:anchor="_Toc241865088" w:history="1">
             <w:r>
               <w:rPr>
                 <w:rStyle w:val="Hipervnculo"/>
+                <w:noProof/>
               </w:rPr>
               <w:t>a. Validación y reflexión técnica</w:t>
             </w:r>
             <w:r>
               <w:rPr>
+                <w:noProof/>
                 <w:webHidden/>
               </w:rPr>
               <w:tab/>
             </w:r>
             <w:r>
               <w:rPr>
+                <w:noProof/>
                 <w:webHidden/>
               </w:rPr>
               <w:fldChar w:fldCharType="begin"/>
             </w:r>
             <w:r>
               <w:rPr>
-                <w:webHidden/>
-              </w:rPr>
-              <w:instrText xml:space="preserve"> PAGEREF _Toc241854684 \h </w:instrText>
-            </w:r>
-            <w:r>
-              <w:rPr>
-                <w:webHidden/>
-              </w:rPr>
-            </w:r>
-            <w:r>
-              <w:rPr>
+                <w:noProof/>
+                <w:webHidden/>
+              </w:rPr>
+              <w:instrText xml:space="preserve"> PAGEREF _Toc241865088 \h </w:instrText>
+            </w:r>
+            <w:r>
+              <w:rPr>
+                <w:noProof/>
+                <w:webHidden/>
+              </w:rPr>
+            </w:r>
+            <w:r>
+              <w:rPr>
+                <w:noProof/>
                 <w:webHidden/>
               </w:rPr>
               <w:fldChar w:fldCharType="separate"/>
             </w:r>
             <w:r>
               <w:rPr>
-                <w:webHidden/>
-              </w:rPr>
-              <w:t>6</w:t>
-            </w:r>
-            <w:r>
-              <w:rPr>
+                <w:noProof/>
+                <w:webHidden/>
+              </w:rPr>
+              <w:t>7</w:t>
+            </w:r>
+            <w:r>
+              <w:rPr>
+                <w:noProof/>
                 <w:webHidden/>
               </w:rPr>
               <w:fldChar w:fldCharType="end"/>
@@ -2855,6 +3242,7 @@
             </w:tabs>
             <w:rPr>
               <w:rFonts w:asciiTheme="minorHAnsi" w:eastAsiaTheme="minorEastAsia" w:hAnsiTheme="minorHAnsi"/>
+              <w:noProof/>
               <w:kern w:val="2"/>
               <w:sz w:val="24"/>
               <w:szCs w:val="24"/>
@@ -2862,50 +3250,58 @@
               <w14:ligatures w14:val="standardContextual"/>
             </w:rPr>
           </w:pPr>
-          <w:hyperlink w:anchor="_Toc241854685" w:history="1">
+          <w:hyperlink w:anchor="_Toc241865089" w:history="1">
             <w:r>
               <w:rPr>
                 <w:rStyle w:val="Hipervnculo"/>
+                <w:noProof/>
               </w:rPr>
               <w:t>b. Resultados</w:t>
             </w:r>
             <w:r>
               <w:rPr>
+                <w:noProof/>
                 <w:webHidden/>
               </w:rPr>
               <w:tab/>
             </w:r>
             <w:r>
               <w:rPr>
+                <w:noProof/>
                 <w:webHidden/>
               </w:rPr>
               <w:fldChar w:fldCharType="begin"/>
             </w:r>
             <w:r>
               <w:rPr>
-                <w:webHidden/>
-              </w:rPr>
-              <w:instrText xml:space="preserve"> PAGEREF _Toc241854685 \h </w:instrText>
-            </w:r>
-            <w:r>
-              <w:rPr>
-                <w:webHidden/>
-              </w:rPr>
-            </w:r>
-            <w:r>
-              <w:rPr>
+                <w:noProof/>
+                <w:webHidden/>
+              </w:rPr>
+              <w:instrText xml:space="preserve"> PAGEREF _Toc241865089 \h </w:instrText>
+            </w:r>
+            <w:r>
+              <w:rPr>
+                <w:noProof/>
+                <w:webHidden/>
+              </w:rPr>
+            </w:r>
+            <w:r>
+              <w:rPr>
+                <w:noProof/>
                 <w:webHidden/>
               </w:rPr>
               <w:fldChar w:fldCharType="separate"/>
             </w:r>
             <w:r>
               <w:rPr>
-                <w:webHidden/>
-              </w:rPr>
-              <w:t>6</w:t>
-            </w:r>
-            <w:r>
-              <w:rPr>
+                <w:noProof/>
+                <w:webHidden/>
+              </w:rPr>
+              <w:t>7</w:t>
+            </w:r>
+            <w:r>
+              <w:rPr>
+                <w:noProof/>
                 <w:webHidden/>
               </w:rPr>
               <w:fldChar w:fldCharType="end"/>
@@ -2920,6 +3316,7 @@
             </w:tabs>
             <w:rPr>
               <w:rFonts w:asciiTheme="minorHAnsi" w:eastAsiaTheme="minorEastAsia" w:hAnsiTheme="minorHAnsi"/>
+              <w:noProof/>
               <w:kern w:val="2"/>
               <w:sz w:val="24"/>
               <w:szCs w:val="24"/>
@@ -2927,50 +3324,58 @@
               <w14:ligatures w14:val="standardContextual"/>
             </w:rPr>
           </w:pPr>
-          <w:hyperlink w:anchor="_Toc241854686" w:history="1">
+          <w:hyperlink w:anchor="_Toc241865090" w:history="1">
             <w:r>
               <w:rPr>
                 <w:rStyle w:val="Hipervnculo"/>
+                <w:noProof/>
               </w:rPr>
               <w:t>c. Discusión</w:t>
             </w:r>
             <w:r>
               <w:rPr>
+                <w:noProof/>
                 <w:webHidden/>
               </w:rPr>
               <w:tab/>
             </w:r>
             <w:r>
               <w:rPr>
+                <w:noProof/>
                 <w:webHidden/>
               </w:rPr>
               <w:fldChar w:fldCharType="begin"/>
             </w:r>
             <w:r>
               <w:rPr>
-                <w:webHidden/>
-              </w:rPr>
-              <w:instrText xml:space="preserve"> PAGEREF _Toc241854686 \h </w:instrText>
-            </w:r>
-            <w:r>
-              <w:rPr>
-                <w:webHidden/>
-              </w:rPr>
-            </w:r>
-            <w:r>
-              <w:rPr>
+                <w:noProof/>
+                <w:webHidden/>
+              </w:rPr>
+              <w:instrText xml:space="preserve"> PAGEREF _Toc241865090 \h </w:instrText>
+            </w:r>
+            <w:r>
+              <w:rPr>
+                <w:noProof/>
+                <w:webHidden/>
+              </w:rPr>
+            </w:r>
+            <w:r>
+              <w:rPr>
+                <w:noProof/>
                 <w:webHidden/>
               </w:rPr>
               <w:fldChar w:fldCharType="separate"/>
             </w:r>
             <w:r>
               <w:rPr>
-                <w:webHidden/>
-              </w:rPr>
-              <w:t>6</w:t>
-            </w:r>
-            <w:r>
-              <w:rPr>
+                <w:noProof/>
+                <w:webHidden/>
+              </w:rPr>
+              <w:t>7</w:t>
+            </w:r>
+            <w:r>
+              <w:rPr>
+                <w:noProof/>
                 <w:webHidden/>
               </w:rPr>
               <w:fldChar w:fldCharType="end"/>
@@ -2985,6 +3390,7 @@
             </w:tabs>
             <w:rPr>
               <w:rFonts w:asciiTheme="minorHAnsi" w:eastAsiaTheme="minorEastAsia" w:hAnsiTheme="minorHAnsi"/>
+              <w:noProof/>
               <w:kern w:val="2"/>
               <w:sz w:val="24"/>
               <w:szCs w:val="24"/>
@@ -2992,50 +3398,58 @@
               <w14:ligatures w14:val="standardContextual"/>
             </w:rPr>
           </w:pPr>
-          <w:hyperlink w:anchor="_Toc241854687" w:history="1">
+          <w:hyperlink w:anchor="_Toc241865091" w:history="1">
             <w:r>
               <w:rPr>
                 <w:rStyle w:val="Hipervnculo"/>
+                <w:noProof/>
               </w:rPr>
               <w:t>d. Conclusiones</w:t>
             </w:r>
             <w:r>
               <w:rPr>
+                <w:noProof/>
                 <w:webHidden/>
               </w:rPr>
               <w:tab/>
             </w:r>
             <w:r>
               <w:rPr>
+                <w:noProof/>
                 <w:webHidden/>
               </w:rPr>
               <w:fldChar w:fldCharType="begin"/>
             </w:r>
             <w:r>
               <w:rPr>
-                <w:webHidden/>
-              </w:rPr>
-              <w:instrText xml:space="preserve"> PAGEREF _Toc241854687 \h </w:instrText>
-            </w:r>
-            <w:r>
-              <w:rPr>
-                <w:webHidden/>
-              </w:rPr>
-            </w:r>
-            <w:r>
-              <w:rPr>
+                <w:noProof/>
+                <w:webHidden/>
+              </w:rPr>
+              <w:instrText xml:space="preserve"> PAGEREF _Toc241865091 \h </w:instrText>
+            </w:r>
+            <w:r>
+              <w:rPr>
+                <w:noProof/>
+                <w:webHidden/>
+              </w:rPr>
+            </w:r>
+            <w:r>
+              <w:rPr>
+                <w:noProof/>
                 <w:webHidden/>
               </w:rPr>
               <w:fldChar w:fldCharType="separate"/>
             </w:r>
             <w:r>
               <w:rPr>
-                <w:webHidden/>
-              </w:rPr>
-              <w:t>6</w:t>
-            </w:r>
-            <w:r>
-              <w:rPr>
+                <w:noProof/>
+                <w:webHidden/>
+              </w:rPr>
+              <w:t>7</w:t>
+            </w:r>
+            <w:r>
+              <w:rPr>
+                <w:noProof/>
                 <w:webHidden/>
               </w:rPr>
               <w:fldChar w:fldCharType="end"/>
@@ -3050,6 +3464,7 @@
             </w:tabs>
             <w:rPr>
               <w:rFonts w:asciiTheme="minorHAnsi" w:eastAsiaTheme="minorEastAsia" w:hAnsiTheme="minorHAnsi"/>
+              <w:noProof/>
               <w:kern w:val="2"/>
               <w:sz w:val="24"/>
               <w:szCs w:val="24"/>
@@ -3057,50 +3472,72 @@
               <w14:ligatures w14:val="standardContextual"/>
             </w:rPr>
           </w:pPr>
-          <w:hyperlink w:anchor="_Toc241854688" w:history="1">
+          <w:hyperlink w:anchor="_Toc241865092" w:history="1">
             <w:r>
               <w:rPr>
                 <w:rStyle w:val="Hipervnculo"/>
-              </w:rPr>
-              <w:t>e. Trazabilidad de mejoras</w:t>
-            </w:r>
-            <w:r>
-              <w:rPr>
+                <w:noProof/>
+              </w:rPr>
+              <w:t>e. Trazabilidad de me</w:t>
+            </w:r>
+            <w:r>
+              <w:rPr>
+                <w:rStyle w:val="Hipervnculo"/>
+                <w:noProof/>
+              </w:rPr>
+              <w:t>j</w:t>
+            </w:r>
+            <w:r>
+              <w:rPr>
+                <w:rStyle w:val="Hipervnculo"/>
+                <w:noProof/>
+              </w:rPr>
+              <w:t>oras</w:t>
+            </w:r>
+            <w:r>
+              <w:rPr>
+                <w:noProof/>
                 <w:webHidden/>
               </w:rPr>
               <w:tab/>
             </w:r>
             <w:r>
               <w:rPr>
+                <w:noProof/>
                 <w:webHidden/>
               </w:rPr>
               <w:fldChar w:fldCharType="begin"/>
             </w:r>
             <w:r>
               <w:rPr>
-                <w:webHidden/>
-              </w:rPr>
-              <w:instrText xml:space="preserve"> PAGEREF _Toc241854688 \h </w:instrText>
-            </w:r>
-            <w:r>
-              <w:rPr>
-                <w:webHidden/>
-              </w:rPr>
-            </w:r>
-            <w:r>
-              <w:rPr>
+                <w:noProof/>
+                <w:webHidden/>
+              </w:rPr>
+              <w:instrText xml:space="preserve"> PAGEREF _Toc241865092 \h </w:instrText>
+            </w:r>
+            <w:r>
+              <w:rPr>
+                <w:noProof/>
+                <w:webHidden/>
+              </w:rPr>
+            </w:r>
+            <w:r>
+              <w:rPr>
+                <w:noProof/>
                 <w:webHidden/>
               </w:rPr>
               <w:fldChar w:fldCharType="separate"/>
             </w:r>
             <w:r>
               <w:rPr>
-                <w:webHidden/>
-              </w:rPr>
-              <w:t>6</w:t>
-            </w:r>
-            <w:r>
-              <w:rPr>
+                <w:noProof/>
+                <w:webHidden/>
+              </w:rPr>
+              <w:t>7</w:t>
+            </w:r>
+            <w:r>
+              <w:rPr>
+                <w:noProof/>
                 <w:webHidden/>
               </w:rPr>
               <w:fldChar w:fldCharType="end"/>
@@ -3115,6 +3552,7 @@
             </w:tabs>
             <w:rPr>
               <w:rFonts w:asciiTheme="minorHAnsi" w:eastAsiaTheme="minorEastAsia" w:hAnsiTheme="minorHAnsi"/>
+              <w:noProof/>
               <w:kern w:val="2"/>
               <w:sz w:val="24"/>
               <w:szCs w:val="24"/>
@@ -3122,50 +3560,58 @@
               <w14:ligatures w14:val="standardContextual"/>
             </w:rPr>
           </w:pPr>
-          <w:hyperlink w:anchor="_Toc241854689" w:history="1">
+          <w:hyperlink w:anchor="_Toc241865093" w:history="1">
             <w:r>
               <w:rPr>
                 <w:rStyle w:val="Hipervnculo"/>
+                <w:noProof/>
               </w:rPr>
               <w:t>IX. Presentación Audiovisual</w:t>
             </w:r>
             <w:r>
               <w:rPr>
+                <w:noProof/>
                 <w:webHidden/>
               </w:rPr>
               <w:tab/>
             </w:r>
             <w:r>
               <w:rPr>
+                <w:noProof/>
                 <w:webHidden/>
               </w:rPr>
               <w:fldChar w:fldCharType="begin"/>
             </w:r>
             <w:r>
               <w:rPr>
-                <w:webHidden/>
-              </w:rPr>
-              <w:instrText xml:space="preserve"> PAGEREF _Toc241854689 \h </w:instrText>
-            </w:r>
-            <w:r>
-              <w:rPr>
-                <w:webHidden/>
-              </w:rPr>
-            </w:r>
-            <w:r>
-              <w:rPr>
+                <w:noProof/>
+                <w:webHidden/>
+              </w:rPr>
+              <w:instrText xml:space="preserve"> PAGEREF _Toc241865093 \h </w:instrText>
+            </w:r>
+            <w:r>
+              <w:rPr>
+                <w:noProof/>
+                <w:webHidden/>
+              </w:rPr>
+            </w:r>
+            <w:r>
+              <w:rPr>
+                <w:noProof/>
                 <w:webHidden/>
               </w:rPr>
               <w:fldChar w:fldCharType="separate"/>
             </w:r>
             <w:r>
               <w:rPr>
-                <w:webHidden/>
-              </w:rPr>
-              <w:t>6</w:t>
-            </w:r>
-            <w:r>
-              <w:rPr>
+                <w:noProof/>
+                <w:webHidden/>
+              </w:rPr>
+              <w:t>9</w:t>
+            </w:r>
+            <w:r>
+              <w:rPr>
+                <w:noProof/>
                 <w:webHidden/>
               </w:rPr>
               <w:fldChar w:fldCharType="end"/>
@@ -3180,6 +3626,7 @@
             </w:tabs>
             <w:rPr>
               <w:rFonts w:asciiTheme="minorHAnsi" w:eastAsiaTheme="minorEastAsia" w:hAnsiTheme="minorHAnsi"/>
+              <w:noProof/>
               <w:kern w:val="2"/>
               <w:sz w:val="24"/>
               <w:szCs w:val="24"/>
@@ -3187,50 +3634,58 @@
               <w14:ligatures w14:val="standardContextual"/>
             </w:rPr>
           </w:pPr>
-          <w:hyperlink w:anchor="_Toc241854690" w:history="1">
+          <w:hyperlink w:anchor="_Toc241865094" w:history="1">
             <w:r>
               <w:rPr>
                 <w:rStyle w:val="Hipervnculo"/>
+                <w:noProof/>
               </w:rPr>
               <w:t>X. Bibliografía</w:t>
             </w:r>
             <w:r>
               <w:rPr>
+                <w:noProof/>
                 <w:webHidden/>
               </w:rPr>
               <w:tab/>
             </w:r>
             <w:r>
               <w:rPr>
+                <w:noProof/>
                 <w:webHidden/>
               </w:rPr>
               <w:fldChar w:fldCharType="begin"/>
             </w:r>
             <w:r>
               <w:rPr>
-                <w:webHidden/>
-              </w:rPr>
-              <w:instrText xml:space="preserve"> PAGEREF _Toc241854690 \h </w:instrText>
-            </w:r>
-            <w:r>
-              <w:rPr>
-                <w:webHidden/>
-              </w:rPr>
-            </w:r>
-            <w:r>
-              <w:rPr>
+                <w:noProof/>
+                <w:webHidden/>
+              </w:rPr>
+              <w:instrText xml:space="preserve"> PAGEREF _Toc241865094 \h </w:instrText>
+            </w:r>
+            <w:r>
+              <w:rPr>
+                <w:noProof/>
+                <w:webHidden/>
+              </w:rPr>
+            </w:r>
+            <w:r>
+              <w:rPr>
+                <w:noProof/>
                 <w:webHidden/>
               </w:rPr>
               <w:fldChar w:fldCharType="separate"/>
             </w:r>
             <w:r>
               <w:rPr>
-                <w:webHidden/>
-              </w:rPr>
-              <w:t>7</w:t>
-            </w:r>
-            <w:r>
-              <w:rPr>
+                <w:noProof/>
+                <w:webHidden/>
+              </w:rPr>
+              <w:t>9</w:t>
+            </w:r>
+            <w:r>
+              <w:rPr>
+                <w:noProof/>
                 <w:webHidden/>
               </w:rPr>
               <w:fldChar w:fldCharType="end"/>
@@ -3448,7 +3903,15 @@
         <w:jc w:val="left"/>
       </w:pPr>
       <w:r>
-        <w:t>Preprocesamiento y transformación del dataset.</w:t>
+        <w:t xml:space="preserve">Preprocesamiento y transformación del </w:t>
+      </w:r>
+      <w:proofErr w:type="spellStart"/>
+      <w:r>
+        <w:t>dataset</w:t>
+      </w:r>
+      <w:proofErr w:type="spellEnd"/>
+      <w:r>
+        <w:t>.</w:t>
       </w:r>
     </w:p>
     <w:p>
@@ -3759,7 +4222,7 @@
       <w:pPr>
         <w:pStyle w:val="Ttulo1"/>
       </w:pPr>
-      <w:bookmarkStart w:id="0" w:name="_Toc241854660"/>
+      <w:bookmarkStart w:id="0" w:name="_Toc241865062"/>
       <w:r>
         <w:lastRenderedPageBreak/>
         <w:t>II. Introducción y contextualización</w:t>
@@ -3773,36 +4236,62 @@
     </w:p>
     <w:p>
       <w:r>
-        <w:t>La necesidad técnica del proyecto surge de la estructura y volumen de los registros. La fuente original contiene 359.891 filas y 33 columnas, mientras que el subconjunto definido para el estudio corresponde a 729 registros en formato ancho. Para facilitar el análisis temporal, los datos fueron transformados a formato largo, obteniéndose un dataset analítico de 17.496 observaciones y 13 variables, donde cada fila representa una combinación de central, fecha y hora. Este proceso exige programación para automatizar la preparación, validación y análisis de los datos de manera reproducible.</w:t>
-      </w:r>
-    </w:p>
-    <w:p>
-      <w:r>
-        <w:t>El objetivo general es caracterizar los patrones temporales de generación eléctrica de las tres centrales mediante un proceso reproducible de preparación, validación y análisis. El alcance se mantiene deliberadamente descriptivo: los registros iguales a 0 MWh se conservan y analizan como parte de los datos publicados, pero no se atribuyen a fallas, detenciones, mantenimiento u otras causas operacionales que no puedan verificarse con la información disponible.</w:t>
-      </w:r>
-    </w:p>
-    <w:p>
-      <w:r>
-        <w:t>El desarrollo se articula en cuatro fases. F1 definió la problemática, los objetivos, el alcance y el entorno reproducible; F2 implementó la preparación, transformación y validación del dataset; F3 consolidó el núcleo algorítmico, incorporó mediciones de eficiencia, recursividad y Programación Orientada a Objetos; y F4 integra los resultados, construye las visualizaciones finales, documenta la trazabilidad de mejoras y comunica las conclusiones del proyecto. Esta progresión permite relacionar decisiones técnicas, código, evidencias y resultados dentro de un único flujo reproducible.</w:t>
+        <w:t xml:space="preserve">La necesidad técnica del proyecto surge de la estructura y volumen de los registros. La fuente original contiene 359.891 filas y 33 columnas, mientras que el subconjunto definido para el estudio corresponde a 729 registros en formato ancho. Para facilitar el análisis temporal, los datos fueron transformados a formato largo, obteniéndose un </w:t>
+      </w:r>
+      <w:proofErr w:type="spellStart"/>
+      <w:r>
+        <w:t>dataset</w:t>
+      </w:r>
+      <w:proofErr w:type="spellEnd"/>
+      <w:r>
+        <w:t xml:space="preserve"> analítico de 17.496 observaciones y 13 variables, donde cada fila representa una combinación de central, fecha y hora. Este proceso exige programación para automatizar la preparación, validación y análisis de los datos de manera reproducible.</w:t>
+      </w:r>
+    </w:p>
+    <w:p>
+      <w:r>
+        <w:t xml:space="preserve">El objetivo general es caracterizar los patrones temporales de generación eléctrica de las tres centrales mediante un proceso reproducible de preparación, validación y análisis. El alcance se mantiene deliberadamente descriptivo: los registros iguales a 0 </w:t>
+      </w:r>
+      <w:proofErr w:type="spellStart"/>
+      <w:r>
+        <w:t>MWh</w:t>
+      </w:r>
+      <w:proofErr w:type="spellEnd"/>
+      <w:r>
+        <w:t xml:space="preserve"> se conservan y analizan como parte de los datos publicados, pero no se atribuyen a fallas, detenciones, mantenimiento u otras causas operacionales que no puedan verificarse con la información disponible.</w:t>
+      </w:r>
+    </w:p>
+    <w:p>
+      <w:r>
+        <w:t xml:space="preserve">El desarrollo se articula en cuatro fases. F1 definió la problemática, los objetivos, el alcance y el entorno reproducible; F2 implementó la preparación, transformación y validación del </w:t>
+      </w:r>
+      <w:proofErr w:type="spellStart"/>
+      <w:r>
+        <w:t>dataset</w:t>
+      </w:r>
+      <w:proofErr w:type="spellEnd"/>
+      <w:r>
+        <w:t>; F3 consolidó el núcleo algorítmico, incorporó mediciones de eficiencia, recursividad y Programación Orientada a Objetos; y F4 integra los resultados, construye las visualizaciones finales, documenta la trazabilidad de mejoras y comunica las conclusiones del proyecto. Esta progresión permite relacionar decisiones técnicas, código, evidencias y resultados dentro de un único flujo reproducible.</w:t>
       </w:r>
     </w:p>
     <w:p>
       <w:pPr>
         <w:pStyle w:val="Ttulo1"/>
       </w:pPr>
+      <w:bookmarkStart w:id="1" w:name="_Toc241865063"/>
       <w:r>
         <w:t>III. Definición de la problemática y objetivos del proyecto</w:t>
       </w:r>
+      <w:bookmarkEnd w:id="1"/>
     </w:p>
     <w:p>
       <w:pPr>
         <w:pStyle w:val="Ttulo2"/>
       </w:pPr>
-      <w:bookmarkStart w:id="1" w:name="_Toc241854661"/>
+      <w:bookmarkStart w:id="2" w:name="_Toc241865064"/>
       <w:r>
         <w:t>3.1 Problemática y pregunta de investigación</w:t>
       </w:r>
-      <w:bookmarkEnd w:id="1"/>
+      <w:bookmarkEnd w:id="2"/>
     </w:p>
     <w:p>
       <w:r>
@@ -3812,6 +4301,11 @@
     <w:p>
       <w:r>
         <w:t>La pregunta se formuló con un alcance analizable y verificable. Por ello, el proyecto se concentra en patrones observables en la serie temporal y evita extender la interpretación hacia causas operacionales, económicas o de mantenimiento que la fuente no permite sustentar.</w:t>
+      </w:r>
+    </w:p>
+    <w:p>
+      <w:r>
+        <w:t>La selección de TER CMPC Laja, TER CMPC Pacífico y TER CMPC Santa Fe delimita un conjunto comparable dentro de una misma fuente de información y bajo un período común de observación. Para cada central se dispone de 243 días de registros entre enero y agosto de 2026, lo que permite trabajar con una base temporal homogénea. Después del filtrado se obtuvieron 729 registros en formato ancho, que posteriormente se transformaron en 17.496 observaciones horarias, manteniendo 24 registros por combinación central-fecha.</w:t>
       </w:r>
     </w:p>
     <w:p>
@@ -3833,12 +4327,12 @@
       <w:pPr>
         <w:pStyle w:val="Ttulo2"/>
       </w:pPr>
-      <w:bookmarkStart w:id="2" w:name="_Toc241854662"/>
+      <w:bookmarkStart w:id="3" w:name="_Toc241865065"/>
       <w:r>
         <w:lastRenderedPageBreak/>
         <w:t>3.2 Objetivo general</w:t>
       </w:r>
-      <w:bookmarkEnd w:id="2"/>
+      <w:bookmarkEnd w:id="3"/>
     </w:p>
     <w:p>
       <w:r>
@@ -3849,11 +4343,11 @@
       <w:pPr>
         <w:pStyle w:val="Ttulo2"/>
       </w:pPr>
-      <w:bookmarkStart w:id="3" w:name="_Toc241854663"/>
+      <w:bookmarkStart w:id="4" w:name="_Toc241865066"/>
       <w:r>
         <w:t>3.3 Objetivos específicos</w:t>
       </w:r>
-      <w:bookmarkEnd w:id="3"/>
+      <w:bookmarkEnd w:id="4"/>
     </w:p>
     <w:p>
       <w:pPr>
@@ -3912,7 +4406,23 @@
           <w:rFonts w:eastAsia="Arial"/>
           <w:lang w:val="es-CL"/>
         </w:rPr>
-        <w:t>Analizar la frecuencia y la distribución temporal de los registros con generación igual a 0 MWh, sin atribuirles causas operacionales que no estén respaldadas por la fuente.</w:t>
+        <w:t xml:space="preserve">Analizar la frecuencia y la distribución temporal de los registros con generación igual a 0 </w:t>
+      </w:r>
+      <w:proofErr w:type="spellStart"/>
+      <w:r>
+        <w:rPr>
+          <w:rFonts w:eastAsia="Arial"/>
+          <w:lang w:val="es-CL"/>
+        </w:rPr>
+        <w:t>MWh</w:t>
+      </w:r>
+      <w:proofErr w:type="spellEnd"/>
+      <w:r>
+        <w:rPr>
+          <w:rFonts w:eastAsia="Arial"/>
+          <w:lang w:val="es-CL"/>
+        </w:rPr>
+        <w:t>, sin atribuirles causas operacionales que no estén respaldadas por la fuente.</w:t>
       </w:r>
     </w:p>
     <w:p>
@@ -3939,11 +4449,11 @@
       <w:pPr>
         <w:pStyle w:val="Ttulo2"/>
       </w:pPr>
-      <w:bookmarkStart w:id="4" w:name="_Toc241854664"/>
+      <w:bookmarkStart w:id="5" w:name="_Toc241865067"/>
       <w:r>
         <w:t>3.4 Alcance, restricciones y supuestos</w:t>
       </w:r>
-      <w:bookmarkEnd w:id="4"/>
+      <w:bookmarkEnd w:id="5"/>
     </w:p>
     <w:p>
       <w:pPr>
@@ -3980,7 +4490,23 @@
           <w:rFonts w:eastAsia="Arial"/>
           <w:lang w:val="es-CL"/>
         </w:rPr>
-        <w:t>Se utilizan exclusivamente datos públicos de Generación Real del CEN y se conserva la escala original de generación en MWh.</w:t>
+        <w:t xml:space="preserve">Se utilizan exclusivamente datos públicos de Generación Real del CEN y se conserva la escala original de generación en </w:t>
+      </w:r>
+      <w:proofErr w:type="spellStart"/>
+      <w:r>
+        <w:rPr>
+          <w:rFonts w:eastAsia="Arial"/>
+          <w:lang w:val="es-CL"/>
+        </w:rPr>
+        <w:t>MWh</w:t>
+      </w:r>
+      <w:proofErr w:type="spellEnd"/>
+      <w:r>
+        <w:rPr>
+          <w:rFonts w:eastAsia="Arial"/>
+          <w:lang w:val="es-CL"/>
+        </w:rPr>
+        <w:t>.</w:t>
       </w:r>
     </w:p>
     <w:p>
@@ -4018,7 +4544,23 @@
           <w:rFonts w:eastAsia="Arial"/>
           <w:lang w:val="es-CL"/>
         </w:rPr>
-        <w:t>Los registros de 0 MWh se conservan como observaciones válidas mientras no exista evidencia suficiente para clasificarlos como errores.</w:t>
+        <w:t xml:space="preserve">Los registros de 0 </w:t>
+      </w:r>
+      <w:proofErr w:type="spellStart"/>
+      <w:r>
+        <w:rPr>
+          <w:rFonts w:eastAsia="Arial"/>
+          <w:lang w:val="es-CL"/>
+        </w:rPr>
+        <w:t>MWh</w:t>
+      </w:r>
+      <w:proofErr w:type="spellEnd"/>
+      <w:r>
+        <w:rPr>
+          <w:rFonts w:eastAsia="Arial"/>
+          <w:lang w:val="es-CL"/>
+        </w:rPr>
+        <w:t xml:space="preserve"> se conservan como observaciones válidas mientras no exista evidencia suficiente para clasificarlos como errores.</w:t>
       </w:r>
     </w:p>
     <w:p>
@@ -4044,11 +4586,11 @@
       <w:pPr>
         <w:pStyle w:val="Ttulo2"/>
       </w:pPr>
-      <w:bookmarkStart w:id="5" w:name="_Toc241854665"/>
+      <w:bookmarkStart w:id="6" w:name="_Toc241865068"/>
       <w:r>
         <w:t>3.5 Articulación con las fases F1–F4</w:t>
       </w:r>
-      <w:bookmarkEnd w:id="5"/>
+      <w:bookmarkEnd w:id="6"/>
     </w:p>
     <w:tbl>
       <w:tblPr>
@@ -4211,7 +4753,15 @@
               <w:cnfStyle w:val="000000000000" w:firstRow="0" w:lastRow="0" w:firstColumn="0" w:lastColumn="0" w:oddVBand="0" w:evenVBand="0" w:oddHBand="0" w:evenHBand="0" w:firstRowFirstColumn="0" w:firstRowLastColumn="0" w:lastRowFirstColumn="0" w:lastRowLastColumn="0"/>
             </w:pPr>
             <w:r>
-              <w:t>Carga, transformación, validación y dataset analítico en formato largo.</w:t>
+              <w:t xml:space="preserve">Carga, transformación, validación y </w:t>
+            </w:r>
+            <w:proofErr w:type="spellStart"/>
+            <w:r>
+              <w:t>dataset</w:t>
+            </w:r>
+            <w:proofErr w:type="spellEnd"/>
+            <w:r>
+              <w:t xml:space="preserve"> analítico en formato largo.</w:t>
             </w:r>
           </w:p>
         </w:tc>
@@ -4351,54 +4901,56 @@
       <w:pPr>
         <w:pStyle w:val="Ttulo1"/>
       </w:pPr>
+      <w:bookmarkStart w:id="7" w:name="_Toc241865069"/>
       <w:r>
         <w:lastRenderedPageBreak/>
         <w:t>IV. Aplicación de herramientas científicas</w:t>
       </w:r>
+      <w:bookmarkEnd w:id="7"/>
     </w:p>
     <w:p>
       <w:pPr>
         <w:pStyle w:val="Ttulo2"/>
         <w:ind w:left="720"/>
       </w:pPr>
-      <w:bookmarkStart w:id="6" w:name="_Toc241854666"/>
+      <w:bookmarkStart w:id="8" w:name="_Toc241865070"/>
       <w:r>
         <w:t>a. Reproducibilidad técnica</w:t>
       </w:r>
-      <w:bookmarkEnd w:id="6"/>
+      <w:bookmarkEnd w:id="8"/>
     </w:p>
     <w:p>
       <w:pPr>
         <w:pStyle w:val="Ttulo2"/>
         <w:ind w:left="720"/>
       </w:pPr>
-      <w:bookmarkStart w:id="7" w:name="_Toc241854667"/>
+      <w:bookmarkStart w:id="9" w:name="_Toc241865071"/>
       <w:r>
         <w:t>b. Control de versiones</w:t>
       </w:r>
-      <w:bookmarkEnd w:id="7"/>
+      <w:bookmarkEnd w:id="9"/>
     </w:p>
     <w:p>
       <w:pPr>
         <w:pStyle w:val="Ttulo2"/>
         <w:ind w:left="720"/>
       </w:pPr>
-      <w:bookmarkStart w:id="8" w:name="_Toc241854668"/>
+      <w:bookmarkStart w:id="10" w:name="_Toc241865072"/>
       <w:r>
         <w:t>c. Documentación del proceso</w:t>
       </w:r>
-      <w:bookmarkEnd w:id="8"/>
+      <w:bookmarkEnd w:id="10"/>
     </w:p>
     <w:p>
       <w:pPr>
         <w:pStyle w:val="Ttulo2"/>
         <w:ind w:left="720"/>
       </w:pPr>
-      <w:bookmarkStart w:id="9" w:name="_Toc241854669"/>
+      <w:bookmarkStart w:id="11" w:name="_Toc241865073"/>
       <w:r>
         <w:t>d. Repositorio GitHub actualizado</w:t>
       </w:r>
-      <w:bookmarkEnd w:id="9"/>
+      <w:bookmarkEnd w:id="11"/>
     </w:p>
     <w:p>
       <w:pPr>
@@ -4420,77 +4972,82 @@
       <w:pPr>
         <w:pStyle w:val="Ttulo1"/>
       </w:pPr>
-      <w:bookmarkStart w:id="10" w:name="_Toc241854670"/>
+      <w:bookmarkStart w:id="12" w:name="_Toc241865074"/>
       <w:r>
         <w:t>V. Diseño de soluciones algorítmicas eficientes</w:t>
       </w:r>
-      <w:bookmarkEnd w:id="10"/>
+      <w:bookmarkEnd w:id="12"/>
     </w:p>
     <w:p>
       <w:pPr>
         <w:pStyle w:val="Ttulo2"/>
         <w:ind w:left="720"/>
       </w:pPr>
-      <w:bookmarkStart w:id="11" w:name="_Toc241854671"/>
+      <w:bookmarkStart w:id="13" w:name="_Toc241865075"/>
       <w:r>
         <w:t>a. Codificación funcional</w:t>
       </w:r>
-      <w:bookmarkEnd w:id="11"/>
+      <w:bookmarkEnd w:id="13"/>
     </w:p>
     <w:p>
       <w:pPr>
         <w:pStyle w:val="Ttulo2"/>
         <w:ind w:left="720"/>
       </w:pPr>
-      <w:bookmarkStart w:id="12" w:name="_Toc241854672"/>
-      <w:r>
-        <w:t>b. Preprocesamiento y transformación del dataset</w:t>
-      </w:r>
-      <w:bookmarkEnd w:id="12"/>
+      <w:bookmarkStart w:id="14" w:name="_Toc241865076"/>
+      <w:r>
+        <w:t xml:space="preserve">b. Preprocesamiento y transformación del </w:t>
+      </w:r>
+      <w:proofErr w:type="spellStart"/>
+      <w:r>
+        <w:t>dataset</w:t>
+      </w:r>
+      <w:bookmarkEnd w:id="14"/>
+      <w:proofErr w:type="spellEnd"/>
     </w:p>
     <w:p>
       <w:pPr>
         <w:pStyle w:val="Ttulo2"/>
         <w:ind w:left="720"/>
       </w:pPr>
-      <w:bookmarkStart w:id="13" w:name="_Toc241854673"/>
+      <w:bookmarkStart w:id="15" w:name="_Toc241865077"/>
       <w:r>
         <w:t>c. Validación técnica y verificación del código</w:t>
       </w:r>
-      <w:bookmarkEnd w:id="13"/>
+      <w:bookmarkEnd w:id="15"/>
     </w:p>
     <w:p>
       <w:pPr>
         <w:pStyle w:val="Ttulo2"/>
         <w:ind w:left="720"/>
       </w:pPr>
-      <w:bookmarkStart w:id="14" w:name="_Toc241854674"/>
+      <w:bookmarkStart w:id="16" w:name="_Toc241865078"/>
       <w:r>
         <w:t>d. Eficiencia y optimización</w:t>
       </w:r>
-      <w:bookmarkEnd w:id="14"/>
+      <w:bookmarkEnd w:id="16"/>
     </w:p>
     <w:p>
       <w:pPr>
         <w:pStyle w:val="Ttulo2"/>
         <w:ind w:left="720"/>
       </w:pPr>
-      <w:bookmarkStart w:id="15" w:name="_Toc241854675"/>
+      <w:bookmarkStart w:id="17" w:name="_Toc241865079"/>
       <w:r>
         <w:t>e. Diseño estructurado del código</w:t>
       </w:r>
-      <w:bookmarkEnd w:id="15"/>
+      <w:bookmarkEnd w:id="17"/>
     </w:p>
     <w:p>
       <w:pPr>
         <w:pStyle w:val="Ttulo2"/>
         <w:ind w:left="720"/>
       </w:pPr>
-      <w:bookmarkStart w:id="16" w:name="_Toc241854676"/>
+      <w:bookmarkStart w:id="18" w:name="_Toc241865080"/>
       <w:r>
         <w:t>f. Notebook final ejecutado y documentado</w:t>
       </w:r>
-      <w:bookmarkEnd w:id="16"/>
+      <w:bookmarkEnd w:id="18"/>
     </w:p>
     <w:p>
       <w:pPr>
@@ -4512,33 +5069,33 @@
       <w:pPr>
         <w:pStyle w:val="Ttulo1"/>
       </w:pPr>
-      <w:bookmarkStart w:id="17" w:name="_Toc241854677"/>
+      <w:bookmarkStart w:id="19" w:name="_Toc241865081"/>
       <w:r>
         <w:t>VI. Implementación de código modular y robusto</w:t>
       </w:r>
-      <w:bookmarkEnd w:id="17"/>
+      <w:bookmarkEnd w:id="19"/>
     </w:p>
     <w:p>
       <w:pPr>
         <w:pStyle w:val="Ttulo2"/>
         <w:ind w:left="720"/>
       </w:pPr>
-      <w:bookmarkStart w:id="18" w:name="_Toc241854678"/>
+      <w:bookmarkStart w:id="20" w:name="_Toc241865082"/>
       <w:r>
         <w:t>a. Programación orientada a objetos</w:t>
       </w:r>
-      <w:bookmarkEnd w:id="18"/>
+      <w:bookmarkEnd w:id="20"/>
     </w:p>
     <w:p>
       <w:pPr>
         <w:pStyle w:val="Ttulo2"/>
         <w:ind w:left="720"/>
       </w:pPr>
-      <w:bookmarkStart w:id="19" w:name="_Toc241854679"/>
+      <w:bookmarkStart w:id="21" w:name="_Toc241865083"/>
       <w:r>
         <w:t>b. Documentación de arquitectura</w:t>
       </w:r>
-      <w:bookmarkEnd w:id="19"/>
+      <w:bookmarkEnd w:id="21"/>
     </w:p>
     <w:p>
       <w:pPr>
@@ -4560,33 +5117,33 @@
       <w:pPr>
         <w:pStyle w:val="Ttulo1"/>
       </w:pPr>
-      <w:bookmarkStart w:id="20" w:name="_Toc241854680"/>
+      <w:bookmarkStart w:id="22" w:name="_Toc241865084"/>
       <w:r>
         <w:t>VII. Construcción de visualizaciones de datos efectivas</w:t>
       </w:r>
-      <w:bookmarkEnd w:id="20"/>
+      <w:bookmarkEnd w:id="22"/>
     </w:p>
     <w:p>
       <w:pPr>
         <w:pStyle w:val="Ttulo2"/>
         <w:ind w:left="720"/>
       </w:pPr>
-      <w:bookmarkStart w:id="21" w:name="_Toc241854681"/>
+      <w:bookmarkStart w:id="23" w:name="_Toc241865085"/>
       <w:r>
         <w:t>a. Preprocesamiento y transformación de datos</w:t>
       </w:r>
-      <w:bookmarkEnd w:id="21"/>
+      <w:bookmarkEnd w:id="23"/>
     </w:p>
     <w:p>
       <w:pPr>
         <w:pStyle w:val="Ttulo2"/>
         <w:ind w:left="720"/>
       </w:pPr>
-      <w:bookmarkStart w:id="22" w:name="_Toc241854682"/>
+      <w:bookmarkStart w:id="24" w:name="_Toc241865086"/>
       <w:r>
         <w:t>b. Visualizaciones analíticas</w:t>
       </w:r>
-      <w:bookmarkEnd w:id="22"/>
+      <w:bookmarkEnd w:id="24"/>
     </w:p>
     <w:p>
       <w:pPr>
@@ -4608,66 +5165,66 @@
       <w:pPr>
         <w:pStyle w:val="Ttulo1"/>
       </w:pPr>
-      <w:bookmarkStart w:id="23" w:name="_Toc241854683"/>
+      <w:bookmarkStart w:id="25" w:name="_Toc241865087"/>
       <w:r>
         <w:t>VIII. Metodología del desarrollo técnico</w:t>
       </w:r>
-      <w:bookmarkEnd w:id="23"/>
+      <w:bookmarkEnd w:id="25"/>
     </w:p>
     <w:p>
       <w:pPr>
         <w:pStyle w:val="Ttulo2"/>
         <w:ind w:left="720"/>
       </w:pPr>
-      <w:bookmarkStart w:id="24" w:name="_Toc241854684"/>
+      <w:bookmarkStart w:id="26" w:name="_Toc241865088"/>
       <w:r>
         <w:t>a. Validación y reflexión técnica</w:t>
       </w:r>
-      <w:bookmarkEnd w:id="24"/>
+      <w:bookmarkEnd w:id="26"/>
     </w:p>
     <w:p>
       <w:pPr>
         <w:pStyle w:val="Ttulo2"/>
         <w:ind w:left="720"/>
       </w:pPr>
-      <w:bookmarkStart w:id="25" w:name="_Toc241854685"/>
+      <w:bookmarkStart w:id="27" w:name="_Toc241865089"/>
       <w:r>
         <w:t>b. Resultados</w:t>
       </w:r>
-      <w:bookmarkEnd w:id="25"/>
+      <w:bookmarkEnd w:id="27"/>
     </w:p>
     <w:p>
       <w:pPr>
         <w:pStyle w:val="Ttulo2"/>
         <w:ind w:left="720"/>
       </w:pPr>
-      <w:bookmarkStart w:id="26" w:name="_Toc241854686"/>
+      <w:bookmarkStart w:id="28" w:name="_Toc241865090"/>
       <w:r>
         <w:t>c. Discusión</w:t>
       </w:r>
-      <w:bookmarkEnd w:id="26"/>
+      <w:bookmarkEnd w:id="28"/>
     </w:p>
     <w:p>
       <w:pPr>
         <w:pStyle w:val="Ttulo2"/>
         <w:ind w:left="720"/>
       </w:pPr>
-      <w:bookmarkStart w:id="27" w:name="_Toc241854687"/>
+      <w:bookmarkStart w:id="29" w:name="_Toc241865091"/>
       <w:r>
         <w:t>d. Conclusiones</w:t>
       </w:r>
-      <w:bookmarkEnd w:id="27"/>
+      <w:bookmarkEnd w:id="29"/>
     </w:p>
     <w:p>
       <w:pPr>
         <w:pStyle w:val="Ttulo2"/>
         <w:ind w:left="720"/>
       </w:pPr>
-      <w:bookmarkStart w:id="28" w:name="_Toc241854688"/>
+      <w:bookmarkStart w:id="30" w:name="_Toc241865092"/>
       <w:r>
         <w:t>e. Trazabilidad de mejoras</w:t>
       </w:r>
-      <w:bookmarkEnd w:id="28"/>
+      <w:bookmarkEnd w:id="30"/>
     </w:p>
     <w:p>
       <w:pPr>
@@ -4683,13 +5240,29 @@
       </w:pPr>
       <w:r>
         <w:lastRenderedPageBreak/>
-        <w:t>En la primera evaluación se identificaron, entre otros aspectos, una modularización incompleta del pipeline, validaciones concentradas en una única función, inconsistencias en las identidades registradas por Git y falta de evidencia suficiente de ejecución reproducible de</w:t>
+        <w:t xml:space="preserve">En la primera evaluación se identificaron, entre otros aspectos, una </w:t>
+      </w:r>
+      <w:proofErr w:type="spellStart"/>
+      <w:r>
+        <w:t>modularización</w:t>
+      </w:r>
+      <w:proofErr w:type="spellEnd"/>
+      <w:r>
+        <w:t xml:space="preserve"> incompleta del pipeline, validaciones concentradas en una única función, inconsistencias en las identidades registradas por Git y falta de evidencia suficiente de ejecución reproducible de</w:t>
       </w:r>
       <w:r>
         <w:t>l</w:t>
       </w:r>
       <w:r>
-        <w:t xml:space="preserve"> notebook. También se solicitó documentar con mayor claridad el impacto de las transformaciones y profundizar el análisis temporal de los registros de generación igual a 0 MWh. </w:t>
+        <w:t xml:space="preserve"> notebook. También se solicitó documentar con mayor claridad el impacto de las transformaciones y profundizar el análisis temporal de los registros de generación igual a 0 </w:t>
+      </w:r>
+      <w:proofErr w:type="spellStart"/>
+      <w:r>
+        <w:t>MWh</w:t>
+      </w:r>
+      <w:proofErr w:type="spellEnd"/>
+      <w:r>
+        <w:t xml:space="preserve">. </w:t>
       </w:r>
     </w:p>
     <w:p>
@@ -4697,7 +5270,39 @@
         <w:ind w:left="720"/>
       </w:pPr>
       <w:r>
-        <w:t>Estas observaciones fueron abordadas durante la Fase 3. El propio feedback posterior confirmó que la modularización fue ampliada, las reglas de validación se parametrizaron y separaron, las identidades de Git se consolidaron mediante .mailmap y los notebooks comenzaron a ejecutarse desde kernel limpio.</w:t>
+        <w:t xml:space="preserve">Estas observaciones fueron abordadas durante la Fase 3. El propio </w:t>
+      </w:r>
+      <w:proofErr w:type="spellStart"/>
+      <w:r>
+        <w:t>feedback</w:t>
+      </w:r>
+      <w:proofErr w:type="spellEnd"/>
+      <w:r>
+        <w:t xml:space="preserve"> posterior confirmó que la </w:t>
+      </w:r>
+      <w:proofErr w:type="spellStart"/>
+      <w:r>
+        <w:t>modularización</w:t>
+      </w:r>
+      <w:proofErr w:type="spellEnd"/>
+      <w:r>
+        <w:t xml:space="preserve"> fue ampliada, las reglas de validación se parametrizaron y separaron, las identidades de Git se consolidaron mediante .</w:t>
+      </w:r>
+      <w:proofErr w:type="spellStart"/>
+      <w:r>
+        <w:t>mailmap</w:t>
+      </w:r>
+      <w:proofErr w:type="spellEnd"/>
+      <w:r>
+        <w:t xml:space="preserve"> y los notebooks comenzaron a ejecutarse desde </w:t>
+      </w:r>
+      <w:proofErr w:type="spellStart"/>
+      <w:r>
+        <w:t>kernel</w:t>
+      </w:r>
+      <w:proofErr w:type="spellEnd"/>
+      <w:r>
+        <w:t xml:space="preserve"> limpio.</w:t>
       </w:r>
     </w:p>
     <w:p>
@@ -4802,8 +5407,13 @@
               <w:cnfStyle w:val="100000000000" w:firstRow="1" w:lastRow="0" w:firstColumn="0" w:lastColumn="0" w:oddVBand="0" w:evenVBand="0" w:oddHBand="0" w:evenHBand="0" w:firstRowFirstColumn="0" w:firstRowLastColumn="0" w:lastRowFirstColumn="0" w:lastRowLastColumn="0"/>
             </w:pPr>
             <w:r>
-              <w:t>Evidencia / commit</w:t>
-            </w:r>
+              <w:t xml:space="preserve">Evidencia / </w:t>
+            </w:r>
+            <w:proofErr w:type="spellStart"/>
+            <w:r>
+              <w:t>commit</w:t>
+            </w:r>
+            <w:proofErr w:type="spellEnd"/>
           </w:p>
         </w:tc>
         <w:tc>
@@ -4840,8 +5450,13 @@
               <w:ind w:left="30" w:hanging="11"/>
               <w:jc w:val="left"/>
             </w:pPr>
-            <w:r>
-              <w:t>Modularización insuficiente del pipeline</w:t>
+            <w:proofErr w:type="spellStart"/>
+            <w:r>
+              <w:t>Modularización</w:t>
+            </w:r>
+            <w:proofErr w:type="spellEnd"/>
+            <w:r>
+              <w:t xml:space="preserve"> insuficiente del pipeline</w:t>
             </w:r>
           </w:p>
         </w:tc>
@@ -5001,7 +5616,15 @@
               <w:cnfStyle w:val="000000100000" w:firstRow="0" w:lastRow="0" w:firstColumn="0" w:lastColumn="0" w:oddVBand="0" w:evenVBand="0" w:oddHBand="1" w:evenHBand="0" w:firstRowFirstColumn="0" w:firstRowLastColumn="0" w:lastRowFirstColumn="0" w:lastRowLastColumn="0"/>
             </w:pPr>
             <w:r>
-              <w:t>Se incorporó y corrigió .mailmap para consolidar las identidades del equipo</w:t>
+              <w:t>Se incorporó y corrigió .</w:t>
+            </w:r>
+            <w:proofErr w:type="spellStart"/>
+            <w:r>
+              <w:t>mailmap</w:t>
+            </w:r>
+            <w:proofErr w:type="spellEnd"/>
+            <w:r>
+              <w:t xml:space="preserve"> para consolidar las identidades del equipo</w:t>
             </w:r>
           </w:p>
         </w:tc>
@@ -5054,7 +5677,15 @@
               <w:jc w:val="left"/>
             </w:pPr>
             <w:r>
-              <w:t>Notebooks sin evidencia completa de ejecución desde kernel limpio</w:t>
+              <w:t xml:space="preserve">Notebooks sin evidencia completa de ejecución desde </w:t>
+            </w:r>
+            <w:proofErr w:type="spellStart"/>
+            <w:r>
+              <w:t>kernel</w:t>
+            </w:r>
+            <w:proofErr w:type="spellEnd"/>
+            <w:r>
+              <w:t xml:space="preserve"> limpio</w:t>
             </w:r>
           </w:p>
         </w:tc>
@@ -5071,7 +5702,15 @@
               <w:cnfStyle w:val="000000000000" w:firstRow="0" w:lastRow="0" w:firstColumn="0" w:lastColumn="0" w:oddVBand="0" w:evenVBand="0" w:oddHBand="0" w:evenHBand="0" w:firstRowFirstColumn="0" w:firstRowLastColumn="0" w:lastRowFirstColumn="0" w:lastRowLastColumn="0"/>
             </w:pPr>
             <w:r>
-              <w:t>Se corrigió y verificó la ejecución reproducible de F1 y F2; posteriormente F3 también fue validado desde kernel reiniciado</w:t>
+              <w:t xml:space="preserve">Se corrigió y verificó la ejecución reproducible de F1 y F2; posteriormente F3 también fue validado desde </w:t>
+            </w:r>
+            <w:proofErr w:type="spellStart"/>
+            <w:r>
+              <w:t>kernel</w:t>
+            </w:r>
+            <w:proofErr w:type="spellEnd"/>
+            <w:r>
+              <w:t xml:space="preserve"> reiniciado</w:t>
             </w:r>
           </w:p>
         </w:tc>
@@ -5144,7 +5783,15 @@
               <w:cnfStyle w:val="000000100000" w:firstRow="0" w:lastRow="0" w:firstColumn="0" w:lastColumn="0" w:oddVBand="0" w:evenVBand="0" w:oddHBand="1" w:evenHBand="0" w:firstRowFirstColumn="0" w:firstRowLastColumn="0" w:lastRowFirstColumn="0" w:lastRowLastColumn="0"/>
             </w:pPr>
             <w:r>
-              <w:t>Se incorporaron benchmarks y comparación entre implementaciones</w:t>
+              <w:t xml:space="preserve">Se incorporaron </w:t>
+            </w:r>
+            <w:proofErr w:type="spellStart"/>
+            <w:r>
+              <w:t>benchmarks</w:t>
+            </w:r>
+            <w:proofErr w:type="spellEnd"/>
+            <w:r>
+              <w:t xml:space="preserve"> y comparación entre implementaciones</w:t>
             </w:r>
           </w:p>
         </w:tc>
@@ -5297,7 +5944,15 @@
               <w:cnfStyle w:val="000000100000" w:firstRow="0" w:lastRow="0" w:firstColumn="0" w:lastColumn="0" w:oddVBand="0" w:evenVBand="0" w:oddHBand="1" w:evenHBand="0" w:firstRowFirstColumn="0" w:firstRowLastColumn="0" w:lastRowFirstColumn="0" w:lastRowLastColumn="0"/>
             </w:pPr>
             <w:r>
-              <w:t>Se creó changelog.md con fecha, descripción, commit, justificación e impacto</w:t>
+              <w:t xml:space="preserve">Se creó changelog.md con fecha, descripción, </w:t>
+            </w:r>
+            <w:proofErr w:type="spellStart"/>
+            <w:r>
+              <w:t>commit</w:t>
+            </w:r>
+            <w:proofErr w:type="spellEnd"/>
+            <w:r>
+              <w:t>, justificación e impacto</w:t>
             </w:r>
           </w:p>
         </w:tc>
@@ -5417,7 +6072,15 @@
         <w:ind w:left="720"/>
       </w:pPr>
       <w:r>
-        <w:t>Los commits asociados a estas mejoras son verificables en el historial del repositorio. Por ejemplo, la refactorización de validaciones se registró en a4e655d, la mejora del pipeline POO y del filtrado temporal en 2a7372f, y la consolidación de la trazabilidad F1–F4 en 8f9f73e.</w:t>
+        <w:t xml:space="preserve">Los </w:t>
+      </w:r>
+      <w:proofErr w:type="spellStart"/>
+      <w:r>
+        <w:t>commits</w:t>
+      </w:r>
+      <w:proofErr w:type="spellEnd"/>
+      <w:r>
+        <w:t xml:space="preserve"> asociados a estas mejoras son verificables en el historial del repositorio. Por ejemplo, la refactorización de validaciones se registró en a4e655d, la mejora del pipeline POO y del filtrado temporal en 2a7372f, y la consolidación de la trazabilidad F1–F4 en 8f9f73e.</w:t>
       </w:r>
     </w:p>
     <w:p>
@@ -5433,11 +6096,11 @@
       <w:pPr>
         <w:pStyle w:val="Ttulo1"/>
       </w:pPr>
-      <w:bookmarkStart w:id="29" w:name="_Toc241854689"/>
+      <w:bookmarkStart w:id="31" w:name="_Toc241865093"/>
       <w:r>
         <w:t>IX. Presentación Audiovisual</w:t>
       </w:r>
-      <w:bookmarkEnd w:id="29"/>
+      <w:bookmarkEnd w:id="31"/>
     </w:p>
     <w:p>
       <w:pPr>
@@ -5459,11 +6122,11 @@
       <w:pPr>
         <w:pStyle w:val="Ttulo1"/>
       </w:pPr>
-      <w:bookmarkStart w:id="30" w:name="_Toc241854690"/>
+      <w:bookmarkStart w:id="32" w:name="_Toc241865094"/>
       <w:r>
         <w:t>X. Bibliografía</w:t>
       </w:r>
-      <w:bookmarkEnd w:id="30"/>
+      <w:bookmarkEnd w:id="32"/>
     </w:p>
     <w:p>
       <w:pPr>
@@ -5669,7 +6332,7 @@
             </wp:anchor>
           </w:drawing>
         </mc:Choice>
-        <mc:Fallback xmlns:a="http://schemas.openxmlformats.org/drawingml/2006/main" xmlns:pic="http://schemas.openxmlformats.org/drawingml/2006/picture">
+        <mc:Fallback xmlns:pic="http://schemas.openxmlformats.org/drawingml/2006/picture" xmlns:a="http://schemas.openxmlformats.org/drawingml/2006/main">
           <w:pict>
             <v:shape id="Graphic 17" style="position:absolute;margin-left:42.5pt;margin-top:739.9pt;width:218.15pt;height:.1pt;z-index:-15813632;visibility:visible;mso-wrap-style:square;mso-wrap-distance-left:0;mso-wrap-distance-top:0;mso-wrap-distance-right:0;mso-wrap-distance-bottom:0;mso-position-horizontal:absolute;mso-position-horizontal-relative:page;mso-position-vertical:absolute;mso-position-vertical-relative:page;v-text-anchor:top" coordsize="2770505,1270" o:spid="_x0000_s1026" filled="f" strokecolor="#1d4b63" path="m,l2770204,e" o:gfxdata="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" w14:anchorId="0747A2B0">
               <v:path arrowok="t"/>
@@ -5748,7 +6411,7 @@
             </wp:anchor>
           </w:drawing>
         </mc:Choice>
-        <mc:Fallback xmlns:a="http://schemas.openxmlformats.org/drawingml/2006/main" xmlns:pic="http://schemas.openxmlformats.org/drawingml/2006/picture">
+        <mc:Fallback xmlns:pic="http://schemas.openxmlformats.org/drawingml/2006/picture" xmlns:a="http://schemas.openxmlformats.org/drawingml/2006/main">
           <w:pict>
             <v:shape id="Graphic 18" style="position:absolute;margin-left:371.35pt;margin-top:739.9pt;width:198.15pt;height:.1pt;z-index:-15813120;visibility:visible;mso-wrap-style:square;mso-wrap-distance-left:0;mso-wrap-distance-top:0;mso-wrap-distance-right:0;mso-wrap-distance-bottom:0;mso-position-horizontal:absolute;mso-position-horizontal-relative:page;mso-position-vertical:absolute;mso-position-vertical-relative:page;v-text-anchor:top" coordsize="2516505,1270" o:spid="_x0000_s1026" filled="f" strokecolor="#1d4b63" path="m,l2516399,e" o:gfxdata="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" w14:anchorId="3C0EE5FF">
               <v:path arrowok="t"/>
@@ -5892,7 +6555,7 @@
             </wp:anchor>
           </w:drawing>
         </mc:Choice>
-        <mc:Fallback xmlns:a="http://schemas.openxmlformats.org/drawingml/2006/main" xmlns:pic="http://schemas.openxmlformats.org/drawingml/2006/picture">
+        <mc:Fallback xmlns:pic="http://schemas.openxmlformats.org/drawingml/2006/picture" xmlns:a="http://schemas.openxmlformats.org/drawingml/2006/main">
           <w:pict>
             <v:group id="Group 12" style="position:absolute;margin-left:42.5pt;margin-top:37.85pt;width:527pt;height:9.1pt;z-index:-15815168;mso-wrap-distance-left:0;mso-wrap-distance-right:0;mso-position-horizontal-relative:page;mso-position-vertical-relative:page" coordsize="66929,1155" o:spid="_x0000_s1026" w14:anchorId="58BDBA3A" o:gfxdata="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">
               <v:shape id="Graphic 13" style="position:absolute;left:539;top:551;width:66390;height:13;visibility:visible;mso-wrap-style:square;v-text-anchor:top" coordsize="6638925,1270" o:spid="_x0000_s1027" filled="f" strokecolor="#1d4b63" path="m,l6638404,e" o:gfxdata="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">
@@ -8690,10 +9353,6 @@
 </file>
 
 <file path=customXml/item1.xml><?xml version="1.0" encoding="utf-8"?>
-<b:Sources xmlns:b="http://schemas.openxmlformats.org/officeDocument/2006/bibliography" xmlns="http://schemas.openxmlformats.org/officeDocument/2006/bibliography" SelectedStyle="\APASixthEditionOfficeOnline.xsl" StyleName="APA" Version="6"/>
-</file>
-
-<file path=customXml/item2.xml><?xml version="1.0" encoding="utf-8"?>
 <p:properties xmlns:p="http://schemas.microsoft.com/office/2006/metadata/properties" xmlns:xsi="http://www.w3.org/2001/XMLSchema-instance" xmlns:pc="http://schemas.microsoft.com/office/infopath/2007/PartnerControls">
   <documentManagement>
     <_ApprovalAssignedTo xmlns="0a2fff00-f002-44e7-b50c-b90cb65110b9">
@@ -8715,7 +9374,20 @@
 </p:properties>
 </file>
 
+<file path=customXml/item2.xml><?xml version="1.0" encoding="utf-8"?>
+<b:Sources xmlns:b="http://schemas.openxmlformats.org/officeDocument/2006/bibliography" xmlns="http://schemas.openxmlformats.org/officeDocument/2006/bibliography" SelectedStyle="\APASixthEditionOfficeOnline.xsl" StyleName="APA" Version="6"/>
+</file>
+
 <file path=customXml/item3.xml><?xml version="1.0" encoding="utf-8"?>
+<?mso-contentType ?>
+<FormTemplates xmlns="http://schemas.microsoft.com/sharepoint/v3/contenttype/forms">
+  <Display>DocumentLibraryForm</Display>
+  <Edit>DocumentLibraryForm</Edit>
+  <New>DocumentLibraryForm</New>
+</FormTemplates>
+</file>
+
+<file path=customXml/item4.xml><?xml version="1.0" encoding="utf-8"?>
 <ct:contentTypeSchema xmlns:ct="http://schemas.microsoft.com/office/2006/metadata/contentType" xmlns:ma="http://schemas.microsoft.com/office/2006/metadata/properties/metaAttributes" ct:_="" ma:_="" ma:contentTypeName="Documento" ma:contentTypeID="0x010100E4D0EA28D091FE4192BEFA8519B37564" ma:contentTypeVersion="11" ma:contentTypeDescription="Crear nuevo documento." ma:contentTypeScope="" ma:versionID="03233efde1029e2378ce26f68e4e04a7">
   <xsd:schema xmlns:xsd="http://www.w3.org/2001/XMLSchema" xmlns:xs="http://www.w3.org/2001/XMLSchema" xmlns:p="http://schemas.microsoft.com/office/2006/metadata/properties" xmlns:ns2="0a2fff00-f002-44e7-b50c-b90cb65110b9" targetNamespace="http://schemas.microsoft.com/office/2006/metadata/properties" ma:root="true" ma:fieldsID="0c61ffaedf55a65463b0f7398d7e3f83" ns2:_="">
     <xsd:import namespace="0a2fff00-f002-44e7-b50c-b90cb65110b9"/>
@@ -8943,24 +9615,7 @@
 </ct:contentTypeSchema>
 </file>
 
-<file path=customXml/item4.xml><?xml version="1.0" encoding="utf-8"?>
-<?mso-contentType ?>
-<FormTemplates xmlns="http://schemas.microsoft.com/sharepoint/v3/contenttype/forms">
-  <Display>DocumentLibraryForm</Display>
-  <Edit>DocumentLibraryForm</Edit>
-  <New>DocumentLibraryForm</New>
-</FormTemplates>
-</file>
-
 <file path=customXml/itemProps1.xml><?xml version="1.0" encoding="utf-8"?>
-<ds:datastoreItem xmlns:ds="http://schemas.openxmlformats.org/officeDocument/2006/customXml" ds:itemID="{FACB83BB-458E-4CCB-91D7-35CFBA93934D}">
-  <ds:schemaRefs>
-    <ds:schemaRef ds:uri="http://schemas.openxmlformats.org/officeDocument/2006/bibliography"/>
-  </ds:schemaRefs>
-</ds:datastoreItem>
-</file>
-
-<file path=customXml/itemProps2.xml><?xml version="1.0" encoding="utf-8"?>
 <ds:datastoreItem xmlns:ds="http://schemas.openxmlformats.org/officeDocument/2006/customXml" ds:itemID="{662F60C8-4BC5-4139-BE63-6954D22D77BD}">
   <ds:schemaRefs>
     <ds:schemaRef ds:uri="http://schemas.microsoft.com/office/2006/metadata/properties"/>
@@ -8970,7 +9625,23 @@
 </ds:datastoreItem>
 </file>
 
+<file path=customXml/itemProps2.xml><?xml version="1.0" encoding="utf-8"?>
+<ds:datastoreItem xmlns:ds="http://schemas.openxmlformats.org/officeDocument/2006/customXml" ds:itemID="{FACB83BB-458E-4CCB-91D7-35CFBA93934D}">
+  <ds:schemaRefs>
+    <ds:schemaRef ds:uri="http://schemas.openxmlformats.org/officeDocument/2006/bibliography"/>
+  </ds:schemaRefs>
+</ds:datastoreItem>
+</file>
+
 <file path=customXml/itemProps3.xml><?xml version="1.0" encoding="utf-8"?>
+<ds:datastoreItem xmlns:ds="http://schemas.openxmlformats.org/officeDocument/2006/customXml" ds:itemID="{084C26D9-49C9-4ADB-A387-DA6079798921}">
+  <ds:schemaRefs>
+    <ds:schemaRef ds:uri="http://schemas.microsoft.com/sharepoint/v3/contenttype/forms"/>
+  </ds:schemaRefs>
+</ds:datastoreItem>
+</file>
+
+<file path=customXml/itemProps4.xml><?xml version="1.0" encoding="utf-8"?>
 <ds:datastoreItem xmlns:ds="http://schemas.openxmlformats.org/officeDocument/2006/customXml" ds:itemID="{23546E79-64AE-4765-BD79-8F86E2CE885D}">
   <ds:schemaRefs>
     <ds:schemaRef ds:uri="http://schemas.microsoft.com/office/2006/metadata/contentType"/>
@@ -8986,12 +9657,4 @@
     <ds:schemaRef ds:uri="http://schemas.microsoft.com/internal/obd"/>
   </ds:schemaRefs>
 </ds:datastoreItem>
-</file>
-
-<file path=customXml/itemProps4.xml><?xml version="1.0" encoding="utf-8"?>
-<ds:datastoreItem xmlns:ds="http://schemas.openxmlformats.org/officeDocument/2006/customXml" ds:itemID="{084C26D9-49C9-4ADB-A387-DA6079798921}">
-  <ds:schemaRefs>
-    <ds:schemaRef ds:uri="http://schemas.microsoft.com/sharepoint/v3/contenttype/forms"/>
-  </ds:schemaRefs>
-</ds:datastoreItem>
 </file>
</xml_diff>

<commit_message>
docs: Sección 3.1 f4_S03_evaluacion_entregable_grupo2.docx - Añade justificación selección centrales CMPC
</commit_message>
<xml_diff>
--- a/docs/f4_s03_evaluacion_entregable_grupo2.docx
+++ b/docs/f4_s03_evaluacion_entregable_grupo2.docx
@@ -1,11 +1,12 @@
 
 <file path=word/document.xml><?xml version="1.0" encoding="utf-8"?>
-<w:document xmlns:wpc="http://schemas.microsoft.com/office/word/2010/wordprocessingCanvas" xmlns:cx="http://schemas.microsoft.com/office/drawing/2014/chartex" xmlns:cx1="http://schemas.microsoft.com/office/drawing/2015/9/8/chartex" xmlns:cx2="http://schemas.microsoft.com/office/drawing/2015/10/21/chartex" xmlns:cx3="http://schemas.microsoft.com/office/drawing/2016/5/9/chartex" xmlns:cx4="http://schemas.microsoft.com/office/drawing/2016/5/10/chartex" xmlns:cx5="http://schemas.microsoft.com/office/drawing/2016/5/11/chartex" xmlns:cx6="http://schemas.microsoft.com/office/drawing/2016/5/12/chartex" xmlns:cx7="http://schemas.microsoft.com/office/drawing/2016/5/13/chartex" xmlns:cx8="http://schemas.microsoft.com/office/drawing/2016/5/14/chartex" xmlns:mc="http://schemas.openxmlformats.org/markup-compatibility/2006" xmlns:aink="http://schemas.microsoft.com/office/drawing/2016/ink" xmlns:am3d="http://schemas.microsoft.com/office/drawing/2017/model3d" xmlns:o="urn:schemas-microsoft-com:office:office" xmlns:oel="http://schemas.microsoft.com/office/2019/extlst" xmlns:r="http://schemas.openxmlformats.org/officeDocument/2006/relationships" xmlns:m="http://schemas.openxmlformats.org/officeDocument/2006/math" xmlns:v="urn:schemas-microsoft-com:vml" xmlns:wp14="http://schemas.microsoft.com/office/word/2010/wordprocessingDrawing" xmlns:wp="http://schemas.openxmlformats.org/drawingml/2006/wordprocessingDrawing" xmlns:w10="urn:schemas-microsoft-com:office:word" xmlns:w="http://schemas.openxmlformats.org/wordprocessingml/2006/main" xmlns:w14="http://schemas.microsoft.com/office/word/2010/wordml" xmlns:w15="http://schemas.microsoft.com/office/word/2012/wordml" xmlns:w16cex="http://schemas.microsoft.com/office/word/2018/wordml/cex" xmlns:w16cid="http://schemas.microsoft.com/office/word/2016/wordml/cid" xmlns:w16="http://schemas.microsoft.com/office/word/2018/wordml" xmlns:w16du="http://schemas.microsoft.com/office/word/2023/wordml/word16du" xmlns:w16sdtdh="http://schemas.microsoft.com/office/word/2020/wordml/sdtdatahash" xmlns:w16sdtfl="http://schemas.microsoft.com/office/word/2024/wordml/sdtformatlock" xmlns:w16se="http://schemas.microsoft.com/office/word/2015/wordml/symex" xmlns:wpg="http://schemas.microsoft.com/office/word/2010/wordprocessingGroup" xmlns:wpi="http://schemas.microsoft.com/office/word/2010/wordprocessingInk" xmlns:wne="http://schemas.microsoft.com/office/word/2006/wordml" xmlns:wps="http://schemas.microsoft.com/office/word/2010/wordprocessingShape" mc:Ignorable="w14 w15 w16se w16cid w16 w16cex w16sdtdh w16sdtfl w16du wp14">
+<w:document xmlns:wpc="http://schemas.microsoft.com/office/word/2010/wordprocessingCanvas" xmlns:cx="http://schemas.microsoft.com/office/drawing/2014/chartex" xmlns:mc="http://schemas.openxmlformats.org/markup-compatibility/2006" xmlns:o="urn:schemas-microsoft-com:office:office" xmlns:r="http://schemas.openxmlformats.org/officeDocument/2006/relationships" xmlns:m="http://schemas.openxmlformats.org/officeDocument/2006/math" xmlns:v="urn:schemas-microsoft-com:vml" xmlns:wp14="http://schemas.microsoft.com/office/word/2010/wordprocessingDrawing" xmlns:wp="http://schemas.openxmlformats.org/drawingml/2006/wordprocessingDrawing" xmlns:w10="urn:schemas-microsoft-com:office:word" xmlns:w="http://schemas.openxmlformats.org/wordprocessingml/2006/main" xmlns:w14="http://schemas.microsoft.com/office/word/2010/wordml" xmlns:w15="http://schemas.microsoft.com/office/word/2012/wordml" xmlns:w16se="http://schemas.microsoft.com/office/word/2015/wordml/symex" xmlns:wpg="http://schemas.microsoft.com/office/word/2010/wordprocessingGroup" xmlns:wpi="http://schemas.microsoft.com/office/word/2010/wordprocessingInk" xmlns:wne="http://schemas.microsoft.com/office/word/2006/wordml" xmlns:wps="http://schemas.microsoft.com/office/word/2010/wordprocessingShape" mc:Ignorable="w14 w15 w16se wp14">
   <w:body>
     <w:p>
       <w:r>
         <w:rPr>
           <w:noProof/>
+          <w:lang w:eastAsia="es-CL"/>
         </w:rPr>
         <w:drawing>
           <wp:inline distT="0" distB="0" distL="0" distR="0" wp14:anchorId="5725E8ED" wp14:editId="6465C388">
@@ -53,6 +54,7 @@
         <w:rPr>
           <w:noProof/>
           <w:spacing w:val="63"/>
+          <w:lang w:eastAsia="es-CL"/>
         </w:rPr>
         <mc:AlternateContent>
           <mc:Choice Requires="wpg">
@@ -796,7 +798,7 @@
               </wp:inline>
             </w:drawing>
           </mc:Choice>
-          <mc:Fallback xmlns:pic="http://schemas.openxmlformats.org/drawingml/2006/picture" xmlns:a="http://schemas.openxmlformats.org/drawingml/2006/main">
+          <mc:Fallback xmlns:a="http://schemas.openxmlformats.org/drawingml/2006/main" xmlns:pic="http://schemas.openxmlformats.org/drawingml/2006/picture" xmlns:w16sdtfl="http://schemas.microsoft.com/office/word/2024/wordml/sdtformatlock" xmlns:w16sdtdh="http://schemas.microsoft.com/office/word/2020/wordml/sdtdatahash" xmlns:w16du="http://schemas.microsoft.com/office/word/2023/wordml/word16du" xmlns:w16="http://schemas.microsoft.com/office/word/2018/wordml" xmlns:w16cid="http://schemas.microsoft.com/office/word/2016/wordml/cid" xmlns:w16cex="http://schemas.microsoft.com/office/word/2018/wordml/cex" xmlns:oel="http://schemas.microsoft.com/office/2019/extlst" xmlns:am3d="http://schemas.microsoft.com/office/drawing/2017/model3d" xmlns:aink="http://schemas.microsoft.com/office/drawing/2016/ink" xmlns:cx8="http://schemas.microsoft.com/office/drawing/2016/5/14/chartex" xmlns:cx7="http://schemas.microsoft.com/office/drawing/2016/5/13/chartex" xmlns:cx6="http://schemas.microsoft.com/office/drawing/2016/5/12/chartex" xmlns:cx5="http://schemas.microsoft.com/office/drawing/2016/5/11/chartex" xmlns:cx4="http://schemas.microsoft.com/office/drawing/2016/5/10/chartex" xmlns:cx3="http://schemas.microsoft.com/office/drawing/2016/5/9/chartex" xmlns:cx2="http://schemas.microsoft.com/office/drawing/2015/10/21/chartex" xmlns:cx1="http://schemas.microsoft.com/office/drawing/2015/9/8/chartex">
             <w:pict>
               <v:group id="Group 2" style="width:85.45pt;height:51.55pt;mso-position-horizontal-relative:char;mso-position-vertical-relative:line" coordsize="10852,6546" o:spid="_x0000_s1026" w14:anchorId="42076BD7" o:gfxdata="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">
                 <v:shape id="Graphic 3" style="position:absolute;left:122;top:167;width:2101;height:3099;visibility:visible;mso-wrap-style:square;v-text-anchor:top" coordsize="210185,309880" o:spid="_x0000_s1027" fillcolor="#c6c4c4" stroked="f" path="m209791,l188086,r,184061l181850,232548r-17516,33480l137327,285432r-34712,6261l71098,285811,45396,267038,28085,233684,21742,184061,21742,,,,,185381r8392,58937l30862,282681r32483,20806l101777,309753r41068,-6762l177287,281095r23690,-39451l209791,182219,209791,xe" o:gfxdata="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">
@@ -1030,7 +1032,15 @@
     </w:p>
     <w:p>
       <w:r>
-        <w:t xml:space="preserve">Rojas Vilches , Daniela </w:t>
+        <w:t xml:space="preserve">Rojas </w:t>
+      </w:r>
+      <w:proofErr w:type="gramStart"/>
+      <w:r>
+        <w:t>Vilches ,</w:t>
+      </w:r>
+      <w:proofErr w:type="gramEnd"/>
+      <w:r>
+        <w:t xml:space="preserve"> Daniela </w:t>
       </w:r>
     </w:p>
     <w:p>
@@ -1318,21 +1328,7 @@
                 <w:rStyle w:val="Hipervnculo"/>
                 <w:noProof/>
               </w:rPr>
-              <w:t>III. Definición de la problemátic</w:t>
-            </w:r>
-            <w:r>
-              <w:rPr>
-                <w:rStyle w:val="Hipervnculo"/>
-                <w:noProof/>
-              </w:rPr>
-              <w:t>a</w:t>
-            </w:r>
-            <w:r>
-              <w:rPr>
-                <w:rStyle w:val="Hipervnculo"/>
-                <w:noProof/>
-              </w:rPr>
-              <w:t xml:space="preserve"> y objetivos del proyecto</w:t>
+              <w:t>III. Definición de la problemática y objetivos del proyecto</w:t>
             </w:r>
             <w:r>
               <w:rPr>
@@ -3478,21 +3474,7 @@
                 <w:rStyle w:val="Hipervnculo"/>
                 <w:noProof/>
               </w:rPr>
-              <w:t>e. Trazabilidad de me</w:t>
-            </w:r>
-            <w:r>
-              <w:rPr>
-                <w:rStyle w:val="Hipervnculo"/>
-                <w:noProof/>
-              </w:rPr>
-              <w:t>j</w:t>
-            </w:r>
-            <w:r>
-              <w:rPr>
-                <w:rStyle w:val="Hipervnculo"/>
-                <w:noProof/>
-              </w:rPr>
-              <w:t>oras</w:t>
+              <w:t>e. Trazabilidad de mejoras</w:t>
             </w:r>
             <w:r>
               <w:rPr>
@@ -3791,7 +3773,10 @@
         <w:jc w:val="left"/>
       </w:pPr>
       <w:r>
-        <w:t>Aplicación de herramientas científicas.</w:t>
+        <w:t xml:space="preserve">Aplicación de </w:t>
+      </w:r>
+      <w:r>
+        <w:t>herramientas científicas.</w:t>
       </w:r>
     </w:p>
     <w:p>
@@ -4039,7 +4024,10 @@
         <w:jc w:val="left"/>
       </w:pPr>
       <w:r>
-        <w:t>Construcción de visualizaciones de datos efectivas.</w:t>
+        <w:t>Co</w:t>
+      </w:r>
+      <w:r>
+        <w:t>nstrucción de visualizaciones de datos efectivas.</w:t>
       </w:r>
     </w:p>
     <w:p>
@@ -4183,7 +4171,10 @@
         <w:jc w:val="left"/>
       </w:pPr>
       <w:r>
-        <w:t>Presentación Audiovisual.</w:t>
+        <w:t>Pres</w:t>
+      </w:r>
+      <w:r>
+        <w:t>entación Audiovisual.</w:t>
       </w:r>
     </w:p>
     <w:p>
@@ -4231,12 +4222,24 @@
     </w:p>
     <w:p>
       <w:r>
-        <w:t>El proyecto analiza datos públicos de Generación Real publicados por el Coordinador Eléctrico Nacional (CEN) para las centrales TER CMPC Laja, TER CMPC Pacífico y TER CMPC Santa Fe durante el período enero-agosto de 2026. El propósito es caracterizar cómo varía la generación eléctrica en el tiempo, identificar patrones horarios y mensuales y comparar el comportamiento observado entre las tres centrales. La información utilizada proviene de una fuente oficial y se interpreta de acuerdo con el diccionario de datos del Sistema de Información Pública del CEN (Coordinador Eléctrico Nacional, 2022; 2026a).</w:t>
-      </w:r>
-    </w:p>
-    <w:p>
-      <w:r>
-        <w:t xml:space="preserve">La necesidad técnica del proyecto surge de la estructura y volumen de los registros. La fuente original contiene 359.891 filas y 33 columnas, mientras que el subconjunto definido para el estudio corresponde a 729 registros en formato ancho. Para facilitar el análisis temporal, los datos fueron transformados a formato largo, obteniéndose un </w:t>
+        <w:t>El proyecto analiza datos públicos de Generación Real publicados por el Coordinador Eléctrico Nacional (CEN) para las centrales TER CMPC Laja, TER CMPC Pacífico y TER CMPC Santa Fe</w:t>
+      </w:r>
+      <w:r>
+        <w:t xml:space="preserve"> durante el período enero-agosto de 2026. El propósito es caracterizar cómo varía la generación eléctrica en el tiempo, identificar patrones horarios y mensuales y comparar el comportamiento observado entre las tres centrales. La información utilizada prov</w:t>
+      </w:r>
+      <w:r>
+        <w:t>iene de una fuente oficial y se interpreta de acuerdo con el diccionario de datos del Sistema de Información Pública del CEN (Coordinador Eléctrico Nacional, 2022; 2026a).</w:t>
+      </w:r>
+    </w:p>
+    <w:p>
+      <w:r>
+        <w:t>La necesidad técnica del proyecto surge de la estructura y volumen de los registros.</w:t>
+      </w:r>
+      <w:r>
+        <w:t xml:space="preserve"> La fuente original contiene 359.891 filas y 33 columnas, mientras que el subconjunto definido para el estudio corresponde a 729 registros en formato ancho. Para facilitar el análisis temporal, los datos fueron transformados a formato largo, obteniéndose u</w:t>
+      </w:r>
+      <w:r>
+        <w:t xml:space="preserve">n </w:t>
       </w:r>
       <w:proofErr w:type="spellStart"/>
       <w:r>
@@ -4249,7 +4252,10 @@
     </w:p>
     <w:p>
       <w:r>
-        <w:t xml:space="preserve">El objetivo general es caracterizar los patrones temporales de generación eléctrica de las tres centrales mediante un proceso reproducible de preparación, validación y análisis. El alcance se mantiene deliberadamente descriptivo: los registros iguales a 0 </w:t>
+        <w:t xml:space="preserve">El </w:t>
+      </w:r>
+      <w:r>
+        <w:t xml:space="preserve">objetivo general es caracterizar los patrones temporales de generación eléctrica de las tres centrales mediante un proceso reproducible de preparación, validación y análisis. El alcance se mantiene deliberadamente descriptivo: los registros iguales a 0 </w:t>
       </w:r>
       <w:proofErr w:type="spellStart"/>
       <w:r>
@@ -4262,7 +4268,10 @@
     </w:p>
     <w:p>
       <w:r>
-        <w:t xml:space="preserve">El desarrollo se articula en cuatro fases. F1 definió la problemática, los objetivos, el alcance y el entorno reproducible; F2 implementó la preparación, transformación y validación del </w:t>
+        <w:t>El desarrollo se articula en cuatro fases. F1 defin</w:t>
+      </w:r>
+      <w:r>
+        <w:t xml:space="preserve">ió la problemática, los objetivos, el alcance y el entorno reproducible; F2 implementó la preparación, transformación y validación del </w:t>
       </w:r>
       <w:proofErr w:type="spellStart"/>
       <w:r>
@@ -4270,7 +4279,13 @@
       </w:r>
       <w:proofErr w:type="spellEnd"/>
       <w:r>
-        <w:t>; F3 consolidó el núcleo algorítmico, incorporó mediciones de eficiencia, recursividad y Programación Orientada a Objetos; y F4 integra los resultados, construye las visualizaciones finales, documenta la trazabilidad de mejoras y comunica las conclusiones del proyecto. Esta progresión permite relacionar decisiones técnicas, código, evidencias y resultados dentro de un único flujo reproducible.</w:t>
+        <w:t xml:space="preserve">; F3 consolidó el núcleo algorítmico, incorporó mediciones de eficiencia, recursividad y Programación Orientada a </w:t>
+      </w:r>
+      <w:r>
+        <w:t>Objetos; y F4 integra los resultados, construye las visualizaciones finales, documenta la trazabilidad de mejoras y comunica las conclusiones del proyecto. Esta progresión permite relacionar decisiones técnicas, código, evidencias y resultados dentro de un</w:t>
+      </w:r>
+      <w:r>
+        <w:t xml:space="preserve"> único flujo reproducible.</w:t>
       </w:r>
     </w:p>
     <w:p>
@@ -4295,17 +4310,162 @@
     </w:p>
     <w:p>
       <w:r>
-        <w:t>La problemática consiste en describir y comparar el comportamiento temporal de la generación eléctrica registrada por las centrales seleccionadas, utilizando exclusivamente la evidencia disponible en los datos públicos del CEN. La pregunta que guía el análisis se mantiene sin cambios desde la Fase 1: ¿Qué patrones temporales de generación eléctrica caracterizan a las centrales TER CMPC Laja, TER CMPC Pacífico y TER CMPC Santa Fe durante el período enero-agosto de 2026?</w:t>
-      </w:r>
-    </w:p>
-    <w:p>
-      <w:r>
-        <w:t>La pregunta se formuló con un alcance analizable y verificable. Por ello, el proyecto se concentra en patrones observables en la serie temporal y evita extender la interpretación hacia causas operacionales, económicas o de mantenimiento que la fuente no permite sustentar.</w:t>
-      </w:r>
-    </w:p>
-    <w:p>
-      <w:r>
-        <w:t>La selección de TER CMPC Laja, TER CMPC Pacífico y TER CMPC Santa Fe delimita un conjunto comparable dentro de una misma fuente de información y bajo un período común de observación. Para cada central se dispone de 243 días de registros entre enero y agosto de 2026, lo que permite trabajar con una base temporal homogénea. Después del filtrado se obtuvieron 729 registros en formato ancho, que posteriormente se transformaron en 17.496 observaciones horarias, manteniendo 24 registros por combinación central-fecha.</w:t>
+        <w:t>La problemática consiste en describir y comparar el comportamiento temporal de la generación eléctrica registrada por las ce</w:t>
+      </w:r>
+      <w:r>
+        <w:t xml:space="preserve">ntrales seleccionadas, utilizando exclusivamente la evidencia disponible en los datos públicos del CEN. La pregunta que guía el análisis se mantiene sin cambios desde la Fase 1: ¿Qué patrones temporales de generación eléctrica caracterizan a las centrales </w:t>
+      </w:r>
+      <w:r>
+        <w:t>TER CMPC Laja, TER CMPC Pacífico y TER CMPC Santa Fe durante el período enero-agosto de 2026?</w:t>
+      </w:r>
+    </w:p>
+    <w:p>
+      <w:r>
+        <w:t>La pregunta se formuló con un alcance analizable y verificable. Por ello, el proyecto se concentra en patrones observables en la serie temporal y evita extender l</w:t>
+      </w:r>
+      <w:r>
+        <w:t>a interpretación hacia causas operacionales, económicas o de mantenimiento que la fuente no permite sustentar.</w:t>
+      </w:r>
+    </w:p>
+    <w:p>
+      <w:pPr>
+        <w:pStyle w:val="paragraph"/>
+        <w:spacing w:before="0" w:beforeAutospacing="0" w:after="0" w:afterAutospacing="0"/>
+        <w:ind w:firstLine="720"/>
+        <w:textAlignment w:val="baseline"/>
+        <w:rPr>
+          <w:rStyle w:val="normaltextrun"/>
+          <w:rFonts w:ascii="Arial" w:hAnsi="Arial" w:cs="Arial"/>
+          <w:sz w:val="22"/>
+          <w:szCs w:val="22"/>
+        </w:rPr>
+      </w:pPr>
+      <w:r>
+        <w:rPr>
+          <w:rStyle w:val="normaltextrun"/>
+          <w:rFonts w:ascii="Arial" w:hAnsi="Arial" w:cs="Arial"/>
+          <w:sz w:val="22"/>
+          <w:szCs w:val="22"/>
+        </w:rPr>
+        <w:t xml:space="preserve">La selección de TER CMPC Laja, TER CMPC Pacífico y TER CMPC Santa Fe responde a que conforman el conjunto de centrales termoeléctricas de cogeneración a biomasa de CMPC </w:t>
+      </w:r>
+      <w:proofErr w:type="spellStart"/>
+      <w:r>
+        <w:rPr>
+          <w:rStyle w:val="normaltextrun"/>
+          <w:rFonts w:ascii="Arial" w:hAnsi="Arial" w:cs="Arial"/>
+          <w:sz w:val="22"/>
+          <w:szCs w:val="22"/>
+        </w:rPr>
+        <w:t>Pulp</w:t>
+      </w:r>
+      <w:proofErr w:type="spellEnd"/>
+      <w:r>
+        <w:rPr>
+          <w:rStyle w:val="normaltextrun"/>
+          <w:rFonts w:ascii="Arial" w:hAnsi="Arial" w:cs="Arial"/>
+          <w:sz w:val="22"/>
+          <w:szCs w:val="22"/>
+        </w:rPr>
+        <w:t xml:space="preserve"> S.A. Estas plantas generan energía principalmente para autoabastecer sus propios procesos de celulosa según su programación interna, y comercializan los excedentes inyectándolos al Sistema Eléctrico Nacional. Trabajar con estas centrales permite observar de manera controlada el comportamiento de los datos de generación real de excedentes e identificar posibles patrones temporales o variaciones de interés.</w:t>
+      </w:r>
+    </w:p>
+    <w:p>
+      <w:pPr>
+        <w:pStyle w:val="paragraph"/>
+        <w:spacing w:before="0" w:beforeAutospacing="0" w:after="0" w:afterAutospacing="0"/>
+        <w:ind w:firstLine="720"/>
+        <w:textAlignment w:val="baseline"/>
+        <w:rPr>
+          <w:rFonts w:ascii="Segoe UI" w:hAnsi="Segoe UI" w:cs="Segoe UI"/>
+          <w:sz w:val="18"/>
+          <w:szCs w:val="18"/>
+          <w:lang w:val="es-ES"/>
+        </w:rPr>
+      </w:pPr>
+      <w:bookmarkStart w:id="3" w:name="_GoBack"/>
+      <w:bookmarkEnd w:id="3"/>
+      <w:r>
+        <w:rPr>
+          <w:rStyle w:val="normaltextrun"/>
+          <w:rFonts w:ascii="Arial" w:hAnsi="Arial" w:cs="Arial"/>
+          <w:sz w:val="22"/>
+          <w:szCs w:val="22"/>
+        </w:rPr>
+        <w:t xml:space="preserve"> </w:t>
+      </w:r>
+      <w:r>
+        <w:rPr>
+          <w:rStyle w:val="eop"/>
+          <w:rFonts w:ascii="Arial" w:hAnsi="Arial" w:cs="Arial"/>
+          <w:sz w:val="22"/>
+          <w:szCs w:val="22"/>
+          <w:lang w:val="es-ES"/>
+        </w:rPr>
+        <w:t> </w:t>
+      </w:r>
+    </w:p>
+    <w:p>
+      <w:pPr>
+        <w:pStyle w:val="paragraph"/>
+        <w:spacing w:before="0" w:beforeAutospacing="0" w:after="0" w:afterAutospacing="0"/>
+        <w:ind w:firstLine="720"/>
+        <w:textAlignment w:val="baseline"/>
+        <w:rPr>
+          <w:rFonts w:ascii="Segoe UI" w:hAnsi="Segoe UI" w:cs="Segoe UI"/>
+          <w:sz w:val="18"/>
+          <w:szCs w:val="18"/>
+          <w:lang w:val="es-ES"/>
+        </w:rPr>
+      </w:pPr>
+      <w:r>
+        <w:rPr>
+          <w:rStyle w:val="normaltextrun"/>
+          <w:rFonts w:ascii="Arial" w:hAnsi="Arial" w:cs="Arial"/>
+          <w:sz w:val="22"/>
+          <w:szCs w:val="22"/>
+        </w:rPr>
+        <w:t xml:space="preserve">Asimismo, esta delimitación conforma un conjunto comparable dentro de una misma fuente de información y bajo un período común de observación. Para cada central se dispone de 243 días de </w:t>
+      </w:r>
+      <w:r>
+        <w:rPr>
+          <w:rStyle w:val="normaltextrun"/>
+          <w:rFonts w:ascii="Arial" w:hAnsi="Arial" w:cs="Arial"/>
+          <w:sz w:val="22"/>
+          <w:szCs w:val="22"/>
+        </w:rPr>
+        <w:lastRenderedPageBreak/>
+        <w:t xml:space="preserve">registros continuos entre enero y agosto de 2026, lo que permite trabajar con una base temporal homogénea. Tras el filtrado y transformación reproducible, se obtienen 729 registros en formato ancho y un </w:t>
+      </w:r>
+      <w:proofErr w:type="spellStart"/>
+      <w:r>
+        <w:rPr>
+          <w:rStyle w:val="normaltextrun"/>
+          <w:rFonts w:ascii="Arial" w:hAnsi="Arial" w:cs="Arial"/>
+          <w:sz w:val="22"/>
+          <w:szCs w:val="22"/>
+        </w:rPr>
+        <w:t>dataset</w:t>
+      </w:r>
+      <w:proofErr w:type="spellEnd"/>
+      <w:r>
+        <w:rPr>
+          <w:rStyle w:val="normaltextrun"/>
+          <w:rFonts w:ascii="Arial" w:hAnsi="Arial" w:cs="Arial"/>
+          <w:sz w:val="22"/>
+          <w:szCs w:val="22"/>
+        </w:rPr>
+        <w:t xml:space="preserve"> analítico final de 17.496 observaciones horarias (24 registros por combinación central-fecha).</w:t>
+      </w:r>
+      <w:r>
+        <w:rPr>
+          <w:rStyle w:val="eop"/>
+          <w:rFonts w:ascii="Arial" w:hAnsi="Arial" w:cs="Arial"/>
+          <w:sz w:val="22"/>
+          <w:szCs w:val="22"/>
+          <w:lang w:val="es-ES"/>
+        </w:rPr>
+        <w:t> </w:t>
       </w:r>
     </w:p>
     <w:p>
@@ -4320,6 +4480,9 @@
         </w:rPr>
       </w:pPr>
       <w:r>
+        <w:t xml:space="preserve"> </w:t>
+      </w:r>
+      <w:r>
         <w:br w:type="page"/>
       </w:r>
     </w:p>
@@ -4327,27 +4490,30 @@
       <w:pPr>
         <w:pStyle w:val="Ttulo2"/>
       </w:pPr>
-      <w:bookmarkStart w:id="3" w:name="_Toc241865065"/>
+      <w:bookmarkStart w:id="4" w:name="_Toc241865065"/>
       <w:r>
         <w:lastRenderedPageBreak/>
         <w:t>3.2 Objetivo general</w:t>
       </w:r>
-      <w:bookmarkEnd w:id="3"/>
-    </w:p>
-    <w:p>
-      <w:r>
-        <w:t>Caracterizar los patrones temporales de generación eléctrica de las centrales TER CMPC Laja, TER CMPC Pacífico y TER CMPC Santa Fe durante enero-agosto de 2026, utilizando datos públicos del Coordinador Eléctrico Nacional mediante un proceso reproducible de preparación, validación y análisis.</w:t>
+      <w:bookmarkEnd w:id="4"/>
+    </w:p>
+    <w:p>
+      <w:r>
+        <w:t xml:space="preserve">Caracterizar los patrones temporales de generación eléctrica de las centrales TER CMPC Laja, TER CMPC Pacífico y TER </w:t>
+      </w:r>
+      <w:r>
+        <w:t>CMPC Santa Fe durante enero-agosto de 2026, utilizando datos públicos del Coordinador Eléctrico Nacional mediante un proceso reproducible de preparación, validación y análisis.</w:t>
       </w:r>
     </w:p>
     <w:p>
       <w:pPr>
         <w:pStyle w:val="Ttulo2"/>
       </w:pPr>
-      <w:bookmarkStart w:id="4" w:name="_Toc241865066"/>
+      <w:bookmarkStart w:id="5" w:name="_Toc241865066"/>
       <w:r>
         <w:t>3.3 Objetivos específicos</w:t>
       </w:r>
-      <w:bookmarkEnd w:id="4"/>
+      <w:bookmarkEnd w:id="5"/>
     </w:p>
     <w:p>
       <w:pPr>
@@ -4366,7 +4532,14 @@
           <w:rFonts w:eastAsia="Arial"/>
           <w:lang w:val="es-CL"/>
         </w:rPr>
-        <w:t>Caracterizar la distribución horaria, diaria y mensual de la generación eléctrica de las tres centrales.</w:t>
+        <w:t>Caracterizar la distribución horaria, diaria y mensua</w:t>
+      </w:r>
+      <w:r>
+        <w:rPr>
+          <w:rFonts w:eastAsia="Arial"/>
+          <w:lang w:val="es-CL"/>
+        </w:rPr>
+        <w:t>l de la generación eléctrica de las tres centrales.</w:t>
       </w:r>
     </w:p>
     <w:p>
@@ -4422,7 +4595,14 @@
           <w:rFonts w:eastAsia="Arial"/>
           <w:lang w:val="es-CL"/>
         </w:rPr>
-        <w:t>, sin atribuirles causas operacionales que no estén respaldadas por la fuente.</w:t>
+        <w:t>, sin</w:t>
+      </w:r>
+      <w:r>
+        <w:rPr>
+          <w:rFonts w:eastAsia="Arial"/>
+          <w:lang w:val="es-CL"/>
+        </w:rPr>
+        <w:t xml:space="preserve"> atribuirles causas operacionales que no estén respaldadas por la fuente.</w:t>
       </w:r>
     </w:p>
     <w:p>
@@ -4449,11 +4629,11 @@
       <w:pPr>
         <w:pStyle w:val="Ttulo2"/>
       </w:pPr>
-      <w:bookmarkStart w:id="5" w:name="_Toc241865067"/>
+      <w:bookmarkStart w:id="6" w:name="_Toc241865067"/>
       <w:r>
         <w:t>3.4 Alcance, restricciones y supuestos</w:t>
       </w:r>
-      <w:bookmarkEnd w:id="5"/>
+      <w:bookmarkEnd w:id="6"/>
     </w:p>
     <w:p>
       <w:pPr>
@@ -4471,7 +4651,14 @@
           <w:rFonts w:eastAsia="Arial"/>
           <w:lang w:val="es-CL"/>
         </w:rPr>
-        <w:t>El análisis se limita a las tres centrales seleccionadas y al período comprendido entre el 1 de enero y el 31 de agosto de 2026.</w:t>
+        <w:t>El análisis se lim</w:t>
+      </w:r>
+      <w:r>
+        <w:rPr>
+          <w:rFonts w:eastAsia="Arial"/>
+          <w:lang w:val="es-CL"/>
+        </w:rPr>
+        <w:t>ita a las tres centrales seleccionadas y al período comprendido entre el 1 de enero y el 31 de agosto de 2026.</w:t>
       </w:r>
     </w:p>
     <w:p>
@@ -4525,7 +4712,14 @@
           <w:rFonts w:eastAsia="Arial"/>
           <w:lang w:val="es-CL"/>
         </w:rPr>
-        <w:t>No se atribuyen causas operacionales, económicas o de mantenimiento a comportamientos que no puedan verificarse con la fuente disponible.</w:t>
+        <w:t>No se atribuyen causa</w:t>
+      </w:r>
+      <w:r>
+        <w:rPr>
+          <w:rFonts w:eastAsia="Arial"/>
+          <w:lang w:val="es-CL"/>
+        </w:rPr>
+        <w:t>s operacionales, económicas o de mantenimiento a comportamientos que no puedan verificarse con la fuente disponible.</w:t>
       </w:r>
     </w:p>
     <w:p>
@@ -4579,22 +4773,29 @@
           <w:rFonts w:eastAsia="Arial"/>
           <w:lang w:val="es-CL"/>
         </w:rPr>
-        <w:t>Se mantiene la codificación horaria 1-24 informada por el CEN y se espera una estructura de 24 observaciones por combinación central-fecha.</w:t>
+        <w:t xml:space="preserve">Se </w:t>
+      </w:r>
+      <w:r>
+        <w:rPr>
+          <w:rFonts w:eastAsia="Arial"/>
+          <w:lang w:val="es-CL"/>
+        </w:rPr>
+        <w:t>mantiene la codificación horaria 1-24 informada por el CEN y se espera una estructura de 24 observaciones por combinación central-fecha.</w:t>
       </w:r>
     </w:p>
     <w:p>
       <w:pPr>
         <w:pStyle w:val="Ttulo2"/>
       </w:pPr>
-      <w:bookmarkStart w:id="6" w:name="_Toc241865068"/>
+      <w:bookmarkStart w:id="7" w:name="_Toc241865068"/>
       <w:r>
         <w:t>3.5 Articulación con las fases F1–F4</w:t>
       </w:r>
-      <w:bookmarkEnd w:id="6"/>
+      <w:bookmarkEnd w:id="7"/>
     </w:p>
     <w:tbl>
       <w:tblPr>
-        <w:tblStyle w:val="Tablaconcuadrcula4-nfasis1"/>
+        <w:tblStyle w:val="Tabladecuadrcula4-nfasis1"/>
         <w:tblW w:w="9493" w:type="dxa"/>
         <w:jc w:val="center"/>
         <w:tblLayout w:type="fixed"/>
@@ -4697,7 +4898,10 @@
               <w:cnfStyle w:val="000000100000" w:firstRow="0" w:lastRow="0" w:firstColumn="0" w:lastColumn="0" w:oddVBand="0" w:evenVBand="0" w:oddHBand="1" w:evenHBand="0" w:firstRowFirstColumn="0" w:firstRowLastColumn="0" w:lastRowFirstColumn="0" w:lastRowLastColumn="0"/>
             </w:pPr>
             <w:r>
-              <w:t>Definición del problema, objetivos, alcance y entorno reproducible.</w:t>
+              <w:t xml:space="preserve">Definición del problema, objetivos, alcance y </w:t>
+            </w:r>
+            <w:r>
+              <w:t>entorno reproducible.</w:t>
             </w:r>
           </w:p>
         </w:tc>
@@ -4901,56 +5105,56 @@
       <w:pPr>
         <w:pStyle w:val="Ttulo1"/>
       </w:pPr>
-      <w:bookmarkStart w:id="7" w:name="_Toc241865069"/>
+      <w:bookmarkStart w:id="8" w:name="_Toc241865069"/>
       <w:r>
         <w:lastRenderedPageBreak/>
         <w:t>IV. Aplicación de herramientas científicas</w:t>
       </w:r>
-      <w:bookmarkEnd w:id="7"/>
+      <w:bookmarkEnd w:id="8"/>
     </w:p>
     <w:p>
       <w:pPr>
         <w:pStyle w:val="Ttulo2"/>
         <w:ind w:left="720"/>
       </w:pPr>
-      <w:bookmarkStart w:id="8" w:name="_Toc241865070"/>
+      <w:bookmarkStart w:id="9" w:name="_Toc241865070"/>
       <w:r>
         <w:t>a. Reproducibilidad técnica</w:t>
       </w:r>
-      <w:bookmarkEnd w:id="8"/>
+      <w:bookmarkEnd w:id="9"/>
     </w:p>
     <w:p>
       <w:pPr>
         <w:pStyle w:val="Ttulo2"/>
         <w:ind w:left="720"/>
       </w:pPr>
-      <w:bookmarkStart w:id="9" w:name="_Toc241865071"/>
+      <w:bookmarkStart w:id="10" w:name="_Toc241865071"/>
       <w:r>
         <w:t>b. Control de versiones</w:t>
       </w:r>
-      <w:bookmarkEnd w:id="9"/>
+      <w:bookmarkEnd w:id="10"/>
     </w:p>
     <w:p>
       <w:pPr>
         <w:pStyle w:val="Ttulo2"/>
         <w:ind w:left="720"/>
       </w:pPr>
-      <w:bookmarkStart w:id="10" w:name="_Toc241865072"/>
+      <w:bookmarkStart w:id="11" w:name="_Toc241865072"/>
       <w:r>
         <w:t>c. Documentación del proceso</w:t>
       </w:r>
-      <w:bookmarkEnd w:id="10"/>
+      <w:bookmarkEnd w:id="11"/>
     </w:p>
     <w:p>
       <w:pPr>
         <w:pStyle w:val="Ttulo2"/>
         <w:ind w:left="720"/>
       </w:pPr>
-      <w:bookmarkStart w:id="11" w:name="_Toc241865073"/>
+      <w:bookmarkStart w:id="12" w:name="_Toc241865073"/>
       <w:r>
         <w:t>d. Repositorio GitHub actualizado</w:t>
       </w:r>
-      <w:bookmarkEnd w:id="11"/>
+      <w:bookmarkEnd w:id="12"/>
     </w:p>
     <w:p>
       <w:pPr>
@@ -4972,37 +5176,40 @@
       <w:pPr>
         <w:pStyle w:val="Ttulo1"/>
       </w:pPr>
-      <w:bookmarkStart w:id="12" w:name="_Toc241865074"/>
+      <w:bookmarkStart w:id="13" w:name="_Toc241865074"/>
       <w:r>
         <w:t>V. Diseño de soluciones algorítmicas eficientes</w:t>
       </w:r>
-      <w:bookmarkEnd w:id="12"/>
+      <w:bookmarkEnd w:id="13"/>
     </w:p>
     <w:p>
       <w:pPr>
         <w:pStyle w:val="Ttulo2"/>
         <w:ind w:left="720"/>
       </w:pPr>
-      <w:bookmarkStart w:id="13" w:name="_Toc241865075"/>
+      <w:bookmarkStart w:id="14" w:name="_Toc241865075"/>
       <w:r>
         <w:t>a. Codificación funcional</w:t>
       </w:r>
-      <w:bookmarkEnd w:id="13"/>
+      <w:bookmarkEnd w:id="14"/>
     </w:p>
     <w:p>
       <w:pPr>
         <w:pStyle w:val="Ttulo2"/>
         <w:ind w:left="720"/>
       </w:pPr>
-      <w:bookmarkStart w:id="14" w:name="_Toc241865076"/>
-      <w:r>
-        <w:t xml:space="preserve">b. Preprocesamiento y transformación del </w:t>
+      <w:bookmarkStart w:id="15" w:name="_Toc241865076"/>
+      <w:r>
+        <w:t>b. Preprocesamie</w:t>
+      </w:r>
+      <w:r>
+        <w:t xml:space="preserve">nto y transformación del </w:t>
       </w:r>
       <w:proofErr w:type="spellStart"/>
       <w:r>
         <w:t>dataset</w:t>
       </w:r>
-      <w:bookmarkEnd w:id="14"/>
+      <w:bookmarkEnd w:id="15"/>
       <w:proofErr w:type="spellEnd"/>
     </w:p>
     <w:p>
@@ -5010,44 +5217,44 @@
         <w:pStyle w:val="Ttulo2"/>
         <w:ind w:left="720"/>
       </w:pPr>
-      <w:bookmarkStart w:id="15" w:name="_Toc241865077"/>
+      <w:bookmarkStart w:id="16" w:name="_Toc241865077"/>
       <w:r>
         <w:t>c. Validación técnica y verificación del código</w:t>
       </w:r>
-      <w:bookmarkEnd w:id="15"/>
+      <w:bookmarkEnd w:id="16"/>
     </w:p>
     <w:p>
       <w:pPr>
         <w:pStyle w:val="Ttulo2"/>
         <w:ind w:left="720"/>
       </w:pPr>
-      <w:bookmarkStart w:id="16" w:name="_Toc241865078"/>
+      <w:bookmarkStart w:id="17" w:name="_Toc241865078"/>
       <w:r>
         <w:t>d. Eficiencia y optimización</w:t>
       </w:r>
-      <w:bookmarkEnd w:id="16"/>
+      <w:bookmarkEnd w:id="17"/>
     </w:p>
     <w:p>
       <w:pPr>
         <w:pStyle w:val="Ttulo2"/>
         <w:ind w:left="720"/>
       </w:pPr>
-      <w:bookmarkStart w:id="17" w:name="_Toc241865079"/>
+      <w:bookmarkStart w:id="18" w:name="_Toc241865079"/>
       <w:r>
         <w:t>e. Diseño estructurado del código</w:t>
       </w:r>
-      <w:bookmarkEnd w:id="17"/>
+      <w:bookmarkEnd w:id="18"/>
     </w:p>
     <w:p>
       <w:pPr>
         <w:pStyle w:val="Ttulo2"/>
         <w:ind w:left="720"/>
       </w:pPr>
-      <w:bookmarkStart w:id="18" w:name="_Toc241865080"/>
+      <w:bookmarkStart w:id="19" w:name="_Toc241865080"/>
       <w:r>
         <w:t>f. Notebook final ejecutado y documentado</w:t>
       </w:r>
-      <w:bookmarkEnd w:id="18"/>
+      <w:bookmarkEnd w:id="19"/>
     </w:p>
     <w:p>
       <w:pPr>
@@ -5062,40 +5269,47 @@
           <w:rFonts w:eastAsia="Arial"/>
           <w:lang w:val="es-CL"/>
         </w:rPr>
-        <w:t>Sección preparada para integración en la siguiente versión del informe final.</w:t>
+        <w:t>Sección preparada para integración en la siguiente versión del informe</w:t>
+      </w:r>
+      <w:r>
+        <w:rPr>
+          <w:rFonts w:eastAsia="Arial"/>
+          <w:lang w:val="es-CL"/>
+        </w:rPr>
+        <w:t xml:space="preserve"> final.</w:t>
       </w:r>
     </w:p>
     <w:p>
       <w:pPr>
         <w:pStyle w:val="Ttulo1"/>
       </w:pPr>
-      <w:bookmarkStart w:id="19" w:name="_Toc241865081"/>
+      <w:bookmarkStart w:id="20" w:name="_Toc241865081"/>
       <w:r>
         <w:t>VI. Implementación de código modular y robusto</w:t>
       </w:r>
-      <w:bookmarkEnd w:id="19"/>
+      <w:bookmarkEnd w:id="20"/>
     </w:p>
     <w:p>
       <w:pPr>
         <w:pStyle w:val="Ttulo2"/>
         <w:ind w:left="720"/>
       </w:pPr>
-      <w:bookmarkStart w:id="20" w:name="_Toc241865082"/>
+      <w:bookmarkStart w:id="21" w:name="_Toc241865082"/>
       <w:r>
         <w:t>a. Programación orientada a objetos</w:t>
       </w:r>
-      <w:bookmarkEnd w:id="20"/>
+      <w:bookmarkEnd w:id="21"/>
     </w:p>
     <w:p>
       <w:pPr>
         <w:pStyle w:val="Ttulo2"/>
         <w:ind w:left="720"/>
       </w:pPr>
-      <w:bookmarkStart w:id="21" w:name="_Toc241865083"/>
+      <w:bookmarkStart w:id="22" w:name="_Toc241865083"/>
       <w:r>
         <w:t>b. Documentación de arquitectura</w:t>
       </w:r>
-      <w:bookmarkEnd w:id="21"/>
+      <w:bookmarkEnd w:id="22"/>
     </w:p>
     <w:p>
       <w:pPr>
@@ -5117,33 +5331,36 @@
       <w:pPr>
         <w:pStyle w:val="Ttulo1"/>
       </w:pPr>
-      <w:bookmarkStart w:id="22" w:name="_Toc241865084"/>
-      <w:r>
-        <w:t>VII. Construcción de visualizaciones de datos efectivas</w:t>
-      </w:r>
-      <w:bookmarkEnd w:id="22"/>
+      <w:bookmarkStart w:id="23" w:name="_Toc241865084"/>
+      <w:r>
+        <w:t xml:space="preserve">VII. Construcción de visualizaciones de datos </w:t>
+      </w:r>
+      <w:r>
+        <w:t>efectivas</w:t>
+      </w:r>
+      <w:bookmarkEnd w:id="23"/>
     </w:p>
     <w:p>
       <w:pPr>
         <w:pStyle w:val="Ttulo2"/>
         <w:ind w:left="720"/>
       </w:pPr>
-      <w:bookmarkStart w:id="23" w:name="_Toc241865085"/>
+      <w:bookmarkStart w:id="24" w:name="_Toc241865085"/>
       <w:r>
         <w:t>a. Preprocesamiento y transformación de datos</w:t>
       </w:r>
-      <w:bookmarkEnd w:id="23"/>
+      <w:bookmarkEnd w:id="24"/>
     </w:p>
     <w:p>
       <w:pPr>
         <w:pStyle w:val="Ttulo2"/>
         <w:ind w:left="720"/>
       </w:pPr>
-      <w:bookmarkStart w:id="24" w:name="_Toc241865086"/>
+      <w:bookmarkStart w:id="25" w:name="_Toc241865086"/>
       <w:r>
         <w:t>b. Visualizaciones analíticas</w:t>
       </w:r>
-      <w:bookmarkEnd w:id="24"/>
+      <w:bookmarkEnd w:id="25"/>
     </w:p>
     <w:p>
       <w:pPr>
@@ -5165,66 +5382,69 @@
       <w:pPr>
         <w:pStyle w:val="Ttulo1"/>
       </w:pPr>
-      <w:bookmarkStart w:id="25" w:name="_Toc241865087"/>
+      <w:bookmarkStart w:id="26" w:name="_Toc241865087"/>
       <w:r>
         <w:t>VIII. Metodología del desarrollo técnico</w:t>
       </w:r>
-      <w:bookmarkEnd w:id="25"/>
+      <w:bookmarkEnd w:id="26"/>
     </w:p>
     <w:p>
       <w:pPr>
         <w:pStyle w:val="Ttulo2"/>
         <w:ind w:left="720"/>
       </w:pPr>
-      <w:bookmarkStart w:id="26" w:name="_Toc241865088"/>
+      <w:bookmarkStart w:id="27" w:name="_Toc241865088"/>
       <w:r>
         <w:t>a. Validación y reflexión técnica</w:t>
       </w:r>
-      <w:bookmarkEnd w:id="26"/>
+      <w:bookmarkEnd w:id="27"/>
     </w:p>
     <w:p>
       <w:pPr>
         <w:pStyle w:val="Ttulo2"/>
         <w:ind w:left="720"/>
       </w:pPr>
-      <w:bookmarkStart w:id="27" w:name="_Toc241865089"/>
+      <w:bookmarkStart w:id="28" w:name="_Toc241865089"/>
       <w:r>
         <w:t>b. Resultados</w:t>
       </w:r>
-      <w:bookmarkEnd w:id="27"/>
+      <w:bookmarkEnd w:id="28"/>
     </w:p>
     <w:p>
       <w:pPr>
         <w:pStyle w:val="Ttulo2"/>
         <w:ind w:left="720"/>
       </w:pPr>
-      <w:bookmarkStart w:id="28" w:name="_Toc241865090"/>
-      <w:r>
-        <w:t>c. Discusión</w:t>
-      </w:r>
-      <w:bookmarkEnd w:id="28"/>
+      <w:bookmarkStart w:id="29" w:name="_Toc241865090"/>
+      <w:r>
+        <w:t xml:space="preserve">c. </w:t>
+      </w:r>
+      <w:r>
+        <w:t>Discusión</w:t>
+      </w:r>
+      <w:bookmarkEnd w:id="29"/>
     </w:p>
     <w:p>
       <w:pPr>
         <w:pStyle w:val="Ttulo2"/>
         <w:ind w:left="720"/>
       </w:pPr>
-      <w:bookmarkStart w:id="29" w:name="_Toc241865091"/>
+      <w:bookmarkStart w:id="30" w:name="_Toc241865091"/>
       <w:r>
         <w:t>d. Conclusiones</w:t>
       </w:r>
-      <w:bookmarkEnd w:id="29"/>
+      <w:bookmarkEnd w:id="30"/>
     </w:p>
     <w:p>
       <w:pPr>
         <w:pStyle w:val="Ttulo2"/>
         <w:ind w:left="720"/>
       </w:pPr>
-      <w:bookmarkStart w:id="30" w:name="_Toc241865092"/>
+      <w:bookmarkStart w:id="31" w:name="_Toc241865092"/>
       <w:r>
         <w:t>e. Trazabilidad de mejoras</w:t>
       </w:r>
-      <w:bookmarkEnd w:id="30"/>
+      <w:bookmarkEnd w:id="31"/>
     </w:p>
     <w:p>
       <w:pPr>
@@ -5286,13 +5506,18 @@
       </w:r>
       <w:proofErr w:type="spellEnd"/>
       <w:r>
-        <w:t xml:space="preserve"> fue ampliada, las reglas de validación se parametrizaron y separaron, las identidades de Git se consolidaron mediante .</w:t>
+        <w:t xml:space="preserve"> fue ampliada, las reglas de validación se parametrizaron y separaron, las identidades de Git se consolidaron </w:t>
+      </w:r>
+      <w:proofErr w:type="gramStart"/>
+      <w:r>
+        <w:t>mediante .</w:t>
       </w:r>
       <w:proofErr w:type="spellStart"/>
       <w:r>
         <w:t>mailmap</w:t>
       </w:r>
       <w:proofErr w:type="spellEnd"/>
+      <w:proofErr w:type="gramEnd"/>
       <w:r>
         <w:t xml:space="preserve"> y los notebooks comenzaron a ejecutarse desde </w:t>
       </w:r>
@@ -5345,7 +5570,7 @@
     </w:p>
     <w:tbl>
       <w:tblPr>
-        <w:tblStyle w:val="Tablaconcuadrcula4-nfasis1"/>
+        <w:tblStyle w:val="Tabladecuadrcula4-nfasis1"/>
         <w:tblW w:w="9634" w:type="dxa"/>
         <w:tblInd w:w="567" w:type="dxa"/>
         <w:tblLook w:val="04A0" w:firstRow="1" w:lastRow="0" w:firstColumn="1" w:lastColumn="0" w:noHBand="0" w:noVBand="1"/>
@@ -5927,6 +6152,7 @@
               <w:jc w:val="left"/>
             </w:pPr>
             <w:r>
+              <w:lastRenderedPageBreak/>
               <w:t>Falta de trazabilidad consolidada entre fases</w:t>
             </w:r>
           </w:p>
@@ -6096,11 +6322,11 @@
       <w:pPr>
         <w:pStyle w:val="Ttulo1"/>
       </w:pPr>
-      <w:bookmarkStart w:id="31" w:name="_Toc241865093"/>
+      <w:bookmarkStart w:id="32" w:name="_Toc241865093"/>
       <w:r>
         <w:t>IX. Presentación Audiovisual</w:t>
       </w:r>
-      <w:bookmarkEnd w:id="31"/>
+      <w:bookmarkEnd w:id="32"/>
     </w:p>
     <w:p>
       <w:pPr>
@@ -6122,11 +6348,11 @@
       <w:pPr>
         <w:pStyle w:val="Ttulo1"/>
       </w:pPr>
-      <w:bookmarkStart w:id="32" w:name="_Toc241865094"/>
+      <w:bookmarkStart w:id="33" w:name="_Toc241865094"/>
       <w:r>
         <w:t>X. Bibliografía</w:t>
       </w:r>
-      <w:bookmarkEnd w:id="32"/>
+      <w:bookmarkEnd w:id="33"/>
     </w:p>
     <w:p>
       <w:pPr>
@@ -6141,7 +6367,14 @@
           <w:rFonts w:eastAsia="Arial"/>
           <w:lang w:val="es-CL"/>
         </w:rPr>
-        <w:t>Coordinador Eléctrico Nacional. (2022). Diccionario de datos para la descarga de datos Portal Web Sistema de Información Pública (SIP), B43-DIN-04.</w:t>
+        <w:t>Coordinador Eléctrico Nacional. (2022). Diccionario de datos para la descarga de datos Portal Web Sistem</w:t>
+      </w:r>
+      <w:r>
+        <w:rPr>
+          <w:rFonts w:eastAsia="Arial"/>
+          <w:lang w:val="es-CL"/>
+        </w:rPr>
+        <w:t>a de Información Pública (SIP), B43-DIN-04.</w:t>
       </w:r>
     </w:p>
     <w:p>
@@ -6173,7 +6406,14 @@
           <w:rFonts w:eastAsia="Arial"/>
           <w:lang w:val="es-CL"/>
         </w:rPr>
-        <w:t>Salinas Silva, O. (2026). Programación para la ciencia de datos [Presentación de clase, Semana 1]. Magíster en Ciencia de Datos e Inteligencia Artificial, Universidad Andrés Bello.</w:t>
+        <w:t>Salinas Silva, O. (2026). Programación para la ciencia de datos [Presentación de clase, Semana 1]</w:t>
+      </w:r>
+      <w:r>
+        <w:rPr>
+          <w:rFonts w:eastAsia="Arial"/>
+          <w:lang w:val="es-CL"/>
+        </w:rPr>
+        <w:t>. Magíster en Ciencia de Datos e Inteligencia Artificial, Universidad Andrés Bello.</w:t>
       </w:r>
     </w:p>
     <w:sectPr>
@@ -6188,7 +6428,7 @@
 </file>
 
 <file path=word/endnotes.xml><?xml version="1.0" encoding="utf-8"?>
-<w:endnotes xmlns:wpc="http://schemas.microsoft.com/office/word/2010/wordprocessingCanvas" xmlns:cx="http://schemas.microsoft.com/office/drawing/2014/chartex" xmlns:cx1="http://schemas.microsoft.com/office/drawing/2015/9/8/chartex" xmlns:cx2="http://schemas.microsoft.com/office/drawing/2015/10/21/chartex" xmlns:cx3="http://schemas.microsoft.com/office/drawing/2016/5/9/chartex" xmlns:cx4="http://schemas.microsoft.com/office/drawing/2016/5/10/chartex" xmlns:cx5="http://schemas.microsoft.com/office/drawing/2016/5/11/chartex" xmlns:cx6="http://schemas.microsoft.com/office/drawing/2016/5/12/chartex" xmlns:cx7="http://schemas.microsoft.com/office/drawing/2016/5/13/chartex" xmlns:cx8="http://schemas.microsoft.com/office/drawing/2016/5/14/chartex" xmlns:mc="http://schemas.openxmlformats.org/markup-compatibility/2006" xmlns:aink="http://schemas.microsoft.com/office/drawing/2016/ink" xmlns:am3d="http://schemas.microsoft.com/office/drawing/2017/model3d" xmlns:o="urn:schemas-microsoft-com:office:office" xmlns:oel="http://schemas.microsoft.com/office/2019/extlst" xmlns:r="http://schemas.openxmlformats.org/officeDocument/2006/relationships" xmlns:m="http://schemas.openxmlformats.org/officeDocument/2006/math" xmlns:v="urn:schemas-microsoft-com:vml" xmlns:wp14="http://schemas.microsoft.com/office/word/2010/wordprocessingDrawing" xmlns:wp="http://schemas.openxmlformats.org/drawingml/2006/wordprocessingDrawing" xmlns:w10="urn:schemas-microsoft-com:office:word" xmlns:w="http://schemas.openxmlformats.org/wordprocessingml/2006/main" xmlns:w14="http://schemas.microsoft.com/office/word/2010/wordml" xmlns:w15="http://schemas.microsoft.com/office/word/2012/wordml" xmlns:w16cex="http://schemas.microsoft.com/office/word/2018/wordml/cex" xmlns:w16cid="http://schemas.microsoft.com/office/word/2016/wordml/cid" xmlns:w16="http://schemas.microsoft.com/office/word/2018/wordml" xmlns:w16du="http://schemas.microsoft.com/office/word/2023/wordml/word16du" xmlns:w16sdtdh="http://schemas.microsoft.com/office/word/2020/wordml/sdtdatahash" xmlns:w16sdtfl="http://schemas.microsoft.com/office/word/2024/wordml/sdtformatlock" xmlns:w16se="http://schemas.microsoft.com/office/word/2015/wordml/symex" xmlns:wpg="http://schemas.microsoft.com/office/word/2010/wordprocessingGroup" xmlns:wpi="http://schemas.microsoft.com/office/word/2010/wordprocessingInk" xmlns:wne="http://schemas.microsoft.com/office/word/2006/wordml" xmlns:wps="http://schemas.microsoft.com/office/word/2010/wordprocessingShape" mc:Ignorable="w14 w15 w16se w16cid w16 w16cex w16sdtdh w16sdtfl w16du wp14">
+<w:endnotes xmlns:wpc="http://schemas.microsoft.com/office/word/2010/wordprocessingCanvas" xmlns:cx="http://schemas.microsoft.com/office/drawing/2014/chartex" xmlns:mc="http://schemas.openxmlformats.org/markup-compatibility/2006" xmlns:o="urn:schemas-microsoft-com:office:office" xmlns:r="http://schemas.openxmlformats.org/officeDocument/2006/relationships" xmlns:m="http://schemas.openxmlformats.org/officeDocument/2006/math" xmlns:v="urn:schemas-microsoft-com:vml" xmlns:wp14="http://schemas.microsoft.com/office/word/2010/wordprocessingDrawing" xmlns:wp="http://schemas.openxmlformats.org/drawingml/2006/wordprocessingDrawing" xmlns:w10="urn:schemas-microsoft-com:office:word" xmlns:w="http://schemas.openxmlformats.org/wordprocessingml/2006/main" xmlns:w14="http://schemas.microsoft.com/office/word/2010/wordml" xmlns:w15="http://schemas.microsoft.com/office/word/2012/wordml" xmlns:w16se="http://schemas.microsoft.com/office/word/2015/wordml/symex" xmlns:wpg="http://schemas.microsoft.com/office/word/2010/wordprocessingGroup" xmlns:wpi="http://schemas.microsoft.com/office/word/2010/wordprocessingInk" xmlns:wne="http://schemas.microsoft.com/office/word/2006/wordml" xmlns:wps="http://schemas.microsoft.com/office/word/2010/wordprocessingShape" mc:Ignorable="w14 w15 w16se wp14">
   <w:endnote w:type="separator" w:id="-1">
     <w:p>
       <w:r>
@@ -6207,7 +6447,7 @@
 </file>
 
 <file path=word/footer1.xml><?xml version="1.0" encoding="utf-8"?>
-<w:ftr xmlns:wpc="http://schemas.microsoft.com/office/word/2010/wordprocessingCanvas" xmlns:cx="http://schemas.microsoft.com/office/drawing/2014/chartex" xmlns:cx1="http://schemas.microsoft.com/office/drawing/2015/9/8/chartex" xmlns:cx2="http://schemas.microsoft.com/office/drawing/2015/10/21/chartex" xmlns:cx3="http://schemas.microsoft.com/office/drawing/2016/5/9/chartex" xmlns:cx4="http://schemas.microsoft.com/office/drawing/2016/5/10/chartex" xmlns:cx5="http://schemas.microsoft.com/office/drawing/2016/5/11/chartex" xmlns:cx6="http://schemas.microsoft.com/office/drawing/2016/5/12/chartex" xmlns:cx7="http://schemas.microsoft.com/office/drawing/2016/5/13/chartex" xmlns:cx8="http://schemas.microsoft.com/office/drawing/2016/5/14/chartex" xmlns:mc="http://schemas.openxmlformats.org/markup-compatibility/2006" xmlns:aink="http://schemas.microsoft.com/office/drawing/2016/ink" xmlns:am3d="http://schemas.microsoft.com/office/drawing/2017/model3d" xmlns:o="urn:schemas-microsoft-com:office:office" xmlns:oel="http://schemas.microsoft.com/office/2019/extlst" xmlns:r="http://schemas.openxmlformats.org/officeDocument/2006/relationships" xmlns:m="http://schemas.openxmlformats.org/officeDocument/2006/math" xmlns:v="urn:schemas-microsoft-com:vml" xmlns:wp14="http://schemas.microsoft.com/office/word/2010/wordprocessingDrawing" xmlns:wp="http://schemas.openxmlformats.org/drawingml/2006/wordprocessingDrawing" xmlns:w10="urn:schemas-microsoft-com:office:word" xmlns:w="http://schemas.openxmlformats.org/wordprocessingml/2006/main" xmlns:w14="http://schemas.microsoft.com/office/word/2010/wordml" xmlns:w15="http://schemas.microsoft.com/office/word/2012/wordml" xmlns:w16cex="http://schemas.microsoft.com/office/word/2018/wordml/cex" xmlns:w16cid="http://schemas.microsoft.com/office/word/2016/wordml/cid" xmlns:w16="http://schemas.microsoft.com/office/word/2018/wordml" xmlns:w16du="http://schemas.microsoft.com/office/word/2023/wordml/word16du" xmlns:w16sdtdh="http://schemas.microsoft.com/office/word/2020/wordml/sdtdatahash" xmlns:w16sdtfl="http://schemas.microsoft.com/office/word/2024/wordml/sdtformatlock" xmlns:w16se="http://schemas.microsoft.com/office/word/2015/wordml/symex" xmlns:wpg="http://schemas.microsoft.com/office/word/2010/wordprocessingGroup" xmlns:wpi="http://schemas.microsoft.com/office/word/2010/wordprocessingInk" xmlns:wne="http://schemas.microsoft.com/office/word/2006/wordml" xmlns:wps="http://schemas.microsoft.com/office/word/2010/wordprocessingShape" mc:Ignorable="w14 w15 w16se w16cid w16 w16cex w16sdtdh w16sdtfl w16du wp14">
+<w:ftr xmlns:wpc="http://schemas.microsoft.com/office/word/2010/wordprocessingCanvas" xmlns:cx="http://schemas.microsoft.com/office/drawing/2014/chartex" xmlns:mc="http://schemas.openxmlformats.org/markup-compatibility/2006" xmlns:o="urn:schemas-microsoft-com:office:office" xmlns:r="http://schemas.openxmlformats.org/officeDocument/2006/relationships" xmlns:m="http://schemas.openxmlformats.org/officeDocument/2006/math" xmlns:v="urn:schemas-microsoft-com:vml" xmlns:wp14="http://schemas.microsoft.com/office/word/2010/wordprocessingDrawing" xmlns:wp="http://schemas.openxmlformats.org/drawingml/2006/wordprocessingDrawing" xmlns:w10="urn:schemas-microsoft-com:office:word" xmlns:w="http://schemas.openxmlformats.org/wordprocessingml/2006/main" xmlns:w14="http://schemas.microsoft.com/office/word/2010/wordml" xmlns:w15="http://schemas.microsoft.com/office/word/2012/wordml" xmlns:w16se="http://schemas.microsoft.com/office/word/2015/wordml/symex" xmlns:wpg="http://schemas.microsoft.com/office/word/2010/wordprocessingGroup" xmlns:wpi="http://schemas.microsoft.com/office/word/2010/wordprocessingInk" xmlns:wne="http://schemas.microsoft.com/office/word/2006/wordml" xmlns:wps="http://schemas.microsoft.com/office/word/2010/wordprocessingShape" mc:Ignorable="w14 w15 w16se wp14">
   <w:p>
     <w:pPr>
       <w:pStyle w:val="Textoindependiente"/>
@@ -6218,6 +6458,7 @@
     <w:r>
       <w:rPr>
         <w:noProof/>
+        <w:lang w:eastAsia="es-CL"/>
       </w:rPr>
       <w:drawing>
         <wp:anchor distT="0" distB="0" distL="0" distR="0" simplePos="0" relativeHeight="487502336" behindDoc="1" locked="0" layoutInCell="1" allowOverlap="1" wp14:anchorId="48AD0833" wp14:editId="3120761A">
@@ -6266,6 +6507,7 @@
     <w:r>
       <w:rPr>
         <w:noProof/>
+        <w:lang w:eastAsia="es-CL"/>
       </w:rPr>
       <mc:AlternateContent>
         <mc:Choice Requires="wps">
@@ -6332,7 +6574,7 @@
             </wp:anchor>
           </w:drawing>
         </mc:Choice>
-        <mc:Fallback xmlns:pic="http://schemas.openxmlformats.org/drawingml/2006/picture" xmlns:a="http://schemas.openxmlformats.org/drawingml/2006/main">
+        <mc:Fallback xmlns:a="http://schemas.openxmlformats.org/drawingml/2006/main" xmlns:pic="http://schemas.openxmlformats.org/drawingml/2006/picture" xmlns:w16sdtfl="http://schemas.microsoft.com/office/word/2024/wordml/sdtformatlock" xmlns:w16sdtdh="http://schemas.microsoft.com/office/word/2020/wordml/sdtdatahash" xmlns:w16du="http://schemas.microsoft.com/office/word/2023/wordml/word16du" xmlns:w16="http://schemas.microsoft.com/office/word/2018/wordml" xmlns:w16cid="http://schemas.microsoft.com/office/word/2016/wordml/cid" xmlns:w16cex="http://schemas.microsoft.com/office/word/2018/wordml/cex" xmlns:oel="http://schemas.microsoft.com/office/2019/extlst" xmlns:am3d="http://schemas.microsoft.com/office/drawing/2017/model3d" xmlns:aink="http://schemas.microsoft.com/office/drawing/2016/ink" xmlns:cx8="http://schemas.microsoft.com/office/drawing/2016/5/14/chartex" xmlns:cx7="http://schemas.microsoft.com/office/drawing/2016/5/13/chartex" xmlns:cx6="http://schemas.microsoft.com/office/drawing/2016/5/12/chartex" xmlns:cx5="http://schemas.microsoft.com/office/drawing/2016/5/11/chartex" xmlns:cx4="http://schemas.microsoft.com/office/drawing/2016/5/10/chartex" xmlns:cx3="http://schemas.microsoft.com/office/drawing/2016/5/9/chartex" xmlns:cx2="http://schemas.microsoft.com/office/drawing/2015/10/21/chartex" xmlns:cx1="http://schemas.microsoft.com/office/drawing/2015/9/8/chartex">
           <w:pict>
             <v:shape id="Graphic 17" style="position:absolute;margin-left:42.5pt;margin-top:739.9pt;width:218.15pt;height:.1pt;z-index:-15813632;visibility:visible;mso-wrap-style:square;mso-wrap-distance-left:0;mso-wrap-distance-top:0;mso-wrap-distance-right:0;mso-wrap-distance-bottom:0;mso-position-horizontal:absolute;mso-position-horizontal-relative:page;mso-position-vertical:absolute;mso-position-vertical-relative:page;v-text-anchor:top" coordsize="2770505,1270" o:spid="_x0000_s1026" filled="f" strokecolor="#1d4b63" path="m,l2770204,e" o:gfxdata="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" w14:anchorId="0747A2B0">
               <v:path arrowok="t"/>
@@ -6345,6 +6587,7 @@
     <w:r>
       <w:rPr>
         <w:noProof/>
+        <w:lang w:eastAsia="es-CL"/>
       </w:rPr>
       <mc:AlternateContent>
         <mc:Choice Requires="wps">
@@ -6411,7 +6654,7 @@
             </wp:anchor>
           </w:drawing>
         </mc:Choice>
-        <mc:Fallback xmlns:pic="http://schemas.openxmlformats.org/drawingml/2006/picture" xmlns:a="http://schemas.openxmlformats.org/drawingml/2006/main">
+        <mc:Fallback xmlns:a="http://schemas.openxmlformats.org/drawingml/2006/main" xmlns:pic="http://schemas.openxmlformats.org/drawingml/2006/picture" xmlns:w16sdtfl="http://schemas.microsoft.com/office/word/2024/wordml/sdtformatlock" xmlns:w16sdtdh="http://schemas.microsoft.com/office/word/2020/wordml/sdtdatahash" xmlns:w16du="http://schemas.microsoft.com/office/word/2023/wordml/word16du" xmlns:w16="http://schemas.microsoft.com/office/word/2018/wordml" xmlns:w16cid="http://schemas.microsoft.com/office/word/2016/wordml/cid" xmlns:w16cex="http://schemas.microsoft.com/office/word/2018/wordml/cex" xmlns:oel="http://schemas.microsoft.com/office/2019/extlst" xmlns:am3d="http://schemas.microsoft.com/office/drawing/2017/model3d" xmlns:aink="http://schemas.microsoft.com/office/drawing/2016/ink" xmlns:cx8="http://schemas.microsoft.com/office/drawing/2016/5/14/chartex" xmlns:cx7="http://schemas.microsoft.com/office/drawing/2016/5/13/chartex" xmlns:cx6="http://schemas.microsoft.com/office/drawing/2016/5/12/chartex" xmlns:cx5="http://schemas.microsoft.com/office/drawing/2016/5/11/chartex" xmlns:cx4="http://schemas.microsoft.com/office/drawing/2016/5/10/chartex" xmlns:cx3="http://schemas.microsoft.com/office/drawing/2016/5/9/chartex" xmlns:cx2="http://schemas.microsoft.com/office/drawing/2015/10/21/chartex" xmlns:cx1="http://schemas.microsoft.com/office/drawing/2015/9/8/chartex">
           <w:pict>
             <v:shape id="Graphic 18" style="position:absolute;margin-left:371.35pt;margin-top:739.9pt;width:198.15pt;height:.1pt;z-index:-15813120;visibility:visible;mso-wrap-style:square;mso-wrap-distance-left:0;mso-wrap-distance-top:0;mso-wrap-distance-right:0;mso-wrap-distance-bottom:0;mso-position-horizontal:absolute;mso-position-horizontal-relative:page;mso-position-vertical:absolute;mso-position-vertical-relative:page;v-text-anchor:top" coordsize="2516505,1270" o:spid="_x0000_s1026" filled="f" strokecolor="#1d4b63" path="m,l2516399,e" o:gfxdata="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" w14:anchorId="3C0EE5FF">
               <v:path arrowok="t"/>
@@ -6426,7 +6669,7 @@
 </file>
 
 <file path=word/footnotes.xml><?xml version="1.0" encoding="utf-8"?>
-<w:footnotes xmlns:wpc="http://schemas.microsoft.com/office/word/2010/wordprocessingCanvas" xmlns:cx="http://schemas.microsoft.com/office/drawing/2014/chartex" xmlns:cx1="http://schemas.microsoft.com/office/drawing/2015/9/8/chartex" xmlns:cx2="http://schemas.microsoft.com/office/drawing/2015/10/21/chartex" xmlns:cx3="http://schemas.microsoft.com/office/drawing/2016/5/9/chartex" xmlns:cx4="http://schemas.microsoft.com/office/drawing/2016/5/10/chartex" xmlns:cx5="http://schemas.microsoft.com/office/drawing/2016/5/11/chartex" xmlns:cx6="http://schemas.microsoft.com/office/drawing/2016/5/12/chartex" xmlns:cx7="http://schemas.microsoft.com/office/drawing/2016/5/13/chartex" xmlns:cx8="http://schemas.microsoft.com/office/drawing/2016/5/14/chartex" xmlns:mc="http://schemas.openxmlformats.org/markup-compatibility/2006" xmlns:aink="http://schemas.microsoft.com/office/drawing/2016/ink" xmlns:am3d="http://schemas.microsoft.com/office/drawing/2017/model3d" xmlns:o="urn:schemas-microsoft-com:office:office" xmlns:oel="http://schemas.microsoft.com/office/2019/extlst" xmlns:r="http://schemas.openxmlformats.org/officeDocument/2006/relationships" xmlns:m="http://schemas.openxmlformats.org/officeDocument/2006/math" xmlns:v="urn:schemas-microsoft-com:vml" xmlns:wp14="http://schemas.microsoft.com/office/word/2010/wordprocessingDrawing" xmlns:wp="http://schemas.openxmlformats.org/drawingml/2006/wordprocessingDrawing" xmlns:w10="urn:schemas-microsoft-com:office:word" xmlns:w="http://schemas.openxmlformats.org/wordprocessingml/2006/main" xmlns:w14="http://schemas.microsoft.com/office/word/2010/wordml" xmlns:w15="http://schemas.microsoft.com/office/word/2012/wordml" xmlns:w16cex="http://schemas.microsoft.com/office/word/2018/wordml/cex" xmlns:w16cid="http://schemas.microsoft.com/office/word/2016/wordml/cid" xmlns:w16="http://schemas.microsoft.com/office/word/2018/wordml" xmlns:w16du="http://schemas.microsoft.com/office/word/2023/wordml/word16du" xmlns:w16sdtdh="http://schemas.microsoft.com/office/word/2020/wordml/sdtdatahash" xmlns:w16sdtfl="http://schemas.microsoft.com/office/word/2024/wordml/sdtformatlock" xmlns:w16se="http://schemas.microsoft.com/office/word/2015/wordml/symex" xmlns:wpg="http://schemas.microsoft.com/office/word/2010/wordprocessingGroup" xmlns:wpi="http://schemas.microsoft.com/office/word/2010/wordprocessingInk" xmlns:wne="http://schemas.microsoft.com/office/word/2006/wordml" xmlns:wps="http://schemas.microsoft.com/office/word/2010/wordprocessingShape" mc:Ignorable="w14 w15 w16se w16cid w16 w16cex w16sdtdh w16sdtfl w16du wp14">
+<w:footnotes xmlns:wpc="http://schemas.microsoft.com/office/word/2010/wordprocessingCanvas" xmlns:cx="http://schemas.microsoft.com/office/drawing/2014/chartex" xmlns:mc="http://schemas.openxmlformats.org/markup-compatibility/2006" xmlns:o="urn:schemas-microsoft-com:office:office" xmlns:r="http://schemas.openxmlformats.org/officeDocument/2006/relationships" xmlns:m="http://schemas.openxmlformats.org/officeDocument/2006/math" xmlns:v="urn:schemas-microsoft-com:vml" xmlns:wp14="http://schemas.microsoft.com/office/word/2010/wordprocessingDrawing" xmlns:wp="http://schemas.openxmlformats.org/drawingml/2006/wordprocessingDrawing" xmlns:w10="urn:schemas-microsoft-com:office:word" xmlns:w="http://schemas.openxmlformats.org/wordprocessingml/2006/main" xmlns:w14="http://schemas.microsoft.com/office/word/2010/wordml" xmlns:w15="http://schemas.microsoft.com/office/word/2012/wordml" xmlns:w16se="http://schemas.microsoft.com/office/word/2015/wordml/symex" xmlns:wpg="http://schemas.microsoft.com/office/word/2010/wordprocessingGroup" xmlns:wpi="http://schemas.microsoft.com/office/word/2010/wordprocessingInk" xmlns:wne="http://schemas.microsoft.com/office/word/2006/wordml" xmlns:wps="http://schemas.microsoft.com/office/word/2010/wordprocessingShape" mc:Ignorable="w14 w15 w16se wp14">
   <w:footnote w:type="separator" w:id="-1">
     <w:p>
       <w:r>
@@ -6445,7 +6688,7 @@
 </file>
 
 <file path=word/header1.xml><?xml version="1.0" encoding="utf-8"?>
-<w:hdr xmlns:wpc="http://schemas.microsoft.com/office/word/2010/wordprocessingCanvas" xmlns:cx="http://schemas.microsoft.com/office/drawing/2014/chartex" xmlns:cx1="http://schemas.microsoft.com/office/drawing/2015/9/8/chartex" xmlns:cx2="http://schemas.microsoft.com/office/drawing/2015/10/21/chartex" xmlns:cx3="http://schemas.microsoft.com/office/drawing/2016/5/9/chartex" xmlns:cx4="http://schemas.microsoft.com/office/drawing/2016/5/10/chartex" xmlns:cx5="http://schemas.microsoft.com/office/drawing/2016/5/11/chartex" xmlns:cx6="http://schemas.microsoft.com/office/drawing/2016/5/12/chartex" xmlns:cx7="http://schemas.microsoft.com/office/drawing/2016/5/13/chartex" xmlns:cx8="http://schemas.microsoft.com/office/drawing/2016/5/14/chartex" xmlns:mc="http://schemas.openxmlformats.org/markup-compatibility/2006" xmlns:aink="http://schemas.microsoft.com/office/drawing/2016/ink" xmlns:am3d="http://schemas.microsoft.com/office/drawing/2017/model3d" xmlns:o="urn:schemas-microsoft-com:office:office" xmlns:oel="http://schemas.microsoft.com/office/2019/extlst" xmlns:r="http://schemas.openxmlformats.org/officeDocument/2006/relationships" xmlns:m="http://schemas.openxmlformats.org/officeDocument/2006/math" xmlns:v="urn:schemas-microsoft-com:vml" xmlns:wp14="http://schemas.microsoft.com/office/word/2010/wordprocessingDrawing" xmlns:wp="http://schemas.openxmlformats.org/drawingml/2006/wordprocessingDrawing" xmlns:w10="urn:schemas-microsoft-com:office:word" xmlns:w="http://schemas.openxmlformats.org/wordprocessingml/2006/main" xmlns:w14="http://schemas.microsoft.com/office/word/2010/wordml" xmlns:w15="http://schemas.microsoft.com/office/word/2012/wordml" xmlns:w16cex="http://schemas.microsoft.com/office/word/2018/wordml/cex" xmlns:w16cid="http://schemas.microsoft.com/office/word/2016/wordml/cid" xmlns:w16="http://schemas.microsoft.com/office/word/2018/wordml" xmlns:w16du="http://schemas.microsoft.com/office/word/2023/wordml/word16du" xmlns:w16sdtdh="http://schemas.microsoft.com/office/word/2020/wordml/sdtdatahash" xmlns:w16sdtfl="http://schemas.microsoft.com/office/word/2024/wordml/sdtformatlock" xmlns:w16se="http://schemas.microsoft.com/office/word/2015/wordml/symex" xmlns:wpg="http://schemas.microsoft.com/office/word/2010/wordprocessingGroup" xmlns:wpi="http://schemas.microsoft.com/office/word/2010/wordprocessingInk" xmlns:wne="http://schemas.microsoft.com/office/word/2006/wordml" xmlns:wps="http://schemas.microsoft.com/office/word/2010/wordprocessingShape" mc:Ignorable="w14 w15 w16se w16cid w16 w16cex w16sdtdh w16sdtfl w16du wp14">
+<w:hdr xmlns:wpc="http://schemas.microsoft.com/office/word/2010/wordprocessingCanvas" xmlns:cx="http://schemas.microsoft.com/office/drawing/2014/chartex" xmlns:mc="http://schemas.openxmlformats.org/markup-compatibility/2006" xmlns:o="urn:schemas-microsoft-com:office:office" xmlns:r="http://schemas.openxmlformats.org/officeDocument/2006/relationships" xmlns:m="http://schemas.openxmlformats.org/officeDocument/2006/math" xmlns:v="urn:schemas-microsoft-com:vml" xmlns:wp14="http://schemas.microsoft.com/office/word/2010/wordprocessingDrawing" xmlns:wp="http://schemas.openxmlformats.org/drawingml/2006/wordprocessingDrawing" xmlns:w10="urn:schemas-microsoft-com:office:word" xmlns:w="http://schemas.openxmlformats.org/wordprocessingml/2006/main" xmlns:w14="http://schemas.microsoft.com/office/word/2010/wordml" xmlns:w15="http://schemas.microsoft.com/office/word/2012/wordml" xmlns:w16se="http://schemas.microsoft.com/office/word/2015/wordml/symex" xmlns:wpg="http://schemas.microsoft.com/office/word/2010/wordprocessingGroup" xmlns:wpi="http://schemas.microsoft.com/office/word/2010/wordprocessingInk" xmlns:wne="http://schemas.microsoft.com/office/word/2006/wordml" xmlns:wps="http://schemas.microsoft.com/office/word/2010/wordprocessingShape" mc:Ignorable="w14 w15 w16se wp14">
   <w:p>
     <w:pPr>
       <w:pStyle w:val="Textoindependiente"/>
@@ -6456,6 +6699,7 @@
     <w:r>
       <w:rPr>
         <w:noProof/>
+        <w:lang w:eastAsia="es-CL"/>
       </w:rPr>
       <mc:AlternateContent>
         <mc:Choice Requires="wpg">
@@ -6555,7 +6799,7 @@
             </wp:anchor>
           </w:drawing>
         </mc:Choice>
-        <mc:Fallback xmlns:pic="http://schemas.openxmlformats.org/drawingml/2006/picture" xmlns:a="http://schemas.openxmlformats.org/drawingml/2006/main">
+        <mc:Fallback xmlns:a="http://schemas.openxmlformats.org/drawingml/2006/main" xmlns:pic="http://schemas.openxmlformats.org/drawingml/2006/picture" xmlns:w16sdtfl="http://schemas.microsoft.com/office/word/2024/wordml/sdtformatlock" xmlns:w16sdtdh="http://schemas.microsoft.com/office/word/2020/wordml/sdtdatahash" xmlns:w16du="http://schemas.microsoft.com/office/word/2023/wordml/word16du" xmlns:w16="http://schemas.microsoft.com/office/word/2018/wordml" xmlns:w16cid="http://schemas.microsoft.com/office/word/2016/wordml/cid" xmlns:w16cex="http://schemas.microsoft.com/office/word/2018/wordml/cex" xmlns:oel="http://schemas.microsoft.com/office/2019/extlst" xmlns:am3d="http://schemas.microsoft.com/office/drawing/2017/model3d" xmlns:aink="http://schemas.microsoft.com/office/drawing/2016/ink" xmlns:cx8="http://schemas.microsoft.com/office/drawing/2016/5/14/chartex" xmlns:cx7="http://schemas.microsoft.com/office/drawing/2016/5/13/chartex" xmlns:cx6="http://schemas.microsoft.com/office/drawing/2016/5/12/chartex" xmlns:cx5="http://schemas.microsoft.com/office/drawing/2016/5/11/chartex" xmlns:cx4="http://schemas.microsoft.com/office/drawing/2016/5/10/chartex" xmlns:cx3="http://schemas.microsoft.com/office/drawing/2016/5/9/chartex" xmlns:cx2="http://schemas.microsoft.com/office/drawing/2015/10/21/chartex" xmlns:cx1="http://schemas.microsoft.com/office/drawing/2015/9/8/chartex">
           <w:pict>
             <v:group id="Group 12" style="position:absolute;margin-left:42.5pt;margin-top:37.85pt;width:527pt;height:9.1pt;z-index:-15815168;mso-wrap-distance-left:0;mso-wrap-distance-right:0;mso-position-horizontal-relative:page;mso-position-vertical-relative:page" coordsize="66929,1155" o:spid="_x0000_s1026" w14:anchorId="58BDBA3A" o:gfxdata="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">
               <v:shape id="Graphic 13" style="position:absolute;left:539;top:551;width:66390;height:13;visibility:visible;mso-wrap-style:square;v-text-anchor:top" coordsize="6638925,1270" o:spid="_x0000_s1027" filled="f" strokecolor="#1d4b63" path="m,l6638404,e" o:gfxdata="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">
@@ -6592,6 +6836,7 @@
     <w:r>
       <w:rPr>
         <w:noProof/>
+        <w:lang w:eastAsia="es-CL"/>
       </w:rPr>
       <mc:AlternateContent>
         <mc:Choice Requires="wps">
@@ -6639,7 +6884,10 @@
                             <w:fldChar w:fldCharType="separate"/>
                           </w:r>
                           <w:r>
-                            <w:t>2</w:t>
+                            <w:rPr>
+                              <w:noProof/>
+                            </w:rPr>
+                            <w:t>10</w:t>
                           </w:r>
                           <w:r>
                             <w:fldChar w:fldCharType="end"/>
@@ -6662,7 +6910,8 @@
               <v:stroke joinstyle="miter"/>
               <v:path gradientshapeok="t" o:connecttype="rect"/>
             </v:shapetype>
-            <v:shape id="Textbox 15" o:spid="_x0000_s1026" type="#_x0000_t202" style="position:absolute;left:0;text-align:left;margin-left:560.4pt;margin-top:23.65pt;width:13.1pt;height:14pt;z-index:-15814656;visibility:visible;mso-wrap-style:square;mso-wrap-distance-left:0;mso-wrap-distance-top:0;mso-wrap-distance-right:0;mso-wrap-distance-bottom:0;mso-position-horizontal:absolute;mso-position-horizontal-relative:page;mso-position-vertical:absolute;mso-position-vertical-relative:page;v-text-anchor:top" o:gfxdata="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" filled="f" stroked="f">
+            <v:shape id="Textbox 15" o:spid="_x0000_s1026" type="#_x0000_t202" style="position:absolute;left:0;text-align:left;margin-left:560.4pt;margin-top:23.65pt;width:13.1pt;height:14pt;z-index:-15814656;visibility:visible;mso-wrap-style:square;mso-wrap-distance-left:0;mso-wrap-distance-top:0;mso-wrap-distance-right:0;mso-wrap-distance-bottom:0;mso-position-horizontal:absolute;mso-position-horizontal-relative:page;mso-position-vertical:absolute;mso-position-vertical-relative:page;v-text-anchor:top" o:gfxdata="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" filled="f" stroked="f">
+              <v:path arrowok="t"/>
               <v:textbox inset="0,0,0,0">
                 <w:txbxContent>
                   <w:p>
@@ -6676,7 +6925,10 @@
                       <w:fldChar w:fldCharType="separate"/>
                     </w:r>
                     <w:r>
-                      <w:t>2</w:t>
+                      <w:rPr>
+                        <w:noProof/>
+                      </w:rPr>
+                      <w:t>10</w:t>
                     </w:r>
                     <w:r>
                       <w:fldChar w:fldCharType="end"/>
@@ -6695,7 +6947,7 @@
 </file>
 
 <file path=word/numbering.xml><?xml version="1.0" encoding="utf-8"?>
-<w:numbering xmlns:wpc="http://schemas.microsoft.com/office/word/2010/wordprocessingCanvas" xmlns:cx="http://schemas.microsoft.com/office/drawing/2014/chartex" xmlns:cx1="http://schemas.microsoft.com/office/drawing/2015/9/8/chartex" xmlns:cx2="http://schemas.microsoft.com/office/drawing/2015/10/21/chartex" xmlns:cx3="http://schemas.microsoft.com/office/drawing/2016/5/9/chartex" xmlns:cx4="http://schemas.microsoft.com/office/drawing/2016/5/10/chartex" xmlns:cx5="http://schemas.microsoft.com/office/drawing/2016/5/11/chartex" xmlns:cx6="http://schemas.microsoft.com/office/drawing/2016/5/12/chartex" xmlns:cx7="http://schemas.microsoft.com/office/drawing/2016/5/13/chartex" xmlns:cx8="http://schemas.microsoft.com/office/drawing/2016/5/14/chartex" xmlns:mc="http://schemas.openxmlformats.org/markup-compatibility/2006" xmlns:aink="http://schemas.microsoft.com/office/drawing/2016/ink" xmlns:am3d="http://schemas.microsoft.com/office/drawing/2017/model3d" xmlns:o="urn:schemas-microsoft-com:office:office" xmlns:oel="http://schemas.microsoft.com/office/2019/extlst" xmlns:r="http://schemas.openxmlformats.org/officeDocument/2006/relationships" xmlns:m="http://schemas.openxmlformats.org/officeDocument/2006/math" xmlns:v="urn:schemas-microsoft-com:vml" xmlns:wp14="http://schemas.microsoft.com/office/word/2010/wordprocessingDrawing" xmlns:wp="http://schemas.openxmlformats.org/drawingml/2006/wordprocessingDrawing" xmlns:w10="urn:schemas-microsoft-com:office:word" xmlns:w="http://schemas.openxmlformats.org/wordprocessingml/2006/main" xmlns:w14="http://schemas.microsoft.com/office/word/2010/wordml" xmlns:w15="http://schemas.microsoft.com/office/word/2012/wordml" xmlns:w16cex="http://schemas.microsoft.com/office/word/2018/wordml/cex" xmlns:w16cid="http://schemas.microsoft.com/office/word/2016/wordml/cid" xmlns:w16="http://schemas.microsoft.com/office/word/2018/wordml" xmlns:w16du="http://schemas.microsoft.com/office/word/2023/wordml/word16du" xmlns:w16sdtdh="http://schemas.microsoft.com/office/word/2020/wordml/sdtdatahash" xmlns:w16sdtfl="http://schemas.microsoft.com/office/word/2024/wordml/sdtformatlock" xmlns:w16se="http://schemas.microsoft.com/office/word/2015/wordml/symex" xmlns:wpg="http://schemas.microsoft.com/office/word/2010/wordprocessingGroup" xmlns:wpi="http://schemas.microsoft.com/office/word/2010/wordprocessingInk" xmlns:wne="http://schemas.microsoft.com/office/word/2006/wordml" xmlns:wps="http://schemas.microsoft.com/office/word/2010/wordprocessingShape" mc:Ignorable="w14 w15 w16se w16cid w16 w16cex w16sdtdh w16sdtfl w16du wp14">
+<w:numbering xmlns:wpc="http://schemas.microsoft.com/office/word/2010/wordprocessingCanvas" xmlns:cx="http://schemas.microsoft.com/office/drawing/2014/chartex" xmlns:mc="http://schemas.openxmlformats.org/markup-compatibility/2006" xmlns:o="urn:schemas-microsoft-com:office:office" xmlns:r="http://schemas.openxmlformats.org/officeDocument/2006/relationships" xmlns:m="http://schemas.openxmlformats.org/officeDocument/2006/math" xmlns:v="urn:schemas-microsoft-com:vml" xmlns:wp14="http://schemas.microsoft.com/office/word/2010/wordprocessingDrawing" xmlns:wp="http://schemas.openxmlformats.org/drawingml/2006/wordprocessingDrawing" xmlns:w10="urn:schemas-microsoft-com:office:word" xmlns:w="http://schemas.openxmlformats.org/wordprocessingml/2006/main" xmlns:w14="http://schemas.microsoft.com/office/word/2010/wordml" xmlns:w15="http://schemas.microsoft.com/office/word/2012/wordml" xmlns:w16se="http://schemas.microsoft.com/office/word/2015/wordml/symex" xmlns:wpg="http://schemas.microsoft.com/office/word/2010/wordprocessingGroup" xmlns:wpi="http://schemas.microsoft.com/office/word/2010/wordprocessingInk" xmlns:wne="http://schemas.microsoft.com/office/word/2006/wordml" xmlns:wps="http://schemas.microsoft.com/office/word/2010/wordprocessingShape" mc:Ignorable="w14 w15 w16se wp14">
   <w:abstractNum w:abstractNumId="0" w15:restartNumberingAfterBreak="0">
     <w:nsid w:val="06DF4ED4"/>
     <w:multiLevelType w:val="hybridMultilevel"/>
@@ -8088,13 +8340,13 @@
       </w:pPr>
     </w:lvl>
   </w:abstractNum>
-  <w:num w:numId="1" w16cid:durableId="1792236605">
+  <w:num w:numId="1">
     <w:abstractNumId w:val="4"/>
   </w:num>
-  <w:num w:numId="2" w16cid:durableId="1182664394">
+  <w:num w:numId="2">
     <w:abstractNumId w:val="0"/>
   </w:num>
-  <w:num w:numId="3" w16cid:durableId="25719447">
+  <w:num w:numId="3">
     <w:abstractNumId w:val="9"/>
     <w:lvlOverride w:ilvl="0">
       <w:startOverride w:val="1"/>
@@ -8124,41 +8376,41 @@
       <w:startOverride w:val="1"/>
     </w:lvlOverride>
   </w:num>
-  <w:num w:numId="4" w16cid:durableId="1739790130">
+  <w:num w:numId="4">
     <w:abstractNumId w:val="5"/>
   </w:num>
-  <w:num w:numId="5" w16cid:durableId="114713531">
+  <w:num w:numId="5">
     <w:abstractNumId w:val="8"/>
   </w:num>
-  <w:num w:numId="6" w16cid:durableId="1514028092">
+  <w:num w:numId="6">
     <w:abstractNumId w:val="12"/>
   </w:num>
-  <w:num w:numId="7" w16cid:durableId="701251958">
+  <w:num w:numId="7">
     <w:abstractNumId w:val="2"/>
   </w:num>
-  <w:num w:numId="8" w16cid:durableId="2076852917">
+  <w:num w:numId="8">
     <w:abstractNumId w:val="10"/>
   </w:num>
-  <w:num w:numId="9" w16cid:durableId="1453554094">
+  <w:num w:numId="9">
     <w:abstractNumId w:val="3"/>
   </w:num>
-  <w:num w:numId="10" w16cid:durableId="680010014">
+  <w:num w:numId="10">
     <w:abstractNumId w:val="7"/>
   </w:num>
-  <w:num w:numId="11" w16cid:durableId="1253394110">
+  <w:num w:numId="11">
     <w:abstractNumId w:val="1"/>
   </w:num>
-  <w:num w:numId="12" w16cid:durableId="972171711">
+  <w:num w:numId="12">
     <w:abstractNumId w:val="6"/>
   </w:num>
-  <w:num w:numId="13" w16cid:durableId="287904074">
+  <w:num w:numId="13">
     <w:abstractNumId w:val="11"/>
   </w:num>
 </w:numbering>
 </file>
 
 <file path=word/styles.xml><?xml version="1.0" encoding="utf-8"?>
-<w:styles xmlns:mc="http://schemas.openxmlformats.org/markup-compatibility/2006" xmlns:r="http://schemas.openxmlformats.org/officeDocument/2006/relationships" xmlns:w="http://schemas.openxmlformats.org/wordprocessingml/2006/main" xmlns:w14="http://schemas.microsoft.com/office/word/2010/wordml" xmlns:w15="http://schemas.microsoft.com/office/word/2012/wordml" xmlns:w16cex="http://schemas.microsoft.com/office/word/2018/wordml/cex" xmlns:w16cid="http://schemas.microsoft.com/office/word/2016/wordml/cid" xmlns:w16="http://schemas.microsoft.com/office/word/2018/wordml" xmlns:w16du="http://schemas.microsoft.com/office/word/2023/wordml/word16du" xmlns:w16sdtdh="http://schemas.microsoft.com/office/word/2020/wordml/sdtdatahash" xmlns:w16sdtfl="http://schemas.microsoft.com/office/word/2024/wordml/sdtformatlock" xmlns:w16se="http://schemas.microsoft.com/office/word/2015/wordml/symex" mc:Ignorable="w14 w15 w16se w16cid w16 w16cex w16sdtdh w16sdtfl w16du">
+<w:styles xmlns:mc="http://schemas.openxmlformats.org/markup-compatibility/2006" xmlns:r="http://schemas.openxmlformats.org/officeDocument/2006/relationships" xmlns:w="http://schemas.openxmlformats.org/wordprocessingml/2006/main" xmlns:w14="http://schemas.microsoft.com/office/word/2010/wordml" xmlns:w15="http://schemas.microsoft.com/office/word/2012/wordml" xmlns:w16se="http://schemas.microsoft.com/office/word/2015/wordml/symex" mc:Ignorable="w14 w15 w16se">
   <w:docDefaults>
     <w:rPrDefault>
       <w:rPr>
@@ -8176,7 +8428,7 @@
       </w:pPr>
     </w:pPrDefault>
   </w:docDefaults>
-  <w:latentStyles w:defLockedState="0" w:defUIPriority="99" w:defSemiHidden="0" w:defUnhideWhenUsed="0" w:defQFormat="0" w:count="376">
+  <w:latentStyles w:defLockedState="0" w:defUIPriority="99" w:defSemiHidden="0" w:defUnhideWhenUsed="0" w:defQFormat="0" w:count="371">
     <w:lsdException w:name="Normal" w:uiPriority="0" w:qFormat="1"/>
     <w:lsdException w:name="heading 1" w:uiPriority="9" w:qFormat="1"/>
     <w:lsdException w:name="heading 2" w:semiHidden="1" w:uiPriority="9" w:unhideWhenUsed="1" w:qFormat="1"/>
@@ -8548,11 +8800,6 @@
     <w:lsdException w:name="List Table 5 Dark Accent 6" w:uiPriority="50"/>
     <w:lsdException w:name="List Table 6 Colorful Accent 6" w:uiPriority="51"/>
     <w:lsdException w:name="List Table 7 Colorful Accent 6" w:uiPriority="52"/>
-    <w:lsdException w:name="Mention" w:semiHidden="1" w:unhideWhenUsed="1"/>
-    <w:lsdException w:name="Smart Hyperlink" w:semiHidden="1" w:unhideWhenUsed="1"/>
-    <w:lsdException w:name="Hashtag" w:semiHidden="1" w:unhideWhenUsed="1"/>
-    <w:lsdException w:name="Unresolved Mention" w:semiHidden="1" w:unhideWhenUsed="1"/>
-    <w:lsdException w:name="Smart Link" w:semiHidden="1" w:unhideWhenUsed="1"/>
   </w:latentStyles>
   <w:style w:type="paragraph" w:default="1" w:styleId="Normal">
     <w:name w:val="Normal"/>
@@ -8634,6 +8881,7 @@
   <w:style w:type="character" w:default="1" w:styleId="Fuentedeprrafopredeter">
     <w:name w:val="Default Paragraph Font"/>
     <w:uiPriority w:val="1"/>
+    <w:semiHidden/>
     <w:unhideWhenUsed/>
   </w:style>
   <w:style w:type="table" w:default="1" w:styleId="Tablanormal">
@@ -8718,7 +8966,6 @@
   <w:style w:type="character" w:customStyle="1" w:styleId="eop">
     <w:name w:val="eop"/>
     <w:basedOn w:val="Fuentedeprrafopredeter"/>
-    <w:semiHidden/>
     <w:rsid w:val="00464217"/>
   </w:style>
   <w:style w:type="character" w:customStyle="1" w:styleId="PrrafodelistaCar">
@@ -8850,7 +9097,7 @@
       <w:u w:val="single"/>
     </w:rPr>
   </w:style>
-  <w:style w:type="character" w:styleId="Mencinsinresolver">
+  <w:style w:type="character" w:customStyle="1" w:styleId="UnresolvedMention">
     <w:name w:val="Unresolved Mention"/>
     <w:basedOn w:val="Fuentedeprrafopredeter"/>
     <w:uiPriority w:val="99"/>
@@ -8993,7 +9240,7 @@
       </w:tblBorders>
     </w:tblPr>
   </w:style>
-  <w:style w:type="table" w:styleId="Tablaconcuadrcula4-nfasis1">
+  <w:style w:type="table" w:styleId="Tabladecuadrcula4-nfasis1">
     <w:name w:val="Grid Table 4 Accent 1"/>
     <w:basedOn w:val="Tablanormal"/>
     <w:uiPriority w:val="49"/>
@@ -9065,6 +9312,25 @@
         <w:shd w:val="clear" w:color="auto" w:fill="DBE5F1" w:themeFill="accent1" w:themeFillTint="33"/>
       </w:tcPr>
     </w:tblStylePr>
+  </w:style>
+  <w:style w:type="paragraph" w:customStyle="1" w:styleId="paragraph">
+    <w:name w:val="paragraph"/>
+    <w:basedOn w:val="Normal"/>
+    <w:rsid w:val="00755AD7"/>
+    <w:pPr>
+      <w:widowControl/>
+      <w:autoSpaceDE/>
+      <w:autoSpaceDN/>
+      <w:spacing w:before="100" w:beforeAutospacing="1" w:after="100" w:afterAutospacing="1" w:line="240" w:lineRule="auto"/>
+      <w:ind w:firstLine="0"/>
+      <w:jc w:val="left"/>
+    </w:pPr>
+    <w:rPr>
+      <w:rFonts w:ascii="Times New Roman" w:eastAsia="Times New Roman" w:hAnsi="Times New Roman" w:cs="Times New Roman"/>
+      <w:sz w:val="24"/>
+      <w:szCs w:val="24"/>
+      <w:lang w:eastAsia="es-CL"/>
+    </w:rPr>
   </w:style>
 </w:styles>
 </file>
@@ -9353,41 +9619,6 @@
 </file>
 
 <file path=customXml/item1.xml><?xml version="1.0" encoding="utf-8"?>
-<p:properties xmlns:p="http://schemas.microsoft.com/office/2006/metadata/properties" xmlns:xsi="http://www.w3.org/2001/XMLSchema-instance" xmlns:pc="http://schemas.microsoft.com/office/infopath/2007/PartnerControls">
-  <documentManagement>
-    <_ApprovalAssignedTo xmlns="0a2fff00-f002-44e7-b50c-b90cb65110b9">
-      <UserInfo>
-        <DisplayName/>
-        <AccountId xsi:nil="true"/>
-        <AccountType/>
-      </UserInfo>
-    </_ApprovalAssignedTo>
-    <_ApprovalRespondedBy xmlns="0a2fff00-f002-44e7-b50c-b90cb65110b9">
-      <UserInfo>
-        <DisplayName/>
-        <AccountId xsi:nil="true"/>
-        <AccountType/>
-      </UserInfo>
-    </_ApprovalRespondedBy>
-    <_ApprovalStatus xmlns="0a2fff00-f002-44e7-b50c-b90cb65110b9">0</_ApprovalStatus>
-  </documentManagement>
-</p:properties>
-</file>
-
-<file path=customXml/item2.xml><?xml version="1.0" encoding="utf-8"?>
-<b:Sources xmlns:b="http://schemas.openxmlformats.org/officeDocument/2006/bibliography" xmlns="http://schemas.openxmlformats.org/officeDocument/2006/bibliography" SelectedStyle="\APASixthEditionOfficeOnline.xsl" StyleName="APA" Version="6"/>
-</file>
-
-<file path=customXml/item3.xml><?xml version="1.0" encoding="utf-8"?>
-<?mso-contentType ?>
-<FormTemplates xmlns="http://schemas.microsoft.com/sharepoint/v3/contenttype/forms">
-  <Display>DocumentLibraryForm</Display>
-  <Edit>DocumentLibraryForm</Edit>
-  <New>DocumentLibraryForm</New>
-</FormTemplates>
-</file>
-
-<file path=customXml/item4.xml><?xml version="1.0" encoding="utf-8"?>
 <ct:contentTypeSchema xmlns:ct="http://schemas.microsoft.com/office/2006/metadata/contentType" xmlns:ma="http://schemas.microsoft.com/office/2006/metadata/properties/metaAttributes" ct:_="" ma:_="" ma:contentTypeName="Documento" ma:contentTypeID="0x010100E4D0EA28D091FE4192BEFA8519B37564" ma:contentTypeVersion="11" ma:contentTypeDescription="Crear nuevo documento." ma:contentTypeScope="" ma:versionID="03233efde1029e2378ce26f68e4e04a7">
   <xsd:schema xmlns:xsd="http://www.w3.org/2001/XMLSchema" xmlns:xs="http://www.w3.org/2001/XMLSchema" xmlns:p="http://schemas.microsoft.com/office/2006/metadata/properties" xmlns:ns2="0a2fff00-f002-44e7-b50c-b90cb65110b9" targetNamespace="http://schemas.microsoft.com/office/2006/metadata/properties" ma:root="true" ma:fieldsID="0c61ffaedf55a65463b0f7398d7e3f83" ns2:_="">
     <xsd:import namespace="0a2fff00-f002-44e7-b50c-b90cb65110b9"/>
@@ -9615,33 +9846,42 @@
 </ct:contentTypeSchema>
 </file>
 
-<file path=customXml/itemProps1.xml><?xml version="1.0" encoding="utf-8"?>
-<ds:datastoreItem xmlns:ds="http://schemas.openxmlformats.org/officeDocument/2006/customXml" ds:itemID="{662F60C8-4BC5-4139-BE63-6954D22D77BD}">
-  <ds:schemaRefs>
-    <ds:schemaRef ds:uri="http://schemas.microsoft.com/office/2006/metadata/properties"/>
-    <ds:schemaRef ds:uri="http://schemas.microsoft.com/office/infopath/2007/PartnerControls"/>
-    <ds:schemaRef ds:uri="0a2fff00-f002-44e7-b50c-b90cb65110b9"/>
-  </ds:schemaRefs>
-</ds:datastoreItem>
+<file path=customXml/item2.xml><?xml version="1.0" encoding="utf-8"?>
+<?mso-contentType ?>
+<FormTemplates xmlns="http://schemas.microsoft.com/sharepoint/v3/contenttype/forms">
+  <Display>DocumentLibraryForm</Display>
+  <Edit>DocumentLibraryForm</Edit>
+  <New>DocumentLibraryForm</New>
+</FormTemplates>
 </file>
 
-<file path=customXml/itemProps2.xml><?xml version="1.0" encoding="utf-8"?>
-<ds:datastoreItem xmlns:ds="http://schemas.openxmlformats.org/officeDocument/2006/customXml" ds:itemID="{FACB83BB-458E-4CCB-91D7-35CFBA93934D}">
-  <ds:schemaRefs>
-    <ds:schemaRef ds:uri="http://schemas.openxmlformats.org/officeDocument/2006/bibliography"/>
-  </ds:schemaRefs>
-</ds:datastoreItem>
+<file path=customXml/item3.xml><?xml version="1.0" encoding="utf-8"?>
+<p:properties xmlns:p="http://schemas.microsoft.com/office/2006/metadata/properties" xmlns:xsi="http://www.w3.org/2001/XMLSchema-instance" xmlns:pc="http://schemas.microsoft.com/office/infopath/2007/PartnerControls">
+  <documentManagement>
+    <_ApprovalAssignedTo xmlns="0a2fff00-f002-44e7-b50c-b90cb65110b9">
+      <UserInfo>
+        <DisplayName/>
+        <AccountId xsi:nil="true"/>
+        <AccountType/>
+      </UserInfo>
+    </_ApprovalAssignedTo>
+    <_ApprovalRespondedBy xmlns="0a2fff00-f002-44e7-b50c-b90cb65110b9">
+      <UserInfo>
+        <DisplayName/>
+        <AccountId xsi:nil="true"/>
+        <AccountType/>
+      </UserInfo>
+    </_ApprovalRespondedBy>
+    <_ApprovalStatus xmlns="0a2fff00-f002-44e7-b50c-b90cb65110b9">0</_ApprovalStatus>
+  </documentManagement>
+</p:properties>
 </file>
 
-<file path=customXml/itemProps3.xml><?xml version="1.0" encoding="utf-8"?>
-<ds:datastoreItem xmlns:ds="http://schemas.openxmlformats.org/officeDocument/2006/customXml" ds:itemID="{084C26D9-49C9-4ADB-A387-DA6079798921}">
-  <ds:schemaRefs>
-    <ds:schemaRef ds:uri="http://schemas.microsoft.com/sharepoint/v3/contenttype/forms"/>
-  </ds:schemaRefs>
-</ds:datastoreItem>
+<file path=customXml/item4.xml><?xml version="1.0" encoding="utf-8"?>
+<b:Sources xmlns:b="http://schemas.openxmlformats.org/officeDocument/2006/bibliography" xmlns="http://schemas.openxmlformats.org/officeDocument/2006/bibliography" SelectedStyle="\APASixthEditionOfficeOnline.xsl" StyleName="APA" Version="6"/>
 </file>
 
-<file path=customXml/itemProps4.xml><?xml version="1.0" encoding="utf-8"?>
+<file path=customXml/itemProps1.xml><?xml version="1.0" encoding="utf-8"?>
 <ds:datastoreItem xmlns:ds="http://schemas.openxmlformats.org/officeDocument/2006/customXml" ds:itemID="{23546E79-64AE-4765-BD79-8F86E2CE885D}">
   <ds:schemaRefs>
     <ds:schemaRef ds:uri="http://schemas.microsoft.com/office/2006/metadata/contentType"/>
@@ -9657,4 +9897,30 @@
     <ds:schemaRef ds:uri="http://schemas.microsoft.com/internal/obd"/>
   </ds:schemaRefs>
 </ds:datastoreItem>
+</file>
+
+<file path=customXml/itemProps2.xml><?xml version="1.0" encoding="utf-8"?>
+<ds:datastoreItem xmlns:ds="http://schemas.openxmlformats.org/officeDocument/2006/customXml" ds:itemID="{084C26D9-49C9-4ADB-A387-DA6079798921}">
+  <ds:schemaRefs>
+    <ds:schemaRef ds:uri="http://schemas.microsoft.com/sharepoint/v3/contenttype/forms"/>
+  </ds:schemaRefs>
+</ds:datastoreItem>
+</file>
+
+<file path=customXml/itemProps3.xml><?xml version="1.0" encoding="utf-8"?>
+<ds:datastoreItem xmlns:ds="http://schemas.openxmlformats.org/officeDocument/2006/customXml" ds:itemID="{662F60C8-4BC5-4139-BE63-6954D22D77BD}">
+  <ds:schemaRefs>
+    <ds:schemaRef ds:uri="http://schemas.microsoft.com/office/2006/metadata/properties"/>
+    <ds:schemaRef ds:uri="http://schemas.microsoft.com/office/infopath/2007/PartnerControls"/>
+    <ds:schemaRef ds:uri="0a2fff00-f002-44e7-b50c-b90cb65110b9"/>
+  </ds:schemaRefs>
+</ds:datastoreItem>
+</file>
+
+<file path=customXml/itemProps4.xml><?xml version="1.0" encoding="utf-8"?>
+<ds:datastoreItem xmlns:ds="http://schemas.openxmlformats.org/officeDocument/2006/customXml" ds:itemID="{5C04D8DA-B7F8-49F1-9D72-27DE5772F604}">
+  <ds:schemaRefs>
+    <ds:schemaRef ds:uri="http://schemas.openxmlformats.org/officeDocument/2006/bibliography"/>
+  </ds:schemaRefs>
+</ds:datastoreItem>
 </file>
</xml_diff>

<commit_message>
Ajusta informe a la guía, actualiza requirements y changelog
</commit_message>
<xml_diff>
--- a/docs/f4_s03_evaluacion_entregable_grupo2.docx
+++ b/docs/f4_s03_evaluacion_entregable_grupo2.docx
@@ -2923,7 +2923,7 @@
                 <w:noProof/>
                 <w:webHidden/>
               </w:rPr>
-              <w:t>6</w:t>
+              <w:t>7</w:t>
             </w:r>
             <w:r>
               <w:rPr>
@@ -2997,7 +2997,7 @@
                 <w:noProof/>
                 <w:webHidden/>
               </w:rPr>
-              <w:t>6</w:t>
+              <w:t>7</w:t>
             </w:r>
             <w:r>
               <w:rPr>
@@ -3367,7 +3367,7 @@
                 <w:noProof/>
                 <w:webHidden/>
               </w:rPr>
-              <w:t>8</w:t>
+              <w:t>9</w:t>
             </w:r>
             <w:r>
               <w:rPr>
@@ -3441,7 +3441,7 @@
                 <w:noProof/>
                 <w:webHidden/>
               </w:rPr>
-              <w:t>8</w:t>
+              <w:t>9</w:t>
             </w:r>
             <w:r>
               <w:rPr>
@@ -3738,19 +3738,12 @@
       </w:r>
     </w:p>
     <w:p>
-      <w:r>
-        <w:t xml:space="preserve">El </w:t>
-      </w:r>
-      <w:r>
-        <w:t xml:space="preserve">objetivo general es caracterizar los patrones temporales de generación eléctrica de las tres centrales mediante un proceso reproducible de preparación, validación y análisis. El alcance se mantiene deliberadamente descriptivo: los registros iguales a 0 </w:t>
-      </w:r>
-      <w:proofErr w:type="spellStart"/>
-      <w:r>
-        <w:t>MWh</w:t>
-      </w:r>
-      <w:proofErr w:type="spellEnd"/>
-      <w:r>
-        <w:t xml:space="preserve"> se conservan y analizan como parte de los datos publicados, pero no se atribuyen a fallas, detenciones, mantenimiento u otras causas operacionales que no puedan verificarse con la información disponible.</w:t>
+      <w:pPr>
+        <w:ind w:left="0" w:firstLine="567"/>
+      </w:pPr>
+      <w:r>
+        <w:rPr/>
+        <w:t xml:space="preserve">La relevancia del análisis es práctica: quienes operan estas plantas de cogeneración o analizan la inyección de excedentes al Sistema Eléctrico Nacional pueden usar los patrones horarios, mensuales y la frecuencia de 0 MWh para dimensionar la variabilidad de la generación y priorizar qué períodos revisar con información operacional. El trabajo se enmarca en el curso de Programación para la Ciencia de Datos (Salinas Silva, 2026b) y se organiza en cuatro fases: F1 definió el problema y el entorno, F2 preparó y validó los datos, F3 construyó el núcleo algorítmico (POO, eficiencia y recursividad) y F4 integra, visualiza y comunica los resultados (Tabla de la sección 3.5).</w:t>
       </w:r>
     </w:p>
     <w:p>
@@ -3983,23 +3976,17 @@
           <w:ilvl w:val="0"/>
           <w:numId w:val="12"/>
         </w:numPr>
-        <w:rPr>
-          <w:lang w:val="es-CL"/>
-        </w:rPr>
-      </w:pPr>
-      <w:r>
-        <w:rPr>
-          <w:rFonts w:eastAsia="Arial"/>
-          <w:lang w:val="es-CL"/>
-        </w:rPr>
-        <w:t>El análisis se lim</w:t>
-      </w:r>
-      <w:r>
-        <w:rPr>
-          <w:rFonts w:eastAsia="Arial"/>
-          <w:lang w:val="es-CL"/>
-        </w:rPr>
-        <w:t>ita a las tres centrales seleccionadas y al período comprendido entre el 1 de enero y el 31 de agosto de 2026.</w:t>
+        <w:spacing w:after="60"/>
+      </w:pPr>
+      <w:r>
+        <w:rPr>
+          <w:b/>
+        </w:rPr>
+        <w:t xml:space="preserve">Alcance.</w:t>
+      </w:r>
+      <w:r>
+        <w:rPr/>
+        <w:t xml:space="preserve"> Tres centrales (Laja, Pacífico y Santa Fe), del 1 de enero al 31 de agosto de 2026, con análisis descriptivo de patrones horarios, diarios y mensuales y de los registros de 0 MWh. No incluye otras centrales, pronósticos ni causas operacionales.</w:t>
       </w:r>
     </w:p>
     <w:p>
@@ -4009,23 +3996,17 @@
           <w:ilvl w:val="0"/>
           <w:numId w:val="12"/>
         </w:numPr>
-        <w:rPr>
-          <w:lang w:val="es-CL"/>
-        </w:rPr>
-      </w:pPr>
-      <w:r>
-        <w:rPr>
-          <w:rFonts w:eastAsia="Arial"/>
-          <w:lang w:val="es-CL"/>
-        </w:rPr>
-        <w:t>No se atribuyen causa</w:t>
-      </w:r>
-      <w:r>
-        <w:rPr>
-          <w:rFonts w:eastAsia="Arial"/>
-          <w:lang w:val="es-CL"/>
-        </w:rPr>
-        <w:t>s operacionales, económicas o de mantenimiento a comportamientos que no puedan verificarse con la fuente disponible.</w:t>
+        <w:spacing w:after="60"/>
+      </w:pPr>
+      <w:r>
+        <w:rPr>
+          <w:b/>
+        </w:rPr>
+        <w:t xml:space="preserve">Restricciones.</w:t>
+      </w:r>
+      <w:r>
+        <w:rPr/>
+        <w:t xml:space="preserve"> Solo datos públicos de Generación Real del CEN en MWh, un período de ocho meses (sin estacionalidad anual) y sin información operacional (programación interna, mantenimientos).</w:t>
       </w:r>
     </w:p>
     <w:p>
@@ -4035,58 +4016,17 @@
           <w:ilvl w:val="0"/>
           <w:numId w:val="12"/>
         </w:numPr>
-        <w:rPr>
-          <w:lang w:val="es-CL"/>
-        </w:rPr>
-      </w:pPr>
-      <w:r>
-        <w:rPr>
-          <w:rFonts w:eastAsia="Arial"/>
-          <w:lang w:val="es-CL"/>
-        </w:rPr>
-        <w:t xml:space="preserve">Los registros de 0 </w:t>
-      </w:r>
-      <w:proofErr w:type="spellStart"/>
-      <w:r>
-        <w:rPr>
-          <w:rFonts w:eastAsia="Arial"/>
-          <w:lang w:val="es-CL"/>
-        </w:rPr>
-        <w:t>MWh</w:t>
-      </w:r>
-      <w:proofErr w:type="spellEnd"/>
-      <w:r>
-        <w:rPr>
-          <w:rFonts w:eastAsia="Arial"/>
-          <w:lang w:val="es-CL"/>
-        </w:rPr>
-        <w:t xml:space="preserve"> se conservan como observaciones válidas mientras no exista evidencia suficiente para clasificarlos como errores.</w:t>
-      </w:r>
-    </w:p>
-    <w:p>
-      <w:pPr>
-        <w:pStyle w:val="F4Body"/>
-        <w:numPr>
-          <w:ilvl w:val="0"/>
-          <w:numId w:val="12"/>
-        </w:numPr>
-        <w:rPr>
-          <w:lang w:val="es-CL"/>
-        </w:rPr>
-      </w:pPr>
-      <w:r>
-        <w:rPr>
-          <w:rFonts w:eastAsia="Arial"/>
-          <w:lang w:val="es-CL"/>
-        </w:rPr>
-        <w:t xml:space="preserve">Se </w:t>
-      </w:r>
-      <w:r>
-        <w:rPr>
-          <w:rFonts w:eastAsia="Arial"/>
-          <w:lang w:val="es-CL"/>
-        </w:rPr>
-        <w:t>mantiene la codificación horaria 1-24 informada por el CEN y se espera una estructura de 24 observaciones por combinación central-fecha.</w:t>
+        <w:spacing w:after="60"/>
+      </w:pPr>
+      <w:r>
+        <w:rPr>
+          <w:b/>
+        </w:rPr>
+        <w:t xml:space="preserve">Supuestos.</w:t>
+      </w:r>
+      <w:r>
+        <w:rPr/>
+        <w:t xml:space="preserve"> Los registros de 0 MWh son observaciones válidas mientras no exista evidencia de error; se mantiene la codificación horaria 1–24 del CEN con 24 observaciones por central y fecha; los datos publicados reflejan fielmente la energía inyectada.</w:t>
       </w:r>
     </w:p>
     <w:p>
@@ -4565,7 +4505,7 @@
       </w:r>
       <w:r>
         <w:rPr/>
-        <w:t xml:space="preserve"> (fecha, descripción, hash, justificación y autor) y los hashes citados en este informe (Tabla 4) pueden verificarse con </w:t>
+        <w:t xml:space="preserve"> (fecha, descripción, hash, justificación y autor) y los hashes citados en este informe (Tabla 5) pueden verificarse con </w:t>
       </w:r>
       <w:r>
         <w:rPr>
@@ -4621,7 +4561,7 @@
       </w:r>
       <w:r>
         <w:rPr/>
-        <w:t xml:space="preserve"> documenta con docstrings sus clases y funciones públicas, y cada notebook explica en celdas Markdown las decisiones técnicas antes del código. Cada figura final declara fuente e interpretación (sección VII).</w:t>
+        <w:t xml:space="preserve"> documenta con docstrings sus clases y funciones públicas, y cada notebook explica en celdas Markdown las decisiones técnicas antes del código.</w:t>
       </w:r>
     </w:p>
     <w:p>
@@ -4711,7 +4651,7 @@
       </w:r>
       <w:r>
         <w:rPr/>
-        <w:t xml:space="preserve"> refleja la última versión integrada y no hay ramas remotas con trabajo pendiente de fusionar.</w:t>
+        <w:t xml:space="preserve"> refleja la última versión integrada.</w:t>
       </w:r>
     </w:p>
     <w:p>
@@ -4751,7 +4691,7 @@
       </w:r>
       <w:r>
         <w:rPr/>
-        <w:t xml:space="preserve"> y los notebooks solo la invocan: </w:t>
+        <w:t xml:space="preserve"> y los notebooks solo la invocan (Tabla 2): lectura del CSV (</w:t>
       </w:r>
       <w:r>
         <w:rPr>
@@ -4761,57 +4701,57 @@
       </w:r>
       <w:r>
         <w:rPr/>
-        <w:t xml:space="preserve"> lee el CSV del CEN; </w:t>
+        <w:t xml:space="preserve">), conversión numérica estricta con </w:t>
       </w:r>
       <w:r>
         <w:rPr>
           <w:rFonts w:ascii="Courier New" w:hAnsi="Courier New" w:cs="Courier New"/>
         </w:rPr>
+        <w:t xml:space="preserve">pd.to_numeric(errors="raise")</w:t>
+      </w:r>
+      <w:r>
+        <w:rPr/>
+        <w:t xml:space="preserve"> y paso a formato largo (</w:t>
+      </w:r>
+      <w:r>
+        <w:rPr>
+          <w:rFonts w:ascii="Courier New" w:hAnsi="Courier New" w:cs="Courier New"/>
+        </w:rPr>
         <w:t xml:space="preserve">transformacion.py</w:t>
       </w:r>
       <w:r>
         <w:rPr/>
-        <w:t xml:space="preserve"> convierte los valores a numérico de forma estricta (</w:t>
+        <w:t xml:space="preserve">), reglas de validación atómicas (</w:t>
       </w:r>
       <w:r>
         <w:rPr>
           <w:rFonts w:ascii="Courier New" w:hAnsi="Courier New" w:cs="Courier New"/>
         </w:rPr>
-        <w:t xml:space="preserve">pd.to_numeric(errors="raise")</w:t>
+        <w:t xml:space="preserve">validacion.py</w:t>
       </w:r>
       <w:r>
         <w:rPr/>
-        <w:t xml:space="preserve">) y pasa de formato ancho a largo; </w:t>
+        <w:t xml:space="preserve">), exportación que crea la carpeta de destino (</w:t>
       </w:r>
       <w:r>
         <w:rPr>
           <w:rFonts w:ascii="Courier New" w:hAnsi="Courier New" w:cs="Courier New"/>
         </w:rPr>
-        <w:t xml:space="preserve">validacion.py</w:t>
+        <w:t xml:space="preserve">exportacion.py</w:t>
       </w:r>
       <w:r>
         <w:rPr/>
-        <w:t xml:space="preserve"> implementa reglas atómicas (sin nulos, sin duplicados, sin negativos, categorías esperadas y granularidad de 24 horas); </w:t>
+        <w:t xml:space="preserve">) y secuencias de 0 MWh (</w:t>
       </w:r>
       <w:r>
         <w:rPr>
           <w:rFonts w:ascii="Courier New" w:hAnsi="Courier New" w:cs="Courier New"/>
         </w:rPr>
-        <w:t xml:space="preserve">exportacion.py</w:t>
+        <w:t xml:space="preserve">secuencias.py</w:t>
       </w:r>
       <w:r>
         <w:rPr/>
-        <w:t xml:space="preserve"> guarda el dataset creando la carpeta de destino si no existe; y </w:t>
-      </w:r>
-      <w:r>
-        <w:rPr>
-          <w:rFonts w:ascii="Courier New" w:hAnsi="Courier New" w:cs="Courier New"/>
-        </w:rPr>
-        <w:t xml:space="preserve">secuencias.py</w:t>
-      </w:r>
-      <w:r>
-        <w:rPr/>
-        <w:t xml:space="preserve"> detecta secuencias de 0 MWh.</w:t>
+        <w:t xml:space="preserve">).</w:t>
       </w:r>
     </w:p>
     <w:p>
@@ -4959,7 +4899,7 @@
       </w:r>
       <w:r>
         <w:rPr/>
-        <w:t xml:space="preserve">. Para las secuencias de 0 MWh se adopta la versión iterativa: ambas son O(n), pero la recursiva consume unas tres veces más memoria por la pila de llamadas y no es más rápida desde 250 observaciones; se conserva como contraste algorítmico.</w:t>
+        <w:t xml:space="preserve">. Para las secuencias de 0 MWh se adopta la versión iterativa: ambas son O(n), pero la recursiva consume unas tres veces más memoria por la pila de llamadas y no es más rápida desde 250 observaciones; se conserva como contraste algorítmico. Las mediciones de transformación y de detección de ceros se hicieron sobre el dataset completo y la de secuencias sobre tamaños crecientes (100 a 750 observaciones); no se midió en qué tamaño pequeño se invertiría la ventaja vectorizada.</w:t>
       </w:r>
     </w:p>
     <w:p>
@@ -5406,7 +5346,27 @@
       </w:pPr>
       <w:r>
         <w:rPr/>
-        <w:t xml:space="preserve">El código se organiza por responsabilidad en el flujo carga → transformación → validación → agregación → exportación; los notebooks solo orquestan y narran. Cada función es breve, recibe sus parámetros (período, centrales, columnas horarias) de forma explícita y evita estado global, lo que facilita probarla de manera aislada.</w:t>
+        <w:t xml:space="preserve">El código se organiza por responsabilidad en el flujo carga → transformación → validación → agregación → exportación; los notebooks solo orquestan y narran. Cada función es breve, recibe sus parámetros (período, centrales, columnas horarias) de forma explícita y evita estado global, lo que facilita probarla de manera aislada. Agregar un criterio de agregación nuevo (por ejemplo, semanal) exige crear una sola clase en </w:t>
+      </w:r>
+      <w:r>
+        <w:rPr>
+          <w:rFonts w:ascii="Courier New" w:hAnsi="Courier New" w:cs="Courier New"/>
+        </w:rPr>
+        <w:t xml:space="preserve">agregacion_temporal.py</w:t>
+      </w:r>
+      <w:r>
+        <w:rPr/>
+        <w:t xml:space="preserve"> y no modifica </w:t>
+      </w:r>
+      <w:r>
+        <w:rPr>
+          <w:rFonts w:ascii="Courier New" w:hAnsi="Courier New" w:cs="Courier New"/>
+        </w:rPr>
+        <w:t xml:space="preserve">Pipeline</w:t>
+      </w:r>
+      <w:r>
+        <w:rPr/>
+        <w:t xml:space="preserve">, el notebook ni la validación: se toca un archivo.</w:t>
       </w:r>
     </w:p>
     <w:p>
@@ -5478,17 +5438,7 @@
       </w:r>
       <w:r>
         <w:rPr/>
-        <w:t xml:space="preserve"> define la clase base </w:t>
-      </w:r>
-      <w:r>
-        <w:rPr>
-          <w:rFonts w:ascii="Courier New" w:hAnsi="Courier New" w:cs="Courier New"/>
-        </w:rPr>
-        <w:t xml:space="preserve">Transformador</w:t>
-      </w:r>
-      <w:r>
-        <w:rPr/>
-        <w:t xml:space="preserve"> (interfaz </w:t>
+        <w:t xml:space="preserve"> aplica tres principios sobre el esquema de clase base con </w:t>
       </w:r>
       <w:r>
         <w:rPr>
@@ -5508,7 +5458,17 @@
       </w:r>
       <w:r>
         <w:rPr/>
-        <w:t xml:space="preserve">) y cuatro transformadores concretos —</w:t>
+        <w:t xml:space="preserve"> de la guía del curso (Salinas Silva, 2026a). </w:t>
+      </w:r>
+      <w:r>
+        <w:rPr>
+          <w:b/>
+        </w:rPr>
+        <w:t xml:space="preserve">Herencia:</w:t>
+      </w:r>
+      <w:r>
+        <w:rPr/>
+        <w:t xml:space="preserve"> </w:t>
       </w:r>
       <w:r>
         <w:rPr>
@@ -5548,18 +5508,143 @@
       </w:r>
       <w:r>
         <w:rPr/>
-        <w:t xml:space="preserve">— que la clase </w:t>
+        <w:t xml:space="preserve"> heredan de </w:t>
       </w:r>
       <w:r>
         <w:rPr>
           <w:rFonts w:ascii="Courier New" w:hAnsi="Courier New" w:cs="Courier New"/>
         </w:rPr>
+        <w:t xml:space="preserve">Transformador</w:t>
+      </w:r>
+      <w:r>
+        <w:rPr/>
+        <w:t xml:space="preserve">, que fija el orden (</w:t>
+      </w:r>
+      <w:r>
+        <w:rPr>
+          <w:rFonts w:ascii="Courier New" w:hAnsi="Courier New" w:cs="Courier New"/>
+        </w:rPr>
+        <w:t xml:space="preserve">ajustar</w:t>
+      </w:r>
+      <w:r>
+        <w:rPr/>
+        <w:t xml:space="preserve"> antes de </w:t>
+      </w:r>
+      <w:r>
+        <w:rPr>
+          <w:rFonts w:ascii="Courier New" w:hAnsi="Courier New" w:cs="Courier New"/>
+        </w:rPr>
+        <w:t xml:space="preserve">transformar</w:t>
+      </w:r>
+      <w:r>
+        <w:rPr/>
+        <w:t xml:space="preserve">) y deja a cada hija solo </w:t>
+      </w:r>
+      <w:r>
+        <w:rPr>
+          <w:rFonts w:ascii="Courier New" w:hAnsi="Courier New" w:cs="Courier New"/>
+        </w:rPr>
+        <w:t xml:space="preserve">aprender()</w:t>
+      </w:r>
+      <w:r>
+        <w:rPr/>
+        <w:t xml:space="preserve"> y </w:t>
+      </w:r>
+      <w:r>
+        <w:rPr>
+          <w:rFonts w:ascii="Courier New" w:hAnsi="Courier New" w:cs="Courier New"/>
+        </w:rPr>
+        <w:t xml:space="preserve">aplicar()</w:t>
+      </w:r>
+      <w:r>
+        <w:rPr/>
+        <w:t xml:space="preserve">. </w:t>
+      </w:r>
+      <w:r>
+        <w:rPr>
+          <w:b/>
+        </w:rPr>
+        <w:t xml:space="preserve">Polimorfismo:</w:t>
+      </w:r>
+      <w:r>
+        <w:rPr/>
+        <w:t xml:space="preserve"> </w:t>
+      </w:r>
+      <w:r>
+        <w:rPr>
+          <w:rFonts w:ascii="Courier New" w:hAnsi="Courier New" w:cs="Courier New"/>
+        </w:rPr>
         <w:t xml:space="preserve">Pipeline</w:t>
       </w:r>
       <w:r>
         <w:rPr/>
-        <w:t xml:space="preserve"> ejecuta en orden. </w:t>
-      </w:r>
+        <w:t xml:space="preserve"> recorre sus pasos con la misma llamada, </w:t>
+      </w:r>
+      <w:r>
+        <w:rPr>
+          <w:rFonts w:ascii="Courier New" w:hAnsi="Courier New" w:cs="Courier New"/>
+        </w:rPr>
+        <w:t xml:space="preserve">paso.ajustar(df).transformar(df)</w:t>
+      </w:r>
+      <w:r>
+        <w:rPr/>
+        <w:t xml:space="preserve">, sin preguntar de qué clase es cada uno. </w:t>
+      </w:r>
+      <w:r>
+        <w:rPr>
+          <w:b/>
+        </w:rPr>
+        <w:t xml:space="preserve">Encapsulamiento:</w:t>
+      </w:r>
+      <w:r>
+        <w:rPr/>
+        <w:t xml:space="preserve"> cada objeto guarda su estado en atributos internos (</w:t>
+      </w:r>
+      <w:r>
+        <w:rPr>
+          <w:rFonts w:ascii="Courier New" w:hAnsi="Courier New" w:cs="Courier New"/>
+        </w:rPr>
+        <w:t xml:space="preserve">_parametros</w:t>
+      </w:r>
+      <w:r>
+        <w:rPr/>
+        <w:t xml:space="preserve">, </w:t>
+      </w:r>
+      <w:r>
+        <w:rPr>
+          <w:rFonts w:ascii="Courier New" w:hAnsi="Courier New" w:cs="Courier New"/>
+        </w:rPr>
+        <w:t xml:space="preserve">_ajustado</w:t>
+      </w:r>
+      <w:r>
+        <w:rPr/>
+        <w:t xml:space="preserve">) y </w:t>
+      </w:r>
+      <w:r>
+        <w:rPr>
+          <w:rFonts w:ascii="Courier New" w:hAnsi="Courier New" w:cs="Courier New"/>
+        </w:rPr>
+        <w:t xml:space="preserve">transformar</w:t>
+      </w:r>
+      <w:r>
+        <w:rPr/>
+        <w:t xml:space="preserve"> lanza </w:t>
+      </w:r>
+      <w:r>
+        <w:rPr>
+          <w:rFonts w:ascii="Courier New" w:hAnsi="Courier New" w:cs="Courier New"/>
+        </w:rPr>
+        <w:t xml:space="preserve">RuntimeError</w:t>
+      </w:r>
+      <w:r>
+        <w:rPr/>
+        <w:t xml:space="preserve"> si no se ajustó antes.</w:t>
+      </w:r>
+    </w:p>
+    <w:p>
+      <w:pPr>
+        <w:ind w:left="0" w:firstLine="567"/>
+      </w:pPr>
       <w:r>
         <w:rPr>
           <w:rFonts w:ascii="Courier New" w:hAnsi="Courier New" w:cs="Courier New"/>
@@ -5578,7 +5663,17 @@
       </w:r>
       <w:r>
         <w:rPr/>
-        <w:t xml:space="preserve"> (Gamma et al., 1994): </w:t>
+        <w:t xml:space="preserve"> (Gamma et al., 1994). Sin él, calcular perfiles por hora, día, mes y día de la semana habría requerido funciones casi idénticas, y cada criterio nuevo obligaba a modificar código ya probado. El patrón encapsula cada criterio en una clase con la misma interfaz </w:t>
+      </w:r>
+      <w:r>
+        <w:rPr>
+          <w:rFonts w:ascii="Courier New" w:hAnsi="Courier New" w:cs="Courier New"/>
+        </w:rPr>
+        <w:t xml:space="preserve">agregar()</w:t>
+      </w:r>
+      <w:r>
+        <w:rPr/>
+        <w:t xml:space="preserve"> (</w:t>
       </w:r>
       <w:r>
         <w:rPr>
@@ -5618,27 +5713,17 @@
       </w:r>
       <w:r>
         <w:rPr/>
-        <w:t xml:space="preserve"> comparten la interfaz </w:t>
+        <w:t xml:space="preserve">; 72, 729, 24 y 21 resultados) y </w:t>
       </w:r>
       <w:r>
         <w:rPr>
           <w:rFonts w:ascii="Courier New" w:hAnsi="Courier New" w:cs="Courier New"/>
         </w:rPr>
-        <w:t xml:space="preserve">agregar()</w:t>
+        <w:t xml:space="preserve">CaracterizadorTemporal</w:t>
       </w:r>
       <w:r>
         <w:rPr/>
-        <w:t xml:space="preserve"> y </w:t>
-      </w:r>
-      <w:r>
-        <w:rPr>
-          <w:rFonts w:ascii="Courier New" w:hAnsi="Courier New" w:cs="Courier New"/>
-        </w:rPr>
-        <w:t xml:space="preserve">CaracterizadorTemporal</w:t>
-      </w:r>
-      <w:r>
-        <w:rPr/>
-        <w:t xml:space="preserve"> las usa de forma intercambiable (72, 729, 24 y 21 resultados, respectivamente). Así, una agregación nueva se añade sin modificar el código existente.</w:t>
+        <w:t xml:space="preserve"> las usa de forma intercambiable sin conocerlas.</w:t>
       </w:r>
     </w:p>
     <w:p>
@@ -6400,7 +6485,7 @@
       </w:pPr>
       <w:r>
         <w:rPr/>
-        <w:t xml:space="preserve">Las figuras se construyen sobre el dataset procesado, sin transformaciones adicionales que alteren los datos. Las agregaciones (media horaria, suma diaria, media mensual, media por día de la semana y porcentaje de horas con 0 MWh) se calculan con las estrategias de </w:t>
+        <w:t xml:space="preserve">Las figuras se construyen sobre el dataset procesado, sin transformaciones adicionales que alteren los datos. Las agregaciones (media horaria, suma diaria, media mensual, media por día de la semana y porcentaje de horas con 0 MWh) se calculan con pandas (McKinney, 2010) y las estrategias de </w:t>
       </w:r>
       <w:r>
         <w:rPr>
@@ -6410,7 +6495,7 @@
       </w:r>
       <w:r>
         <w:rPr/>
-        <w:t xml:space="preserve"> y se verificó que conservan el total de MWh. Se usan medias para comparar centrales de escala distinta, los ejes parten en cero y los registros de 0 MWh se muestran, no se excluyen.</w:t>
+        <w:t xml:space="preserve"> y se verificó que conservan el total de MWh. Se usan medias para comparar centrales de escala distinta, los ejes parten en cero y los registros de 0 MWh se muestran, no se excluyen. No se aplicó codificación ni escalamiento, por lo que el dataset conserva las categorías (central, mes, día) y la unidad original (MWh) y sirve directamente para graficar, sin necesidad de una copia aparte.</w:t>
       </w:r>
     </w:p>
     <w:p>
@@ -6430,7 +6515,7 @@
       </w:pPr>
       <w:r>
         <w:rPr/>
-        <w:t xml:space="preserve">El notebook F4 contiene cinco figuras (horaria, diaria, mensual, por día de la semana y ceros); aquí se muestran las tres que sustentan los resultados. Cada título enuncia el hallazgo, los colores son consistentes por central y cada figura declara su fuente.</w:t>
+        <w:t xml:space="preserve">El notebook F4 contiene cinco figuras; aquí se muestran tres. Cada título enuncia el hallazgo, el color identifica a cada central y cada figura declara su fuente.</w:t>
       </w:r>
     </w:p>
     <w:p>
@@ -6443,7 +6528,7 @@
       <w:r>
         <w:drawing>
           <wp:inline xmlns:a="http://schemas.openxmlformats.org/drawingml/2006/main" xmlns:pic="http://schemas.openxmlformats.org/drawingml/2006/picture">
-            <wp:extent cx="5669280" cy="2186722"/>
+            <wp:extent cx="5486400" cy="1763486"/>
             <wp:docPr id="12" name="Picture 12"/>
             <wp:cNvGraphicFramePr>
               <a:graphicFrameLocks noChangeAspect="1"/>
@@ -6464,7 +6549,7 @@
                   <pic:spPr>
                     <a:xfrm>
                       <a:off x="0" y="0"/>
-                      <a:ext cx="5669280" cy="2186722"/>
+                      <a:ext cx="5486400" cy="1763486"/>
                     </a:xfrm>
                     <a:prstGeom prst="rect"/>
                   </pic:spPr>
@@ -6500,7 +6585,7 @@
       <w:r>
         <w:drawing>
           <wp:inline xmlns:a="http://schemas.openxmlformats.org/drawingml/2006/main" xmlns:pic="http://schemas.openxmlformats.org/drawingml/2006/picture">
-            <wp:extent cx="5669280" cy="2186722"/>
+            <wp:extent cx="5486400" cy="1763486"/>
             <wp:docPr id="12" name="Picture 12"/>
             <wp:cNvGraphicFramePr>
               <a:graphicFrameLocks noChangeAspect="1"/>
@@ -6521,7 +6606,7 @@
                   <pic:spPr>
                     <a:xfrm>
                       <a:off x="0" y="0"/>
-                      <a:ext cx="5669280" cy="2186722"/>
+                      <a:ext cx="5486400" cy="1763486"/>
                     </a:xfrm>
                     <a:prstGeom prst="rect"/>
                   </pic:spPr>
@@ -6557,7 +6642,7 @@
       <w:r>
         <w:drawing>
           <wp:inline xmlns:a="http://schemas.openxmlformats.org/drawingml/2006/main" xmlns:pic="http://schemas.openxmlformats.org/drawingml/2006/picture">
-            <wp:extent cx="5669280" cy="1700784"/>
+            <wp:extent cx="5486400" cy="1489166"/>
             <wp:docPr id="12" name="Picture 12"/>
             <wp:cNvGraphicFramePr>
               <a:graphicFrameLocks noChangeAspect="1"/>
@@ -6578,7 +6663,7 @@
                   <pic:spPr>
                     <a:xfrm>
                       <a:off x="0" y="0"/>
-                      <a:ext cx="5669280" cy="1700784"/>
+                      <a:ext cx="5486400" cy="1489166"/>
                     </a:xfrm>
                     <a:prstGeom prst="rect"/>
                   </pic:spPr>
@@ -6631,37 +6716,27 @@
       </w:pPr>
       <w:r>
         <w:rPr/>
-        <w:t xml:space="preserve">La validación técnica combinó la equivalencia entre F2 y F3, la conservación de totales en las agregaciones y las pruebas de casos normales, límite y excepción. Entre las limitaciones, el período cubre ocho meses (no permite evaluar estacionalidad anual), los valores corresponden a generación inyectada al sistema según el CEN y no a la producción total de cada planta, y los datos no incluyen información operacional que explique los registros de 0 MWh. Como aprendizaje, mover la lógica desde los notebooks a </w:t>
+        <w:t xml:space="preserve">La validación técnica combinó la equivalencia entre F2 y F3, la conservación de totales en las agregaciones y las pruebas de casos normales, límite y excepción. Entre las limitaciones, el período cubre ocho meses (no permite evaluar estacionalidad anual), los valores corresponden a generación inyectada al sistema según el CEN y no a la producción total de cada planta, y los datos no incluyen información operacional que explique los registros de 0 MWh. La colaboración quedó documentada en el README (contribuciones por integrante) y en el historial de Git: cuatro autores consolidados con </w:t>
       </w:r>
       <w:r>
         <w:rPr>
           <w:rFonts w:ascii="Courier New" w:hAnsi="Courier New" w:cs="Courier New"/>
         </w:rPr>
-        <w:t xml:space="preserve">src/</w:t>
+        <w:t xml:space="preserve">.mailmap</w:t>
       </w:r>
       <w:r>
         <w:rPr/>
-        <w:t xml:space="preserve"> y probar reglas atómicas redujo la duplicación y facilitó detectar errores.</w:t>
-      </w:r>
-    </w:p>
-    <w:p>
-      <w:pPr>
-        <w:pStyle w:val="Ttulo2"/>
-        <w:ind w:left="720"/>
-      </w:pPr>
-      <w:bookmarkStart w:id="28" w:name="_Toc241865089"/>
-      <w:r>
-        <w:t>b. Resultados</w:t>
-      </w:r>
-      <w:bookmarkEnd w:id="28"/>
-    </w:p>
-    <w:p>
-      <w:pPr>
-        <w:ind w:left="0" w:firstLine="567"/>
-      </w:pPr>
+        <w:t xml:space="preserve">, ramas por tarea y fusión por </w:t>
+      </w:r>
+      <w:r>
+        <w:rPr>
+          <w:i/>
+        </w:rPr>
+        <w:t xml:space="preserve">pull request</w:t>
+      </w:r>
       <w:r>
         <w:rPr/>
-        <w:t xml:space="preserve">La Tabla 3 resume los resultados. TER CMPC Pacífico aporta el 65 % de la generación total del conjunto (94.446 de 144.518 MWh) y mantiene un perfil horario casi plano (14,6–17,9 MWh por hora; Figura 1). Su media mensual se ubica entre 14 y 19 MWh hasta junio y baja a cerca de 12 MWh en julio y agosto (Figura 2). TER CMPC Laja disminuye de 7,6 MWh en enero a 0,4 MWh en agosto y concentra el 72 % de las horas con 0 MWh del conjunto (3.193 de 4.438), con cerca de 90 % de sus horas en cero en julio y agosto (Figura 3) y una secuencia continua máxima de 375 horas (≈15,6 días). TER CMPC Santa Fe presenta su mayor media en abril (7,9 MWh), un perfil horario plano (4,8–5,5 MWh) y un 59 % de horas en cero en agosto. Las diferencias por día de la semana son menores y sin patrón claro (por ejemplo, Laja: 2,5 MWh los domingos y 4,0 los miércoles).</w:t>
+        <w:t xml:space="preserve">.</w:t>
       </w:r>
     </w:p>
     <w:p>
@@ -6677,7 +6752,559 @@
           <w:sz w:val="19"/>
           <w:szCs w:val="19"/>
         </w:rPr>
-        <w:t xml:space="preserve">Tabla 3. Resumen de generación y registros con 0 MWh por central (enero–agosto de 2026)</w:t>
+        <w:t xml:space="preserve">Tabla 3. Comparación con las fases previas</w:t>
+      </w:r>
+    </w:p>
+    <w:tbl>
+      <w:tblPr>
+        <w:tblStyle w:val="Tabladecuadrcula4-nfasis1"/>
+        <w:tblW w:w="10380" w:type="dxa"/>
+        <w:tblLayout w:type="fixed"/>
+        <w:tblLook w:val="04A0" w:firstRow="1" w:lastRow="0" w:firstColumn="1" w:lastColumn="0" w:noHBand="0" w:noVBand="1"/>
+      </w:tblPr>
+      <w:tblGrid>
+        <w:gridCol w:w="1500"/>
+        <w:gridCol w:w="2900"/>
+        <w:gridCol w:w="3300"/>
+        <w:gridCol w:w="2680"/>
+      </w:tblGrid>
+      <w:tr>
+        <w:trPr>
+          <w:cantSplit/>
+          <w:tblHeader/>
+        </w:trPr>
+        <w:tc>
+          <w:tcPr>
+            <w:tcW w:w="1500" w:type="dxa"/>
+            <w:vAlign w:val="center"/>
+          </w:tcPr>
+          <w:p>
+            <w:pPr>
+              <w:spacing w:before="20" w:after="20" w:line="240" w:lineRule="auto"/>
+              <w:ind w:left="0" w:firstLine="0"/>
+              <w:jc w:val="left"/>
+            </w:pPr>
+            <w:r>
+              <w:rPr>
+                <w:sz w:val="17"/>
+                <w:szCs w:val="17"/>
+              </w:rPr>
+              <w:t xml:space="preserve">Aspecto</w:t>
+            </w:r>
+          </w:p>
+        </w:tc>
+        <w:tc>
+          <w:tcPr>
+            <w:tcW w:w="2900" w:type="dxa"/>
+            <w:vAlign w:val="center"/>
+          </w:tcPr>
+          <w:p>
+            <w:pPr>
+              <w:spacing w:before="20" w:after="20" w:line="240" w:lineRule="auto"/>
+              <w:ind w:left="0" w:firstLine="0"/>
+              <w:jc w:val="left"/>
+            </w:pPr>
+            <w:r>
+              <w:rPr>
+                <w:sz w:val="17"/>
+                <w:szCs w:val="17"/>
+              </w:rPr>
+              <w:t xml:space="preserve">Fase previa</w:t>
+            </w:r>
+          </w:p>
+        </w:tc>
+        <w:tc>
+          <w:tcPr>
+            <w:tcW w:w="3300" w:type="dxa"/>
+            <w:vAlign w:val="center"/>
+          </w:tcPr>
+          <w:p>
+            <w:pPr>
+              <w:spacing w:before="20" w:after="20" w:line="240" w:lineRule="auto"/>
+              <w:ind w:left="0" w:firstLine="0"/>
+              <w:jc w:val="left"/>
+            </w:pPr>
+            <w:r>
+              <w:rPr>
+                <w:sz w:val="17"/>
+                <w:szCs w:val="17"/>
+              </w:rPr>
+              <w:t xml:space="preserve">Estado actual</w:t>
+            </w:r>
+          </w:p>
+        </w:tc>
+        <w:tc>
+          <w:tcPr>
+            <w:tcW w:w="2680" w:type="dxa"/>
+            <w:vAlign w:val="center"/>
+          </w:tcPr>
+          <w:p>
+            <w:pPr>
+              <w:spacing w:before="20" w:after="20" w:line="240" w:lineRule="auto"/>
+              <w:ind w:left="0" w:firstLine="0"/>
+              <w:jc w:val="left"/>
+            </w:pPr>
+            <w:r>
+              <w:rPr>
+                <w:sz w:val="17"/>
+                <w:szCs w:val="17"/>
+              </w:rPr>
+              <w:t xml:space="preserve">Motivo del cambio</w:t>
+            </w:r>
+          </w:p>
+        </w:tc>
+      </w:tr>
+      <w:tr>
+        <w:trPr>
+          <w:cantSplit/>
+        </w:trPr>
+        <w:tc>
+          <w:tcPr>
+            <w:tcW w:w="1500" w:type="dxa"/>
+            <w:vAlign w:val="center"/>
+          </w:tcPr>
+          <w:p>
+            <w:pPr>
+              <w:spacing w:before="20" w:after="20" w:line="240" w:lineRule="auto"/>
+              <w:ind w:left="0" w:firstLine="0"/>
+              <w:jc w:val="left"/>
+            </w:pPr>
+            <w:r>
+              <w:rPr>
+                <w:sz w:val="17"/>
+                <w:szCs w:val="17"/>
+              </w:rPr>
+              <w:t xml:space="preserve">Preparación</w:t>
+            </w:r>
+          </w:p>
+        </w:tc>
+        <w:tc>
+          <w:tcPr>
+            <w:tcW w:w="2900" w:type="dxa"/>
+            <w:vAlign w:val="center"/>
+          </w:tcPr>
+          <w:p>
+            <w:pPr>
+              <w:spacing w:before="20" w:after="20" w:line="240" w:lineRule="auto"/>
+              <w:ind w:left="0" w:firstLine="0"/>
+              <w:jc w:val="left"/>
+            </w:pPr>
+            <w:r>
+              <w:rPr>
+                <w:sz w:val="17"/>
+                <w:szCs w:val="17"/>
+              </w:rPr>
+              <w:t xml:space="preserve">Funciones sueltas en el notebook de F2</w:t>
+            </w:r>
+          </w:p>
+        </w:tc>
+        <w:tc>
+          <w:tcPr>
+            <w:tcW w:w="3300" w:type="dxa"/>
+            <w:vAlign w:val="center"/>
+          </w:tcPr>
+          <w:p>
+            <w:pPr>
+              <w:spacing w:before="20" w:after="20" w:line="240" w:lineRule="auto"/>
+              <w:ind w:left="0" w:firstLine="0"/>
+              <w:jc w:val="left"/>
+            </w:pPr>
+            <w:r>
+              <w:rPr>
+                <w:sz w:val="17"/>
+                <w:szCs w:val="17"/>
+              </w:rPr>
+              <w:t xml:space="preserve">Clases y </w:t>
+            </w:r>
+            <w:r>
+              <w:rPr>
+                <w:rFonts w:ascii="Courier New" w:hAnsi="Courier New" w:cs="Courier New"/>
+                <w:sz w:val="17"/>
+                <w:szCs w:val="17"/>
+              </w:rPr>
+              <w:t xml:space="preserve">Pipeline</w:t>
+            </w:r>
+            <w:r>
+              <w:rPr>
+                <w:sz w:val="17"/>
+                <w:szCs w:val="17"/>
+              </w:rPr>
+              <w:t xml:space="preserve"> en </w:t>
+            </w:r>
+            <w:r>
+              <w:rPr>
+                <w:rFonts w:ascii="Courier New" w:hAnsi="Courier New" w:cs="Courier New"/>
+                <w:sz w:val="17"/>
+                <w:szCs w:val="17"/>
+              </w:rPr>
+              <w:t xml:space="preserve">src/</w:t>
+            </w:r>
+            <w:r>
+              <w:rPr>
+                <w:sz w:val="17"/>
+                <w:szCs w:val="17"/>
+              </w:rPr>
+              <w:t xml:space="preserve">, con equivalencia verificada</w:t>
+            </w:r>
+          </w:p>
+        </w:tc>
+        <w:tc>
+          <w:tcPr>
+            <w:tcW w:w="2680" w:type="dxa"/>
+            <w:vAlign w:val="center"/>
+          </w:tcPr>
+          <w:p>
+            <w:pPr>
+              <w:spacing w:before="20" w:after="20" w:line="240" w:lineRule="auto"/>
+              <w:ind w:left="0" w:firstLine="0"/>
+              <w:jc w:val="left"/>
+            </w:pPr>
+            <w:r>
+              <w:rPr>
+                <w:sz w:val="17"/>
+                <w:szCs w:val="17"/>
+              </w:rPr>
+              <w:t xml:space="preserve">Modularidad y reutilización</w:t>
+            </w:r>
+          </w:p>
+        </w:tc>
+      </w:tr>
+      <w:tr>
+        <w:trPr>
+          <w:cantSplit/>
+        </w:trPr>
+        <w:tc>
+          <w:tcPr>
+            <w:tcW w:w="1500" w:type="dxa"/>
+            <w:vAlign w:val="center"/>
+          </w:tcPr>
+          <w:p>
+            <w:pPr>
+              <w:spacing w:before="20" w:after="20" w:line="240" w:lineRule="auto"/>
+              <w:ind w:left="0" w:firstLine="0"/>
+              <w:jc w:val="left"/>
+            </w:pPr>
+            <w:r>
+              <w:rPr>
+                <w:sz w:val="17"/>
+                <w:szCs w:val="17"/>
+              </w:rPr>
+              <w:t xml:space="preserve">Validación</w:t>
+            </w:r>
+          </w:p>
+        </w:tc>
+        <w:tc>
+          <w:tcPr>
+            <w:tcW w:w="2900" w:type="dxa"/>
+            <w:vAlign w:val="center"/>
+          </w:tcPr>
+          <w:p>
+            <w:pPr>
+              <w:spacing w:before="20" w:after="20" w:line="240" w:lineRule="auto"/>
+              <w:ind w:left="0" w:firstLine="0"/>
+              <w:jc w:val="left"/>
+            </w:pPr>
+            <w:r>
+              <w:rPr>
+                <w:sz w:val="17"/>
+                <w:szCs w:val="17"/>
+              </w:rPr>
+              <w:t xml:space="preserve">Una función con valores rígidos</w:t>
+            </w:r>
+          </w:p>
+        </w:tc>
+        <w:tc>
+          <w:tcPr>
+            <w:tcW w:w="3300" w:type="dxa"/>
+            <w:vAlign w:val="center"/>
+          </w:tcPr>
+          <w:p>
+            <w:pPr>
+              <w:spacing w:before="20" w:after="20" w:line="240" w:lineRule="auto"/>
+              <w:ind w:left="0" w:firstLine="0"/>
+              <w:jc w:val="left"/>
+            </w:pPr>
+            <w:r>
+              <w:rPr>
+                <w:sz w:val="17"/>
+                <w:szCs w:val="17"/>
+              </w:rPr>
+              <w:t xml:space="preserve">Reglas atómicas y parametrizables</w:t>
+            </w:r>
+          </w:p>
+        </w:tc>
+        <w:tc>
+          <w:tcPr>
+            <w:tcW w:w="2680" w:type="dxa"/>
+            <w:vAlign w:val="center"/>
+          </w:tcPr>
+          <w:p>
+            <w:pPr>
+              <w:spacing w:before="20" w:after="20" w:line="240" w:lineRule="auto"/>
+              <w:ind w:left="0" w:firstLine="0"/>
+              <w:jc w:val="left"/>
+            </w:pPr>
+            <w:r>
+              <w:rPr>
+                <w:sz w:val="17"/>
+                <w:szCs w:val="17"/>
+              </w:rPr>
+              <w:t xml:space="preserve">Probar cada regla por separado</w:t>
+            </w:r>
+          </w:p>
+        </w:tc>
+      </w:tr>
+      <w:tr>
+        <w:trPr>
+          <w:cantSplit/>
+        </w:trPr>
+        <w:tc>
+          <w:tcPr>
+            <w:tcW w:w="1500" w:type="dxa"/>
+            <w:vAlign w:val="center"/>
+          </w:tcPr>
+          <w:p>
+            <w:pPr>
+              <w:spacing w:before="20" w:after="20" w:line="240" w:lineRule="auto"/>
+              <w:ind w:left="0" w:firstLine="0"/>
+              <w:jc w:val="left"/>
+            </w:pPr>
+            <w:r>
+              <w:rPr>
+                <w:sz w:val="17"/>
+                <w:szCs w:val="17"/>
+              </w:rPr>
+              <w:t xml:space="preserve">Eficiencia</w:t>
+            </w:r>
+          </w:p>
+        </w:tc>
+        <w:tc>
+          <w:tcPr>
+            <w:tcW w:w="2900" w:type="dxa"/>
+            <w:vAlign w:val="center"/>
+          </w:tcPr>
+          <w:p>
+            <w:pPr>
+              <w:spacing w:before="20" w:after="20" w:line="240" w:lineRule="auto"/>
+              <w:ind w:left="0" w:firstLine="0"/>
+              <w:jc w:val="left"/>
+            </w:pPr>
+            <w:r>
+              <w:rPr>
+                <w:sz w:val="17"/>
+                <w:szCs w:val="17"/>
+              </w:rPr>
+              <w:t xml:space="preserve">Sin mediciones</w:t>
+            </w:r>
+          </w:p>
+        </w:tc>
+        <w:tc>
+          <w:tcPr>
+            <w:tcW w:w="3300" w:type="dxa"/>
+            <w:vAlign w:val="center"/>
+          </w:tcPr>
+          <w:p>
+            <w:pPr>
+              <w:spacing w:before="20" w:after="20" w:line="240" w:lineRule="auto"/>
+              <w:ind w:left="0" w:firstLine="0"/>
+              <w:jc w:val="left"/>
+            </w:pPr>
+            <w:r>
+              <w:rPr>
+                <w:rFonts w:ascii="Courier New" w:hAnsi="Courier New" w:cs="Courier New"/>
+                <w:sz w:val="17"/>
+                <w:szCs w:val="17"/>
+              </w:rPr>
+              <w:t xml:space="preserve">timeit</w:t>
+            </w:r>
+            <w:r>
+              <w:rPr>
+                <w:sz w:val="17"/>
+                <w:szCs w:val="17"/>
+              </w:rPr>
+              <w:t xml:space="preserve"> y </w:t>
+            </w:r>
+            <w:r>
+              <w:rPr>
+                <w:rFonts w:ascii="Courier New" w:hAnsi="Courier New" w:cs="Courier New"/>
+                <w:sz w:val="17"/>
+                <w:szCs w:val="17"/>
+              </w:rPr>
+              <w:t xml:space="preserve">tracemalloc</w:t>
+            </w:r>
+            <w:r>
+              <w:rPr>
+                <w:sz w:val="17"/>
+                <w:szCs w:val="17"/>
+              </w:rPr>
+              <w:t xml:space="preserve"> en F3</w:t>
+            </w:r>
+          </w:p>
+        </w:tc>
+        <w:tc>
+          <w:tcPr>
+            <w:tcW w:w="2680" w:type="dxa"/>
+            <w:vAlign w:val="center"/>
+          </w:tcPr>
+          <w:p>
+            <w:pPr>
+              <w:spacing w:before="20" w:after="20" w:line="240" w:lineRule="auto"/>
+              <w:ind w:left="0" w:firstLine="0"/>
+              <w:jc w:val="left"/>
+            </w:pPr>
+            <w:r>
+              <w:rPr>
+                <w:sz w:val="17"/>
+                <w:szCs w:val="17"/>
+              </w:rPr>
+              <w:t xml:space="preserve">Justificar la implementación elegida</w:t>
+            </w:r>
+          </w:p>
+        </w:tc>
+      </w:tr>
+      <w:tr>
+        <w:trPr>
+          <w:cantSplit/>
+        </w:trPr>
+        <w:tc>
+          <w:tcPr>
+            <w:tcW w:w="1500" w:type="dxa"/>
+            <w:vAlign w:val="center"/>
+          </w:tcPr>
+          <w:p>
+            <w:pPr>
+              <w:spacing w:before="20" w:after="20" w:line="240" w:lineRule="auto"/>
+              <w:ind w:left="0" w:firstLine="0"/>
+              <w:jc w:val="left"/>
+            </w:pPr>
+            <w:r>
+              <w:rPr>
+                <w:sz w:val="17"/>
+                <w:szCs w:val="17"/>
+              </w:rPr>
+              <w:t xml:space="preserve">Verificación</w:t>
+            </w:r>
+          </w:p>
+        </w:tc>
+        <w:tc>
+          <w:tcPr>
+            <w:tcW w:w="2900" w:type="dxa"/>
+            <w:vAlign w:val="center"/>
+          </w:tcPr>
+          <w:p>
+            <w:pPr>
+              <w:spacing w:before="20" w:after="20" w:line="240" w:lineRule="auto"/>
+              <w:ind w:left="0" w:firstLine="0"/>
+              <w:jc w:val="left"/>
+            </w:pPr>
+            <w:r>
+              <w:rPr>
+                <w:sz w:val="17"/>
+                <w:szCs w:val="17"/>
+              </w:rPr>
+              <w:t xml:space="preserve">Equivalencia columna a columna (F3)</w:t>
+            </w:r>
+          </w:p>
+        </w:tc>
+        <w:tc>
+          <w:tcPr>
+            <w:tcW w:w="3300" w:type="dxa"/>
+            <w:vAlign w:val="center"/>
+          </w:tcPr>
+          <w:p>
+            <w:pPr>
+              <w:spacing w:before="20" w:after="20" w:line="240" w:lineRule="auto"/>
+              <w:ind w:left="0" w:firstLine="0"/>
+              <w:jc w:val="left"/>
+            </w:pPr>
+            <w:r>
+              <w:rPr>
+                <w:rFonts w:ascii="Courier New" w:hAnsi="Courier New" w:cs="Courier New"/>
+                <w:sz w:val="17"/>
+                <w:szCs w:val="17"/>
+              </w:rPr>
+              <w:t xml:space="preserve">assert_frame_equal</w:t>
+            </w:r>
+            <w:r>
+              <w:rPr>
+                <w:sz w:val="17"/>
+                <w:szCs w:val="17"/>
+              </w:rPr>
+              <w:t xml:space="preserve"> y pruebas normal/límite/excepción (F4)</w:t>
+            </w:r>
+          </w:p>
+        </w:tc>
+        <w:tc>
+          <w:tcPr>
+            <w:tcW w:w="2680" w:type="dxa"/>
+            <w:vAlign w:val="center"/>
+          </w:tcPr>
+          <w:p>
+            <w:pPr>
+              <w:spacing w:before="20" w:after="20" w:line="240" w:lineRule="auto"/>
+              <w:ind w:left="0" w:firstLine="0"/>
+              <w:jc w:val="left"/>
+            </w:pPr>
+            <w:r>
+              <w:rPr>
+                <w:sz w:val="17"/>
+                <w:szCs w:val="17"/>
+              </w:rPr>
+              <w:t xml:space="preserve">Evidencia objetiva de que las mejoras no rompen nada</w:t>
+            </w:r>
+          </w:p>
+        </w:tc>
+      </w:tr>
+    </w:tbl>
+    <w:p>
+      <w:pPr>
+        <w:spacing w:before="0" w:after="120"/>
+        <w:ind w:left="0" w:firstLine="0"/>
+        <w:jc w:val="left"/>
+      </w:pPr>
+      <w:r>
+        <w:rPr>
+          <w:i/>
+          <w:sz w:val="17"/>
+          <w:szCs w:val="17"/>
+        </w:rPr>
+        <w:t xml:space="preserve">Fuente: elaboración propia a partir de los notebooks F2–F4 y de las observaciones recibidas.</w:t>
+      </w:r>
+    </w:p>
+    <w:p>
+      <w:pPr>
+        <w:pStyle w:val="Ttulo2"/>
+        <w:ind w:left="720"/>
+      </w:pPr>
+      <w:bookmarkStart w:id="28" w:name="_Toc241865089"/>
+      <w:r>
+        <w:t>b. Resultados</w:t>
+      </w:r>
+      <w:bookmarkEnd w:id="28"/>
+    </w:p>
+    <w:p>
+      <w:pPr>
+        <w:ind w:left="0" w:firstLine="567"/>
+      </w:pPr>
+      <w:r>
+        <w:rPr/>
+        <w:t xml:space="preserve">La Tabla 4 resume los resultados. TER CMPC Pacífico aporta el 65 % de la generación total del conjunto (94.446 de 144.518 MWh) y mantiene un perfil horario casi plano (14,6–17,9 MWh por hora; Figura 1). Su media mensual se ubica entre 14 y 19 MWh hasta junio y baja a cerca de 12 MWh en julio y agosto (Figura 2). TER CMPC Laja disminuye de 7,6 MWh en enero a 0,4 MWh en agosto y concentra el 72 % de las horas con 0 MWh del conjunto (3.193 de 4.438), con cerca de 90 % de sus horas en cero en julio y agosto (Figura 3) y una secuencia continua máxima de 375 horas (≈15,6 días). TER CMPC Santa Fe presenta su mayor media en abril (7,9 MWh), un perfil horario plano (4,8–5,5 MWh) y un 59 % de horas en cero en agosto. Las diferencias por día de la semana son menores y sin patrón claro (por ejemplo, Laja: 2,5 MWh los domingos y 4,0 los miércoles).</w:t>
+      </w:r>
+    </w:p>
+    <w:p>
+      <w:pPr>
+        <w:keepNext/>
+        <w:spacing w:before="80" w:after="60"/>
+        <w:ind w:left="0" w:firstLine="0"/>
+        <w:jc w:val="left"/>
+      </w:pPr>
+      <w:r>
+        <w:rPr>
+          <w:b/>
+          <w:sz w:val="19"/>
+          <w:szCs w:val="19"/>
+        </w:rPr>
+        <w:t xml:space="preserve">Tabla 4. Resumen de generación y registros con 0 MWh por central (enero–agosto de 2026)</w:t>
       </w:r>
     </w:p>
     <w:tbl>
@@ -7249,7 +7876,7 @@
       </w:pPr>
       <w:r>
         <w:rPr/>
-        <w:t xml:space="preserve">Los resultados muestran tres comportamientos distintos dentro de un mismo grupo empresarial: una central base y estable (Pacífico), una con fuerte caída y alta intermitencia (Laja) y una de nivel intermedio con interrupciones prolongadas (Santa Fe). La ausencia de un ciclo horario marcado es compatible con una generación de excedentes sujeta a la programación interna de los procesos, pero los datos disponibles no permiten confirmarlo ni atribuir los 0 MWh a detenciones, mantenimiento u otras causas; esa interpretación requeriría información operacional adicional, por lo que se mantiene como hipótesis fuera del alcance. La principal amenaza a la validez es el período acotado de ocho meses, que impide distinguir una tendencia sostenida de una variación estacional.</w:t>
+        <w:t xml:space="preserve">Los resultados muestran tres comportamientos distintos dentro de un mismo grupo empresarial: una central base y estable (Pacífico), una con fuerte caída y alta intermitencia (Laja) y una de nivel intermedio con interrupciones prolongadas (Santa Fe). La ausencia de un ciclo horario marcado es compatible con una generación de excedentes sujeta a la programación interna de los procesos, pero los datos disponibles no permiten confirmarlo ni atribuir los 0 MWh a detenciones, mantenimiento u otras causas; esa interpretación requeriría información operacional adicional, por lo que se mantiene como hipótesis fuera del alcance. Como la pregunta es descriptiva, no se formularon hipótesis causales que contrastar; los resultados se contrastan con los objetivos específicos de la sección III.</w:t>
       </w:r>
     </w:p>
     <w:p>
@@ -7349,82 +7976,6 @@
     </w:p>
     <w:p>
       <w:pPr>
-        <w:ind w:left="720"/>
-      </w:pPr>
-      <w:r>
-        <w:lastRenderedPageBreak/>
-        <w:t xml:space="preserve">En la primera evaluación se identificaron, entre otros aspectos, una </w:t>
-      </w:r>
-      <w:proofErr w:type="spellStart"/>
-      <w:r>
-        <w:t>modularización</w:t>
-      </w:r>
-      <w:proofErr w:type="spellEnd"/>
-      <w:r>
-        <w:t xml:space="preserve"> incompleta del pipeline, validaciones concentradas en una única función, inconsistencias en las identidades registradas por Git y falta de evidencia suficiente de ejecución reproducible de</w:t>
-      </w:r>
-      <w:r>
-        <w:t>l</w:t>
-      </w:r>
-      <w:r>
-        <w:t xml:space="preserve"> notebook. También se solicitó documentar con mayor claridad el impacto de las transformaciones y profundizar el análisis temporal de los registros de generación igual a 0 </w:t>
-      </w:r>
-      <w:proofErr w:type="spellStart"/>
-      <w:r>
-        <w:t>MWh</w:t>
-      </w:r>
-      <w:proofErr w:type="spellEnd"/>
-      <w:r>
-        <w:t xml:space="preserve">. </w:t>
-      </w:r>
-    </w:p>
-    <w:p>
-      <w:pPr>
-        <w:ind w:left="720"/>
-      </w:pPr>
-      <w:r>
-        <w:t xml:space="preserve">Estas observaciones fueron abordadas durante la Fase 3. El propio </w:t>
-      </w:r>
-      <w:proofErr w:type="spellStart"/>
-      <w:r>
-        <w:t>feedback</w:t>
-      </w:r>
-      <w:proofErr w:type="spellEnd"/>
-      <w:r>
-        <w:t xml:space="preserve"> posterior confirmó que la </w:t>
-      </w:r>
-      <w:proofErr w:type="spellStart"/>
-      <w:r>
-        <w:t>modularización</w:t>
-      </w:r>
-      <w:proofErr w:type="spellEnd"/>
-      <w:r>
-        <w:t xml:space="preserve"> fue ampliada, las reglas de validación se parametrizaron y separaron, las identidades de Git se consolidaron </w:t>
-      </w:r>
-      <w:proofErr w:type="gramStart"/>
-      <w:r>
-        <w:t>mediante .</w:t>
-      </w:r>
-      <w:proofErr w:type="spellStart"/>
-      <w:r>
-        <w:t>mailmap</w:t>
-      </w:r>
-      <w:proofErr w:type="spellEnd"/>
-      <w:proofErr w:type="gramEnd"/>
-      <w:r>
-        <w:t xml:space="preserve"> y los notebooks comenzaron a ejecutarse desde </w:t>
-      </w:r>
-      <w:proofErr w:type="spellStart"/>
-      <w:r>
-        <w:t>kernel</w:t>
-      </w:r>
-      <w:proofErr w:type="spellEnd"/>
-      <w:r>
-        <w:t xml:space="preserve"> limpio.</w:t>
-      </w:r>
-    </w:p>
-    <w:p>
-      <w:pPr>
         <w:ind w:left="720" w:hanging="11"/>
         <w:rPr>
           <w:b/>
@@ -7443,7 +7994,7 @@
           <w:b/>
           <w:bCs/>
         </w:rPr>
-        <w:t xml:space="preserve"> 4</w:t>
+        <w:t xml:space="preserve"> 5</w:t>
       </w:r>
       <w:r>
         <w:rPr>
@@ -8434,14 +8985,6 @@
       <w:proofErr w:type="spellEnd"/>
       <w:r>
         <w:t xml:space="preserve"> asociados a estas mejoras son verificables en el historial del repositorio. Por ejemplo, la refactorización de validaciones se registró en a4e655d, la mejora del pipeline POO y del filtrado temporal en 2a7372f, y la consolidación de la trazabilidad F1–F4 en 8f9f73e.</w:t>
-      </w:r>
-    </w:p>
-    <w:p>
-      <w:pPr>
-        <w:ind w:left="720"/>
-      </w:pPr>
-      <w:r>
-        <w:t>En conjunto, estas acciones permitieron que el proyecto evolucionara desde una primera arquitectura funcional pero todavía incompleta hacia una solución más modular, reproducible y trazable. La mejora afectó directamente la estructura del código, la capacidad de prueba de las funciones, la confiabilidad de la ejecución y la calidad de la documentación técnica. La retroalimentación de la Fase 3 confirma este avance y señala que los principales problemas identificados previamente fueron corregidos antes de la entrega final.</w:t>
       </w:r>
     </w:p>
     <w:p/>

</xml_diff>

<commit_message>
Actualiza informe final F4 con ajustes de evaluacion
</commit_message>
<xml_diff>
--- a/docs/f4_s03_evaluacion_entregable_grupo2.docx
+++ b/docs/f4_s03_evaluacion_entregable_grupo2.docx
@@ -1229,6 +1229,23 @@
             <w:tabs>
               <w:tab w:val="right" w:leader="dot" w:pos="10370"/>
             </w:tabs>
+          </w:pPr>
+          <w:r>
+            <w:t>I. Portada e índice</w:t>
+          </w:r>
+          <w:r>
+            <w:tab/>
+          </w:r>
+          <w:r>
+            <w:t>1</w:t>
+          </w:r>
+        </w:p>
+        <w:p>
+          <w:pPr>
+            <w:pStyle w:val="TDC1"/>
+            <w:tabs>
+              <w:tab w:val="right" w:leader="dot" w:pos="10370"/>
+            </w:tabs>
             <w:rPr>
               <w:rFonts w:asciiTheme="minorHAnsi" w:eastAsiaTheme="minorEastAsia" w:hAnsiTheme="minorHAnsi"/>
               <w:noProof/>
@@ -2923,7 +2940,7 @@
                 <w:noProof/>
                 <w:webHidden/>
               </w:rPr>
-              <w:t>7</w:t>
+              <w:t>6</w:t>
             </w:r>
             <w:r>
               <w:rPr>
@@ -2997,7 +3014,7 @@
                 <w:noProof/>
                 <w:webHidden/>
               </w:rPr>
-              <w:t>7</w:t>
+              <w:t>6</w:t>
             </w:r>
             <w:r>
               <w:rPr>
@@ -3367,7 +3384,7 @@
                 <w:noProof/>
                 <w:webHidden/>
               </w:rPr>
-              <w:t>9</w:t>
+              <w:t>8</w:t>
             </w:r>
             <w:r>
               <w:rPr>
@@ -3441,7 +3458,7 @@
                 <w:noProof/>
                 <w:webHidden/>
               </w:rPr>
-              <w:t>9</w:t>
+              <w:t>8</w:t>
             </w:r>
             <w:r>
               <w:rPr>
@@ -3698,7 +3715,6 @@
     <w:p>
       <w:pPr>
         <w:pStyle w:val="Ttulo1"/>
-        <w:pageBreakBefore/>
       </w:pPr>
       <w:bookmarkStart w:id="0" w:name="_Toc241865062"/>
       <w:r>
@@ -3738,12 +3754,19 @@
       </w:r>
     </w:p>
     <w:p>
-      <w:pPr>
-        <w:ind w:left="0" w:firstLine="567"/>
-      </w:pPr>
-      <w:r>
-        <w:rPr/>
-        <w:t xml:space="preserve">La relevancia del análisis es práctica: quienes operan estas plantas de cogeneración o analizan la inyección de excedentes al Sistema Eléctrico Nacional pueden usar los patrones horarios, mensuales y la frecuencia de 0 MWh para dimensionar la variabilidad de la generación y priorizar qué períodos revisar con información operacional. El trabajo se enmarca en el curso de Programación para la Ciencia de Datos (Salinas Silva, 2026b) y se organiza en cuatro fases: F1 definió el problema y el entorno, F2 preparó y validó los datos, F3 construyó el núcleo algorítmico (POO, eficiencia y recursividad) y F4 integra, visualiza y comunica los resultados (Tabla de la sección 3.5).</w:t>
+      <w:r>
+        <w:t xml:space="preserve">El </w:t>
+      </w:r>
+      <w:r>
+        <w:t xml:space="preserve">objetivo general es caracterizar los patrones temporales de generación eléctrica de las tres centrales mediante un proceso reproducible de preparación, validación y análisis. El alcance se mantiene deliberadamente descriptivo: los registros iguales a 0 </w:t>
+      </w:r>
+      <w:proofErr w:type="spellStart"/>
+      <w:r>
+        <w:t>MWh</w:t>
+      </w:r>
+      <w:proofErr w:type="spellEnd"/>
+      <w:r>
+        <w:t xml:space="preserve"> se conservan y analizan como parte de los datos publicados, pero no se atribuyen a fallas, detenciones, mantenimiento u otras causas operacionales que no puedan verificarse con la información disponible.</w:t>
       </w:r>
     </w:p>
     <w:p>
@@ -3976,17 +3999,23 @@
           <w:ilvl w:val="0"/>
           <w:numId w:val="12"/>
         </w:numPr>
-        <w:spacing w:after="60"/>
-      </w:pPr>
-      <w:r>
-        <w:rPr>
-          <w:b/>
-        </w:rPr>
-        <w:t xml:space="preserve">Alcance.</w:t>
-      </w:r>
-      <w:r>
-        <w:rPr/>
-        <w:t xml:space="preserve"> Tres centrales (Laja, Pacífico y Santa Fe), del 1 de enero al 31 de agosto de 2026, con análisis descriptivo de patrones horarios, diarios y mensuales y de los registros de 0 MWh. No incluye otras centrales, pronósticos ni causas operacionales.</w:t>
+        <w:rPr>
+          <w:lang w:val="es-CL"/>
+        </w:rPr>
+      </w:pPr>
+      <w:r>
+        <w:rPr>
+          <w:rFonts w:eastAsia="Arial"/>
+          <w:lang w:val="es-CL"/>
+        </w:rPr>
+        <w:t>El análisis se lim</w:t>
+      </w:r>
+      <w:r>
+        <w:rPr>
+          <w:rFonts w:eastAsia="Arial"/>
+          <w:lang w:val="es-CL"/>
+        </w:rPr>
+        <w:t>ita a las tres centrales seleccionadas y al período comprendido entre el 1 de enero y el 31 de agosto de 2026.</w:t>
       </w:r>
     </w:p>
     <w:p>
@@ -3996,17 +4025,23 @@
           <w:ilvl w:val="0"/>
           <w:numId w:val="12"/>
         </w:numPr>
-        <w:spacing w:after="60"/>
-      </w:pPr>
-      <w:r>
-        <w:rPr>
-          <w:b/>
-        </w:rPr>
-        <w:t xml:space="preserve">Restricciones.</w:t>
-      </w:r>
-      <w:r>
-        <w:rPr/>
-        <w:t xml:space="preserve"> Solo datos públicos de Generación Real del CEN en MWh, un período de ocho meses (sin estacionalidad anual) y sin información operacional (programación interna, mantenimientos).</w:t>
+        <w:rPr>
+          <w:lang w:val="es-CL"/>
+        </w:rPr>
+      </w:pPr>
+      <w:r>
+        <w:rPr>
+          <w:rFonts w:eastAsia="Arial"/>
+          <w:lang w:val="es-CL"/>
+        </w:rPr>
+        <w:t>No se atribuyen causa</w:t>
+      </w:r>
+      <w:r>
+        <w:rPr>
+          <w:rFonts w:eastAsia="Arial"/>
+          <w:lang w:val="es-CL"/>
+        </w:rPr>
+        <w:t>s operacionales, económicas o de mantenimiento a comportamientos que no puedan verificarse con la fuente disponible.</w:t>
       </w:r>
     </w:p>
     <w:p>
@@ -4016,17 +4051,58 @@
           <w:ilvl w:val="0"/>
           <w:numId w:val="12"/>
         </w:numPr>
-        <w:spacing w:after="60"/>
-      </w:pPr>
-      <w:r>
-        <w:rPr>
-          <w:b/>
-        </w:rPr>
-        <w:t xml:space="preserve">Supuestos.</w:t>
-      </w:r>
-      <w:r>
-        <w:rPr/>
-        <w:t xml:space="preserve"> Los registros de 0 MWh son observaciones válidas mientras no exista evidencia de error; se mantiene la codificación horaria 1–24 del CEN con 24 observaciones por central y fecha; los datos publicados reflejan fielmente la energía inyectada.</w:t>
+        <w:rPr>
+          <w:lang w:val="es-CL"/>
+        </w:rPr>
+      </w:pPr>
+      <w:r>
+        <w:rPr>
+          <w:rFonts w:eastAsia="Arial"/>
+          <w:lang w:val="es-CL"/>
+        </w:rPr>
+        <w:t xml:space="preserve">Los registros de 0 </w:t>
+      </w:r>
+      <w:proofErr w:type="spellStart"/>
+      <w:r>
+        <w:rPr>
+          <w:rFonts w:eastAsia="Arial"/>
+          <w:lang w:val="es-CL"/>
+        </w:rPr>
+        <w:t>MWh</w:t>
+      </w:r>
+      <w:proofErr w:type="spellEnd"/>
+      <w:r>
+        <w:rPr>
+          <w:rFonts w:eastAsia="Arial"/>
+          <w:lang w:val="es-CL"/>
+        </w:rPr>
+        <w:t xml:space="preserve"> se conservan como observaciones válidas mientras no exista evidencia suficiente para clasificarlos como errores.</w:t>
+      </w:r>
+    </w:p>
+    <w:p>
+      <w:pPr>
+        <w:pStyle w:val="F4Body"/>
+        <w:numPr>
+          <w:ilvl w:val="0"/>
+          <w:numId w:val="12"/>
+        </w:numPr>
+        <w:rPr>
+          <w:lang w:val="es-CL"/>
+        </w:rPr>
+      </w:pPr>
+      <w:r>
+        <w:rPr>
+          <w:rFonts w:eastAsia="Arial"/>
+          <w:lang w:val="es-CL"/>
+        </w:rPr>
+        <w:t xml:space="preserve">Se </w:t>
+      </w:r>
+      <w:r>
+        <w:rPr>
+          <w:rFonts w:eastAsia="Arial"/>
+          <w:lang w:val="es-CL"/>
+        </w:rPr>
+        <w:t>mantiene la codificación horaria 1-24 informada por el CEN y se espera una estructura de 24 observaciones por combinación central-fecha.</w:t>
       </w:r>
     </w:p>
     <w:p>
@@ -4505,7 +4581,7 @@
       </w:r>
       <w:r>
         <w:rPr/>
-        <w:t xml:space="preserve"> (fecha, descripción, hash, justificación y autor) y los hashes citados en este informe (Tabla 5) pueden verificarse con </w:t>
+        <w:t xml:space="preserve"> (fecha, descripción, hash, justificación y autor) y los hashes citados en este informe (Tabla 4) pueden verificarse con </w:t>
       </w:r>
       <w:r>
         <w:rPr>
@@ -4561,7 +4637,7 @@
       </w:r>
       <w:r>
         <w:rPr/>
-        <w:t xml:space="preserve"> documenta con docstrings sus clases y funciones públicas, y cada notebook explica en celdas Markdown las decisiones técnicas antes del código.</w:t>
+        <w:t xml:space="preserve"> documenta con docstrings sus clases y funciones públicas, y cada notebook explica en celdas Markdown las decisiones técnicas antes del código. Cada figura final declara fuente e interpretación (sección VII).</w:t>
       </w:r>
     </w:p>
     <w:p>
@@ -4651,7 +4727,7 @@
       </w:r>
       <w:r>
         <w:rPr/>
-        <w:t xml:space="preserve"> refleja la última versión integrada.</w:t>
+        <w:t xml:space="preserve"> refleja la última versión integrada y no hay ramas remotas con trabajo pendiente de fusionar.</w:t>
       </w:r>
     </w:p>
     <w:p>
@@ -4691,7 +4767,7 @@
       </w:r>
       <w:r>
         <w:rPr/>
-        <w:t xml:space="preserve"> y los notebooks solo la invocan (Tabla 2): lectura del CSV (</w:t>
+        <w:t xml:space="preserve"> y los notebooks solo la invocan: </w:t>
       </w:r>
       <w:r>
         <w:rPr>
@@ -4701,57 +4777,57 @@
       </w:r>
       <w:r>
         <w:rPr/>
-        <w:t xml:space="preserve">), conversión numérica estricta con </w:t>
+        <w:t xml:space="preserve"> lee el CSV del CEN; </w:t>
       </w:r>
       <w:r>
         <w:rPr>
           <w:rFonts w:ascii="Courier New" w:hAnsi="Courier New" w:cs="Courier New"/>
         </w:rPr>
+        <w:t xml:space="preserve">transformacion.py</w:t>
+      </w:r>
+      <w:r>
+        <w:rPr/>
+        <w:t xml:space="preserve"> convierte los valores a numérico de forma estricta (</w:t>
+      </w:r>
+      <w:r>
+        <w:rPr>
+          <w:rFonts w:ascii="Courier New" w:hAnsi="Courier New" w:cs="Courier New"/>
+        </w:rPr>
         <w:t xml:space="preserve">pd.to_numeric(errors="raise")</w:t>
       </w:r>
       <w:r>
         <w:rPr/>
-        <w:t xml:space="preserve"> y paso a formato largo (</w:t>
+        <w:t xml:space="preserve">) y pasa de formato ancho a largo; </w:t>
       </w:r>
       <w:r>
         <w:rPr>
           <w:rFonts w:ascii="Courier New" w:hAnsi="Courier New" w:cs="Courier New"/>
         </w:rPr>
-        <w:t xml:space="preserve">transformacion.py</w:t>
+        <w:t xml:space="preserve">validacion.py</w:t>
       </w:r>
       <w:r>
         <w:rPr/>
-        <w:t xml:space="preserve">), reglas de validación atómicas (</w:t>
+        <w:t xml:space="preserve"> implementa reglas atómicas (sin nulos, sin duplicados, sin negativos, categorías esperadas y granularidad de 24 horas); </w:t>
       </w:r>
       <w:r>
         <w:rPr>
           <w:rFonts w:ascii="Courier New" w:hAnsi="Courier New" w:cs="Courier New"/>
         </w:rPr>
-        <w:t xml:space="preserve">validacion.py</w:t>
+        <w:t xml:space="preserve">exportacion.py</w:t>
       </w:r>
       <w:r>
         <w:rPr/>
-        <w:t xml:space="preserve">), exportación que crea la carpeta de destino (</w:t>
+        <w:t xml:space="preserve"> guarda el dataset creando la carpeta de destino si no existe; y </w:t>
       </w:r>
       <w:r>
         <w:rPr>
           <w:rFonts w:ascii="Courier New" w:hAnsi="Courier New" w:cs="Courier New"/>
         </w:rPr>
-        <w:t xml:space="preserve">exportacion.py</w:t>
+        <w:t xml:space="preserve">secuencias.py</w:t>
       </w:r>
       <w:r>
         <w:rPr/>
-        <w:t xml:space="preserve">) y secuencias de 0 MWh (</w:t>
-      </w:r>
-      <w:r>
-        <w:rPr>
-          <w:rFonts w:ascii="Courier New" w:hAnsi="Courier New" w:cs="Courier New"/>
-        </w:rPr>
-        <w:t xml:space="preserve">secuencias.py</w:t>
-      </w:r>
-      <w:r>
-        <w:rPr/>
-        <w:t xml:space="preserve">).</w:t>
+        <w:t xml:space="preserve"> detecta secuencias de 0 MWh.</w:t>
       </w:r>
     </w:p>
     <w:p>
@@ -4899,7 +4975,7 @@
       </w:r>
       <w:r>
         <w:rPr/>
-        <w:t xml:space="preserve">. Para las secuencias de 0 MWh se adopta la versión iterativa: ambas son O(n), pero la recursiva consume unas tres veces más memoria por la pila de llamadas y no es más rápida desde 250 observaciones; se conserva como contraste algorítmico. Las mediciones de transformación y de detección de ceros se hicieron sobre el dataset completo y la de secuencias sobre tamaños crecientes (100 a 750 observaciones); no se midió en qué tamaño pequeño se invertiría la ventaja vectorizada.</w:t>
+        <w:t xml:space="preserve">. Para las secuencias de 0 MWh se adopta la versión iterativa: ambas son O(n), pero la recursiva consume unas tres veces más memoria por la pila de llamadas y no es más rápida desde 250 observaciones; se conserva como contraste algorítmico.</w:t>
       </w:r>
     </w:p>
     <w:p>
@@ -5346,27 +5422,7 @@
       </w:pPr>
       <w:r>
         <w:rPr/>
-        <w:t xml:space="preserve">El código se organiza por responsabilidad en el flujo carga → transformación → validación → agregación → exportación; los notebooks solo orquestan y narran. Cada función es breve, recibe sus parámetros (período, centrales, columnas horarias) de forma explícita y evita estado global, lo que facilita probarla de manera aislada. Agregar un criterio de agregación nuevo (por ejemplo, semanal) exige crear una sola clase en </w:t>
-      </w:r>
-      <w:r>
-        <w:rPr>
-          <w:rFonts w:ascii="Courier New" w:hAnsi="Courier New" w:cs="Courier New"/>
-        </w:rPr>
-        <w:t xml:space="preserve">agregacion_temporal.py</w:t>
-      </w:r>
-      <w:r>
-        <w:rPr/>
-        <w:t xml:space="preserve"> y no modifica </w:t>
-      </w:r>
-      <w:r>
-        <w:rPr>
-          <w:rFonts w:ascii="Courier New" w:hAnsi="Courier New" w:cs="Courier New"/>
-        </w:rPr>
-        <w:t xml:space="preserve">Pipeline</w:t>
-      </w:r>
-      <w:r>
-        <w:rPr/>
-        <w:t xml:space="preserve">, el notebook ni la validación: se toca un archivo.</w:t>
+        <w:t xml:space="preserve">El código se organiza por responsabilidad en el flujo carga → transformación → validación → agregación → exportación; los notebooks solo orquestan y narran. Cada función es breve, recibe sus parámetros (período, centrales, columnas horarias) de forma explícita y evita estado global, lo que facilita probarla de manera aislada.</w:t>
       </w:r>
     </w:p>
     <w:p>
@@ -5438,7 +5494,17 @@
       </w:r>
       <w:r>
         <w:rPr/>
-        <w:t xml:space="preserve"> aplica tres principios sobre el esquema de clase base con </w:t>
+        <w:t xml:space="preserve"> define la clase base </w:t>
+      </w:r>
+      <w:r>
+        <w:rPr>
+          <w:rFonts w:ascii="Courier New" w:hAnsi="Courier New" w:cs="Courier New"/>
+        </w:rPr>
+        <w:t xml:space="preserve">Transformador</w:t>
+      </w:r>
+      <w:r>
+        <w:rPr/>
+        <w:t xml:space="preserve"> (interfaz </w:t>
       </w:r>
       <w:r>
         <w:rPr>
@@ -5458,17 +5524,7 @@
       </w:r>
       <w:r>
         <w:rPr/>
-        <w:t xml:space="preserve"> de la guía del curso (Salinas Silva, 2026a). </w:t>
-      </w:r>
-      <w:r>
-        <w:rPr>
-          <w:b/>
-        </w:rPr>
-        <w:t xml:space="preserve">Herencia:</w:t>
-      </w:r>
-      <w:r>
-        <w:rPr/>
-        <w:t xml:space="preserve"> </w:t>
+        <w:t xml:space="preserve">) y cuatro transformadores concretos —</w:t>
       </w:r>
       <w:r>
         <w:rPr>
@@ -5508,43 +5564,63 @@
       </w:r>
       <w:r>
         <w:rPr/>
-        <w:t xml:space="preserve"> heredan de </w:t>
+        <w:t xml:space="preserve">— que la clase </w:t>
       </w:r>
       <w:r>
         <w:rPr>
           <w:rFonts w:ascii="Courier New" w:hAnsi="Courier New" w:cs="Courier New"/>
         </w:rPr>
-        <w:t xml:space="preserve">Transformador</w:t>
+        <w:t xml:space="preserve">Pipeline</w:t>
       </w:r>
       <w:r>
         <w:rPr/>
-        <w:t xml:space="preserve">, que fija el orden (</w:t>
+        <w:t xml:space="preserve"> ejecuta en orden. </w:t>
       </w:r>
       <w:r>
         <w:rPr>
           <w:rFonts w:ascii="Courier New" w:hAnsi="Courier New" w:cs="Courier New"/>
         </w:rPr>
-        <w:t xml:space="preserve">ajustar</w:t>
+        <w:t xml:space="preserve">src/agregacion_temporal.py</w:t>
       </w:r>
       <w:r>
         <w:rPr/>
-        <w:t xml:space="preserve"> antes de </w:t>
+        <w:t xml:space="preserve"> aplica el patrón </w:t>
+      </w:r>
+      <w:r>
+        <w:rPr>
+          <w:i/>
+        </w:rPr>
+        <w:t xml:space="preserve">Strategy</w:t>
+      </w:r>
+      <w:r>
+        <w:rPr/>
+        <w:t xml:space="preserve"> (Gamma et al., 1994): </w:t>
       </w:r>
       <w:r>
         <w:rPr>
           <w:rFonts w:ascii="Courier New" w:hAnsi="Courier New" w:cs="Courier New"/>
         </w:rPr>
-        <w:t xml:space="preserve">transformar</w:t>
+        <w:t xml:space="preserve">AgregacionHoraria</w:t>
       </w:r>
       <w:r>
         <w:rPr/>
-        <w:t xml:space="preserve">) y deja a cada hija solo </w:t>
+        <w:t xml:space="preserve">, </w:t>
       </w:r>
       <w:r>
         <w:rPr>
           <w:rFonts w:ascii="Courier New" w:hAnsi="Courier New" w:cs="Courier New"/>
         </w:rPr>
-        <w:t xml:space="preserve">aprender()</w:t>
+        <w:t xml:space="preserve">AgregacionDiaria</w:t>
+      </w:r>
+      <w:r>
+        <w:rPr/>
+        <w:t xml:space="preserve">, </w:t>
+      </w:r>
+      <w:r>
+        <w:rPr>
+          <w:rFonts w:ascii="Courier New" w:hAnsi="Courier New" w:cs="Courier New"/>
+        </w:rPr>
+        <w:t xml:space="preserve">AgregacionMensual</w:t>
       </w:r>
       <w:r>
         <w:rPr/>
@@ -5554,152 +5630,17 @@
         <w:rPr>
           <w:rFonts w:ascii="Courier New" w:hAnsi="Courier New" w:cs="Courier New"/>
         </w:rPr>
-        <w:t xml:space="preserve">aplicar()</w:t>
+        <w:t xml:space="preserve">AgregacionPorDiaSemana</w:t>
       </w:r>
       <w:r>
         <w:rPr/>
-        <w:t xml:space="preserve">. </w:t>
-      </w:r>
-      <w:r>
-        <w:rPr>
-          <w:b/>
-        </w:rPr>
-        <w:t xml:space="preserve">Polimorfismo:</w:t>
-      </w:r>
-      <w:r>
-        <w:rPr/>
-        <w:t xml:space="preserve"> </w:t>
+        <w:t xml:space="preserve"> comparten la interfaz </w:t>
       </w:r>
       <w:r>
         <w:rPr>
           <w:rFonts w:ascii="Courier New" w:hAnsi="Courier New" w:cs="Courier New"/>
         </w:rPr>
-        <w:t xml:space="preserve">Pipeline</w:t>
-      </w:r>
-      <w:r>
-        <w:rPr/>
-        <w:t xml:space="preserve"> recorre sus pasos con la misma llamada, </w:t>
-      </w:r>
-      <w:r>
-        <w:rPr>
-          <w:rFonts w:ascii="Courier New" w:hAnsi="Courier New" w:cs="Courier New"/>
-        </w:rPr>
-        <w:t xml:space="preserve">paso.ajustar(df).transformar(df)</w:t>
-      </w:r>
-      <w:r>
-        <w:rPr/>
-        <w:t xml:space="preserve">, sin preguntar de qué clase es cada uno. </w:t>
-      </w:r>
-      <w:r>
-        <w:rPr>
-          <w:b/>
-        </w:rPr>
-        <w:t xml:space="preserve">Encapsulamiento:</w:t>
-      </w:r>
-      <w:r>
-        <w:rPr/>
-        <w:t xml:space="preserve"> cada objeto guarda su estado en atributos internos (</w:t>
-      </w:r>
-      <w:r>
-        <w:rPr>
-          <w:rFonts w:ascii="Courier New" w:hAnsi="Courier New" w:cs="Courier New"/>
-        </w:rPr>
-        <w:t xml:space="preserve">_parametros</w:t>
-      </w:r>
-      <w:r>
-        <w:rPr/>
-        <w:t xml:space="preserve">, </w:t>
-      </w:r>
-      <w:r>
-        <w:rPr>
-          <w:rFonts w:ascii="Courier New" w:hAnsi="Courier New" w:cs="Courier New"/>
-        </w:rPr>
-        <w:t xml:space="preserve">_ajustado</w:t>
-      </w:r>
-      <w:r>
-        <w:rPr/>
-        <w:t xml:space="preserve">) y </w:t>
-      </w:r>
-      <w:r>
-        <w:rPr>
-          <w:rFonts w:ascii="Courier New" w:hAnsi="Courier New" w:cs="Courier New"/>
-        </w:rPr>
-        <w:t xml:space="preserve">transformar</w:t>
-      </w:r>
-      <w:r>
-        <w:rPr/>
-        <w:t xml:space="preserve"> lanza </w:t>
-      </w:r>
-      <w:r>
-        <w:rPr>
-          <w:rFonts w:ascii="Courier New" w:hAnsi="Courier New" w:cs="Courier New"/>
-        </w:rPr>
-        <w:t xml:space="preserve">RuntimeError</w:t>
-      </w:r>
-      <w:r>
-        <w:rPr/>
-        <w:t xml:space="preserve"> si no se ajustó antes.</w:t>
-      </w:r>
-    </w:p>
-    <w:p>
-      <w:pPr>
-        <w:ind w:left="0" w:firstLine="567"/>
-      </w:pPr>
-      <w:r>
-        <w:rPr>
-          <w:rFonts w:ascii="Courier New" w:hAnsi="Courier New" w:cs="Courier New"/>
-        </w:rPr>
-        <w:t xml:space="preserve">src/agregacion_temporal.py</w:t>
-      </w:r>
-      <w:r>
-        <w:rPr/>
-        <w:t xml:space="preserve"> aplica el patrón </w:t>
-      </w:r>
-      <w:r>
-        <w:rPr>
-          <w:i/>
-        </w:rPr>
-        <w:t xml:space="preserve">Strategy</w:t>
-      </w:r>
-      <w:r>
-        <w:rPr/>
-        <w:t xml:space="preserve"> (Gamma et al., 1994). Sin él, calcular perfiles por hora, día, mes y día de la semana habría requerido funciones casi idénticas, y cada criterio nuevo obligaba a modificar código ya probado. El patrón encapsula cada criterio en una clase con la misma interfaz </w:t>
-      </w:r>
-      <w:r>
-        <w:rPr>
-          <w:rFonts w:ascii="Courier New" w:hAnsi="Courier New" w:cs="Courier New"/>
-        </w:rPr>
         <w:t xml:space="preserve">agregar()</w:t>
-      </w:r>
-      <w:r>
-        <w:rPr/>
-        <w:t xml:space="preserve"> (</w:t>
-      </w:r>
-      <w:r>
-        <w:rPr>
-          <w:rFonts w:ascii="Courier New" w:hAnsi="Courier New" w:cs="Courier New"/>
-        </w:rPr>
-        <w:t xml:space="preserve">AgregacionHoraria</w:t>
-      </w:r>
-      <w:r>
-        <w:rPr/>
-        <w:t xml:space="preserve">, </w:t>
-      </w:r>
-      <w:r>
-        <w:rPr>
-          <w:rFonts w:ascii="Courier New" w:hAnsi="Courier New" w:cs="Courier New"/>
-        </w:rPr>
-        <w:t xml:space="preserve">AgregacionDiaria</w:t>
-      </w:r>
-      <w:r>
-        <w:rPr/>
-        <w:t xml:space="preserve">, </w:t>
-      </w:r>
-      <w:r>
-        <w:rPr>
-          <w:rFonts w:ascii="Courier New" w:hAnsi="Courier New" w:cs="Courier New"/>
-        </w:rPr>
-        <w:t xml:space="preserve">AgregacionMensual</w:t>
       </w:r>
       <w:r>
         <w:rPr/>
@@ -5709,21 +5650,11 @@
         <w:rPr>
           <w:rFonts w:ascii="Courier New" w:hAnsi="Courier New" w:cs="Courier New"/>
         </w:rPr>
-        <w:t xml:space="preserve">AgregacionPorDiaSemana</w:t>
+        <w:t xml:space="preserve">CaracterizadorTemporal</w:t>
       </w:r>
       <w:r>
         <w:rPr/>
-        <w:t xml:space="preserve">; 72, 729, 24 y 21 resultados) y </w:t>
-      </w:r>
-      <w:r>
-        <w:rPr>
-          <w:rFonts w:ascii="Courier New" w:hAnsi="Courier New" w:cs="Courier New"/>
-        </w:rPr>
-        <w:t xml:space="preserve">CaracterizadorTemporal</w:t>
-      </w:r>
-      <w:r>
-        <w:rPr/>
-        <w:t xml:space="preserve"> las usa de forma intercambiable sin conocerlas.</w:t>
+        <w:t xml:space="preserve"> las usa de forma intercambiable (72, 729, 24 y 21 resultados, respectivamente). Así, una agregación nueva se añade sin modificar el código existente.</w:t>
       </w:r>
     </w:p>
     <w:p>
@@ -6485,7 +6416,7 @@
       </w:pPr>
       <w:r>
         <w:rPr/>
-        <w:t xml:space="preserve">Las figuras se construyen sobre el dataset procesado, sin transformaciones adicionales que alteren los datos. Las agregaciones (media horaria, suma diaria, media mensual, media por día de la semana y porcentaje de horas con 0 MWh) se calculan con pandas (McKinney, 2010) y las estrategias de </w:t>
+        <w:t xml:space="preserve">Las figuras se construyen sobre el dataset procesado, sin transformaciones adicionales que alteren los datos. Las agregaciones (media horaria, suma diaria, media mensual, media por día de la semana y porcentaje de horas con 0 MWh) se calculan con las estrategias de </w:t>
       </w:r>
       <w:r>
         <w:rPr>
@@ -6495,7 +6426,7 @@
       </w:r>
       <w:r>
         <w:rPr/>
-        <w:t xml:space="preserve"> y se verificó que conservan el total de MWh. Se usan medias para comparar centrales de escala distinta, los ejes parten en cero y los registros de 0 MWh se muestran, no se excluyen. No se aplicó codificación ni escalamiento, por lo que el dataset conserva las categorías (central, mes, día) y la unidad original (MWh) y sirve directamente para graficar, sin necesidad de una copia aparte.</w:t>
+        <w:t xml:space="preserve"> y se verificó que conservan el total de MWh. Se usan medias para comparar centrales de escala distinta, los ejes parten en cero y los registros de 0 MWh se muestran, no se excluyen.</w:t>
       </w:r>
     </w:p>
     <w:p>
@@ -6515,7 +6446,7 @@
       </w:pPr>
       <w:r>
         <w:rPr/>
-        <w:t xml:space="preserve">El notebook F4 contiene cinco figuras; aquí se muestran tres. Cada título enuncia el hallazgo, el color identifica a cada central y cada figura declara su fuente.</w:t>
+        <w:t xml:space="preserve">El notebook F4 contiene cinco figuras (horaria, diaria, mensual, por día de la semana y ceros); aquí se muestran las tres que sustentan los resultados. Cada título enuncia el hallazgo, los colores son consistentes por central y cada figura declara su fuente.</w:t>
       </w:r>
     </w:p>
     <w:p>
@@ -6528,7 +6459,7 @@
       <w:r>
         <w:drawing>
           <wp:inline xmlns:a="http://schemas.openxmlformats.org/drawingml/2006/main" xmlns:pic="http://schemas.openxmlformats.org/drawingml/2006/picture">
-            <wp:extent cx="5486400" cy="1763486"/>
+            <wp:extent cx="5669280" cy="2186722"/>
             <wp:docPr id="12" name="Picture 12"/>
             <wp:cNvGraphicFramePr>
               <a:graphicFrameLocks noChangeAspect="1"/>
@@ -6549,7 +6480,7 @@
                   <pic:spPr>
                     <a:xfrm>
                       <a:off x="0" y="0"/>
-                      <a:ext cx="5486400" cy="1763486"/>
+                      <a:ext cx="5669280" cy="2186722"/>
                     </a:xfrm>
                     <a:prstGeom prst="rect"/>
                   </pic:spPr>
@@ -6562,7 +6493,7 @@
     </w:p>
     <w:p>
       <w:pPr>
-        <w:spacing w:before="0" w:after="120"/>
+        <w:spacing w:before="0" w:after="20" w:line="240" w:lineRule="auto"/>
         <w:ind w:left="0" w:firstLine="0"/>
         <w:jc w:val="left"/>
       </w:pPr>
@@ -6573,6 +6504,19 @@
           <w:szCs w:val="17"/>
         </w:rPr>
         <w:t xml:space="preserve">Figura 1. Perfil horario medio de generación por central. Fuente: elaboración propia con datos de Generación Real del CEN (2026), enero–agosto de 2026.</w:t>
+      </w:r>
+    </w:p>
+    <w:p>
+      <w:pPr>
+        <w:spacing w:before="20" w:after="60" w:line="240" w:lineRule="auto"/>
+        <w:jc w:val="both"/>
+      </w:pPr>
+      <w:r>
+        <w:rPr>
+          <w:rFonts w:ascii="Arial" w:hAnsi="Arial"/>
+          <w:sz w:val="17"/>
+        </w:rPr>
+        <w:t>La figura muestra que las tres centrales mantienen perfiles horarios relativamente planos, con Pacífico en un nivel medio claramente superior a Laja y Santa Fe. Se infiere que, dentro del período analizado, la hora del día explica menos variación que las diferencias entre centrales. Esta lectura se limita a la generación inyectada informada por el CEN entre enero y agosto de 2026 y no permite atribuir causas operacionales. Como contexto del relato, este resultado orienta el análisis hacia una escala temporal mayor: la comparación mensual de la Figura 2.</w:t>
       </w:r>
     </w:p>
     <w:p>
@@ -6585,7 +6529,7 @@
       <w:r>
         <w:drawing>
           <wp:inline xmlns:a="http://schemas.openxmlformats.org/drawingml/2006/main" xmlns:pic="http://schemas.openxmlformats.org/drawingml/2006/picture">
-            <wp:extent cx="5486400" cy="1763486"/>
+            <wp:extent cx="5669280" cy="2186722"/>
             <wp:docPr id="12" name="Picture 12"/>
             <wp:cNvGraphicFramePr>
               <a:graphicFrameLocks noChangeAspect="1"/>
@@ -6606,7 +6550,7 @@
                   <pic:spPr>
                     <a:xfrm>
                       <a:off x="0" y="0"/>
-                      <a:ext cx="5486400" cy="1763486"/>
+                      <a:ext cx="5669280" cy="2186722"/>
                     </a:xfrm>
                     <a:prstGeom prst="rect"/>
                   </pic:spPr>
@@ -6619,7 +6563,7 @@
     </w:p>
     <w:p>
       <w:pPr>
-        <w:spacing w:before="0" w:after="120"/>
+        <w:spacing w:before="0" w:after="20" w:line="240" w:lineRule="auto"/>
         <w:ind w:left="0" w:firstLine="0"/>
         <w:jc w:val="left"/>
       </w:pPr>
@@ -6630,6 +6574,19 @@
           <w:szCs w:val="17"/>
         </w:rPr>
         <w:t xml:space="preserve">Figura 2. Generación media mensual por central. Fuente: elaboración propia con datos del CEN (2026).</w:t>
+      </w:r>
+    </w:p>
+    <w:p>
+      <w:pPr>
+        <w:spacing w:before="20" w:after="60" w:line="240" w:lineRule="auto"/>
+        <w:jc w:val="both"/>
+      </w:pPr>
+      <w:r>
+        <w:rPr>
+          <w:rFonts w:ascii="Arial" w:hAnsi="Arial"/>
+          <w:sz w:val="17"/>
+        </w:rPr>
+        <w:t>La figura muestra que las diferencias entre centrales se amplían a escala mensual: Laja disminuye hacia agosto, Pacífico reduce su nivel en julio-agosto y Santa Fe alcanza sus mayores medias en el período intermedio. Se infiere que la variación mensual discrimina mejor los cambios temporales que el perfil horario casi plano observado previamente. La comparación cubre solo ocho meses, por lo que no permite establecer estacionalidad anual ni explicar las causas de las variaciones. Este contraste conduce a examinar en la Figura 3 cuánto de esas diferencias coincide con la presencia de horas registradas en 0 MWh.</w:t>
       </w:r>
     </w:p>
     <w:p>
@@ -6642,7 +6599,7 @@
       <w:r>
         <w:drawing>
           <wp:inline xmlns:a="http://schemas.openxmlformats.org/drawingml/2006/main" xmlns:pic="http://schemas.openxmlformats.org/drawingml/2006/picture">
-            <wp:extent cx="5486400" cy="1489166"/>
+            <wp:extent cx="5669280" cy="1700784"/>
             <wp:docPr id="12" name="Picture 12"/>
             <wp:cNvGraphicFramePr>
               <a:graphicFrameLocks noChangeAspect="1"/>
@@ -6663,7 +6620,7 @@
                   <pic:spPr>
                     <a:xfrm>
                       <a:off x="0" y="0"/>
-                      <a:ext cx="5486400" cy="1489166"/>
+                      <a:ext cx="5669280" cy="1700784"/>
                     </a:xfrm>
                     <a:prstGeom prst="rect"/>
                   </pic:spPr>
@@ -6676,7 +6633,7 @@
     </w:p>
     <w:p>
       <w:pPr>
-        <w:spacing w:before="0" w:after="120"/>
+        <w:spacing w:before="0" w:after="20" w:line="240" w:lineRule="auto"/>
         <w:ind w:left="0" w:firstLine="0"/>
         <w:jc w:val="left"/>
       </w:pPr>
@@ -6691,6 +6648,19 @@
     </w:p>
     <w:p>
       <w:pPr>
+        <w:spacing w:before="20" w:after="60" w:line="240" w:lineRule="auto"/>
+        <w:jc w:val="both"/>
+      </w:pPr>
+      <w:r>
+        <w:rPr>
+          <w:rFonts w:ascii="Arial" w:hAnsi="Arial"/>
+          <w:sz w:val="17"/>
+        </w:rPr>
+        <w:t>La figura muestra que los registros de 0 MWh se concentran principalmente en Laja, especialmente en julio y agosto, mientras Pacífico presenta porcentajes bajos y Santa Fe aumenta en agosto. Se infiere que la frecuencia de ceros contribuye a describir las diferencias temporales observadas entre las centrales y ayuda a interpretar la caída mensual de Laja. Sin información operacional complementaria, estos ceros no pueden atribuirse a fallas, mantenimiento, detenciones u otra causa específica. La figura cierra la narrativa al vincular perfil horario, variación mensual y frecuencia de 0 MWh con los objetivos de caracterizar, comparar y describir los patrones temporales del proyecto.</w:t>
+      </w:r>
+    </w:p>
+    <w:p>
+      <w:pPr>
         <w:pStyle w:val="Ttulo1"/>
       </w:pPr>
       <w:bookmarkStart w:id="26" w:name="_Toc241865087"/>
@@ -6716,27 +6686,37 @@
       </w:pPr>
       <w:r>
         <w:rPr/>
-        <w:t xml:space="preserve">La validación técnica combinó la equivalencia entre F2 y F3, la conservación de totales en las agregaciones y las pruebas de casos normales, límite y excepción. Entre las limitaciones, el período cubre ocho meses (no permite evaluar estacionalidad anual), los valores corresponden a generación inyectada al sistema según el CEN y no a la producción total de cada planta, y los datos no incluyen información operacional que explique los registros de 0 MWh. La colaboración quedó documentada en el README (contribuciones por integrante) y en el historial de Git: cuatro autores consolidados con </w:t>
+        <w:t xml:space="preserve">La validación técnica combinó la equivalencia entre F2 y F3, la conservación de totales en las agregaciones y las pruebas de casos normales, límite y excepción. Entre las limitaciones, el período cubre ocho meses (no permite evaluar estacionalidad anual), los valores corresponden a generación inyectada al sistema según el CEN y no a la producción total de cada planta, y los datos no incluyen información operacional que explique los registros de 0 MWh. Como aprendizaje, mover la lógica desde los notebooks a </w:t>
       </w:r>
       <w:r>
         <w:rPr>
           <w:rFonts w:ascii="Courier New" w:hAnsi="Courier New" w:cs="Courier New"/>
         </w:rPr>
-        <w:t xml:space="preserve">.mailmap</w:t>
+        <w:t xml:space="preserve">src/</w:t>
       </w:r>
       <w:r>
         <w:rPr/>
-        <w:t xml:space="preserve">, ramas por tarea y fusión por </w:t>
-      </w:r>
-      <w:r>
-        <w:rPr>
-          <w:i/>
-        </w:rPr>
-        <w:t xml:space="preserve">pull request</w:t>
-      </w:r>
+        <w:t xml:space="preserve"> y probar reglas atómicas redujo la duplicación y facilitó detectar errores.</w:t>
+      </w:r>
+    </w:p>
+    <w:p>
+      <w:pPr>
+        <w:pStyle w:val="Ttulo2"/>
+        <w:ind w:left="720"/>
+      </w:pPr>
+      <w:bookmarkStart w:id="28" w:name="_Toc241865089"/>
+      <w:r>
+        <w:t>b. Resultados</w:t>
+      </w:r>
+      <w:bookmarkEnd w:id="28"/>
+    </w:p>
+    <w:p>
+      <w:pPr>
+        <w:ind w:left="0" w:firstLine="567"/>
+      </w:pPr>
       <w:r>
         <w:rPr/>
-        <w:t xml:space="preserve">.</w:t>
+        <w:t xml:space="preserve">La Tabla 3 resume los resultados. TER CMPC Pacífico aporta el 65 % de la generación total del conjunto (94.446 de 144.518 MWh) y mantiene un perfil horario casi plano (14,6–17,9 MWh por hora; Figura 1). Su media mensual se ubica entre 14 y 19 MWh hasta junio y baja a cerca de 12 MWh en julio y agosto (Figura 2). TER CMPC Laja disminuye de 7,6 MWh en enero a 0,4 MWh en agosto y concentra el 72 % de las horas con 0 MWh del conjunto (3.193 de 4.438), con cerca de 90 % de sus horas en cero en julio y agosto (Figura 3) y una secuencia continua máxima de 375 horas (≈15,6 días). TER CMPC Santa Fe presenta su mayor media en abril (7,9 MWh), un perfil horario plano (4,8–5,5 MWh) y un 59 % de horas en cero en agosto. Las diferencias por día de la semana son menores y sin patrón claro (por ejemplo, Laja: 2,5 MWh los domingos y 4,0 los miércoles).</w:t>
       </w:r>
     </w:p>
     <w:p>
@@ -6752,559 +6732,7 @@
           <w:sz w:val="19"/>
           <w:szCs w:val="19"/>
         </w:rPr>
-        <w:t xml:space="preserve">Tabla 3. Comparación con las fases previas</w:t>
-      </w:r>
-    </w:p>
-    <w:tbl>
-      <w:tblPr>
-        <w:tblStyle w:val="Tabladecuadrcula4-nfasis1"/>
-        <w:tblW w:w="10380" w:type="dxa"/>
-        <w:tblLayout w:type="fixed"/>
-        <w:tblLook w:val="04A0" w:firstRow="1" w:lastRow="0" w:firstColumn="1" w:lastColumn="0" w:noHBand="0" w:noVBand="1"/>
-      </w:tblPr>
-      <w:tblGrid>
-        <w:gridCol w:w="1500"/>
-        <w:gridCol w:w="2900"/>
-        <w:gridCol w:w="3300"/>
-        <w:gridCol w:w="2680"/>
-      </w:tblGrid>
-      <w:tr>
-        <w:trPr>
-          <w:cantSplit/>
-          <w:tblHeader/>
-        </w:trPr>
-        <w:tc>
-          <w:tcPr>
-            <w:tcW w:w="1500" w:type="dxa"/>
-            <w:vAlign w:val="center"/>
-          </w:tcPr>
-          <w:p>
-            <w:pPr>
-              <w:spacing w:before="20" w:after="20" w:line="240" w:lineRule="auto"/>
-              <w:ind w:left="0" w:firstLine="0"/>
-              <w:jc w:val="left"/>
-            </w:pPr>
-            <w:r>
-              <w:rPr>
-                <w:sz w:val="17"/>
-                <w:szCs w:val="17"/>
-              </w:rPr>
-              <w:t xml:space="preserve">Aspecto</w:t>
-            </w:r>
-          </w:p>
-        </w:tc>
-        <w:tc>
-          <w:tcPr>
-            <w:tcW w:w="2900" w:type="dxa"/>
-            <w:vAlign w:val="center"/>
-          </w:tcPr>
-          <w:p>
-            <w:pPr>
-              <w:spacing w:before="20" w:after="20" w:line="240" w:lineRule="auto"/>
-              <w:ind w:left="0" w:firstLine="0"/>
-              <w:jc w:val="left"/>
-            </w:pPr>
-            <w:r>
-              <w:rPr>
-                <w:sz w:val="17"/>
-                <w:szCs w:val="17"/>
-              </w:rPr>
-              <w:t xml:space="preserve">Fase previa</w:t>
-            </w:r>
-          </w:p>
-        </w:tc>
-        <w:tc>
-          <w:tcPr>
-            <w:tcW w:w="3300" w:type="dxa"/>
-            <w:vAlign w:val="center"/>
-          </w:tcPr>
-          <w:p>
-            <w:pPr>
-              <w:spacing w:before="20" w:after="20" w:line="240" w:lineRule="auto"/>
-              <w:ind w:left="0" w:firstLine="0"/>
-              <w:jc w:val="left"/>
-            </w:pPr>
-            <w:r>
-              <w:rPr>
-                <w:sz w:val="17"/>
-                <w:szCs w:val="17"/>
-              </w:rPr>
-              <w:t xml:space="preserve">Estado actual</w:t>
-            </w:r>
-          </w:p>
-        </w:tc>
-        <w:tc>
-          <w:tcPr>
-            <w:tcW w:w="2680" w:type="dxa"/>
-            <w:vAlign w:val="center"/>
-          </w:tcPr>
-          <w:p>
-            <w:pPr>
-              <w:spacing w:before="20" w:after="20" w:line="240" w:lineRule="auto"/>
-              <w:ind w:left="0" w:firstLine="0"/>
-              <w:jc w:val="left"/>
-            </w:pPr>
-            <w:r>
-              <w:rPr>
-                <w:sz w:val="17"/>
-                <w:szCs w:val="17"/>
-              </w:rPr>
-              <w:t xml:space="preserve">Motivo del cambio</w:t>
-            </w:r>
-          </w:p>
-        </w:tc>
-      </w:tr>
-      <w:tr>
-        <w:trPr>
-          <w:cantSplit/>
-        </w:trPr>
-        <w:tc>
-          <w:tcPr>
-            <w:tcW w:w="1500" w:type="dxa"/>
-            <w:vAlign w:val="center"/>
-          </w:tcPr>
-          <w:p>
-            <w:pPr>
-              <w:spacing w:before="20" w:after="20" w:line="240" w:lineRule="auto"/>
-              <w:ind w:left="0" w:firstLine="0"/>
-              <w:jc w:val="left"/>
-            </w:pPr>
-            <w:r>
-              <w:rPr>
-                <w:sz w:val="17"/>
-                <w:szCs w:val="17"/>
-              </w:rPr>
-              <w:t xml:space="preserve">Preparación</w:t>
-            </w:r>
-          </w:p>
-        </w:tc>
-        <w:tc>
-          <w:tcPr>
-            <w:tcW w:w="2900" w:type="dxa"/>
-            <w:vAlign w:val="center"/>
-          </w:tcPr>
-          <w:p>
-            <w:pPr>
-              <w:spacing w:before="20" w:after="20" w:line="240" w:lineRule="auto"/>
-              <w:ind w:left="0" w:firstLine="0"/>
-              <w:jc w:val="left"/>
-            </w:pPr>
-            <w:r>
-              <w:rPr>
-                <w:sz w:val="17"/>
-                <w:szCs w:val="17"/>
-              </w:rPr>
-              <w:t xml:space="preserve">Funciones sueltas en el notebook de F2</w:t>
-            </w:r>
-          </w:p>
-        </w:tc>
-        <w:tc>
-          <w:tcPr>
-            <w:tcW w:w="3300" w:type="dxa"/>
-            <w:vAlign w:val="center"/>
-          </w:tcPr>
-          <w:p>
-            <w:pPr>
-              <w:spacing w:before="20" w:after="20" w:line="240" w:lineRule="auto"/>
-              <w:ind w:left="0" w:firstLine="0"/>
-              <w:jc w:val="left"/>
-            </w:pPr>
-            <w:r>
-              <w:rPr>
-                <w:sz w:val="17"/>
-                <w:szCs w:val="17"/>
-              </w:rPr>
-              <w:t xml:space="preserve">Clases y </w:t>
-            </w:r>
-            <w:r>
-              <w:rPr>
-                <w:rFonts w:ascii="Courier New" w:hAnsi="Courier New" w:cs="Courier New"/>
-                <w:sz w:val="17"/>
-                <w:szCs w:val="17"/>
-              </w:rPr>
-              <w:t xml:space="preserve">Pipeline</w:t>
-            </w:r>
-            <w:r>
-              <w:rPr>
-                <w:sz w:val="17"/>
-                <w:szCs w:val="17"/>
-              </w:rPr>
-              <w:t xml:space="preserve"> en </w:t>
-            </w:r>
-            <w:r>
-              <w:rPr>
-                <w:rFonts w:ascii="Courier New" w:hAnsi="Courier New" w:cs="Courier New"/>
-                <w:sz w:val="17"/>
-                <w:szCs w:val="17"/>
-              </w:rPr>
-              <w:t xml:space="preserve">src/</w:t>
-            </w:r>
-            <w:r>
-              <w:rPr>
-                <w:sz w:val="17"/>
-                <w:szCs w:val="17"/>
-              </w:rPr>
-              <w:t xml:space="preserve">, con equivalencia verificada</w:t>
-            </w:r>
-          </w:p>
-        </w:tc>
-        <w:tc>
-          <w:tcPr>
-            <w:tcW w:w="2680" w:type="dxa"/>
-            <w:vAlign w:val="center"/>
-          </w:tcPr>
-          <w:p>
-            <w:pPr>
-              <w:spacing w:before="20" w:after="20" w:line="240" w:lineRule="auto"/>
-              <w:ind w:left="0" w:firstLine="0"/>
-              <w:jc w:val="left"/>
-            </w:pPr>
-            <w:r>
-              <w:rPr>
-                <w:sz w:val="17"/>
-                <w:szCs w:val="17"/>
-              </w:rPr>
-              <w:t xml:space="preserve">Modularidad y reutilización</w:t>
-            </w:r>
-          </w:p>
-        </w:tc>
-      </w:tr>
-      <w:tr>
-        <w:trPr>
-          <w:cantSplit/>
-        </w:trPr>
-        <w:tc>
-          <w:tcPr>
-            <w:tcW w:w="1500" w:type="dxa"/>
-            <w:vAlign w:val="center"/>
-          </w:tcPr>
-          <w:p>
-            <w:pPr>
-              <w:spacing w:before="20" w:after="20" w:line="240" w:lineRule="auto"/>
-              <w:ind w:left="0" w:firstLine="0"/>
-              <w:jc w:val="left"/>
-            </w:pPr>
-            <w:r>
-              <w:rPr>
-                <w:sz w:val="17"/>
-                <w:szCs w:val="17"/>
-              </w:rPr>
-              <w:t xml:space="preserve">Validación</w:t>
-            </w:r>
-          </w:p>
-        </w:tc>
-        <w:tc>
-          <w:tcPr>
-            <w:tcW w:w="2900" w:type="dxa"/>
-            <w:vAlign w:val="center"/>
-          </w:tcPr>
-          <w:p>
-            <w:pPr>
-              <w:spacing w:before="20" w:after="20" w:line="240" w:lineRule="auto"/>
-              <w:ind w:left="0" w:firstLine="0"/>
-              <w:jc w:val="left"/>
-            </w:pPr>
-            <w:r>
-              <w:rPr>
-                <w:sz w:val="17"/>
-                <w:szCs w:val="17"/>
-              </w:rPr>
-              <w:t xml:space="preserve">Una función con valores rígidos</w:t>
-            </w:r>
-          </w:p>
-        </w:tc>
-        <w:tc>
-          <w:tcPr>
-            <w:tcW w:w="3300" w:type="dxa"/>
-            <w:vAlign w:val="center"/>
-          </w:tcPr>
-          <w:p>
-            <w:pPr>
-              <w:spacing w:before="20" w:after="20" w:line="240" w:lineRule="auto"/>
-              <w:ind w:left="0" w:firstLine="0"/>
-              <w:jc w:val="left"/>
-            </w:pPr>
-            <w:r>
-              <w:rPr>
-                <w:sz w:val="17"/>
-                <w:szCs w:val="17"/>
-              </w:rPr>
-              <w:t xml:space="preserve">Reglas atómicas y parametrizables</w:t>
-            </w:r>
-          </w:p>
-        </w:tc>
-        <w:tc>
-          <w:tcPr>
-            <w:tcW w:w="2680" w:type="dxa"/>
-            <w:vAlign w:val="center"/>
-          </w:tcPr>
-          <w:p>
-            <w:pPr>
-              <w:spacing w:before="20" w:after="20" w:line="240" w:lineRule="auto"/>
-              <w:ind w:left="0" w:firstLine="0"/>
-              <w:jc w:val="left"/>
-            </w:pPr>
-            <w:r>
-              <w:rPr>
-                <w:sz w:val="17"/>
-                <w:szCs w:val="17"/>
-              </w:rPr>
-              <w:t xml:space="preserve">Probar cada regla por separado</w:t>
-            </w:r>
-          </w:p>
-        </w:tc>
-      </w:tr>
-      <w:tr>
-        <w:trPr>
-          <w:cantSplit/>
-        </w:trPr>
-        <w:tc>
-          <w:tcPr>
-            <w:tcW w:w="1500" w:type="dxa"/>
-            <w:vAlign w:val="center"/>
-          </w:tcPr>
-          <w:p>
-            <w:pPr>
-              <w:spacing w:before="20" w:after="20" w:line="240" w:lineRule="auto"/>
-              <w:ind w:left="0" w:firstLine="0"/>
-              <w:jc w:val="left"/>
-            </w:pPr>
-            <w:r>
-              <w:rPr>
-                <w:sz w:val="17"/>
-                <w:szCs w:val="17"/>
-              </w:rPr>
-              <w:t xml:space="preserve">Eficiencia</w:t>
-            </w:r>
-          </w:p>
-        </w:tc>
-        <w:tc>
-          <w:tcPr>
-            <w:tcW w:w="2900" w:type="dxa"/>
-            <w:vAlign w:val="center"/>
-          </w:tcPr>
-          <w:p>
-            <w:pPr>
-              <w:spacing w:before="20" w:after="20" w:line="240" w:lineRule="auto"/>
-              <w:ind w:left="0" w:firstLine="0"/>
-              <w:jc w:val="left"/>
-            </w:pPr>
-            <w:r>
-              <w:rPr>
-                <w:sz w:val="17"/>
-                <w:szCs w:val="17"/>
-              </w:rPr>
-              <w:t xml:space="preserve">Sin mediciones</w:t>
-            </w:r>
-          </w:p>
-        </w:tc>
-        <w:tc>
-          <w:tcPr>
-            <w:tcW w:w="3300" w:type="dxa"/>
-            <w:vAlign w:val="center"/>
-          </w:tcPr>
-          <w:p>
-            <w:pPr>
-              <w:spacing w:before="20" w:after="20" w:line="240" w:lineRule="auto"/>
-              <w:ind w:left="0" w:firstLine="0"/>
-              <w:jc w:val="left"/>
-            </w:pPr>
-            <w:r>
-              <w:rPr>
-                <w:rFonts w:ascii="Courier New" w:hAnsi="Courier New" w:cs="Courier New"/>
-                <w:sz w:val="17"/>
-                <w:szCs w:val="17"/>
-              </w:rPr>
-              <w:t xml:space="preserve">timeit</w:t>
-            </w:r>
-            <w:r>
-              <w:rPr>
-                <w:sz w:val="17"/>
-                <w:szCs w:val="17"/>
-              </w:rPr>
-              <w:t xml:space="preserve"> y </w:t>
-            </w:r>
-            <w:r>
-              <w:rPr>
-                <w:rFonts w:ascii="Courier New" w:hAnsi="Courier New" w:cs="Courier New"/>
-                <w:sz w:val="17"/>
-                <w:szCs w:val="17"/>
-              </w:rPr>
-              <w:t xml:space="preserve">tracemalloc</w:t>
-            </w:r>
-            <w:r>
-              <w:rPr>
-                <w:sz w:val="17"/>
-                <w:szCs w:val="17"/>
-              </w:rPr>
-              <w:t xml:space="preserve"> en F3</w:t>
-            </w:r>
-          </w:p>
-        </w:tc>
-        <w:tc>
-          <w:tcPr>
-            <w:tcW w:w="2680" w:type="dxa"/>
-            <w:vAlign w:val="center"/>
-          </w:tcPr>
-          <w:p>
-            <w:pPr>
-              <w:spacing w:before="20" w:after="20" w:line="240" w:lineRule="auto"/>
-              <w:ind w:left="0" w:firstLine="0"/>
-              <w:jc w:val="left"/>
-            </w:pPr>
-            <w:r>
-              <w:rPr>
-                <w:sz w:val="17"/>
-                <w:szCs w:val="17"/>
-              </w:rPr>
-              <w:t xml:space="preserve">Justificar la implementación elegida</w:t>
-            </w:r>
-          </w:p>
-        </w:tc>
-      </w:tr>
-      <w:tr>
-        <w:trPr>
-          <w:cantSplit/>
-        </w:trPr>
-        <w:tc>
-          <w:tcPr>
-            <w:tcW w:w="1500" w:type="dxa"/>
-            <w:vAlign w:val="center"/>
-          </w:tcPr>
-          <w:p>
-            <w:pPr>
-              <w:spacing w:before="20" w:after="20" w:line="240" w:lineRule="auto"/>
-              <w:ind w:left="0" w:firstLine="0"/>
-              <w:jc w:val="left"/>
-            </w:pPr>
-            <w:r>
-              <w:rPr>
-                <w:sz w:val="17"/>
-                <w:szCs w:val="17"/>
-              </w:rPr>
-              <w:t xml:space="preserve">Verificación</w:t>
-            </w:r>
-          </w:p>
-        </w:tc>
-        <w:tc>
-          <w:tcPr>
-            <w:tcW w:w="2900" w:type="dxa"/>
-            <w:vAlign w:val="center"/>
-          </w:tcPr>
-          <w:p>
-            <w:pPr>
-              <w:spacing w:before="20" w:after="20" w:line="240" w:lineRule="auto"/>
-              <w:ind w:left="0" w:firstLine="0"/>
-              <w:jc w:val="left"/>
-            </w:pPr>
-            <w:r>
-              <w:rPr>
-                <w:sz w:val="17"/>
-                <w:szCs w:val="17"/>
-              </w:rPr>
-              <w:t xml:space="preserve">Equivalencia columna a columna (F3)</w:t>
-            </w:r>
-          </w:p>
-        </w:tc>
-        <w:tc>
-          <w:tcPr>
-            <w:tcW w:w="3300" w:type="dxa"/>
-            <w:vAlign w:val="center"/>
-          </w:tcPr>
-          <w:p>
-            <w:pPr>
-              <w:spacing w:before="20" w:after="20" w:line="240" w:lineRule="auto"/>
-              <w:ind w:left="0" w:firstLine="0"/>
-              <w:jc w:val="left"/>
-            </w:pPr>
-            <w:r>
-              <w:rPr>
-                <w:rFonts w:ascii="Courier New" w:hAnsi="Courier New" w:cs="Courier New"/>
-                <w:sz w:val="17"/>
-                <w:szCs w:val="17"/>
-              </w:rPr>
-              <w:t xml:space="preserve">assert_frame_equal</w:t>
-            </w:r>
-            <w:r>
-              <w:rPr>
-                <w:sz w:val="17"/>
-                <w:szCs w:val="17"/>
-              </w:rPr>
-              <w:t xml:space="preserve"> y pruebas normal/límite/excepción (F4)</w:t>
-            </w:r>
-          </w:p>
-        </w:tc>
-        <w:tc>
-          <w:tcPr>
-            <w:tcW w:w="2680" w:type="dxa"/>
-            <w:vAlign w:val="center"/>
-          </w:tcPr>
-          <w:p>
-            <w:pPr>
-              <w:spacing w:before="20" w:after="20" w:line="240" w:lineRule="auto"/>
-              <w:ind w:left="0" w:firstLine="0"/>
-              <w:jc w:val="left"/>
-            </w:pPr>
-            <w:r>
-              <w:rPr>
-                <w:sz w:val="17"/>
-                <w:szCs w:val="17"/>
-              </w:rPr>
-              <w:t xml:space="preserve">Evidencia objetiva de que las mejoras no rompen nada</w:t>
-            </w:r>
-          </w:p>
-        </w:tc>
-      </w:tr>
-    </w:tbl>
-    <w:p>
-      <w:pPr>
-        <w:spacing w:before="0" w:after="120"/>
-        <w:ind w:left="0" w:firstLine="0"/>
-        <w:jc w:val="left"/>
-      </w:pPr>
-      <w:r>
-        <w:rPr>
-          <w:i/>
-          <w:sz w:val="17"/>
-          <w:szCs w:val="17"/>
-        </w:rPr>
-        <w:t xml:space="preserve">Fuente: elaboración propia a partir de los notebooks F2–F4 y de las observaciones recibidas.</w:t>
-      </w:r>
-    </w:p>
-    <w:p>
-      <w:pPr>
-        <w:pStyle w:val="Ttulo2"/>
-        <w:ind w:left="720"/>
-      </w:pPr>
-      <w:bookmarkStart w:id="28" w:name="_Toc241865089"/>
-      <w:r>
-        <w:t>b. Resultados</w:t>
-      </w:r>
-      <w:bookmarkEnd w:id="28"/>
-    </w:p>
-    <w:p>
-      <w:pPr>
-        <w:ind w:left="0" w:firstLine="567"/>
-      </w:pPr>
-      <w:r>
-        <w:rPr/>
-        <w:t xml:space="preserve">La Tabla 4 resume los resultados. TER CMPC Pacífico aporta el 65 % de la generación total del conjunto (94.446 de 144.518 MWh) y mantiene un perfil horario casi plano (14,6–17,9 MWh por hora; Figura 1). Su media mensual se ubica entre 14 y 19 MWh hasta junio y baja a cerca de 12 MWh en julio y agosto (Figura 2). TER CMPC Laja disminuye de 7,6 MWh en enero a 0,4 MWh en agosto y concentra el 72 % de las horas con 0 MWh del conjunto (3.193 de 4.438), con cerca de 90 % de sus horas en cero en julio y agosto (Figura 3) y una secuencia continua máxima de 375 horas (≈15,6 días). TER CMPC Santa Fe presenta su mayor media en abril (7,9 MWh), un perfil horario plano (4,8–5,5 MWh) y un 59 % de horas en cero en agosto. Las diferencias por día de la semana son menores y sin patrón claro (por ejemplo, Laja: 2,5 MWh los domingos y 4,0 los miércoles).</w:t>
-      </w:r>
-    </w:p>
-    <w:p>
-      <w:pPr>
-        <w:keepNext/>
-        <w:spacing w:before="80" w:after="60"/>
-        <w:ind w:left="0" w:firstLine="0"/>
-        <w:jc w:val="left"/>
-      </w:pPr>
-      <w:r>
-        <w:rPr>
-          <w:b/>
-          <w:sz w:val="19"/>
-          <w:szCs w:val="19"/>
-        </w:rPr>
-        <w:t xml:space="preserve">Tabla 4. Resumen de generación y registros con 0 MWh por central (enero–agosto de 2026)</w:t>
+        <w:t xml:space="preserve">Tabla 3. Resumen de generación y registros con 0 MWh por central (enero–agosto de 2026)</w:t>
       </w:r>
     </w:p>
     <w:tbl>
@@ -7876,7 +7304,7 @@
       </w:pPr>
       <w:r>
         <w:rPr/>
-        <w:t xml:space="preserve">Los resultados muestran tres comportamientos distintos dentro de un mismo grupo empresarial: una central base y estable (Pacífico), una con fuerte caída y alta intermitencia (Laja) y una de nivel intermedio con interrupciones prolongadas (Santa Fe). La ausencia de un ciclo horario marcado es compatible con una generación de excedentes sujeta a la programación interna de los procesos, pero los datos disponibles no permiten confirmarlo ni atribuir los 0 MWh a detenciones, mantenimiento u otras causas; esa interpretación requeriría información operacional adicional, por lo que se mantiene como hipótesis fuera del alcance. Como la pregunta es descriptiva, no se formularon hipótesis causales que contrastar; los resultados se contrastan con los objetivos específicos de la sección III.</w:t>
+        <w:t xml:space="preserve">Los resultados muestran tres comportamientos distintos dentro de un mismo grupo empresarial: una central base y estable (Pacífico), una con fuerte caída y alta intermitencia (Laja) y una de nivel intermedio con interrupciones prolongadas (Santa Fe). La ausencia de un ciclo horario marcado es compatible con una generación de excedentes sujeta a la programación interna de los procesos, pero los datos disponibles no permiten confirmarlo ni atribuir los 0 MWh a detenciones, mantenimiento u otras causas; esa interpretación requeriría información operacional adicional, por lo que se mantiene como hipótesis fuera del alcance. La principal amenaza a la validez es el período acotado de ocho meses, que impide distinguir una tendencia sostenida de una variación estacional.</w:t>
       </w:r>
     </w:p>
     <w:p>
@@ -7976,6 +7404,82 @@
     </w:p>
     <w:p>
       <w:pPr>
+        <w:ind w:left="720"/>
+      </w:pPr>
+      <w:r>
+        <w:lastRenderedPageBreak/>
+        <w:t xml:space="preserve">En la primera evaluación se identificaron, entre otros aspectos, una </w:t>
+      </w:r>
+      <w:proofErr w:type="spellStart"/>
+      <w:r>
+        <w:t>modularización</w:t>
+      </w:r>
+      <w:proofErr w:type="spellEnd"/>
+      <w:r>
+        <w:t xml:space="preserve"> incompleta del pipeline, validaciones concentradas en una única función, inconsistencias en las identidades registradas por Git y falta de evidencia suficiente de ejecución reproducible de</w:t>
+      </w:r>
+      <w:r>
+        <w:t>l</w:t>
+      </w:r>
+      <w:r>
+        <w:t xml:space="preserve"> notebook. También se solicitó documentar con mayor claridad el impacto de las transformaciones y profundizar el análisis temporal de los registros de generación igual a 0 </w:t>
+      </w:r>
+      <w:proofErr w:type="spellStart"/>
+      <w:r>
+        <w:t>MWh</w:t>
+      </w:r>
+      <w:proofErr w:type="spellEnd"/>
+      <w:r>
+        <w:t xml:space="preserve">. </w:t>
+      </w:r>
+    </w:p>
+    <w:p>
+      <w:pPr>
+        <w:ind w:left="720"/>
+      </w:pPr>
+      <w:r>
+        <w:t xml:space="preserve">Estas observaciones fueron abordadas durante la Fase 3. El propio </w:t>
+      </w:r>
+      <w:proofErr w:type="spellStart"/>
+      <w:r>
+        <w:t>feedback</w:t>
+      </w:r>
+      <w:proofErr w:type="spellEnd"/>
+      <w:r>
+        <w:t xml:space="preserve"> posterior confirmó que la </w:t>
+      </w:r>
+      <w:proofErr w:type="spellStart"/>
+      <w:r>
+        <w:t>modularización</w:t>
+      </w:r>
+      <w:proofErr w:type="spellEnd"/>
+      <w:r>
+        <w:t xml:space="preserve"> fue ampliada, las reglas de validación se parametrizaron y separaron, las identidades de Git se consolidaron </w:t>
+      </w:r>
+      <w:proofErr w:type="gramStart"/>
+      <w:r>
+        <w:t>mediante .</w:t>
+      </w:r>
+      <w:proofErr w:type="spellStart"/>
+      <w:r>
+        <w:t>mailmap</w:t>
+      </w:r>
+      <w:proofErr w:type="spellEnd"/>
+      <w:proofErr w:type="gramEnd"/>
+      <w:r>
+        <w:t xml:space="preserve"> y los notebooks comenzaron a ejecutarse desde </w:t>
+      </w:r>
+      <w:proofErr w:type="spellStart"/>
+      <w:r>
+        <w:t>kernel</w:t>
+      </w:r>
+      <w:proofErr w:type="spellEnd"/>
+      <w:r>
+        <w:t xml:space="preserve"> limpio.</w:t>
+      </w:r>
+    </w:p>
+    <w:p>
+      <w:pPr>
         <w:ind w:left="720" w:hanging="11"/>
         <w:rPr>
           <w:b/>
@@ -7994,7 +7498,7 @@
           <w:b/>
           <w:bCs/>
         </w:rPr>
-        <w:t xml:space="preserve"> 5</w:t>
+        <w:t xml:space="preserve"> 4</w:t>
       </w:r>
       <w:r>
         <w:rPr>
@@ -8987,6 +8491,14 @@
         <w:t xml:space="preserve"> asociados a estas mejoras son verificables en el historial del repositorio. Por ejemplo, la refactorización de validaciones se registró en a4e655d, la mejora del pipeline POO y del filtrado temporal en 2a7372f, y la consolidación de la trazabilidad F1–F4 en 8f9f73e.</w:t>
       </w:r>
     </w:p>
+    <w:p>
+      <w:pPr>
+        <w:ind w:left="720"/>
+      </w:pPr>
+      <w:r>
+        <w:t>En conjunto, estas acciones permitieron que el proyecto evolucionara desde una primera arquitectura funcional pero todavía incompleta hacia una solución más modular, reproducible y trazable. La mejora afectó directamente la estructura del código, la capacidad de prueba de las funciones, la confiabilidad de la ejecución y la calidad de la documentación técnica. La retroalimentación de la Fase 3 confirma este avance y señala que los principales problemas identificados previamente fueron corregidos antes de la entrega final.</w:t>
+      </w:r>
+    </w:p>
     <w:p/>
     <w:p>
       <w:pPr>
@@ -9000,6 +8512,7 @@
     </w:p>
     <w:p>
       <w:pPr>
+        <w:spacing w:after="40" w:line="240" w:lineRule="auto"/>
         <w:ind w:left="0" w:firstLine="567"/>
       </w:pPr>
       <w:r>
@@ -9017,6 +8530,7 @@
     <w:p>
       <w:pPr>
         <w:pStyle w:val="Ttulo1"/>
+        <w:spacing w:after="40"/>
       </w:pPr>
       <w:bookmarkStart w:id="33" w:name="_Toc241865094"/>
       <w:r>
@@ -9027,240 +8541,330 @@
     <w:p>
       <w:pPr>
         <w:pStyle w:val="F4Body"/>
-        <w:spacing w:after="80"/>
+        <w:spacing w:after="20" w:before="0" w:line="240" w:lineRule="auto"/>
         <w:ind w:left="567" w:hanging="567"/>
         <w:jc w:val="left"/>
       </w:pPr>
       <w:r>
-        <w:rPr/>
+        <w:rPr>
+          <w:rFonts w:ascii="Arial" w:hAnsi="Arial"/>
+          <w:sz w:val="17"/>
+        </w:rPr>
         <w:t xml:space="preserve">Chacon, S., &amp; Straub, B. (2014). </w:t>
       </w:r>
       <w:r>
         <w:rPr>
+          <w:rFonts w:ascii="Arial" w:hAnsi="Arial"/>
           <w:i/>
+          <w:sz w:val="17"/>
         </w:rPr>
         <w:t xml:space="preserve">Pro Git</w:t>
       </w:r>
       <w:r>
-        <w:rPr/>
+        <w:rPr>
+          <w:rFonts w:ascii="Arial" w:hAnsi="Arial"/>
+          <w:sz w:val="17"/>
+        </w:rPr>
         <w:t xml:space="preserve"> (2.ª ed.). Apress. https://git-scm.com/book</w:t>
       </w:r>
     </w:p>
     <w:p>
       <w:pPr>
         <w:pStyle w:val="F4Body"/>
-        <w:spacing w:after="80"/>
+        <w:spacing w:after="20" w:before="0" w:line="240" w:lineRule="auto"/>
         <w:ind w:left="567" w:hanging="567"/>
         <w:jc w:val="left"/>
       </w:pPr>
       <w:r>
-        <w:rPr/>
+        <w:rPr>
+          <w:rFonts w:ascii="Arial" w:hAnsi="Arial"/>
+          <w:sz w:val="17"/>
+        </w:rPr>
         <w:t xml:space="preserve">Coordinador Eléctrico Nacional. (2022). </w:t>
       </w:r>
       <w:r>
         <w:rPr>
+          <w:rFonts w:ascii="Arial" w:hAnsi="Arial"/>
           <w:i/>
+          <w:sz w:val="17"/>
         </w:rPr>
         <w:t xml:space="preserve">Diccionario de datos para la descarga de datos Portal Web Sistema de Información Pública (SIP), B43-DIN-04</w:t>
       </w:r>
       <w:r>
-        <w:rPr/>
+        <w:rPr>
+          <w:rFonts w:ascii="Arial" w:hAnsi="Arial"/>
+          <w:sz w:val="17"/>
+        </w:rPr>
         <w:t xml:space="preserve">.</w:t>
       </w:r>
     </w:p>
     <w:p>
       <w:pPr>
         <w:pStyle w:val="F4Body"/>
-        <w:spacing w:after="80"/>
+        <w:spacing w:after="20" w:before="0" w:line="240" w:lineRule="auto"/>
         <w:ind w:left="567" w:hanging="567"/>
         <w:jc w:val="left"/>
       </w:pPr>
       <w:r>
-        <w:rPr/>
+        <w:rPr>
+          <w:rFonts w:ascii="Arial" w:hAnsi="Arial"/>
+          <w:sz w:val="17"/>
+        </w:rPr>
         <w:t xml:space="preserve">Coordinador Eléctrico Nacional. (2026). </w:t>
       </w:r>
       <w:r>
         <w:rPr>
+          <w:rFonts w:ascii="Arial" w:hAnsi="Arial"/>
           <w:i/>
+          <w:sz w:val="17"/>
         </w:rPr>
         <w:t xml:space="preserve">Generación real</w:t>
       </w:r>
       <w:r>
-        <w:rPr/>
+        <w:rPr>
+          <w:rFonts w:ascii="Arial" w:hAnsi="Arial"/>
+          <w:sz w:val="17"/>
+        </w:rPr>
         <w:t xml:space="preserve"> [Conjunto de datos]. Portal de Operación Real del Sistema Eléctrico Nacional. https://www.coordinador.cl/operacion/graficos/operacion-real/generacion-real-/</w:t>
       </w:r>
     </w:p>
     <w:p>
       <w:pPr>
         <w:pStyle w:val="F4Body"/>
-        <w:spacing w:after="80"/>
+        <w:spacing w:after="20" w:before="0" w:line="240" w:lineRule="auto"/>
         <w:ind w:left="567" w:hanging="567"/>
         <w:jc w:val="left"/>
       </w:pPr>
       <w:r>
-        <w:rPr/>
+        <w:rPr>
+          <w:rFonts w:ascii="Arial" w:hAnsi="Arial"/>
+          <w:sz w:val="17"/>
+        </w:rPr>
         <w:t xml:space="preserve">Gamma, E., Helm, R., Johnson, R., &amp; Vlissides, J. (1994). </w:t>
       </w:r>
       <w:r>
         <w:rPr>
+          <w:rFonts w:ascii="Arial" w:hAnsi="Arial"/>
           <w:i/>
+          <w:sz w:val="17"/>
         </w:rPr>
         <w:t xml:space="preserve">Design patterns: Elements of reusable object-oriented software</w:t>
       </w:r>
       <w:r>
-        <w:rPr/>
+        <w:rPr>
+          <w:rFonts w:ascii="Arial" w:hAnsi="Arial"/>
+          <w:sz w:val="17"/>
+        </w:rPr>
         <w:t xml:space="preserve">. Addison-Wesley.</w:t>
       </w:r>
     </w:p>
     <w:p>
       <w:pPr>
         <w:pStyle w:val="F4Body"/>
-        <w:spacing w:after="80"/>
+        <w:spacing w:after="20" w:before="0" w:line="240" w:lineRule="auto"/>
         <w:ind w:left="567" w:hanging="567"/>
         <w:jc w:val="left"/>
       </w:pPr>
       <w:r>
-        <w:rPr/>
+        <w:rPr>
+          <w:rFonts w:ascii="Arial" w:hAnsi="Arial"/>
+          <w:sz w:val="17"/>
+        </w:rPr>
         <w:t xml:space="preserve">McKinney, W. (2010). Data structures for statistical computing in Python. En S. van der Walt &amp; J. Millman (Eds.), </w:t>
       </w:r>
       <w:r>
         <w:rPr>
+          <w:rFonts w:ascii="Arial" w:hAnsi="Arial"/>
           <w:i/>
+          <w:sz w:val="17"/>
         </w:rPr>
         <w:t xml:space="preserve">Proceedings of the 9th Python in Science Conference</w:t>
       </w:r>
       <w:r>
-        <w:rPr/>
+        <w:rPr>
+          <w:rFonts w:ascii="Arial" w:hAnsi="Arial"/>
+          <w:sz w:val="17"/>
+        </w:rPr>
         <w:t xml:space="preserve"> (pp. 56–61). https://doi.org/10.25080/Majora-92bf1922-00a</w:t>
       </w:r>
     </w:p>
     <w:p>
       <w:pPr>
         <w:pStyle w:val="F4Body"/>
-        <w:spacing w:after="80"/>
+        <w:spacing w:after="20" w:before="0" w:line="240" w:lineRule="auto"/>
         <w:ind w:left="567" w:hanging="567"/>
         <w:jc w:val="left"/>
       </w:pPr>
       <w:r>
-        <w:rPr/>
+        <w:rPr>
+          <w:rFonts w:ascii="Arial" w:hAnsi="Arial"/>
+          <w:sz w:val="17"/>
+        </w:rPr>
         <w:t xml:space="preserve">Python Software Foundation. (s. f.). </w:t>
       </w:r>
       <w:r>
         <w:rPr>
+          <w:rFonts w:ascii="Arial" w:hAnsi="Arial"/>
           <w:i/>
+          <w:sz w:val="17"/>
         </w:rPr>
         <w:t xml:space="preserve">timeit</w:t>
       </w:r>
       <w:r>
-        <w:rPr/>
+        <w:rPr>
+          <w:rFonts w:ascii="Arial" w:hAnsi="Arial"/>
+          <w:sz w:val="17"/>
+        </w:rPr>
         <w:t xml:space="preserve"> y </w:t>
       </w:r>
       <w:r>
         <w:rPr>
+          <w:rFonts w:ascii="Arial" w:hAnsi="Arial"/>
           <w:i/>
+          <w:sz w:val="17"/>
         </w:rPr>
         <w:t xml:space="preserve">tracemalloc</w:t>
       </w:r>
       <w:r>
-        <w:rPr/>
+        <w:rPr>
+          <w:rFonts w:ascii="Arial" w:hAnsi="Arial"/>
+          <w:sz w:val="17"/>
+        </w:rPr>
         <w:t xml:space="preserve">. En </w:t>
       </w:r>
       <w:r>
         <w:rPr>
+          <w:rFonts w:ascii="Arial" w:hAnsi="Arial"/>
           <w:i/>
+          <w:sz w:val="17"/>
         </w:rPr>
         <w:t xml:space="preserve">The Python standard library</w:t>
       </w:r>
       <w:r>
-        <w:rPr/>
+        <w:rPr>
+          <w:rFonts w:ascii="Arial" w:hAnsi="Arial"/>
+          <w:sz w:val="17"/>
+        </w:rPr>
         <w:t xml:space="preserve">. https://docs.python.org/3/library/timeit.html</w:t>
       </w:r>
     </w:p>
     <w:p>
       <w:pPr>
         <w:pStyle w:val="F4Body"/>
-        <w:spacing w:after="80"/>
+        <w:spacing w:after="20" w:before="0" w:line="240" w:lineRule="auto"/>
         <w:ind w:left="567" w:hanging="567"/>
         <w:jc w:val="left"/>
       </w:pPr>
       <w:r>
-        <w:rPr/>
+        <w:rPr>
+          <w:rFonts w:ascii="Arial" w:hAnsi="Arial"/>
+          <w:sz w:val="17"/>
+        </w:rPr>
         <w:t xml:space="preserve">Salinas Silva, O. (2026a). </w:t>
       </w:r>
       <w:r>
         <w:rPr>
+          <w:rFonts w:ascii="Arial" w:hAnsi="Arial"/>
           <w:i/>
+          <w:sz w:val="17"/>
         </w:rPr>
         <w:t xml:space="preserve">Guía de apoyo Sumativa 3 – Fase 4</w:t>
       </w:r>
       <w:r>
-        <w:rPr/>
+        <w:rPr>
+          <w:rFonts w:ascii="Arial" w:hAnsi="Arial"/>
+          <w:sz w:val="17"/>
+        </w:rPr>
         <w:t xml:space="preserve"> [Documento del curso MCDI500]. Magíster en Ciencia de Datos e Inteligencia Artificial, Universidad Andrés Bello.</w:t>
       </w:r>
     </w:p>
     <w:p>
       <w:pPr>
         <w:pStyle w:val="F4Body"/>
-        <w:spacing w:after="80"/>
+        <w:spacing w:after="20" w:before="0" w:line="240" w:lineRule="auto"/>
         <w:ind w:left="567" w:hanging="567"/>
         <w:jc w:val="left"/>
       </w:pPr>
       <w:r>
-        <w:rPr/>
+        <w:rPr>
+          <w:rFonts w:ascii="Arial" w:hAnsi="Arial"/>
+          <w:sz w:val="17"/>
+        </w:rPr>
         <w:t xml:space="preserve">Salinas Silva, O. (2026b). </w:t>
       </w:r>
       <w:r>
         <w:rPr>
+          <w:rFonts w:ascii="Arial" w:hAnsi="Arial"/>
           <w:i/>
+          <w:sz w:val="17"/>
         </w:rPr>
         <w:t xml:space="preserve">Programación para la ciencia de datos</w:t>
       </w:r>
       <w:r>
-        <w:rPr/>
+        <w:rPr>
+          <w:rFonts w:ascii="Arial" w:hAnsi="Arial"/>
+          <w:sz w:val="17"/>
+        </w:rPr>
         <w:t xml:space="preserve"> [Presentación de clase, Semana 1]. Magíster en Ciencia de Datos e Inteligencia Artificial, Universidad Andrés Bello.</w:t>
       </w:r>
     </w:p>
     <w:p>
       <w:pPr>
         <w:pStyle w:val="F4Body"/>
-        <w:spacing w:after="80"/>
+        <w:spacing w:after="20" w:before="0" w:line="240" w:lineRule="auto"/>
         <w:ind w:left="567" w:hanging="567"/>
         <w:jc w:val="left"/>
       </w:pPr>
       <w:r>
-        <w:rPr/>
+        <w:rPr>
+          <w:rFonts w:ascii="Arial" w:hAnsi="Arial"/>
+          <w:sz w:val="17"/>
+        </w:rPr>
         <w:t xml:space="preserve">The pandas development team. (s. f.). </w:t>
       </w:r>
       <w:r>
         <w:rPr>
+          <w:rFonts w:ascii="Arial" w:hAnsi="Arial"/>
           <w:i/>
+          <w:sz w:val="17"/>
         </w:rPr>
         <w:t xml:space="preserve">pandas documentation</w:t>
       </w:r>
       <w:r>
-        <w:rPr/>
+        <w:rPr>
+          <w:rFonts w:ascii="Arial" w:hAnsi="Arial"/>
+          <w:sz w:val="17"/>
+        </w:rPr>
         <w:t xml:space="preserve">. https://pandas.pydata.org/docs/</w:t>
       </w:r>
     </w:p>
     <w:p>
       <w:pPr>
         <w:pStyle w:val="F4Body"/>
-        <w:spacing w:after="80"/>
+        <w:spacing w:after="20" w:before="0" w:line="240" w:lineRule="auto"/>
         <w:ind w:left="567" w:hanging="567"/>
         <w:jc w:val="left"/>
       </w:pPr>
       <w:r>
-        <w:rPr/>
+        <w:rPr>
+          <w:rFonts w:ascii="Arial" w:hAnsi="Arial"/>
+          <w:sz w:val="17"/>
+        </w:rPr>
         <w:t xml:space="preserve">Wilson, G., Aruliah, D. A., Brown, C. T., Chue Hong, N. P., Davis, M., Guy, R. T., Haddock, S. H. D., Huff, K. D., Mitchell, I. M., Plumbley, M. D., Waugh, B., White, E. P., &amp; Wilson, P. (2014). Best practices for scientific computing. </w:t>
       </w:r>
       <w:r>
         <w:rPr>
+          <w:rFonts w:ascii="Arial" w:hAnsi="Arial"/>
           <w:i/>
+          <w:sz w:val="17"/>
         </w:rPr>
         <w:t xml:space="preserve">PLoS Biology, 12</w:t>
       </w:r>
       <w:r>
-        <w:rPr/>
+        <w:rPr>
+          <w:rFonts w:ascii="Arial" w:hAnsi="Arial"/>
+          <w:sz w:val="17"/>
+        </w:rPr>
         <w:t xml:space="preserve">(1), e1001745. https://doi.org/10.1371/journal.pbio.1001745</w:t>
       </w:r>
     </w:p>

</xml_diff>

<commit_message>
Recupera relevancia, alcance/restricciones/supuestos, POO, comparación con fases previas y citas en informe F4
</commit_message>
<xml_diff>
--- a/docs/f4_s03_evaluacion_entregable_grupo2.docx
+++ b/docs/f4_s03_evaluacion_entregable_grupo2.docx
@@ -2052,7 +2052,7 @@
                 <w:noProof/>
                 <w:webHidden/>
               </w:rPr>
-              <w:t>4</w:t>
+              <w:t>5</w:t>
             </w:r>
             <w:r>
               <w:rPr>
@@ -2940,7 +2940,7 @@
                 <w:noProof/>
                 <w:webHidden/>
               </w:rPr>
-              <w:t>6</w:t>
+              <w:t>7</w:t>
             </w:r>
             <w:r>
               <w:rPr>
@@ -3014,7 +3014,7 @@
                 <w:noProof/>
                 <w:webHidden/>
               </w:rPr>
-              <w:t>6</w:t>
+              <w:t>7</w:t>
             </w:r>
             <w:r>
               <w:rPr>
@@ -3310,7 +3310,7 @@
                 <w:noProof/>
                 <w:webHidden/>
               </w:rPr>
-              <w:t>8</w:t>
+              <w:t>9</w:t>
             </w:r>
             <w:r>
               <w:rPr>
@@ -3384,7 +3384,7 @@
                 <w:noProof/>
                 <w:webHidden/>
               </w:rPr>
-              <w:t>8</w:t>
+              <w:t>9</w:t>
             </w:r>
             <w:r>
               <w:rPr>
@@ -3458,7 +3458,7 @@
                 <w:noProof/>
                 <w:webHidden/>
               </w:rPr>
-              <w:t>8</w:t>
+              <w:t>9</w:t>
             </w:r>
             <w:r>
               <w:rPr>
@@ -3754,19 +3754,12 @@
       </w:r>
     </w:p>
     <w:p>
-      <w:r>
-        <w:t xml:space="preserve">El </w:t>
-      </w:r>
-      <w:r>
-        <w:t xml:space="preserve">objetivo general es caracterizar los patrones temporales de generación eléctrica de las tres centrales mediante un proceso reproducible de preparación, validación y análisis. El alcance se mantiene deliberadamente descriptivo: los registros iguales a 0 </w:t>
-      </w:r>
-      <w:proofErr w:type="spellStart"/>
-      <w:r>
-        <w:t>MWh</w:t>
-      </w:r>
-      <w:proofErr w:type="spellEnd"/>
-      <w:r>
-        <w:t xml:space="preserve"> se conservan y analizan como parte de los datos publicados, pero no se atribuyen a fallas, detenciones, mantenimiento u otras causas operacionales que no puedan verificarse con la información disponible.</w:t>
+      <w:pPr>
+        <w:ind w:left="0" w:firstLine="567"/>
+      </w:pPr>
+      <w:r>
+        <w:rPr/>
+        <w:t xml:space="preserve">La relevancia del análisis es práctica: quienes operan estas plantas de cogeneración o analizan la inyección de excedentes al Sistema Eléctrico Nacional pueden usar los patrones horarios, mensuales y la frecuencia de 0 MWh para dimensionar la variabilidad de la generación y priorizar qué períodos revisar con información operacional. El trabajo se enmarca en el curso de Programación para la Ciencia de Datos (Salinas Silva, 2026b) y se organiza en cuatro fases: F1 definió el problema y el entorno, F2 preparó y validó los datos, F3 construyó el núcleo algorítmico (POO, eficiencia y recursividad) y F4 integra, visualiza y comunica los resultados (Tabla de la sección 3.5).</w:t>
       </w:r>
     </w:p>
     <w:p>
@@ -3999,23 +3992,17 @@
           <w:ilvl w:val="0"/>
           <w:numId w:val="12"/>
         </w:numPr>
-        <w:rPr>
-          <w:lang w:val="es-CL"/>
-        </w:rPr>
-      </w:pPr>
-      <w:r>
-        <w:rPr>
-          <w:rFonts w:eastAsia="Arial"/>
-          <w:lang w:val="es-CL"/>
-        </w:rPr>
-        <w:t>El análisis se lim</w:t>
-      </w:r>
-      <w:r>
-        <w:rPr>
-          <w:rFonts w:eastAsia="Arial"/>
-          <w:lang w:val="es-CL"/>
-        </w:rPr>
-        <w:t>ita a las tres centrales seleccionadas y al período comprendido entre el 1 de enero y el 31 de agosto de 2026.</w:t>
+        <w:spacing w:after="60"/>
+      </w:pPr>
+      <w:r>
+        <w:rPr>
+          <w:b/>
+        </w:rPr>
+        <w:t xml:space="preserve">Alcance.</w:t>
+      </w:r>
+      <w:r>
+        <w:rPr/>
+        <w:t xml:space="preserve"> Tres centrales (Laja, Pacífico y Santa Fe), del 1 de enero al 31 de agosto de 2026, con análisis descriptivo de patrones horarios, diarios y mensuales y de los registros de 0 MWh. No incluye otras centrales, pronósticos ni causas operacionales.</w:t>
       </w:r>
     </w:p>
     <w:p>
@@ -4025,23 +4012,17 @@
           <w:ilvl w:val="0"/>
           <w:numId w:val="12"/>
         </w:numPr>
-        <w:rPr>
-          <w:lang w:val="es-CL"/>
-        </w:rPr>
-      </w:pPr>
-      <w:r>
-        <w:rPr>
-          <w:rFonts w:eastAsia="Arial"/>
-          <w:lang w:val="es-CL"/>
-        </w:rPr>
-        <w:t>No se atribuyen causa</w:t>
-      </w:r>
-      <w:r>
-        <w:rPr>
-          <w:rFonts w:eastAsia="Arial"/>
-          <w:lang w:val="es-CL"/>
-        </w:rPr>
-        <w:t>s operacionales, económicas o de mantenimiento a comportamientos que no puedan verificarse con la fuente disponible.</w:t>
+        <w:spacing w:after="60"/>
+      </w:pPr>
+      <w:r>
+        <w:rPr>
+          <w:b/>
+        </w:rPr>
+        <w:t xml:space="preserve">Restricciones.</w:t>
+      </w:r>
+      <w:r>
+        <w:rPr/>
+        <w:t xml:space="preserve"> Solo datos públicos de Generación Real del CEN en MWh, un período de ocho meses (sin estacionalidad anual) y sin información operacional (programación interna, mantenimientos).</w:t>
       </w:r>
     </w:p>
     <w:p>
@@ -4051,58 +4032,17 @@
           <w:ilvl w:val="0"/>
           <w:numId w:val="12"/>
         </w:numPr>
-        <w:rPr>
-          <w:lang w:val="es-CL"/>
-        </w:rPr>
-      </w:pPr>
-      <w:r>
-        <w:rPr>
-          <w:rFonts w:eastAsia="Arial"/>
-          <w:lang w:val="es-CL"/>
-        </w:rPr>
-        <w:t xml:space="preserve">Los registros de 0 </w:t>
-      </w:r>
-      <w:proofErr w:type="spellStart"/>
-      <w:r>
-        <w:rPr>
-          <w:rFonts w:eastAsia="Arial"/>
-          <w:lang w:val="es-CL"/>
-        </w:rPr>
-        <w:t>MWh</w:t>
-      </w:r>
-      <w:proofErr w:type="spellEnd"/>
-      <w:r>
-        <w:rPr>
-          <w:rFonts w:eastAsia="Arial"/>
-          <w:lang w:val="es-CL"/>
-        </w:rPr>
-        <w:t xml:space="preserve"> se conservan como observaciones válidas mientras no exista evidencia suficiente para clasificarlos como errores.</w:t>
-      </w:r>
-    </w:p>
-    <w:p>
-      <w:pPr>
-        <w:pStyle w:val="F4Body"/>
-        <w:numPr>
-          <w:ilvl w:val="0"/>
-          <w:numId w:val="12"/>
-        </w:numPr>
-        <w:rPr>
-          <w:lang w:val="es-CL"/>
-        </w:rPr>
-      </w:pPr>
-      <w:r>
-        <w:rPr>
-          <w:rFonts w:eastAsia="Arial"/>
-          <w:lang w:val="es-CL"/>
-        </w:rPr>
-        <w:t xml:space="preserve">Se </w:t>
-      </w:r>
-      <w:r>
-        <w:rPr>
-          <w:rFonts w:eastAsia="Arial"/>
-          <w:lang w:val="es-CL"/>
-        </w:rPr>
-        <w:t>mantiene la codificación horaria 1-24 informada por el CEN y se espera una estructura de 24 observaciones por combinación central-fecha.</w:t>
+        <w:spacing w:after="60"/>
+      </w:pPr>
+      <w:r>
+        <w:rPr>
+          <w:b/>
+        </w:rPr>
+        <w:t xml:space="preserve">Supuestos.</w:t>
+      </w:r>
+      <w:r>
+        <w:rPr/>
+        <w:t xml:space="preserve"> Los registros de 0 MWh son observaciones válidas mientras no exista evidencia de error; se mantiene la codificación horaria 1–24 del CEN con 24 observaciones por central y fecha; los datos publicados reflejan fielmente la energía inyectada.</w:t>
       </w:r>
     </w:p>
     <w:p>
@@ -4581,7 +4521,7 @@
       </w:r>
       <w:r>
         <w:rPr/>
-        <w:t xml:space="preserve"> (fecha, descripción, hash, justificación y autor) y los hashes citados en este informe (Tabla 4) pueden verificarse con </w:t>
+        <w:t xml:space="preserve"> (fecha, descripción, hash, justificación y autor) y los hashes citados en este informe (Tabla 5) pueden verificarse con </w:t>
       </w:r>
       <w:r>
         <w:rPr>
@@ -5494,17 +5434,7 @@
       </w:r>
       <w:r>
         <w:rPr/>
-        <w:t xml:space="preserve"> define la clase base </w:t>
-      </w:r>
-      <w:r>
-        <w:rPr>
-          <w:rFonts w:ascii="Courier New" w:hAnsi="Courier New" w:cs="Courier New"/>
-        </w:rPr>
-        <w:t xml:space="preserve">Transformador</w:t>
-      </w:r>
-      <w:r>
-        <w:rPr/>
-        <w:t xml:space="preserve"> (interfaz </w:t>
+        <w:t xml:space="preserve"> aplica tres principios sobre el esquema de clase base con </w:t>
       </w:r>
       <w:r>
         <w:rPr>
@@ -5524,7 +5454,17 @@
       </w:r>
       <w:r>
         <w:rPr/>
-        <w:t xml:space="preserve">) y cuatro transformadores concretos —</w:t>
+        <w:t xml:space="preserve"> de la guía del curso (Salinas Silva, 2026a). </w:t>
+      </w:r>
+      <w:r>
+        <w:rPr>
+          <w:b/>
+        </w:rPr>
+        <w:t xml:space="preserve">Herencia:</w:t>
+      </w:r>
+      <w:r>
+        <w:rPr/>
+        <w:t xml:space="preserve"> </w:t>
       </w:r>
       <w:r>
         <w:rPr>
@@ -5564,18 +5504,143 @@
       </w:r>
       <w:r>
         <w:rPr/>
-        <w:t xml:space="preserve">— que la clase </w:t>
+        <w:t xml:space="preserve"> heredan de </w:t>
       </w:r>
       <w:r>
         <w:rPr>
           <w:rFonts w:ascii="Courier New" w:hAnsi="Courier New" w:cs="Courier New"/>
         </w:rPr>
+        <w:t xml:space="preserve">Transformador</w:t>
+      </w:r>
+      <w:r>
+        <w:rPr/>
+        <w:t xml:space="preserve">, que fija el orden (</w:t>
+      </w:r>
+      <w:r>
+        <w:rPr>
+          <w:rFonts w:ascii="Courier New" w:hAnsi="Courier New" w:cs="Courier New"/>
+        </w:rPr>
+        <w:t xml:space="preserve">ajustar</w:t>
+      </w:r>
+      <w:r>
+        <w:rPr/>
+        <w:t xml:space="preserve"> antes de </w:t>
+      </w:r>
+      <w:r>
+        <w:rPr>
+          <w:rFonts w:ascii="Courier New" w:hAnsi="Courier New" w:cs="Courier New"/>
+        </w:rPr>
+        <w:t xml:space="preserve">transformar</w:t>
+      </w:r>
+      <w:r>
+        <w:rPr/>
+        <w:t xml:space="preserve">) y deja a cada hija solo </w:t>
+      </w:r>
+      <w:r>
+        <w:rPr>
+          <w:rFonts w:ascii="Courier New" w:hAnsi="Courier New" w:cs="Courier New"/>
+        </w:rPr>
+        <w:t xml:space="preserve">aprender()</w:t>
+      </w:r>
+      <w:r>
+        <w:rPr/>
+        <w:t xml:space="preserve"> y </w:t>
+      </w:r>
+      <w:r>
+        <w:rPr>
+          <w:rFonts w:ascii="Courier New" w:hAnsi="Courier New" w:cs="Courier New"/>
+        </w:rPr>
+        <w:t xml:space="preserve">aplicar()</w:t>
+      </w:r>
+      <w:r>
+        <w:rPr/>
+        <w:t xml:space="preserve">. </w:t>
+      </w:r>
+      <w:r>
+        <w:rPr>
+          <w:b/>
+        </w:rPr>
+        <w:t xml:space="preserve">Polimorfismo:</w:t>
+      </w:r>
+      <w:r>
+        <w:rPr/>
+        <w:t xml:space="preserve"> </w:t>
+      </w:r>
+      <w:r>
+        <w:rPr>
+          <w:rFonts w:ascii="Courier New" w:hAnsi="Courier New" w:cs="Courier New"/>
+        </w:rPr>
         <w:t xml:space="preserve">Pipeline</w:t>
       </w:r>
       <w:r>
         <w:rPr/>
-        <w:t xml:space="preserve"> ejecuta en orden. </w:t>
-      </w:r>
+        <w:t xml:space="preserve"> recorre sus pasos con la misma llamada, </w:t>
+      </w:r>
+      <w:r>
+        <w:rPr>
+          <w:rFonts w:ascii="Courier New" w:hAnsi="Courier New" w:cs="Courier New"/>
+        </w:rPr>
+        <w:t xml:space="preserve">paso.ajustar(df).transformar(df)</w:t>
+      </w:r>
+      <w:r>
+        <w:rPr/>
+        <w:t xml:space="preserve">, sin preguntar de qué clase es cada uno. </w:t>
+      </w:r>
+      <w:r>
+        <w:rPr>
+          <w:b/>
+        </w:rPr>
+        <w:t xml:space="preserve">Encapsulamiento:</w:t>
+      </w:r>
+      <w:r>
+        <w:rPr/>
+        <w:t xml:space="preserve"> cada objeto guarda su estado en atributos internos (</w:t>
+      </w:r>
+      <w:r>
+        <w:rPr>
+          <w:rFonts w:ascii="Courier New" w:hAnsi="Courier New" w:cs="Courier New"/>
+        </w:rPr>
+        <w:t xml:space="preserve">_parametros</w:t>
+      </w:r>
+      <w:r>
+        <w:rPr/>
+        <w:t xml:space="preserve">, </w:t>
+      </w:r>
+      <w:r>
+        <w:rPr>
+          <w:rFonts w:ascii="Courier New" w:hAnsi="Courier New" w:cs="Courier New"/>
+        </w:rPr>
+        <w:t xml:space="preserve">_ajustado</w:t>
+      </w:r>
+      <w:r>
+        <w:rPr/>
+        <w:t xml:space="preserve">) y </w:t>
+      </w:r>
+      <w:r>
+        <w:rPr>
+          <w:rFonts w:ascii="Courier New" w:hAnsi="Courier New" w:cs="Courier New"/>
+        </w:rPr>
+        <w:t xml:space="preserve">transformar</w:t>
+      </w:r>
+      <w:r>
+        <w:rPr/>
+        <w:t xml:space="preserve"> lanza </w:t>
+      </w:r>
+      <w:r>
+        <w:rPr>
+          <w:rFonts w:ascii="Courier New" w:hAnsi="Courier New" w:cs="Courier New"/>
+        </w:rPr>
+        <w:t xml:space="preserve">RuntimeError</w:t>
+      </w:r>
+      <w:r>
+        <w:rPr/>
+        <w:t xml:space="preserve"> si no se ajustó antes.</w:t>
+      </w:r>
+    </w:p>
+    <w:p>
+      <w:pPr>
+        <w:ind w:left="0" w:firstLine="567"/>
+      </w:pPr>
       <w:r>
         <w:rPr>
           <w:rFonts w:ascii="Courier New" w:hAnsi="Courier New" w:cs="Courier New"/>
@@ -5594,7 +5659,17 @@
       </w:r>
       <w:r>
         <w:rPr/>
-        <w:t xml:space="preserve"> (Gamma et al., 1994): </w:t>
+        <w:t xml:space="preserve"> (Gamma et al., 1994). Sin él, calcular perfiles por hora, día, mes y día de la semana habría requerido funciones casi idénticas, y cada criterio nuevo obligaba a modificar código ya probado. El patrón encapsula cada criterio en una clase con la misma interfaz </w:t>
+      </w:r>
+      <w:r>
+        <w:rPr>
+          <w:rFonts w:ascii="Courier New" w:hAnsi="Courier New" w:cs="Courier New"/>
+        </w:rPr>
+        <w:t xml:space="preserve">agregar()</w:t>
+      </w:r>
+      <w:r>
+        <w:rPr/>
+        <w:t xml:space="preserve"> (</w:t>
       </w:r>
       <w:r>
         <w:rPr>
@@ -5634,27 +5709,17 @@
       </w:r>
       <w:r>
         <w:rPr/>
-        <w:t xml:space="preserve"> comparten la interfaz </w:t>
+        <w:t xml:space="preserve">; 72, 729, 24 y 21 resultados) y </w:t>
       </w:r>
       <w:r>
         <w:rPr>
           <w:rFonts w:ascii="Courier New" w:hAnsi="Courier New" w:cs="Courier New"/>
         </w:rPr>
-        <w:t xml:space="preserve">agregar()</w:t>
+        <w:t xml:space="preserve">CaracterizadorTemporal</w:t>
       </w:r>
       <w:r>
         <w:rPr/>
-        <w:t xml:space="preserve"> y </w:t>
-      </w:r>
-      <w:r>
-        <w:rPr>
-          <w:rFonts w:ascii="Courier New" w:hAnsi="Courier New" w:cs="Courier New"/>
-        </w:rPr>
-        <w:t xml:space="preserve">CaracterizadorTemporal</w:t>
-      </w:r>
-      <w:r>
-        <w:rPr/>
-        <w:t xml:space="preserve"> las usa de forma intercambiable (72, 729, 24 y 21 resultados, respectivamente). Así, una agregación nueva se añade sin modificar el código existente.</w:t>
+        <w:t xml:space="preserve"> las usa de forma intercambiable sin conocerlas.</w:t>
       </w:r>
     </w:p>
     <w:p>
@@ -6416,7 +6481,7 @@
       </w:pPr>
       <w:r>
         <w:rPr/>
-        <w:t xml:space="preserve">Las figuras se construyen sobre el dataset procesado, sin transformaciones adicionales que alteren los datos. Las agregaciones (media horaria, suma diaria, media mensual, media por día de la semana y porcentaje de horas con 0 MWh) se calculan con las estrategias de </w:t>
+        <w:t xml:space="preserve">Las figuras se construyen sobre el dataset procesado, sin transformaciones adicionales que alteren los datos. Las agregaciones (media horaria, suma diaria, media mensual, media por día de la semana y porcentaje de horas con 0 MWh) se calculan con pandas (McKinney, 2010) y las estrategias de </w:t>
       </w:r>
       <w:r>
         <w:rPr>
@@ -6426,7 +6491,7 @@
       </w:r>
       <w:r>
         <w:rPr/>
-        <w:t xml:space="preserve"> y se verificó que conservan el total de MWh. Se usan medias para comparar centrales de escala distinta, los ejes parten en cero y los registros de 0 MWh se muestran, no se excluyen.</w:t>
+        <w:t xml:space="preserve"> y se verificó que conservan el total de MWh. Se usan medias para comparar centrales de escala distinta, los ejes parten en cero y los registros de 0 MWh se muestran, no se excluyen. No se aplicó codificación ni escalamiento, por lo que el dataset conserva las categorías (central, mes, día) y la unidad original (MWh) y sirve directamente para graficar, sin necesidad de una copia aparte.</w:t>
       </w:r>
     </w:p>
     <w:p>
@@ -6459,7 +6524,7 @@
       <w:r>
         <w:drawing>
           <wp:inline xmlns:a="http://schemas.openxmlformats.org/drawingml/2006/main" xmlns:pic="http://schemas.openxmlformats.org/drawingml/2006/picture">
-            <wp:extent cx="5669280" cy="2186722"/>
+            <wp:extent cx="4818888" cy="1858714"/>
             <wp:docPr id="12" name="Picture 12"/>
             <wp:cNvGraphicFramePr>
               <a:graphicFrameLocks noChangeAspect="1"/>
@@ -6480,7 +6545,7 @@
                   <pic:spPr>
                     <a:xfrm>
                       <a:off x="0" y="0"/>
-                      <a:ext cx="5669280" cy="2186722"/>
+                      <a:ext cx="4818888" cy="1858714"/>
                     </a:xfrm>
                     <a:prstGeom prst="rect"/>
                   </pic:spPr>
@@ -6529,7 +6594,7 @@
       <w:r>
         <w:drawing>
           <wp:inline xmlns:a="http://schemas.openxmlformats.org/drawingml/2006/main" xmlns:pic="http://schemas.openxmlformats.org/drawingml/2006/picture">
-            <wp:extent cx="5669280" cy="2186722"/>
+            <wp:extent cx="4818888" cy="1858714"/>
             <wp:docPr id="12" name="Picture 12"/>
             <wp:cNvGraphicFramePr>
               <a:graphicFrameLocks noChangeAspect="1"/>
@@ -6550,7 +6615,7 @@
                   <pic:spPr>
                     <a:xfrm>
                       <a:off x="0" y="0"/>
-                      <a:ext cx="5669280" cy="2186722"/>
+                      <a:ext cx="4818888" cy="1858714"/>
                     </a:xfrm>
                     <a:prstGeom prst="rect"/>
                   </pic:spPr>
@@ -6599,7 +6664,7 @@
       <w:r>
         <w:drawing>
           <wp:inline xmlns:a="http://schemas.openxmlformats.org/drawingml/2006/main" xmlns:pic="http://schemas.openxmlformats.org/drawingml/2006/picture">
-            <wp:extent cx="5669280" cy="1700784"/>
+            <wp:extent cx="4818888" cy="1445666"/>
             <wp:docPr id="12" name="Picture 12"/>
             <wp:cNvGraphicFramePr>
               <a:graphicFrameLocks noChangeAspect="1"/>
@@ -6620,7 +6685,7 @@
                   <pic:spPr>
                     <a:xfrm>
                       <a:off x="0" y="0"/>
-                      <a:ext cx="5669280" cy="1700784"/>
+                      <a:ext cx="4818888" cy="1445666"/>
                     </a:xfrm>
                     <a:prstGeom prst="rect"/>
                   </pic:spPr>
@@ -6701,26 +6766,6 @@
     </w:p>
     <w:p>
       <w:pPr>
-        <w:pStyle w:val="Ttulo2"/>
-        <w:ind w:left="720"/>
-      </w:pPr>
-      <w:bookmarkStart w:id="28" w:name="_Toc241865089"/>
-      <w:r>
-        <w:t>b. Resultados</w:t>
-      </w:r>
-      <w:bookmarkEnd w:id="28"/>
-    </w:p>
-    <w:p>
-      <w:pPr>
-        <w:ind w:left="0" w:firstLine="567"/>
-      </w:pPr>
-      <w:r>
-        <w:rPr/>
-        <w:t xml:space="preserve">La Tabla 3 resume los resultados. TER CMPC Pacífico aporta el 65 % de la generación total del conjunto (94.446 de 144.518 MWh) y mantiene un perfil horario casi plano (14,6–17,9 MWh por hora; Figura 1). Su media mensual se ubica entre 14 y 19 MWh hasta junio y baja a cerca de 12 MWh en julio y agosto (Figura 2). TER CMPC Laja disminuye de 7,6 MWh en enero a 0,4 MWh en agosto y concentra el 72 % de las horas con 0 MWh del conjunto (3.193 de 4.438), con cerca de 90 % de sus horas en cero en julio y agosto (Figura 3) y una secuencia continua máxima de 375 horas (≈15,6 días). TER CMPC Santa Fe presenta su mayor media en abril (7,9 MWh), un perfil horario plano (4,8–5,5 MWh) y un 59 % de horas en cero en agosto. Las diferencias por día de la semana son menores y sin patrón claro (por ejemplo, Laja: 2,5 MWh los domingos y 4,0 los miércoles).</w:t>
-      </w:r>
-    </w:p>
-    <w:p>
-      <w:pPr>
         <w:keepNext/>
         <w:spacing w:before="80" w:after="60"/>
         <w:ind w:left="0" w:firstLine="0"/>
@@ -6732,7 +6777,559 @@
           <w:sz w:val="19"/>
           <w:szCs w:val="19"/>
         </w:rPr>
-        <w:t xml:space="preserve">Tabla 3. Resumen de generación y registros con 0 MWh por central (enero–agosto de 2026)</w:t>
+        <w:t xml:space="preserve">Tabla 3. Comparación con las fases previas</w:t>
+      </w:r>
+    </w:p>
+    <w:tbl>
+      <w:tblPr>
+        <w:tblStyle w:val="Tabladecuadrcula4-nfasis1"/>
+        <w:tblW w:w="10380" w:type="dxa"/>
+        <w:tblLayout w:type="fixed"/>
+        <w:tblLook w:val="04A0" w:firstRow="1" w:lastRow="0" w:firstColumn="1" w:lastColumn="0" w:noHBand="0" w:noVBand="1"/>
+      </w:tblPr>
+      <w:tblGrid>
+        <w:gridCol w:w="1500"/>
+        <w:gridCol w:w="2900"/>
+        <w:gridCol w:w="3300"/>
+        <w:gridCol w:w="2680"/>
+      </w:tblGrid>
+      <w:tr>
+        <w:trPr>
+          <w:cantSplit/>
+          <w:tblHeader/>
+        </w:trPr>
+        <w:tc>
+          <w:tcPr>
+            <w:tcW w:w="1500" w:type="dxa"/>
+            <w:vAlign w:val="center"/>
+          </w:tcPr>
+          <w:p>
+            <w:pPr>
+              <w:spacing w:before="20" w:after="20" w:line="240" w:lineRule="auto"/>
+              <w:ind w:left="0" w:firstLine="0"/>
+              <w:jc w:val="left"/>
+            </w:pPr>
+            <w:r>
+              <w:rPr>
+                <w:sz w:val="17"/>
+                <w:szCs w:val="17"/>
+              </w:rPr>
+              <w:t xml:space="preserve">Aspecto</w:t>
+            </w:r>
+          </w:p>
+        </w:tc>
+        <w:tc>
+          <w:tcPr>
+            <w:tcW w:w="2900" w:type="dxa"/>
+            <w:vAlign w:val="center"/>
+          </w:tcPr>
+          <w:p>
+            <w:pPr>
+              <w:spacing w:before="20" w:after="20" w:line="240" w:lineRule="auto"/>
+              <w:ind w:left="0" w:firstLine="0"/>
+              <w:jc w:val="left"/>
+            </w:pPr>
+            <w:r>
+              <w:rPr>
+                <w:sz w:val="17"/>
+                <w:szCs w:val="17"/>
+              </w:rPr>
+              <w:t xml:space="preserve">Fase previa</w:t>
+            </w:r>
+          </w:p>
+        </w:tc>
+        <w:tc>
+          <w:tcPr>
+            <w:tcW w:w="3300" w:type="dxa"/>
+            <w:vAlign w:val="center"/>
+          </w:tcPr>
+          <w:p>
+            <w:pPr>
+              <w:spacing w:before="20" w:after="20" w:line="240" w:lineRule="auto"/>
+              <w:ind w:left="0" w:firstLine="0"/>
+              <w:jc w:val="left"/>
+            </w:pPr>
+            <w:r>
+              <w:rPr>
+                <w:sz w:val="17"/>
+                <w:szCs w:val="17"/>
+              </w:rPr>
+              <w:t xml:space="preserve">Estado actual</w:t>
+            </w:r>
+          </w:p>
+        </w:tc>
+        <w:tc>
+          <w:tcPr>
+            <w:tcW w:w="2680" w:type="dxa"/>
+            <w:vAlign w:val="center"/>
+          </w:tcPr>
+          <w:p>
+            <w:pPr>
+              <w:spacing w:before="20" w:after="20" w:line="240" w:lineRule="auto"/>
+              <w:ind w:left="0" w:firstLine="0"/>
+              <w:jc w:val="left"/>
+            </w:pPr>
+            <w:r>
+              <w:rPr>
+                <w:sz w:val="17"/>
+                <w:szCs w:val="17"/>
+              </w:rPr>
+              <w:t xml:space="preserve">Motivo del cambio</w:t>
+            </w:r>
+          </w:p>
+        </w:tc>
+      </w:tr>
+      <w:tr>
+        <w:trPr>
+          <w:cantSplit/>
+        </w:trPr>
+        <w:tc>
+          <w:tcPr>
+            <w:tcW w:w="1500" w:type="dxa"/>
+            <w:vAlign w:val="center"/>
+          </w:tcPr>
+          <w:p>
+            <w:pPr>
+              <w:spacing w:before="20" w:after="20" w:line="240" w:lineRule="auto"/>
+              <w:ind w:left="0" w:firstLine="0"/>
+              <w:jc w:val="left"/>
+            </w:pPr>
+            <w:r>
+              <w:rPr>
+                <w:sz w:val="17"/>
+                <w:szCs w:val="17"/>
+              </w:rPr>
+              <w:t xml:space="preserve">Preparación</w:t>
+            </w:r>
+          </w:p>
+        </w:tc>
+        <w:tc>
+          <w:tcPr>
+            <w:tcW w:w="2900" w:type="dxa"/>
+            <w:vAlign w:val="center"/>
+          </w:tcPr>
+          <w:p>
+            <w:pPr>
+              <w:spacing w:before="20" w:after="20" w:line="240" w:lineRule="auto"/>
+              <w:ind w:left="0" w:firstLine="0"/>
+              <w:jc w:val="left"/>
+            </w:pPr>
+            <w:r>
+              <w:rPr>
+                <w:sz w:val="17"/>
+                <w:szCs w:val="17"/>
+              </w:rPr>
+              <w:t xml:space="preserve">Funciones sueltas en el notebook de F2</w:t>
+            </w:r>
+          </w:p>
+        </w:tc>
+        <w:tc>
+          <w:tcPr>
+            <w:tcW w:w="3300" w:type="dxa"/>
+            <w:vAlign w:val="center"/>
+          </w:tcPr>
+          <w:p>
+            <w:pPr>
+              <w:spacing w:before="20" w:after="20" w:line="240" w:lineRule="auto"/>
+              <w:ind w:left="0" w:firstLine="0"/>
+              <w:jc w:val="left"/>
+            </w:pPr>
+            <w:r>
+              <w:rPr>
+                <w:sz w:val="17"/>
+                <w:szCs w:val="17"/>
+              </w:rPr>
+              <w:t xml:space="preserve">Clases y </w:t>
+            </w:r>
+            <w:r>
+              <w:rPr>
+                <w:rFonts w:ascii="Courier New" w:hAnsi="Courier New" w:cs="Courier New"/>
+                <w:sz w:val="17"/>
+                <w:szCs w:val="17"/>
+              </w:rPr>
+              <w:t xml:space="preserve">Pipeline</w:t>
+            </w:r>
+            <w:r>
+              <w:rPr>
+                <w:sz w:val="17"/>
+                <w:szCs w:val="17"/>
+              </w:rPr>
+              <w:t xml:space="preserve"> en </w:t>
+            </w:r>
+            <w:r>
+              <w:rPr>
+                <w:rFonts w:ascii="Courier New" w:hAnsi="Courier New" w:cs="Courier New"/>
+                <w:sz w:val="17"/>
+                <w:szCs w:val="17"/>
+              </w:rPr>
+              <w:t xml:space="preserve">src/</w:t>
+            </w:r>
+            <w:r>
+              <w:rPr>
+                <w:sz w:val="17"/>
+                <w:szCs w:val="17"/>
+              </w:rPr>
+              <w:t xml:space="preserve">, con equivalencia verificada</w:t>
+            </w:r>
+          </w:p>
+        </w:tc>
+        <w:tc>
+          <w:tcPr>
+            <w:tcW w:w="2680" w:type="dxa"/>
+            <w:vAlign w:val="center"/>
+          </w:tcPr>
+          <w:p>
+            <w:pPr>
+              <w:spacing w:before="20" w:after="20" w:line="240" w:lineRule="auto"/>
+              <w:ind w:left="0" w:firstLine="0"/>
+              <w:jc w:val="left"/>
+            </w:pPr>
+            <w:r>
+              <w:rPr>
+                <w:sz w:val="17"/>
+                <w:szCs w:val="17"/>
+              </w:rPr>
+              <w:t xml:space="preserve">Modularidad y reutilización</w:t>
+            </w:r>
+          </w:p>
+        </w:tc>
+      </w:tr>
+      <w:tr>
+        <w:trPr>
+          <w:cantSplit/>
+        </w:trPr>
+        <w:tc>
+          <w:tcPr>
+            <w:tcW w:w="1500" w:type="dxa"/>
+            <w:vAlign w:val="center"/>
+          </w:tcPr>
+          <w:p>
+            <w:pPr>
+              <w:spacing w:before="20" w:after="20" w:line="240" w:lineRule="auto"/>
+              <w:ind w:left="0" w:firstLine="0"/>
+              <w:jc w:val="left"/>
+            </w:pPr>
+            <w:r>
+              <w:rPr>
+                <w:sz w:val="17"/>
+                <w:szCs w:val="17"/>
+              </w:rPr>
+              <w:t xml:space="preserve">Validación</w:t>
+            </w:r>
+          </w:p>
+        </w:tc>
+        <w:tc>
+          <w:tcPr>
+            <w:tcW w:w="2900" w:type="dxa"/>
+            <w:vAlign w:val="center"/>
+          </w:tcPr>
+          <w:p>
+            <w:pPr>
+              <w:spacing w:before="20" w:after="20" w:line="240" w:lineRule="auto"/>
+              <w:ind w:left="0" w:firstLine="0"/>
+              <w:jc w:val="left"/>
+            </w:pPr>
+            <w:r>
+              <w:rPr>
+                <w:sz w:val="17"/>
+                <w:szCs w:val="17"/>
+              </w:rPr>
+              <w:t xml:space="preserve">Una función con valores rígidos</w:t>
+            </w:r>
+          </w:p>
+        </w:tc>
+        <w:tc>
+          <w:tcPr>
+            <w:tcW w:w="3300" w:type="dxa"/>
+            <w:vAlign w:val="center"/>
+          </w:tcPr>
+          <w:p>
+            <w:pPr>
+              <w:spacing w:before="20" w:after="20" w:line="240" w:lineRule="auto"/>
+              <w:ind w:left="0" w:firstLine="0"/>
+              <w:jc w:val="left"/>
+            </w:pPr>
+            <w:r>
+              <w:rPr>
+                <w:sz w:val="17"/>
+                <w:szCs w:val="17"/>
+              </w:rPr>
+              <w:t xml:space="preserve">Reglas atómicas y parametrizables</w:t>
+            </w:r>
+          </w:p>
+        </w:tc>
+        <w:tc>
+          <w:tcPr>
+            <w:tcW w:w="2680" w:type="dxa"/>
+            <w:vAlign w:val="center"/>
+          </w:tcPr>
+          <w:p>
+            <w:pPr>
+              <w:spacing w:before="20" w:after="20" w:line="240" w:lineRule="auto"/>
+              <w:ind w:left="0" w:firstLine="0"/>
+              <w:jc w:val="left"/>
+            </w:pPr>
+            <w:r>
+              <w:rPr>
+                <w:sz w:val="17"/>
+                <w:szCs w:val="17"/>
+              </w:rPr>
+              <w:t xml:space="preserve">Probar cada regla por separado</w:t>
+            </w:r>
+          </w:p>
+        </w:tc>
+      </w:tr>
+      <w:tr>
+        <w:trPr>
+          <w:cantSplit/>
+        </w:trPr>
+        <w:tc>
+          <w:tcPr>
+            <w:tcW w:w="1500" w:type="dxa"/>
+            <w:vAlign w:val="center"/>
+          </w:tcPr>
+          <w:p>
+            <w:pPr>
+              <w:spacing w:before="20" w:after="20" w:line="240" w:lineRule="auto"/>
+              <w:ind w:left="0" w:firstLine="0"/>
+              <w:jc w:val="left"/>
+            </w:pPr>
+            <w:r>
+              <w:rPr>
+                <w:sz w:val="17"/>
+                <w:szCs w:val="17"/>
+              </w:rPr>
+              <w:t xml:space="preserve">Eficiencia</w:t>
+            </w:r>
+          </w:p>
+        </w:tc>
+        <w:tc>
+          <w:tcPr>
+            <w:tcW w:w="2900" w:type="dxa"/>
+            <w:vAlign w:val="center"/>
+          </w:tcPr>
+          <w:p>
+            <w:pPr>
+              <w:spacing w:before="20" w:after="20" w:line="240" w:lineRule="auto"/>
+              <w:ind w:left="0" w:firstLine="0"/>
+              <w:jc w:val="left"/>
+            </w:pPr>
+            <w:r>
+              <w:rPr>
+                <w:sz w:val="17"/>
+                <w:szCs w:val="17"/>
+              </w:rPr>
+              <w:t xml:space="preserve">Sin mediciones</w:t>
+            </w:r>
+          </w:p>
+        </w:tc>
+        <w:tc>
+          <w:tcPr>
+            <w:tcW w:w="3300" w:type="dxa"/>
+            <w:vAlign w:val="center"/>
+          </w:tcPr>
+          <w:p>
+            <w:pPr>
+              <w:spacing w:before="20" w:after="20" w:line="240" w:lineRule="auto"/>
+              <w:ind w:left="0" w:firstLine="0"/>
+              <w:jc w:val="left"/>
+            </w:pPr>
+            <w:r>
+              <w:rPr>
+                <w:rFonts w:ascii="Courier New" w:hAnsi="Courier New" w:cs="Courier New"/>
+                <w:sz w:val="17"/>
+                <w:szCs w:val="17"/>
+              </w:rPr>
+              <w:t xml:space="preserve">timeit</w:t>
+            </w:r>
+            <w:r>
+              <w:rPr>
+                <w:sz w:val="17"/>
+                <w:szCs w:val="17"/>
+              </w:rPr>
+              <w:t xml:space="preserve"> y </w:t>
+            </w:r>
+            <w:r>
+              <w:rPr>
+                <w:rFonts w:ascii="Courier New" w:hAnsi="Courier New" w:cs="Courier New"/>
+                <w:sz w:val="17"/>
+                <w:szCs w:val="17"/>
+              </w:rPr>
+              <w:t xml:space="preserve">tracemalloc</w:t>
+            </w:r>
+            <w:r>
+              <w:rPr>
+                <w:sz w:val="17"/>
+                <w:szCs w:val="17"/>
+              </w:rPr>
+              <w:t xml:space="preserve"> en F3</w:t>
+            </w:r>
+          </w:p>
+        </w:tc>
+        <w:tc>
+          <w:tcPr>
+            <w:tcW w:w="2680" w:type="dxa"/>
+            <w:vAlign w:val="center"/>
+          </w:tcPr>
+          <w:p>
+            <w:pPr>
+              <w:spacing w:before="20" w:after="20" w:line="240" w:lineRule="auto"/>
+              <w:ind w:left="0" w:firstLine="0"/>
+              <w:jc w:val="left"/>
+            </w:pPr>
+            <w:r>
+              <w:rPr>
+                <w:sz w:val="17"/>
+                <w:szCs w:val="17"/>
+              </w:rPr>
+              <w:t xml:space="preserve">Justificar la implementación elegida</w:t>
+            </w:r>
+          </w:p>
+        </w:tc>
+      </w:tr>
+      <w:tr>
+        <w:trPr>
+          <w:cantSplit/>
+        </w:trPr>
+        <w:tc>
+          <w:tcPr>
+            <w:tcW w:w="1500" w:type="dxa"/>
+            <w:vAlign w:val="center"/>
+          </w:tcPr>
+          <w:p>
+            <w:pPr>
+              <w:spacing w:before="20" w:after="20" w:line="240" w:lineRule="auto"/>
+              <w:ind w:left="0" w:firstLine="0"/>
+              <w:jc w:val="left"/>
+            </w:pPr>
+            <w:r>
+              <w:rPr>
+                <w:sz w:val="17"/>
+                <w:szCs w:val="17"/>
+              </w:rPr>
+              <w:t xml:space="preserve">Verificación</w:t>
+            </w:r>
+          </w:p>
+        </w:tc>
+        <w:tc>
+          <w:tcPr>
+            <w:tcW w:w="2900" w:type="dxa"/>
+            <w:vAlign w:val="center"/>
+          </w:tcPr>
+          <w:p>
+            <w:pPr>
+              <w:spacing w:before="20" w:after="20" w:line="240" w:lineRule="auto"/>
+              <w:ind w:left="0" w:firstLine="0"/>
+              <w:jc w:val="left"/>
+            </w:pPr>
+            <w:r>
+              <w:rPr>
+                <w:sz w:val="17"/>
+                <w:szCs w:val="17"/>
+              </w:rPr>
+              <w:t xml:space="preserve">Equivalencia columna a columna (F3)</w:t>
+            </w:r>
+          </w:p>
+        </w:tc>
+        <w:tc>
+          <w:tcPr>
+            <w:tcW w:w="3300" w:type="dxa"/>
+            <w:vAlign w:val="center"/>
+          </w:tcPr>
+          <w:p>
+            <w:pPr>
+              <w:spacing w:before="20" w:after="20" w:line="240" w:lineRule="auto"/>
+              <w:ind w:left="0" w:firstLine="0"/>
+              <w:jc w:val="left"/>
+            </w:pPr>
+            <w:r>
+              <w:rPr>
+                <w:rFonts w:ascii="Courier New" w:hAnsi="Courier New" w:cs="Courier New"/>
+                <w:sz w:val="17"/>
+                <w:szCs w:val="17"/>
+              </w:rPr>
+              <w:t xml:space="preserve">assert_frame_equal</w:t>
+            </w:r>
+            <w:r>
+              <w:rPr>
+                <w:sz w:val="17"/>
+                <w:szCs w:val="17"/>
+              </w:rPr>
+              <w:t xml:space="preserve"> y pruebas normal/límite/excepción (F4)</w:t>
+            </w:r>
+          </w:p>
+        </w:tc>
+        <w:tc>
+          <w:tcPr>
+            <w:tcW w:w="2680" w:type="dxa"/>
+            <w:vAlign w:val="center"/>
+          </w:tcPr>
+          <w:p>
+            <w:pPr>
+              <w:spacing w:before="20" w:after="20" w:line="240" w:lineRule="auto"/>
+              <w:ind w:left="0" w:firstLine="0"/>
+              <w:jc w:val="left"/>
+            </w:pPr>
+            <w:r>
+              <w:rPr>
+                <w:sz w:val="17"/>
+                <w:szCs w:val="17"/>
+              </w:rPr>
+              <w:t xml:space="preserve">Evidencia objetiva de que las mejoras no rompen nada</w:t>
+            </w:r>
+          </w:p>
+        </w:tc>
+      </w:tr>
+    </w:tbl>
+    <w:p>
+      <w:pPr>
+        <w:spacing w:before="0" w:after="120"/>
+        <w:ind w:left="0" w:firstLine="0"/>
+        <w:jc w:val="left"/>
+      </w:pPr>
+      <w:r>
+        <w:rPr>
+          <w:i/>
+          <w:sz w:val="17"/>
+          <w:szCs w:val="17"/>
+        </w:rPr>
+        <w:t xml:space="preserve">Fuente: elaboración propia a partir de los notebooks F2–F4 y de las observaciones recibidas.</w:t>
+      </w:r>
+    </w:p>
+    <w:p>
+      <w:pPr>
+        <w:pStyle w:val="Ttulo2"/>
+        <w:ind w:left="720"/>
+      </w:pPr>
+      <w:bookmarkStart w:id="28" w:name="_Toc241865089"/>
+      <w:r>
+        <w:t>b. Resultados</w:t>
+      </w:r>
+      <w:bookmarkEnd w:id="28"/>
+    </w:p>
+    <w:p>
+      <w:pPr>
+        <w:ind w:left="0" w:firstLine="567"/>
+      </w:pPr>
+      <w:r>
+        <w:rPr/>
+        <w:t xml:space="preserve">La Tabla 4 resume los resultados. TER CMPC Pacífico aporta el 65 % de la generación total del conjunto (94.446 de 144.518 MWh) y mantiene un perfil horario casi plano (14,6–17,9 MWh por hora; Figura 1). Su media mensual se ubica entre 14 y 19 MWh hasta junio y baja a cerca de 12 MWh en julio y agosto (Figura 2). TER CMPC Laja disminuye de 7,6 MWh en enero a 0,4 MWh en agosto y concentra el 72 % de las horas con 0 MWh del conjunto (3.193 de 4.438), con cerca de 90 % de sus horas en cero en julio y agosto (Figura 3) y una secuencia continua máxima de 375 horas (≈15,6 días). TER CMPC Santa Fe presenta su mayor media en abril (7,9 MWh), un perfil horario plano (4,8–5,5 MWh) y un 59 % de horas en cero en agosto. Las diferencias por día de la semana son menores y sin patrón claro (por ejemplo, Laja: 2,5 MWh los domingos y 4,0 los miércoles).</w:t>
+      </w:r>
+    </w:p>
+    <w:p>
+      <w:pPr>
+        <w:keepNext/>
+        <w:spacing w:before="80" w:after="60"/>
+        <w:ind w:left="0" w:firstLine="0"/>
+        <w:jc w:val="left"/>
+      </w:pPr>
+      <w:r>
+        <w:rPr>
+          <w:b/>
+          <w:sz w:val="19"/>
+          <w:szCs w:val="19"/>
+        </w:rPr>
+        <w:t xml:space="preserve">Tabla 4. Resumen de generación y registros con 0 MWh por central (enero–agosto de 2026)</w:t>
       </w:r>
     </w:p>
     <w:tbl>
@@ -7404,82 +8001,7 @@
     </w:p>
     <w:p>
       <w:pPr>
-        <w:ind w:left="720"/>
-      </w:pPr>
-      <w:r>
-        <w:lastRenderedPageBreak/>
-        <w:t xml:space="preserve">En la primera evaluación se identificaron, entre otros aspectos, una </w:t>
-      </w:r>
-      <w:proofErr w:type="spellStart"/>
-      <w:r>
-        <w:t>modularización</w:t>
-      </w:r>
-      <w:proofErr w:type="spellEnd"/>
-      <w:r>
-        <w:t xml:space="preserve"> incompleta del pipeline, validaciones concentradas en una única función, inconsistencias en las identidades registradas por Git y falta de evidencia suficiente de ejecución reproducible de</w:t>
-      </w:r>
-      <w:r>
-        <w:t>l</w:t>
-      </w:r>
-      <w:r>
-        <w:t xml:space="preserve"> notebook. También se solicitó documentar con mayor claridad el impacto de las transformaciones y profundizar el análisis temporal de los registros de generación igual a 0 </w:t>
-      </w:r>
-      <w:proofErr w:type="spellStart"/>
-      <w:r>
-        <w:t>MWh</w:t>
-      </w:r>
-      <w:proofErr w:type="spellEnd"/>
-      <w:r>
-        <w:t xml:space="preserve">. </w:t>
-      </w:r>
-    </w:p>
-    <w:p>
-      <w:pPr>
-        <w:ind w:left="720"/>
-      </w:pPr>
-      <w:r>
-        <w:t xml:space="preserve">Estas observaciones fueron abordadas durante la Fase 3. El propio </w:t>
-      </w:r>
-      <w:proofErr w:type="spellStart"/>
-      <w:r>
-        <w:t>feedback</w:t>
-      </w:r>
-      <w:proofErr w:type="spellEnd"/>
-      <w:r>
-        <w:t xml:space="preserve"> posterior confirmó que la </w:t>
-      </w:r>
-      <w:proofErr w:type="spellStart"/>
-      <w:r>
-        <w:t>modularización</w:t>
-      </w:r>
-      <w:proofErr w:type="spellEnd"/>
-      <w:r>
-        <w:t xml:space="preserve"> fue ampliada, las reglas de validación se parametrizaron y separaron, las identidades de Git se consolidaron </w:t>
-      </w:r>
-      <w:proofErr w:type="gramStart"/>
-      <w:r>
-        <w:t>mediante .</w:t>
-      </w:r>
-      <w:proofErr w:type="spellStart"/>
-      <w:r>
-        <w:t>mailmap</w:t>
-      </w:r>
-      <w:proofErr w:type="spellEnd"/>
-      <w:proofErr w:type="gramEnd"/>
-      <w:r>
-        <w:t xml:space="preserve"> y los notebooks comenzaron a ejecutarse desde </w:t>
-      </w:r>
-      <w:proofErr w:type="spellStart"/>
-      <w:r>
-        <w:t>kernel</w:t>
-      </w:r>
-      <w:proofErr w:type="spellEnd"/>
-      <w:r>
-        <w:t xml:space="preserve"> limpio.</w:t>
-      </w:r>
-    </w:p>
-    <w:p>
-      <w:pPr>
+        <w:keepNext/>
         <w:ind w:left="720" w:hanging="11"/>
         <w:rPr>
           <w:b/>
@@ -7498,7 +8020,7 @@
           <w:b/>
           <w:bCs/>
         </w:rPr>
-        <w:t xml:space="preserve"> 4</w:t>
+        <w:t xml:space="preserve"> 5</w:t>
       </w:r>
       <w:r>
         <w:rPr>
@@ -7507,13 +8029,6 @@
         </w:rPr>
         <w:t>. Trazabilidad de observaciones y acciones de mejora</w:t>
       </w:r>
-    </w:p>
-    <w:p>
-      <w:pPr>
-        <w:spacing w:after="0" w:line="240" w:lineRule="auto"/>
-        <w:ind w:firstLine="0"/>
-        <w:jc w:val="center"/>
-      </w:pPr>
     </w:p>
     <w:tbl>
       <w:tblPr>
@@ -8470,36 +8985,6 @@
         </w:tc>
       </w:tr>
     </w:tbl>
-    <w:p>
-      <w:pPr>
-        <w:ind w:left="720"/>
-      </w:pPr>
-    </w:p>
-    <w:p>
-      <w:pPr>
-        <w:ind w:left="720"/>
-      </w:pPr>
-      <w:r>
-        <w:t xml:space="preserve">Los </w:t>
-      </w:r>
-      <w:proofErr w:type="spellStart"/>
-      <w:r>
-        <w:t>commits</w:t>
-      </w:r>
-      <w:proofErr w:type="spellEnd"/>
-      <w:r>
-        <w:t xml:space="preserve"> asociados a estas mejoras son verificables en el historial del repositorio. Por ejemplo, la refactorización de validaciones se registró en a4e655d, la mejora del pipeline POO y del filtrado temporal en 2a7372f, y la consolidación de la trazabilidad F1–F4 en 8f9f73e.</w:t>
-      </w:r>
-    </w:p>
-    <w:p>
-      <w:pPr>
-        <w:ind w:left="720"/>
-      </w:pPr>
-      <w:r>
-        <w:t>En conjunto, estas acciones permitieron que el proyecto evolucionara desde una primera arquitectura funcional pero todavía incompleta hacia una solución más modular, reproducible y trazable. La mejora afectó directamente la estructura del código, la capacidad de prueba de las funciones, la confiabilidad de la ejecución y la calidad de la documentación técnica. La retroalimentación de la Fase 3 confirma este avance y señala que los principales problemas identificados previamente fueron corregidos antes de la entrega final.</w:t>
-      </w:r>
-    </w:p>
-    <w:p/>
     <w:p>
       <w:pPr>
         <w:pStyle w:val="Ttulo1"/>

</xml_diff>

<commit_message>
Informe F4: agrega vínculo con el foro técnico, herramientas científicas y metodología; corrige versión de Python y portada
</commit_message>
<xml_diff>
--- a/docs/f4_s03_evaluacion_entregable_grupo2.docx
+++ b/docs/f4_s03_evaluacion_entregable_grupo2.docx
@@ -1036,7 +1036,7 @@
       </w:r>
       <w:proofErr w:type="gramStart"/>
       <w:r>
-        <w:t>Vilches ,</w:t>
+        <w:t>Vilches,</w:t>
       </w:r>
       <w:proofErr w:type="gramEnd"/>
       <w:r>
@@ -2052,7 +2052,7 @@
                 <w:noProof/>
                 <w:webHidden/>
               </w:rPr>
-              <w:t>5</w:t>
+              <w:t>4</w:t>
             </w:r>
             <w:r>
               <w:rPr>
@@ -3310,7 +3310,7 @@
                 <w:noProof/>
                 <w:webHidden/>
               </w:rPr>
-              <w:t>9</w:t>
+              <w:t>8</w:t>
             </w:r>
             <w:r>
               <w:rPr>
@@ -3735,22 +3735,12 @@
       </w:r>
     </w:p>
     <w:p>
-      <w:r>
-        <w:t>La necesidad técnica del proyecto surge de la estructura y volumen de los registros.</w:t>
-      </w:r>
-      <w:r>
-        <w:t xml:space="preserve"> La fuente original contiene 359.891 filas y 33 columnas, mientras que el subconjunto definido para el estudio corresponde a 729 registros en formato ancho. Para facilitar el análisis temporal, los datos fueron transformados a formato largo, obteniéndose u</w:t>
-      </w:r>
-      <w:r>
-        <w:t xml:space="preserve">n </w:t>
-      </w:r>
-      <w:proofErr w:type="spellStart"/>
-      <w:r>
-        <w:t>dataset</w:t>
-      </w:r>
-      <w:proofErr w:type="spellEnd"/>
-      <w:r>
-        <w:t xml:space="preserve"> analítico de 17.496 observaciones y 13 variables, donde cada fila representa una combinación de central, fecha y hora. Este proceso exige programación para automatizar la preparación, validación y análisis de los datos de manera reproducible.</w:t>
+      <w:pPr>
+        <w:ind w:left="0" w:firstLine="567"/>
+      </w:pPr>
+      <w:r>
+        <w:rPr/>
+        <w:t xml:space="preserve">La necesidad técnica surge del volumen de los registros: la fuente original tiene 359.891 filas y 33 columnas, y llevarla a 17.496 observaciones analíticas (una por central, fecha y hora) exige programación para automatizar la preparación, la validación y el análisis de forma reproducible.</w:t>
       </w:r>
     </w:p>
     <w:p>
@@ -3833,7 +3823,7 @@
           <w:sz w:val="22"/>
           <w:szCs w:val="22"/>
         </w:rPr>
-        <w:t xml:space="preserve"> S.A. Estas plantas generan energía principalmente para autoabastecer sus propios procesos de celulosa según su programación interna, y comercializan los excedentes inyectándolos al Sistema Eléctrico Nacional. Trabajar con estas centrales permite observar de manera controlada el comportamiento de los datos de generación real de excedentes e identificar posibles patrones temporales o variaciones de interés.</w:t>
+        <w:t xml:space="preserve"> S.A. Estas plantas generan energía principalmente para autoabastecer sus propios procesos de celulosa según su programación interna, y comercializan los excedentes inyectándolos al Sistema Eléctrico Nacional.</w:t>
       </w:r>
     </w:p>
     <w:p>
@@ -4376,6 +4366,15 @@
     </w:p>
     <w:p>
       <w:pPr>
+        <w:ind w:left="0" w:firstLine="567"/>
+      </w:pPr>
+      <w:r>
+        <w:rPr/>
+        <w:t xml:space="preserve">Se usa el ecosistema científico de Python: pandas para cargar, transformar y agregar los datos, NumPy para el cálculo numérico, Matplotlib para construir y exportar las figuras, y Jupyter para integrar código, resultados y explicación en un notebook por fase.</w:t>
+      </w:r>
+    </w:p>
+    <w:p>
+      <w:pPr>
         <w:pStyle w:val="Ttulo2"/>
         <w:ind w:left="720"/>
       </w:pPr>
@@ -4391,7 +4390,7 @@
       </w:pPr>
       <w:r>
         <w:rPr/>
-        <w:t xml:space="preserve">El proyecto se ejecuta en un entorno virtual dedicado con Python 3.14.7 y pandas 3.0.5 sobre Windows 11. Cada notebook (F1–F4) abre con una celda que imprime las versiones y verifica </w:t>
+        <w:t xml:space="preserve">El proyecto se ejecuta en un entorno virtual dedicado con Python 3.13.15 y pandas 3.0.5 sobre Windows 11. Cada notebook (F1–F4) abre con una celda que imprime las versiones y verifica </w:t>
       </w:r>
       <w:r>
         <w:rPr>
@@ -4845,7 +4844,7 @@
       </w:r>
       <w:r>
         <w:rPr/>
-        <w:t xml:space="preserve"> ante generación negativa (excepción). En F3, el algoritmo de secuencias se prueba con cinco casos controlados (normal, sin ceros, todos ceros, vacío y tipo inválido). Además, el </w:t>
+        <w:t xml:space="preserve"> ante generación negativa (excepción). Además, el </w:t>
       </w:r>
       <w:r>
         <w:rPr>
@@ -6511,7 +6510,7 @@
       </w:pPr>
       <w:r>
         <w:rPr/>
-        <w:t xml:space="preserve">El notebook F4 contiene cinco figuras (horaria, diaria, mensual, por día de la semana y ceros); aquí se muestran las tres que sustentan los resultados. Cada título enuncia el hallazgo, los colores son consistentes por central y cada figura declara su fuente.</w:t>
+        <w:t xml:space="preserve">De las cinco figuras del notebook F4, aquí se muestran las tres que sustentan los resultados. Cada título enuncia el hallazgo, los colores son consistentes por central y cada figura declara su fuente.</w:t>
       </w:r>
     </w:p>
     <w:p>
@@ -6524,7 +6523,7 @@
       <w:r>
         <w:drawing>
           <wp:inline xmlns:a="http://schemas.openxmlformats.org/drawingml/2006/main" xmlns:pic="http://schemas.openxmlformats.org/drawingml/2006/picture">
-            <wp:extent cx="4818888" cy="1858714"/>
+            <wp:extent cx="3855110" cy="1486971"/>
             <wp:docPr id="12" name="Picture 12"/>
             <wp:cNvGraphicFramePr>
               <a:graphicFrameLocks noChangeAspect="1"/>
@@ -6545,7 +6544,7 @@
                   <pic:spPr>
                     <a:xfrm>
                       <a:off x="0" y="0"/>
-                      <a:ext cx="4818888" cy="1858714"/>
+                      <a:ext cx="3855110" cy="1486971"/>
                     </a:xfrm>
                     <a:prstGeom prst="rect"/>
                   </pic:spPr>
@@ -6594,7 +6593,7 @@
       <w:r>
         <w:drawing>
           <wp:inline xmlns:a="http://schemas.openxmlformats.org/drawingml/2006/main" xmlns:pic="http://schemas.openxmlformats.org/drawingml/2006/picture">
-            <wp:extent cx="4818888" cy="1858714"/>
+            <wp:extent cx="3855110" cy="1486971"/>
             <wp:docPr id="12" name="Picture 12"/>
             <wp:cNvGraphicFramePr>
               <a:graphicFrameLocks noChangeAspect="1"/>
@@ -6615,7 +6614,7 @@
                   <pic:spPr>
                     <a:xfrm>
                       <a:off x="0" y="0"/>
-                      <a:ext cx="4818888" cy="1858714"/>
+                      <a:ext cx="3855110" cy="1486971"/>
                     </a:xfrm>
                     <a:prstGeom prst="rect"/>
                   </pic:spPr>
@@ -6664,7 +6663,7 @@
       <w:r>
         <w:drawing>
           <wp:inline xmlns:a="http://schemas.openxmlformats.org/drawingml/2006/main" xmlns:pic="http://schemas.openxmlformats.org/drawingml/2006/picture">
-            <wp:extent cx="4818888" cy="1445666"/>
+            <wp:extent cx="3855110" cy="1156533"/>
             <wp:docPr id="12" name="Picture 12"/>
             <wp:cNvGraphicFramePr>
               <a:graphicFrameLocks noChangeAspect="1"/>
@@ -6685,7 +6684,7 @@
                   <pic:spPr>
                     <a:xfrm>
                       <a:off x="0" y="0"/>
-                      <a:ext cx="4818888" cy="1445666"/>
+                      <a:ext cx="3855110" cy="1156533"/>
                     </a:xfrm>
                     <a:prstGeom prst="rect"/>
                   </pic:spPr>
@@ -6736,6 +6735,45 @@
     </w:p>
     <w:p>
       <w:pPr>
+        <w:ind w:left="0" w:firstLine="567"/>
+      </w:pPr>
+      <w:r>
+        <w:rPr/>
+        <w:t xml:space="preserve">Las fases se encadenan: F1 definió la pregunta y el entorno, F2 produjo el dataset validado, F3 llevó la preparación a clases y midió la eficiencia, y F4 interpretó y comunicó los resultados. El flujo es </w:t>
+      </w:r>
+      <w:r>
+        <w:rPr>
+          <w:rFonts w:ascii="Courier New" w:hAnsi="Courier New" w:cs="Courier New"/>
+        </w:rPr>
+        <w:t xml:space="preserve">Pipeline.ajustar().transformar()</w:t>
+      </w:r>
+      <w:r>
+        <w:rPr/>
+        <w:t xml:space="preserve"> → </w:t>
+      </w:r>
+      <w:r>
+        <w:rPr>
+          <w:rFonts w:ascii="Courier New" w:hAnsi="Courier New" w:cs="Courier New"/>
+        </w:rPr>
+        <w:t xml:space="preserve">validar_dataset_procesado()</w:t>
+      </w:r>
+      <w:r>
+        <w:rPr/>
+        <w:t xml:space="preserve"> → </w:t>
+      </w:r>
+      <w:r>
+        <w:rPr>
+          <w:rFonts w:ascii="Courier New" w:hAnsi="Courier New" w:cs="Courier New"/>
+        </w:rPr>
+        <w:t xml:space="preserve">CaracterizadorTemporal.caracterizar()</w:t>
+      </w:r>
+      <w:r>
+        <w:rPr/>
+        <w:t xml:space="preserve">. Cada decisión produjo un resultado: melt, 5,3 veces más rápido que iterrows, reprocesa todo el período; las reglas atómicas se prueban por separado; y conservar los 0 MWh hizo posible la Figura 3.</w:t>
+      </w:r>
+    </w:p>
+    <w:p>
+      <w:pPr>
         <w:pStyle w:val="Ttulo2"/>
         <w:ind w:left="720"/>
       </w:pPr>
@@ -6751,7 +6789,7 @@
       </w:pPr>
       <w:r>
         <w:rPr/>
-        <w:t xml:space="preserve">La validación técnica combinó la equivalencia entre F2 y F3, la conservación de totales en las agregaciones y las pruebas de casos normales, límite y excepción. Entre las limitaciones, el período cubre ocho meses (no permite evaluar estacionalidad anual), los valores corresponden a generación inyectada al sistema según el CEN y no a la producción total de cada planta, y los datos no incluyen información operacional que explique los registros de 0 MWh. Como aprendizaje, mover la lógica desde los notebooks a </w:t>
+        <w:t xml:space="preserve">La validación técnica (sección V.c) confirmó la equivalencia entre F2 y F3 y la conservación de totales en las agregaciones. Entre las limitaciones, el período cubre ocho meses (no permite evaluar estacionalidad anual), los valores corresponden a generación inyectada al sistema según el CEN y no a la producción total de cada planta, y los datos no incluyen información operacional que explique los registros de 0 MWh. Como aprendizaje, mover la lógica desde los notebooks a </w:t>
       </w:r>
       <w:r>
         <w:rPr>
@@ -6762,6 +6800,55 @@
       <w:r>
         <w:rPr/>
         <w:t xml:space="preserve"> y probar reglas atómicas redujo la duplicación y facilitó detectar errores.</w:t>
+      </w:r>
+    </w:p>
+    <w:p>
+      <w:pPr>
+        <w:ind w:left="0" w:firstLine="567"/>
+      </w:pPr>
+      <w:r>
+        <w:rPr/>
+        <w:t xml:space="preserve">Esta separación responde al foro técnico del curso, donde se discutió la modularización: se refactorizó </w:t>
+      </w:r>
+      <w:r>
+        <w:rPr>
+          <w:rFonts w:ascii="Courier New" w:hAnsi="Courier New" w:cs="Courier New"/>
+        </w:rPr>
+        <w:t xml:space="preserve">validacion.py</w:t>
+      </w:r>
+      <w:r>
+        <w:rPr/>
+        <w:t xml:space="preserve"> en reglas parametrizables (commit a4e655d), y por eso la prueba de excepción de F4 usa solo </w:t>
+      </w:r>
+      <w:r>
+        <w:rPr>
+          <w:rFonts w:ascii="Courier New" w:hAnsi="Courier New" w:cs="Courier New"/>
+        </w:rPr>
+        <w:t xml:space="preserve">validar_no_negativos()</w:t>
+      </w:r>
+      <w:r>
+        <w:rPr/>
+        <w:t xml:space="preserve">. En escalabilidad, sumar meses o centrales solo cambia los parámetros de </w:t>
+      </w:r>
+      <w:r>
+        <w:rPr>
+          <w:rFonts w:ascii="Courier New" w:hAnsi="Courier New" w:cs="Courier New"/>
+        </w:rPr>
+        <w:t xml:space="preserve">FiltradorPeriodo</w:t>
+      </w:r>
+      <w:r>
+        <w:rPr/>
+        <w:t xml:space="preserve"> y </w:t>
+      </w:r>
+      <w:r>
+        <w:rPr>
+          <w:rFonts w:ascii="Courier New" w:hAnsi="Courier New" w:cs="Courier New"/>
+        </w:rPr>
+        <w:t xml:space="preserve">FiltradorCentrales</w:t>
+      </w:r>
+      <w:r>
+        <w:rPr/>
+        <w:t xml:space="preserve">. La colaboración se organizó con ramas por tarea y pull requests a main.</w:t>
       </w:r>
     </w:p>
     <w:p>
@@ -7313,7 +7400,7 @@
       </w:pPr>
       <w:r>
         <w:rPr/>
-        <w:t xml:space="preserve">La Tabla 4 resume los resultados. TER CMPC Pacífico aporta el 65 % de la generación total del conjunto (94.446 de 144.518 MWh) y mantiene un perfil horario casi plano (14,6–17,9 MWh por hora; Figura 1). Su media mensual se ubica entre 14 y 19 MWh hasta junio y baja a cerca de 12 MWh en julio y agosto (Figura 2). TER CMPC Laja disminuye de 7,6 MWh en enero a 0,4 MWh en agosto y concentra el 72 % de las horas con 0 MWh del conjunto (3.193 de 4.438), con cerca de 90 % de sus horas en cero en julio y agosto (Figura 3) y una secuencia continua máxima de 375 horas (≈15,6 días). TER CMPC Santa Fe presenta su mayor media en abril (7,9 MWh), un perfil horario plano (4,8–5,5 MWh) y un 59 % de horas en cero en agosto. Las diferencias por día de la semana son menores y sin patrón claro (por ejemplo, Laja: 2,5 MWh los domingos y 4,0 los miércoles).</w:t>
+        <w:t xml:space="preserve">La Tabla 4 resume los resultados. TER CMPC Pacífico aporta el 65 % de la generación total del conjunto (94.446 de 144.518 MWh) y tiene el menor porcentaje de horas en cero (6,4 %). TER CMPC Laja disminuye de 7,6 MWh por hora en enero a 0,4 MWh en agosto (Figura 2) y concentra el 72 % de las horas con 0 MWh del conjunto (3.193 de 4.438), con una secuencia continua máxima de 375 horas (≈15,6 días). TER CMPC Santa Fe alcanza su mayor media en abril (7,9 MWh) y llega a 59 % de horas en cero en agosto (Figura 3). Ninguna central muestra un ciclo horario marcado (Figura 1).</w:t>
       </w:r>
     </w:p>
     <w:p>
@@ -7963,7 +8050,7 @@
       </w:pPr>
       <w:r>
         <w:rPr/>
-        <w:t xml:space="preserve">Los registros de 0 MWh (25,4 % del total) se concentran en Laja y se agrupan en secuencias largas, lo que sugiere interrupciones continuas y no ruido aislado.</w:t>
+        <w:t xml:space="preserve">Los registros de 0 MWh (25,4 % del total) se concentran en Laja y se agrupan en secuencias largas, es decir, en tramos continuos de horas sin inyección y no en registros aislados.</w:t>
       </w:r>
     </w:p>
     <w:p>
@@ -7993,10 +8080,31 @@
     </w:p>
     <w:p>
       <w:pPr>
-        <w:ind w:left="720"/>
-      </w:pPr>
-      <w:r>
-        <w:t>El proyecto se desarrolló de manera iterativa, incorporando observaciones recibidas durante las evaluaciones anteriores y registrando los cambios mediante Git/GitHub. La trazabilidad de estas mejoras permite relacionar la retroalimentación recibida con acciones concretas sobre el código, los notebooks y la documentación.</w:t>
+        <w:ind w:left="0" w:firstLine="567"/>
+      </w:pPr>
+      <w:r>
+        <w:rPr/>
+        <w:t xml:space="preserve">Cada observación recibida en las evaluaciones anteriores se tradujo en una acción concreta con su commit (Tabla 5). En síntesis, las mejoras dieron modularidad (siete módulos en </w:t>
+      </w:r>
+      <w:r>
+        <w:rPr>
+          <w:rFonts w:ascii="Courier New" w:hAnsi="Courier New" w:cs="Courier New"/>
+        </w:rPr>
+        <w:t xml:space="preserve">src/</w:t>
+      </w:r>
+      <w:r>
+        <w:rPr/>
+        <w:t xml:space="preserve">), respaldo medido al rendimiento y documentación verificable en </w:t>
+      </w:r>
+      <w:r>
+        <w:rPr>
+          <w:rFonts w:ascii="Courier New" w:hAnsi="Courier New" w:cs="Courier New"/>
+        </w:rPr>
+        <w:t xml:space="preserve">changelog.md</w:t>
+      </w:r>
+      <w:r>
+        <w:rPr/>
+        <w:t xml:space="preserve">.</w:t>
       </w:r>
     </w:p>
     <w:p>

</xml_diff>

<commit_message>
Informe F4: alinea la referencia al foro de la Fase 4 con el notebook
</commit_message>
<xml_diff>
--- a/docs/f4_s03_evaluacion_entregable_grupo2.docx
+++ b/docs/f4_s03_evaluacion_entregable_grupo2.docx
@@ -6808,7 +6808,7 @@
       </w:pPr>
       <w:r>
         <w:rPr/>
-        <w:t xml:space="preserve">Esta separación responde al foro técnico del curso, donde se discutió la modularización: se refactorizó </w:t>
+        <w:t xml:space="preserve">En el foro reflexivo de la Fase 4 se revisaron estas decisiones, entre ellas la refactorización de </w:t>
       </w:r>
       <w:r>
         <w:rPr>
@@ -6818,7 +6818,7 @@
       </w:r>
       <w:r>
         <w:rPr/>
-        <w:t xml:space="preserve"> en reglas parametrizables (commit a4e655d), y por eso la prueba de excepción de F4 usa solo </w:t>
+        <w:t xml:space="preserve"> en reglas parametrizables (commit a4e655d), originada en la retroalimentación docente, que permite probar una regla aislada como </w:t>
       </w:r>
       <w:r>
         <w:rPr>

</xml_diff>

<commit_message>
Informe F4: incorpora correcciones de Verónica sobre foro y 0 MWh, conserva hipótesis y limitación del profesor
</commit_message>
<xml_diff>
--- a/docs/f4_s03_evaluacion_entregable_grupo2.docx
+++ b/docs/f4_s03_evaluacion_entregable_grupo2.docx
@@ -3749,7 +3749,7 @@
       </w:pPr>
       <w:r>
         <w:rPr/>
-        <w:t xml:space="preserve">La relevancia del análisis es práctica: quienes operan estas plantas de cogeneración o analizan la inyección de excedentes al Sistema Eléctrico Nacional pueden usar los patrones horarios, mensuales y la frecuencia de 0 MWh para dimensionar la variabilidad de la generación y priorizar qué períodos revisar con información operacional. El trabajo se enmarca en el curso de Programación para la Ciencia de Datos (Salinas Silva, 2026b) y se organiza en cuatro fases: F1 definió el problema y el entorno, F2 preparó y validó los datos, F3 construyó el núcleo algorítmico (POO, eficiencia y recursividad) y F4 integra, visualiza y comunica los resultados (Tabla de la sección 3.5).</w:t>
+        <w:t>La relevancia del análisis es práctica: quienes operan estas plantas de cogeneración o analizan su comportamiento de generación eléctrica pueden usar los patrones horarios, mensuales y la frecuencia de 0 MWh para dimensionar la variabilidad de la generación y priorizar qué períodos revisar con información operacional. El trabajo se enmarca en el curso de Programación para la Ciencia de Datos (Salinas Silva, 2026b) y se organiza en cuatro fases: F1 definió el problema y el entorno, F2 preparó y validó los datos, F3 construyó el núcleo algorítmico (POO, eficiencia y recursividad) y F4 integra, visualiza y comunica los resultados (Tabla de la sección 3.5).</w:t>
       </w:r>
     </w:p>
     <w:p>
@@ -4028,11 +4028,10 @@
         <w:rPr>
           <w:b/>
         </w:rPr>
-        <w:t xml:space="preserve">Supuestos.</w:t>
+        <w:t>Supuestos. Los registros de 0 MWh son observaciones válidas mientras no exista evidencia de error; se mantiene la codificación horaria 1–24 del CEN con 24 observaciones por central y fecha; los datos publicados se consideran registros válidos de Generación Real del CEN.</w:t>
       </w:r>
       <w:r>
         <w:rPr/>
-        <w:t xml:space="preserve"> Los registros de 0 MWh son observaciones válidas mientras no exista evidencia de error; se mantiene la codificación horaria 1–24 del CEN con 24 observaciones por central y fecha; los datos publicados reflejan fielmente la energía inyectada.</w:t>
       </w:r>
     </w:p>
     <w:p>
@@ -6523,7 +6522,7 @@
       <w:r>
         <w:drawing>
           <wp:inline xmlns:a="http://schemas.openxmlformats.org/drawingml/2006/main" xmlns:pic="http://schemas.openxmlformats.org/drawingml/2006/picture">
-            <wp:extent cx="3855110" cy="1486971"/>
+            <wp:extent cx="3662354" cy="1412622"/>
             <wp:docPr id="12" name="Picture 12"/>
             <wp:cNvGraphicFramePr>
               <a:graphicFrameLocks noChangeAspect="1"/>
@@ -6544,7 +6543,7 @@
                   <pic:spPr>
                     <a:xfrm>
                       <a:off x="0" y="0"/>
-                      <a:ext cx="3855110" cy="1486971"/>
+                      <a:ext cx="3662354" cy="1412622"/>
                     </a:xfrm>
                     <a:prstGeom prst="rect"/>
                   </pic:spPr>
@@ -6580,7 +6579,7 @@
           <w:rFonts w:ascii="Arial" w:hAnsi="Arial"/>
           <w:sz w:val="17"/>
         </w:rPr>
-        <w:t>La figura muestra que las tres centrales mantienen perfiles horarios relativamente planos, con Pacífico en un nivel medio claramente superior a Laja y Santa Fe. Se infiere que, dentro del período analizado, la hora del día explica menos variación que las diferencias entre centrales. Esta lectura se limita a la generación inyectada informada por el CEN entre enero y agosto de 2026 y no permite atribuir causas operacionales. Como contexto del relato, este resultado orienta el análisis hacia una escala temporal mayor: la comparación mensual de la Figura 2.</w:t>
+        <w:t>La figura muestra que las tres centrales mantienen perfiles horarios relativamente planos, con Pacífico en un nivel medio claramente superior a Laja y Santa Fe. Se infiere que, dentro del período analizado, la hora del día explica menos variación que las diferencias entre centrales. Esta lectura se limita a la Generación Real informada por el CEN entre enero y agosto de 2026 y no permite atribuir causas operacionales. Como contexto del relato, este resultado orienta el análisis hacia una escala temporal mayor: la comparación mensual de la Figura 2.</w:t>
       </w:r>
     </w:p>
     <w:p>
@@ -6593,7 +6592,7 @@
       <w:r>
         <w:drawing>
           <wp:inline xmlns:a="http://schemas.openxmlformats.org/drawingml/2006/main" xmlns:pic="http://schemas.openxmlformats.org/drawingml/2006/picture">
-            <wp:extent cx="3855110" cy="1486971"/>
+            <wp:extent cx="3662354" cy="1412622"/>
             <wp:docPr id="12" name="Picture 12"/>
             <wp:cNvGraphicFramePr>
               <a:graphicFrameLocks noChangeAspect="1"/>
@@ -6614,7 +6613,7 @@
                   <pic:spPr>
                     <a:xfrm>
                       <a:off x="0" y="0"/>
-                      <a:ext cx="3855110" cy="1486971"/>
+                      <a:ext cx="3662354" cy="1412622"/>
                     </a:xfrm>
                     <a:prstGeom prst="rect"/>
                   </pic:spPr>
@@ -6663,7 +6662,7 @@
       <w:r>
         <w:drawing>
           <wp:inline xmlns:a="http://schemas.openxmlformats.org/drawingml/2006/main" xmlns:pic="http://schemas.openxmlformats.org/drawingml/2006/picture">
-            <wp:extent cx="3855110" cy="1156533"/>
+            <wp:extent cx="3662354" cy="1098706"/>
             <wp:docPr id="12" name="Picture 12"/>
             <wp:cNvGraphicFramePr>
               <a:graphicFrameLocks noChangeAspect="1"/>
@@ -6684,7 +6683,7 @@
                   <pic:spPr>
                     <a:xfrm>
                       <a:off x="0" y="0"/>
-                      <a:ext cx="3855110" cy="1156533"/>
+                      <a:ext cx="3662354" cy="1098706"/>
                     </a:xfrm>
                     <a:prstGeom prst="rect"/>
                   </pic:spPr>
@@ -6789,7 +6788,7 @@
       </w:pPr>
       <w:r>
         <w:rPr/>
-        <w:t xml:space="preserve">La validación técnica (sección V.c) confirmó la equivalencia entre F2 y F3 y la conservación de totales en las agregaciones. Entre las limitaciones, el período cubre ocho meses (no permite evaluar estacionalidad anual), los valores corresponden a generación inyectada al sistema según el CEN y no a la producción total de cada planta, y los datos no incluyen información operacional que explique los registros de 0 MWh. Como aprendizaje, mover la lógica desde los notebooks a </w:t>
+        <w:t xml:space="preserve">La validación técnica (sección V.c) confirmó la equivalencia entre F2 y F3 y la conservación de totales en las agregaciones. Entre las limitaciones, el período cubre ocho meses (no permite evaluar estacionalidad anual), los valores son registros de Generación Real del CEN, es decir, generación inyectada y no producción total de cada planta, y los datos no incluyen información operacional que explique los registros de 0 MWh. Como aprendizaje, llevar la lógica a </w:t>
       </w:r>
       <w:r>
         <w:rPr>
@@ -6799,7 +6798,7 @@
       </w:r>
       <w:r>
         <w:rPr/>
-        <w:t xml:space="preserve"> y probar reglas atómicas redujo la duplicación y facilitó detectar errores.</w:t>
+        <w:t xml:space="preserve"> con reglas atómicas redujo la duplicación y facilitó detectar errores.</w:t>
       </w:r>
     </w:p>
     <w:p>
@@ -6808,7 +6807,7 @@
       </w:pPr>
       <w:r>
         <w:rPr/>
-        <w:t xml:space="preserve">En el foro reflexivo de la Fase 4 se revisaron estas decisiones, entre ellas la refactorización de </w:t>
+        <w:t xml:space="preserve">La reflexión metodológica de la Fase 4 revisó críticamente decisiones técnicas previas, como la refactorización de </w:t>
       </w:r>
       <w:r>
         <w:rPr>
@@ -6818,7 +6817,7 @@
       </w:r>
       <w:r>
         <w:rPr/>
-        <w:t xml:space="preserve"> en reglas parametrizables (commit a4e655d), originada en la retroalimentación docente, que permite probar una regla aislada como </w:t>
+        <w:t xml:space="preserve"> en reglas atómicas y parametrizables (commit a4e655d), que fortalece la modularidad y permite que la prueba de excepción de F4 use solo </w:t>
       </w:r>
       <w:r>
         <w:rPr>
@@ -6828,7 +6827,7 @@
       </w:r>
       <w:r>
         <w:rPr/>
-        <w:t xml:space="preserve">. En escalabilidad, sumar meses o centrales solo cambia los parámetros de </w:t>
+        <w:t xml:space="preserve">. La reflexión no originó esta mejora: sirvió para evaluar su aporte a la reproducibilidad, la verificabilidad y la trazabilidad. En escalabilidad, sumar meses o centrales solo cambia los parámetros de </w:t>
       </w:r>
       <w:r>
         <w:rPr>
@@ -7400,7 +7399,7 @@
       </w:pPr>
       <w:r>
         <w:rPr/>
-        <w:t xml:space="preserve">La Tabla 4 resume los resultados. TER CMPC Pacífico aporta el 65 % de la generación total del conjunto (94.446 de 144.518 MWh) y tiene el menor porcentaje de horas en cero (6,4 %). TER CMPC Laja disminuye de 7,6 MWh por hora en enero a 0,4 MWh en agosto (Figura 2) y concentra el 72 % de las horas con 0 MWh del conjunto (3.193 de 4.438), con una secuencia continua máxima de 375 horas (≈15,6 días). TER CMPC Santa Fe alcanza su mayor media en abril (7,9 MWh) y llega a 59 % de horas en cero en agosto (Figura 3). Ninguna central muestra un ciclo horario marcado (Figura 1).</w:t>
+        <w:t xml:space="preserve">La Tabla 4 resume los resultados. TER CMPC Pacífico aporta el 65 % de la generación total del conjunto (94.446 de 144.518 MWh) y tiene el menor porcentaje de horas en cero (6,4 %). TER CMPC Laja disminuye de 7,6 MWh por hora en enero a 0,4 MWh en agosto (Figura 2) y concentra el 72 % de las horas con 0 MWh del conjunto (3.193 de 4.438), con una secuencia continua máxima de 375 horas (≈15,6 días). TER CMPC Santa Fe alcanza su mayor media en abril (7,9 MWh) y llega a 59 % de horas en cero en agosto (Figura 3).</w:t>
       </w:r>
     </w:p>
     <w:p>
@@ -7988,7 +7987,7 @@
       </w:pPr>
       <w:r>
         <w:rPr/>
-        <w:t xml:space="preserve">Los resultados muestran tres comportamientos distintos dentro de un mismo grupo empresarial: una central base y estable (Pacífico), una con fuerte caída y alta intermitencia (Laja) y una de nivel intermedio con interrupciones prolongadas (Santa Fe). La ausencia de un ciclo horario marcado es compatible con una generación de excedentes sujeta a la programación interna de los procesos, pero los datos disponibles no permiten confirmarlo ni atribuir los 0 MWh a detenciones, mantenimiento u otras causas; esa interpretación requeriría información operacional adicional, por lo que se mantiene como hipótesis fuera del alcance. La principal amenaza a la validez es el período acotado de ocho meses, que impide distinguir una tendencia sostenida de una variación estacional.</w:t>
+        <w:t xml:space="preserve">Los resultados muestran tres comportamientos distintos: Pacífico presenta una generación comparativamente alta y estable; Laja, una disminución marcada y una alta frecuencia de registros de 0 MWh; y Santa Fe, un nivel intermedio con períodos prolongados de registros consecutivos de 0 MWh. La ausencia de un ciclo horario marcado es compatible con una generación de excedentes sujeta a la programación interna de los procesos, pero los datos disponibles no permiten confirmarlo ni atribuir los 0 MWh a detenciones, mantenimiento u otras causas, por lo que se mantiene como hipótesis fuera del alcance. La principal amenaza a la validez es el período de ocho meses, que no permite distinguir una tendencia de una variación estacional.</w:t>
       </w:r>
     </w:p>
     <w:p>
@@ -8022,7 +8021,7 @@
       </w:pPr>
       <w:r>
         <w:rPr/>
-        <w:t xml:space="preserve">La generación horaria es casi plana en las tres centrales; no hay un ciclo diario marcado, y Pacífico opera a un nivel 3 a 5 veces superior al de Laja y Santa Fe.</w:t>
+        <w:t xml:space="preserve">La generación horaria es casi plana en las tres centrales, sin ciclo diario marcado, y Pacífico opera a un nivel 3 a 5 veces superior al de Laja y Santa Fe.</w:t>
       </w:r>
     </w:p>
     <w:p>
@@ -8050,7 +8049,7 @@
       </w:pPr>
       <w:r>
         <w:rPr/>
-        <w:t xml:space="preserve">Los registros de 0 MWh (25,4 % del total) se concentran en Laja y se agrupan en secuencias largas, es decir, en tramos continuos de horas sin inyección y no en registros aislados.</w:t>
+        <w:t>Los registros de 0 MWh (25,4 % del total) se concentran en Laja y se agrupan en secuencias largas, es decir, en tramos continuos y no en registros aislados.</w:t>
       </w:r>
     </w:p>
     <w:p>
@@ -8084,7 +8083,7 @@
       </w:pPr>
       <w:r>
         <w:rPr/>
-        <w:t xml:space="preserve">Cada observación recibida en las evaluaciones anteriores se tradujo en una acción concreta con su commit (Tabla 5). En síntesis, las mejoras dieron modularidad (siete módulos en </w:t>
+        <w:t xml:space="preserve">Cada observación se tradujo en una acción con su commit (Tabla 5), con más modularidad (siete módulos en </w:t>
       </w:r>
       <w:r>
         <w:rPr>
@@ -8094,7 +8093,7 @@
       </w:r>
       <w:r>
         <w:rPr/>
-        <w:t xml:space="preserve">), respaldo medido al rendimiento y documentación verificable en </w:t>
+        <w:t xml:space="preserve">), rendimiento medido y documentación verificable en </w:t>
       </w:r>
       <w:r>
         <w:rPr>

</xml_diff>

<commit_message>
Informe F4: usa las figuras versionadas en F4/figuras para coincidir con el notebook y el video
</commit_message>
<xml_diff>
--- a/docs/f4_s03_evaluacion_entregable_grupo2.docx
+++ b/docs/f4_s03_evaluacion_entregable_grupo2.docx
@@ -4575,7 +4575,7 @@
       </w:r>
       <w:r>
         <w:rPr/>
-        <w:t xml:space="preserve"> documenta con docstrings sus clases y funciones públicas, y cada notebook explica en celdas Markdown las decisiones técnicas antes del código. Cada figura final declara fuente e interpretación (sección VII).</w:t>
+        <w:t xml:space="preserve"> documenta con docstrings sus clases y funciones públicas, y cada notebook explica en celdas Markdown las decisiones técnicas antes del código.</w:t>
       </w:r>
     </w:p>
     <w:p>
@@ -6489,7 +6489,7 @@
       </w:r>
       <w:r>
         <w:rPr/>
-        <w:t xml:space="preserve"> y se verificó que conservan el total de MWh. Se usan medias para comparar centrales de escala distinta, los ejes parten en cero y los registros de 0 MWh se muestran, no se excluyen. No se aplicó codificación ni escalamiento, por lo que el dataset conserva las categorías (central, mes, día) y la unidad original (MWh) y sirve directamente para graficar, sin necesidad de una copia aparte.</w:t>
+        <w:t xml:space="preserve"> y se verificó que conservan el total de MWh. Se usan medias para comparar centrales de escala distinta, los ejes parten en cero y los registros de 0 MWh se muestran, no se excluyen. Sin codificación ni escalamiento, el dataset conserva sus categorías y la unidad original (MWh), y se grafica directamente.</w:t>
       </w:r>
     </w:p>
     <w:p>
@@ -6522,7 +6522,7 @@
       <w:r>
         <w:drawing>
           <wp:inline xmlns:a="http://schemas.openxmlformats.org/drawingml/2006/main" xmlns:pic="http://schemas.openxmlformats.org/drawingml/2006/picture">
-            <wp:extent cx="3662354" cy="1412622"/>
+            <wp:extent cx="3383280" cy="1778347"/>
             <wp:docPr id="12" name="Picture 12"/>
             <wp:cNvGraphicFramePr>
               <a:graphicFrameLocks noChangeAspect="1"/>
@@ -6543,7 +6543,7 @@
                   <pic:spPr>
                     <a:xfrm>
                       <a:off x="0" y="0"/>
-                      <a:ext cx="3662354" cy="1412622"/>
+                      <a:ext cx="3383280" cy="1778347"/>
                     </a:xfrm>
                     <a:prstGeom prst="rect"/>
                   </pic:spPr>
@@ -6566,7 +6566,7 @@
           <w:sz w:val="17"/>
           <w:szCs w:val="17"/>
         </w:rPr>
-        <w:t xml:space="preserve">Figura 1. Perfil horario medio de generación por central. Fuente: elaboración propia con datos de Generación Real del CEN (2026), enero–agosto de 2026.</w:t>
+        <w:t xml:space="preserve">Figura 1. Perfil horario medio de generación por central. Fuente: elaboración propia con datos del CEN (2026).</w:t>
       </w:r>
     </w:p>
     <w:p>
@@ -6579,7 +6579,7 @@
           <w:rFonts w:ascii="Arial" w:hAnsi="Arial"/>
           <w:sz w:val="17"/>
         </w:rPr>
-        <w:t>La figura muestra que las tres centrales mantienen perfiles horarios relativamente planos, con Pacífico en un nivel medio claramente superior a Laja y Santa Fe. Se infiere que, dentro del período analizado, la hora del día explica menos variación que las diferencias entre centrales. Esta lectura se limita a la Generación Real informada por el CEN entre enero y agosto de 2026 y no permite atribuir causas operacionales. Como contexto del relato, este resultado orienta el análisis hacia una escala temporal mayor: la comparación mensual de la Figura 2.</w:t>
+        <w:t>La figura muestra que las tres centrales mantienen perfiles horarios relativamente planos, con Pacífico en un nivel medio claramente superior a Laja y Santa Fe. Se infiere que, dentro del período analizado, la hora del día explica menos variación que las diferencias entre centrales. Esta lectura se limita a la Generación Real del período y no permite atribuir causas operacionales. Como contexto del relato, este resultado orienta el análisis hacia una escala temporal mayor: la comparación mensual de la Figura 2.</w:t>
       </w:r>
     </w:p>
     <w:p>
@@ -6592,7 +6592,7 @@
       <w:r>
         <w:drawing>
           <wp:inline xmlns:a="http://schemas.openxmlformats.org/drawingml/2006/main" xmlns:pic="http://schemas.openxmlformats.org/drawingml/2006/picture">
-            <wp:extent cx="3662354" cy="1412622"/>
+            <wp:extent cx="3383280" cy="1615872"/>
             <wp:docPr id="12" name="Picture 12"/>
             <wp:cNvGraphicFramePr>
               <a:graphicFrameLocks noChangeAspect="1"/>
@@ -6613,7 +6613,7 @@
                   <pic:spPr>
                     <a:xfrm>
                       <a:off x="0" y="0"/>
-                      <a:ext cx="3662354" cy="1412622"/>
+                      <a:ext cx="3383280" cy="1615872"/>
                     </a:xfrm>
                     <a:prstGeom prst="rect"/>
                   </pic:spPr>
@@ -6662,7 +6662,7 @@
       <w:r>
         <w:drawing>
           <wp:inline xmlns:a="http://schemas.openxmlformats.org/drawingml/2006/main" xmlns:pic="http://schemas.openxmlformats.org/drawingml/2006/picture">
-            <wp:extent cx="3662354" cy="1098706"/>
+            <wp:extent cx="3383280" cy="1496417"/>
             <wp:docPr id="12" name="Picture 12"/>
             <wp:cNvGraphicFramePr>
               <a:graphicFrameLocks noChangeAspect="1"/>
@@ -6683,7 +6683,7 @@
                   <pic:spPr>
                     <a:xfrm>
                       <a:off x="0" y="0"/>
-                      <a:ext cx="3662354" cy="1098706"/>
+                      <a:ext cx="3383280" cy="1496417"/>
                     </a:xfrm>
                     <a:prstGeom prst="rect"/>
                   </pic:spPr>
@@ -6719,7 +6719,7 @@
           <w:rFonts w:ascii="Arial" w:hAnsi="Arial"/>
           <w:sz w:val="17"/>
         </w:rPr>
-        <w:t>La figura muestra que los registros de 0 MWh se concentran principalmente en Laja, especialmente en julio y agosto, mientras Pacífico presenta porcentajes bajos y Santa Fe aumenta en agosto. Se infiere que la frecuencia de ceros contribuye a describir las diferencias temporales observadas entre las centrales y ayuda a interpretar la caída mensual de Laja. Sin información operacional complementaria, estos ceros no pueden atribuirse a fallas, mantenimiento, detenciones u otra causa específica. La figura cierra la narrativa al vincular perfil horario, variación mensual y frecuencia de 0 MWh con los objetivos de caracterizar, comparar y describir los patrones temporales del proyecto.</w:t>
+        <w:t>La figura muestra que los registros de 0 MWh se concentran principalmente en Laja, especialmente en julio y agosto, mientras Pacífico presenta porcentajes bajos y Santa Fe aumenta en agosto. Se infiere que la frecuencia de ceros contribuye a describir las diferencias temporales observadas entre las centrales y ayuda a interpretar la caída mensual de Laja. Sin información operacional complementaria, estos ceros no pueden atribuirse a fallas, mantenimiento, detenciones u otra causa específica. La figura cierra el relato y responde a los objetivos de caracterizar, comparar y describir los patrones temporales.</w:t>
       </w:r>
     </w:p>
     <w:p>
@@ -7399,7 +7399,7 @@
       </w:pPr>
       <w:r>
         <w:rPr/>
-        <w:t xml:space="preserve">La Tabla 4 resume los resultados. TER CMPC Pacífico aporta el 65 % de la generación total del conjunto (94.446 de 144.518 MWh) y tiene el menor porcentaje de horas en cero (6,4 %). TER CMPC Laja disminuye de 7,6 MWh por hora en enero a 0,4 MWh en agosto (Figura 2) y concentra el 72 % de las horas con 0 MWh del conjunto (3.193 de 4.438), con una secuencia continua máxima de 375 horas (≈15,6 días). TER CMPC Santa Fe alcanza su mayor media en abril (7,9 MWh) y llega a 59 % de horas en cero en agosto (Figura 3).</w:t>
+        <w:t xml:space="preserve">La Tabla 4 resume los resultados. TER CMPC Pacífico aporta el 65 % de la generación total del conjunto y tiene el menor porcentaje de horas en cero (6,4 %). TER CMPC Laja disminuye de 7,6 MWh por hora en enero a 0,4 MWh en agosto (Figura 2) y concentra el 72 % de las horas con 0 MWh del conjunto, con una secuencia continua máxima de 375 horas (≈15,6 días). TER CMPC Santa Fe alcanza su mayor media en abril (7,9 MWh) y llega a 59 % de horas en cero en agosto (Figura 3).</w:t>
       </w:r>
     </w:p>
     <w:p>
@@ -7987,7 +7987,7 @@
       </w:pPr>
       <w:r>
         <w:rPr/>
-        <w:t xml:space="preserve">Los resultados muestran tres comportamientos distintos: Pacífico presenta una generación comparativamente alta y estable; Laja, una disminución marcada y una alta frecuencia de registros de 0 MWh; y Santa Fe, un nivel intermedio con períodos prolongados de registros consecutivos de 0 MWh. La ausencia de un ciclo horario marcado es compatible con una generación de excedentes sujeta a la programación interna de los procesos, pero los datos disponibles no permiten confirmarlo ni atribuir los 0 MWh a detenciones, mantenimiento u otras causas, por lo que se mantiene como hipótesis fuera del alcance. La principal amenaza a la validez es el período de ocho meses, que no permite distinguir una tendencia de una variación estacional.</w:t>
+        <w:t xml:space="preserve">Los resultados muestran tres comportamientos distintos: Pacífico presenta una generación comparativamente alta y estable; Laja, una disminución marcada y una alta frecuencia de registros de 0 MWh; y Santa Fe, un nivel intermedio con períodos prolongados de registros consecutivos de 0 MWh. La ausencia de un ciclo horario marcado es compatible con una generación de excedentes sujeta a la programación interna de los procesos, pero los datos disponibles no permiten confirmarlo ni atribuir los 0 MWh a detenciones, mantenimiento u otras causas, por lo que se mantiene como hipótesis fuera del alcance. La principal amenaza a la validez es el período de ocho meses, que no distingue tendencia de estacionalidad.</w:t>
       </w:r>
     </w:p>
     <w:p>

</xml_diff>

<commit_message>
docs: agrega enlace de video a informe final de F4
</commit_message>
<xml_diff>
--- a/docs/f4_s03_evaluacion_entregable_grupo2.docx
+++ b/docs/f4_s03_evaluacion_entregable_grupo2.docx
@@ -798,7 +798,7 @@
               </wp:inline>
             </w:drawing>
           </mc:Choice>
-          <mc:Fallback xmlns:pic="http://schemas.openxmlformats.org/drawingml/2006/picture" xmlns:a="http://schemas.openxmlformats.org/drawingml/2006/main">
+          <mc:Fallback xmlns:a="http://schemas.openxmlformats.org/drawingml/2006/main" xmlns:pic="http://schemas.openxmlformats.org/drawingml/2006/picture">
             <w:pict>
               <v:group id="Group 2" style="width:85.45pt;height:51.55pt;mso-position-horizontal-relative:char;mso-position-vertical-relative:line" coordsize="10852,6546" o:spid="_x0000_s1026" w14:anchorId="42076BD7" o:gfxdata="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">
                 <v:shape id="Graphic 3" style="position:absolute;left:122;top:167;width:2101;height:3099;visibility:visible;mso-wrap-style:square;v-text-anchor:top" coordsize="210185,309880" o:spid="_x0000_s1027" fillcolor="#c6c4c4" stroked="f" path="m209791,l188086,r,184061l181850,232548r-17516,33480l137327,285432r-34712,6261l71098,285811,45396,267038,28085,233684,21742,184061,21742,,,,,185381r8392,58937l30862,282681r32483,20806l101777,309753r41068,-6762l177287,281095r23690,-39451l209791,182219,209791,xe" o:gfxdata="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">
@@ -3692,6 +3692,7 @@
               <w:b/>
               <w:bCs/>
             </w:rPr>
+            <w:lastRenderedPageBreak/>
             <w:fldChar w:fldCharType="end"/>
           </w:r>
         </w:p>
@@ -3843,15 +3844,7 @@
           <w:rFonts w:eastAsia="Arial"/>
           <w:lang w:val="es-CL"/>
         </w:rPr>
-        <w:t xml:space="preserve">Comparar los patrones temporales observados entre TER CMPC Laja, TER CMPC Pacífico y TER </w:t>
-      </w:r>
-      <w:r>
-        <w:rPr>
-          <w:rFonts w:eastAsia="Arial"/>
-          <w:lang w:val="es-CL"/>
-        </w:rPr>
-        <w:lastRenderedPageBreak/>
-        <w:t>CMPC Santa Fe.</w:t>
+        <w:t>Comparar los patrones temporales observados entre TER CMPC Laja, TER CMPC Pacífico y TER CMPC Santa Fe.</w:t>
       </w:r>
     </w:p>
     <w:p>
@@ -3887,7 +3880,15 @@
           <w:rFonts w:eastAsia="Arial"/>
           <w:lang w:val="es-CL"/>
         </w:rPr>
-        <w:t>, sin atribuirles causas operacionales que no estén respaldadas por la fuente.</w:t>
+        <w:t xml:space="preserve">, sin </w:t>
+      </w:r>
+      <w:r>
+        <w:rPr>
+          <w:rFonts w:eastAsia="Arial"/>
+          <w:lang w:val="es-CL"/>
+        </w:rPr>
+        <w:lastRenderedPageBreak/>
+        <w:t>atribuirles causas operacionales que no estén respaldadas por la fuente.</w:t>
       </w:r>
     </w:p>
     <w:p>
@@ -3907,7 +3908,23 @@
           <w:rFonts w:eastAsia="Arial"/>
           <w:lang w:val="es-CL"/>
         </w:rPr>
-        <w:t>Identificar regularidades y diferencias que sustenten la comunicación de resultados y las conclusiones finales del proyecto.</w:t>
+        <w:t xml:space="preserve">Identificar regularidades y diferencias que sustenten la comunicación de resultados y las </w:t>
+      </w:r>
+      <w:proofErr w:type="gramStart"/>
+      <w:r>
+        <w:rPr>
+          <w:rFonts w:eastAsia="Arial"/>
+          <w:lang w:val="es-CL"/>
+        </w:rPr>
+        <w:t>conclusiones finales</w:t>
+      </w:r>
+      <w:proofErr w:type="gramEnd"/>
+      <w:r>
+        <w:rPr>
+          <w:rFonts w:eastAsia="Arial"/>
+          <w:lang w:val="es-CL"/>
+        </w:rPr>
+        <w:t xml:space="preserve"> del proyecto.</w:t>
       </w:r>
     </w:p>
     <w:p>
@@ -3981,7 +3998,15 @@
       </w:r>
       <w:proofErr w:type="spellEnd"/>
       <w:r>
-        <w:t>, pronósticos ni causas operacionales.</w:t>
+        <w:t xml:space="preserve">, </w:t>
+      </w:r>
+      <w:proofErr w:type="spellStart"/>
+      <w:r>
+        <w:t>pronósticos</w:t>
+      </w:r>
+      <w:proofErr w:type="spellEnd"/>
+      <w:r>
+        <w:t xml:space="preserve"> ni causas operacionales.</w:t>
       </w:r>
     </w:p>
     <w:p>
@@ -4423,11 +4448,33 @@
       <w:r>
         <w:t xml:space="preserve"> y pandas 3.0.5 sobre Windows 11. Cada notebook (F1–F4) abre con una celda que imprime las versiones y verifica </w:t>
       </w:r>
+      <w:proofErr w:type="gramStart"/>
       <w:r>
         <w:rPr>
           <w:rFonts w:ascii="Courier New" w:hAnsi="Courier New" w:cs="Courier New"/>
         </w:rPr>
-        <w:t>sys.prefix != sys.base_prefix</w:t>
+        <w:t>sys.prefix !=</w:t>
+      </w:r>
+      <w:proofErr w:type="gramEnd"/>
+      <w:r>
+        <w:rPr>
+          <w:rFonts w:ascii="Courier New" w:hAnsi="Courier New" w:cs="Courier New"/>
+        </w:rPr>
+        <w:t xml:space="preserve"> </w:t>
+      </w:r>
+      <w:proofErr w:type="gramStart"/>
+      <w:r>
+        <w:rPr>
+          <w:rFonts w:ascii="Courier New" w:hAnsi="Courier New" w:cs="Courier New"/>
+        </w:rPr>
+        <w:t>sys.base</w:t>
+      </w:r>
+      <w:proofErr w:type="gramEnd"/>
+      <w:r>
+        <w:rPr>
+          <w:rFonts w:ascii="Courier New" w:hAnsi="Courier New" w:cs="Courier New"/>
+        </w:rPr>
+        <w:t>_prefix</w:t>
       </w:r>
       <w:r>
         <w:t xml:space="preserve"> para confirmar que el entorno virtual está activo. Las dependencias con versión fija se registran en </w:t>
@@ -4457,7 +4504,11 @@
         <w:t>data/processed</w:t>
       </w:r>
       <w:r>
-        <w:t xml:space="preserve">, y </w:t>
+        <w:t xml:space="preserve">, </w:t>
+      </w:r>
+      <w:proofErr w:type="gramStart"/>
+      <w:r>
+        <w:t xml:space="preserve">y </w:t>
       </w:r>
       <w:r>
         <w:rPr>
@@ -4465,6 +4516,7 @@
         </w:rPr>
         <w:t>.gitignore</w:t>
       </w:r>
+      <w:proofErr w:type="gramEnd"/>
       <w:r>
         <w:t xml:space="preserve"> excluye entornos virtuales y archivos temporales, siguiendo las buenas prácticas de computación científica (Wilson et al., 2014). Los notebooks se entregan ejecutados desde kernel limpio (</w:t>
       </w:r>
@@ -4512,15 +4564,19 @@
         <w:t>pull request</w:t>
       </w:r>
       <w:r>
-        <w:t xml:space="preserve">. Las identidades duplicadas de los cuatro integrantes se consolidaron con </w:t>
+        <w:t xml:space="preserve">. Las identidades duplicadas de los cuatro integrantes se consolidaron </w:t>
+      </w:r>
+      <w:proofErr w:type="gramStart"/>
+      <w:r>
+        <w:t xml:space="preserve">con </w:t>
       </w:r>
       <w:r>
         <w:rPr>
           <w:rFonts w:ascii="Courier New" w:hAnsi="Courier New" w:cs="Courier New"/>
         </w:rPr>
-        <w:lastRenderedPageBreak/>
         <w:t>.mailmap</w:t>
       </w:r>
+      <w:proofErr w:type="gramEnd"/>
       <w:r>
         <w:t xml:space="preserve">, de modo que </w:t>
       </w:r>
@@ -4546,7 +4602,21 @@
         <w:rPr>
           <w:rFonts w:ascii="Courier New" w:hAnsi="Courier New" w:cs="Courier New"/>
         </w:rPr>
-        <w:t>git show &lt;hash&gt;</w:t>
+        <w:t xml:space="preserve">git </w:t>
+      </w:r>
+      <w:proofErr w:type="gramStart"/>
+      <w:r>
+        <w:rPr>
+          <w:rFonts w:ascii="Courier New" w:hAnsi="Courier New" w:cs="Courier New"/>
+        </w:rPr>
+        <w:t>show</w:t>
+      </w:r>
+      <w:proofErr w:type="gramEnd"/>
+      <w:r>
+        <w:rPr>
+          <w:rFonts w:ascii="Courier New" w:hAnsi="Courier New" w:cs="Courier New"/>
+        </w:rPr>
+        <w:t xml:space="preserve"> &lt;hash&gt;</w:t>
       </w:r>
       <w:r>
         <w:t>.</w:t>
@@ -4559,6 +4629,7 @@
       </w:pPr>
       <w:bookmarkStart w:id="10" w:name="_Toc241865072"/>
       <w:r>
+        <w:lastRenderedPageBreak/>
         <w:t>c. Documentación del proceso</w:t>
       </w:r>
       <w:bookmarkEnd w:id="10"/>
@@ -4847,11 +4918,33 @@
       <w:r>
         <w:t xml:space="preserve"> orientado a objetos se reconstruye desde los datos crudos y se compara con el dataset de F2 mediante </w:t>
       </w:r>
+      <w:proofErr w:type="gramStart"/>
       <w:r>
         <w:rPr>
           <w:rFonts w:ascii="Courier New" w:hAnsi="Courier New" w:cs="Courier New"/>
         </w:rPr>
-        <w:t>pd.testing.assert_frame_equal</w:t>
+        <w:t>pd.testing</w:t>
+      </w:r>
+      <w:proofErr w:type="gramEnd"/>
+      <w:r>
+        <w:rPr>
+          <w:rFonts w:ascii="Courier New" w:hAnsi="Courier New" w:cs="Courier New"/>
+        </w:rPr>
+        <w:t>.assert_</w:t>
+      </w:r>
+      <w:proofErr w:type="gramStart"/>
+      <w:r>
+        <w:rPr>
+          <w:rFonts w:ascii="Courier New" w:hAnsi="Courier New" w:cs="Courier New"/>
+        </w:rPr>
+        <w:t>frame</w:t>
+      </w:r>
+      <w:proofErr w:type="gramEnd"/>
+      <w:r>
+        <w:rPr>
+          <w:rFonts w:ascii="Courier New" w:hAnsi="Courier New" w:cs="Courier New"/>
+        </w:rPr>
+        <w:t>_equal</w:t>
       </w:r>
       <w:r>
         <w:t>, confirmando equivalencia funcional.</w:t>
@@ -4900,11 +4993,15 @@
         <w:t>iterrows</w:t>
       </w:r>
       <w:r>
-        <w:t xml:space="preserve">. Para las secuencias de 0 MWh se adopta la versión iterativa: ambas son O(n), pero la recursiva consume unas tres veces más memoria por la pila de llamadas y no es más rápida desde 250 observaciones; se conserva como contraste </w:t>
-      </w:r>
-      <w:r>
-        <w:lastRenderedPageBreak/>
-        <w:t>algorítmico.</w:t>
+        <w:t xml:space="preserve">. Para las secuencias de 0 MWh se adopta la versión iterativa: ambas son O(n), pero la recursiva consume </w:t>
+      </w:r>
+      <w:proofErr w:type="gramStart"/>
+      <w:r>
+        <w:t>unas tres veces más memoria</w:t>
+      </w:r>
+      <w:proofErr w:type="gramEnd"/>
+      <w:r>
+        <w:t xml:space="preserve"> por la pila de llamadas y no es más rápida desde 250 observaciones; se conserva como contraste algorítmico.</w:t>
       </w:r>
     </w:p>
     <w:p>
@@ -4920,6 +5017,7 @@
           <w:sz w:val="19"/>
           <w:szCs w:val="19"/>
         </w:rPr>
+        <w:lastRenderedPageBreak/>
         <w:t>Tabla 1. Comparación de eficiencia entre implementaciones equivalentes</w:t>
       </w:r>
     </w:p>
@@ -5341,14 +5439,25 @@
           <w:sz w:val="17"/>
           <w:szCs w:val="17"/>
         </w:rPr>
-        <w:t>F3_nucleo_algoritmico.ipynb</w:t>
-      </w:r>
-      <w:r>
-        <w:rPr>
+        <w:t>F3_nucleo_</w:t>
+      </w:r>
+      <w:proofErr w:type="gramStart"/>
+      <w:r>
+        <w:rPr>
+          <w:rFonts w:ascii="Courier New" w:hAnsi="Courier New" w:cs="Courier New"/>
           <w:i/>
           <w:sz w:val="17"/>
           <w:szCs w:val="17"/>
         </w:rPr>
+        <w:t>algoritmico.ipynb</w:t>
+      </w:r>
+      <w:proofErr w:type="gramEnd"/>
+      <w:r>
+        <w:rPr>
+          <w:i/>
+          <w:sz w:val="17"/>
+          <w:szCs w:val="17"/>
+        </w:rPr>
         <w:t>).</w:t>
       </w:r>
     </w:p>
@@ -5529,20 +5638,36 @@
       <w:r>
         <w:t xml:space="preserve">) y deja a cada hija solo </w:t>
       </w:r>
+      <w:proofErr w:type="gramStart"/>
       <w:r>
         <w:rPr>
           <w:rFonts w:ascii="Courier New" w:hAnsi="Courier New" w:cs="Courier New"/>
         </w:rPr>
-        <w:t>aprender()</w:t>
+        <w:t>aprender(</w:t>
+      </w:r>
+      <w:proofErr w:type="gramEnd"/>
+      <w:r>
+        <w:rPr>
+          <w:rFonts w:ascii="Courier New" w:hAnsi="Courier New" w:cs="Courier New"/>
+        </w:rPr>
+        <w:t>)</w:t>
       </w:r>
       <w:r>
         <w:t xml:space="preserve"> y </w:t>
       </w:r>
+      <w:proofErr w:type="gramStart"/>
       <w:r>
         <w:rPr>
           <w:rFonts w:ascii="Courier New" w:hAnsi="Courier New" w:cs="Courier New"/>
         </w:rPr>
-        <w:t>aplicar()</w:t>
+        <w:t>aplicar(</w:t>
+      </w:r>
+      <w:proofErr w:type="gramEnd"/>
+      <w:r>
+        <w:rPr>
+          <w:rFonts w:ascii="Courier New" w:hAnsi="Courier New" w:cs="Courier New"/>
+        </w:rPr>
+        <w:t>)</w:t>
       </w:r>
       <w:r>
         <w:t xml:space="preserve">. </w:t>
@@ -5565,11 +5690,33 @@
       <w:r>
         <w:t xml:space="preserve"> recorre sus pasos con la misma llamada, </w:t>
       </w:r>
+      <w:proofErr w:type="gramStart"/>
       <w:r>
         <w:rPr>
           <w:rFonts w:ascii="Courier New" w:hAnsi="Courier New" w:cs="Courier New"/>
         </w:rPr>
-        <w:t>paso.ajustar(df).transformar(df)</w:t>
+        <w:t>paso.ajustar</w:t>
+      </w:r>
+      <w:proofErr w:type="gramEnd"/>
+      <w:r>
+        <w:rPr>
+          <w:rFonts w:ascii="Courier New" w:hAnsi="Courier New" w:cs="Courier New"/>
+        </w:rPr>
+        <w:t>(df</w:t>
+      </w:r>
+      <w:proofErr w:type="gramStart"/>
+      <w:r>
+        <w:rPr>
+          <w:rFonts w:ascii="Courier New" w:hAnsi="Courier New" w:cs="Courier New"/>
+        </w:rPr>
+        <w:t>).transformar</w:t>
+      </w:r>
+      <w:proofErr w:type="gramEnd"/>
+      <w:r>
+        <w:rPr>
+          <w:rFonts w:ascii="Courier New" w:hAnsi="Courier New" w:cs="Courier New"/>
+        </w:rPr>
+        <w:t>(df)</w:t>
       </w:r>
       <w:r>
         <w:t xml:space="preserve">, sin preguntar de qué clase es cada uno. </w:t>
@@ -5642,11 +5789,19 @@
       <w:r>
         <w:t xml:space="preserve"> (Gamma et al., 1994). Sin él, calcular perfiles por hora, día, mes y día de la semana habría requerido funciones casi idénticas, y cada criterio nuevo obligaba a modificar código ya probado. El patrón encapsula cada criterio en una clase con la misma interfaz </w:t>
       </w:r>
+      <w:proofErr w:type="gramStart"/>
       <w:r>
         <w:rPr>
           <w:rFonts w:ascii="Courier New" w:hAnsi="Courier New" w:cs="Courier New"/>
         </w:rPr>
-        <w:t>agregar()</w:t>
+        <w:t>agregar(</w:t>
+      </w:r>
+      <w:proofErr w:type="gramEnd"/>
+      <w:r>
+        <w:rPr>
+          <w:rFonts w:ascii="Courier New" w:hAnsi="Courier New" w:cs="Courier New"/>
+        </w:rPr>
+        <w:t>)</w:t>
       </w:r>
       <w:r>
         <w:t xml:space="preserve"> (</w:t>
@@ -5765,7 +5920,6 @@
           <w:sz w:val="19"/>
           <w:szCs w:val="19"/>
         </w:rPr>
-        <w:lastRenderedPageBreak/>
         <w:t xml:space="preserve">Tabla 2. Arquitectura del paquete </w:t>
       </w:r>
       <w:r>
@@ -6023,6 +6177,7 @@
                 <w:sz w:val="17"/>
                 <w:szCs w:val="17"/>
               </w:rPr>
+              <w:lastRenderedPageBreak/>
               <w:t>validacion.py</w:t>
             </w:r>
           </w:p>
@@ -6592,7 +6747,6 @@
         <w:rPr>
           <w:noProof/>
         </w:rPr>
-        <w:lastRenderedPageBreak/>
         <w:drawing>
           <wp:inline distT="0" distB="0" distL="0" distR="0" wp14:anchorId="70F93287" wp14:editId="231453DD">
             <wp:extent cx="3383280" cy="1615872"/>
@@ -6653,6 +6807,7 @@
         <w:rPr>
           <w:sz w:val="17"/>
         </w:rPr>
+        <w:lastRenderedPageBreak/>
         <w:t>La figura muestra que las diferencias entre centrales se amplían a escala mensual: Laja disminuye hacia agosto, Pacífico reduce su nivel en julio-agosto y Santa Fe alcanza sus mayores medias en el período intermedio. Se infiere que la variación mensual discrimina mejor los cambios temporales que el perfil horario casi plano observado previamente. La comparación cubre solo ocho meses, por lo que no permite establecer estacionalidad anual ni explicar las causas de las variaciones. Este contraste conduce a examinar en la Figura 3 cuánto de esas diferencias coincide con la presencia de horas registradas en 0 MWh.</w:t>
       </w:r>
     </w:p>
@@ -6751,7 +6906,21 @@
         <w:rPr>
           <w:rFonts w:ascii="Courier New" w:hAnsi="Courier New" w:cs="Courier New"/>
         </w:rPr>
-        <w:t>Pipeline.ajustar().transformar()</w:t>
+        <w:t>Pipeline.ajustar(</w:t>
+      </w:r>
+      <w:proofErr w:type="gramStart"/>
+      <w:r>
+        <w:rPr>
+          <w:rFonts w:ascii="Courier New" w:hAnsi="Courier New" w:cs="Courier New"/>
+        </w:rPr>
+        <w:t>).transformar</w:t>
+      </w:r>
+      <w:proofErr w:type="gramEnd"/>
+      <w:r>
+        <w:rPr>
+          <w:rFonts w:ascii="Courier New" w:hAnsi="Courier New" w:cs="Courier New"/>
+        </w:rPr>
+        <w:t>()</w:t>
       </w:r>
       <w:r>
         <w:t xml:space="preserve"> → </w:t>
@@ -6760,7 +6929,21 @@
         <w:rPr>
           <w:rFonts w:ascii="Courier New" w:hAnsi="Courier New" w:cs="Courier New"/>
         </w:rPr>
-        <w:t>validar_dataset_procesado()</w:t>
+        <w:t>validar_dataset_</w:t>
+      </w:r>
+      <w:proofErr w:type="gramStart"/>
+      <w:r>
+        <w:rPr>
+          <w:rFonts w:ascii="Courier New" w:hAnsi="Courier New" w:cs="Courier New"/>
+        </w:rPr>
+        <w:t>procesado(</w:t>
+      </w:r>
+      <w:proofErr w:type="gramEnd"/>
+      <w:r>
+        <w:rPr>
+          <w:rFonts w:ascii="Courier New" w:hAnsi="Courier New" w:cs="Courier New"/>
+        </w:rPr>
+        <w:t>)</w:t>
       </w:r>
       <w:r>
         <w:t xml:space="preserve"> → </w:t>
@@ -6817,20 +7000,38 @@
         <w:t>validacion.py</w:t>
       </w:r>
       <w:r>
-        <w:t xml:space="preserve"> en reglas atómicas y parametrizables (commit a4e655d), que fortalece la modularidad y permite que la prueba de excepción de F4 use solo </w:t>
+        <w:t xml:space="preserve"> en reglas atómicas y parametrizables (commit a4e655d), que fortalece </w:t>
+      </w:r>
+      <w:proofErr w:type="gramStart"/>
+      <w:r>
+        <w:t>la modularidad</w:t>
+      </w:r>
+      <w:proofErr w:type="gramEnd"/>
+      <w:r>
+        <w:t xml:space="preserve"> y permite que la prueba de excepción de F4 use solo </w:t>
       </w:r>
       <w:r>
         <w:rPr>
           <w:rFonts w:ascii="Courier New" w:hAnsi="Courier New" w:cs="Courier New"/>
         </w:rPr>
-        <w:t>validar_no_negativos()</w:t>
-      </w:r>
-      <w:r>
-        <w:t xml:space="preserve">. La reflexión no originó esta mejora: sirvió para evaluar su aporte a la reproducibilidad, la verificabilidad y la </w:t>
-      </w:r>
-      <w:r>
-        <w:lastRenderedPageBreak/>
-        <w:t xml:space="preserve">trazabilidad. En escalabilidad, sumar meses o centrales solo cambia los parámetros de </w:t>
+        <w:t>validar_no_</w:t>
+      </w:r>
+      <w:proofErr w:type="gramStart"/>
+      <w:r>
+        <w:rPr>
+          <w:rFonts w:ascii="Courier New" w:hAnsi="Courier New" w:cs="Courier New"/>
+        </w:rPr>
+        <w:t>negativos(</w:t>
+      </w:r>
+      <w:proofErr w:type="gramEnd"/>
+      <w:r>
+        <w:rPr>
+          <w:rFonts w:ascii="Courier New" w:hAnsi="Courier New" w:cs="Courier New"/>
+        </w:rPr>
+        <w:t>)</w:t>
+      </w:r>
+      <w:r>
+        <w:t xml:space="preserve">. La reflexión no originó esta mejora: sirvió para evaluar su aporte a la reproducibilidad, la verificabilidad y la trazabilidad. En escalabilidad, sumar meses o centrales solo cambia los parámetros de </w:t>
       </w:r>
       <w:r>
         <w:rPr>
@@ -7314,6 +7515,7 @@
                 <w:sz w:val="17"/>
                 <w:szCs w:val="17"/>
               </w:rPr>
+              <w:lastRenderedPageBreak/>
               <w:t>Verificación</w:t>
             </w:r>
           </w:p>
@@ -7357,14 +7559,48 @@
                 <w:sz w:val="17"/>
                 <w:szCs w:val="17"/>
               </w:rPr>
-              <w:t>assert_frame_equal</w:t>
-            </w:r>
-            <w:r>
-              <w:rPr>
-                <w:sz w:val="17"/>
-                <w:szCs w:val="17"/>
-              </w:rPr>
-              <w:t xml:space="preserve"> y pruebas normal/límite/excepción (F4)</w:t>
+              <w:t>assert_</w:t>
+            </w:r>
+            <w:proofErr w:type="gramStart"/>
+            <w:r>
+              <w:rPr>
+                <w:rFonts w:ascii="Courier New" w:hAnsi="Courier New" w:cs="Courier New"/>
+                <w:sz w:val="17"/>
+                <w:szCs w:val="17"/>
+              </w:rPr>
+              <w:t>frame</w:t>
+            </w:r>
+            <w:proofErr w:type="gramEnd"/>
+            <w:r>
+              <w:rPr>
+                <w:rFonts w:ascii="Courier New" w:hAnsi="Courier New" w:cs="Courier New"/>
+                <w:sz w:val="17"/>
+                <w:szCs w:val="17"/>
+              </w:rPr>
+              <w:t>_equal</w:t>
+            </w:r>
+            <w:r>
+              <w:rPr>
+                <w:sz w:val="17"/>
+                <w:szCs w:val="17"/>
+              </w:rPr>
+              <w:t xml:space="preserve"> y </w:t>
+            </w:r>
+            <w:proofErr w:type="gramStart"/>
+            <w:r>
+              <w:rPr>
+                <w:sz w:val="17"/>
+                <w:szCs w:val="17"/>
+              </w:rPr>
+              <w:t>pruebas normal</w:t>
+            </w:r>
+            <w:proofErr w:type="gramEnd"/>
+            <w:r>
+              <w:rPr>
+                <w:sz w:val="17"/>
+                <w:szCs w:val="17"/>
+              </w:rPr>
+              <w:t>/límite/excepción (F4)</w:t>
             </w:r>
           </w:p>
         </w:tc>
@@ -8140,14 +8376,7 @@
         <w:rPr>
           <w:lang w:val="es-CL"/>
         </w:rPr>
-        <w:t xml:space="preserve">El flujo es reproducible y verificable: pipeline modular con pruebas, equivalencia F2↔F3 y </w:t>
-      </w:r>
-      <w:r>
-        <w:rPr>
-          <w:lang w:val="es-CL"/>
-        </w:rPr>
-        <w:lastRenderedPageBreak/>
-        <w:t>trazabilidad en Git. Como trabajo futuro, ampliar el período y contrastar los ceros con información operacional.</w:t>
+        <w:t>El flujo es reproducible y verificable: pipeline modular con pruebas, equivalencia F2↔F3 y trazabilidad en Git. Como trabajo futuro, ampliar el período y contrastar los ceros con información operacional.</w:t>
       </w:r>
     </w:p>
     <w:p>
@@ -8201,6 +8430,7 @@
           <w:b/>
           <w:bCs/>
         </w:rPr>
+        <w:lastRenderedPageBreak/>
         <w:t>Tabla 5. Trazabilidad de observaciones y acciones de mejora</w:t>
       </w:r>
     </w:p>
@@ -8554,7 +8784,15 @@
                 <w:sz w:val="17"/>
                 <w:szCs w:val="17"/>
               </w:rPr>
-              <w:t>Se incorporó y corrigió .</w:t>
+              <w:t xml:space="preserve">Se incorporó y </w:t>
+            </w:r>
+            <w:proofErr w:type="gramStart"/>
+            <w:r>
+              <w:rPr>
+                <w:sz w:val="17"/>
+                <w:szCs w:val="17"/>
+              </w:rPr>
+              <w:t>corrigió .</w:t>
             </w:r>
             <w:proofErr w:type="spellStart"/>
             <w:r>
@@ -8565,6 +8803,7 @@
               <w:t>mailmap</w:t>
             </w:r>
             <w:proofErr w:type="spellEnd"/>
+            <w:proofErr w:type="gramEnd"/>
             <w:r>
               <w:rPr>
                 <w:sz w:val="17"/>
@@ -9156,15 +9395,19 @@
         <w:ind w:firstLine="567"/>
       </w:pPr>
       <w:r>
-        <w:t xml:space="preserve">El video de 5 a 8 minutos presenta el contexto, la metodología, los resultados y las conclusiones del proyecto, con participación de los cuatro integrantes. Enlace al video: </w:t>
-      </w:r>
-      <w:r>
-        <w:rPr>
-          <w:b/>
-          <w:highlight w:val="yellow"/>
-        </w:rPr>
-        <w:t>[PEGAR AQUÍ EL ENLACE DEL VIDEO]</w:t>
-      </w:r>
+        <w:t>El video de 5 a 8 minutos presenta el contexto, la metodología, los resultados y las conclusiones del proyecto, con participación de los cuatro integrantes. Enlace al video:</w:t>
+      </w:r>
+      <w:r>
+        <w:t xml:space="preserve"> </w:t>
+      </w:r>
+      <w:hyperlink r:id="rId26" w:history="1">
+        <w:r>
+          <w:rPr>
+            <w:rStyle w:val="Hipervnculo"/>
+          </w:rPr>
+          <w:t>https://youtu.be/SCsrixbww2E</w:t>
+        </w:r>
+      </w:hyperlink>
     </w:p>
     <w:p>
       <w:pPr>
@@ -9457,8 +9700,21 @@
         <w:rPr>
           <w:sz w:val="17"/>
         </w:rPr>
-        <w:lastRenderedPageBreak/>
-        <w:t xml:space="preserve">The pandas development team. (s. f.). </w:t>
+        <w:t xml:space="preserve">The </w:t>
+      </w:r>
+      <w:proofErr w:type="gramStart"/>
+      <w:r>
+        <w:rPr>
+          <w:sz w:val="17"/>
+        </w:rPr>
+        <w:t>pandas</w:t>
+      </w:r>
+      <w:proofErr w:type="gramEnd"/>
+      <w:r>
+        <w:rPr>
+          <w:sz w:val="17"/>
+        </w:rPr>
+        <w:t xml:space="preserve"> development team. (s. f.). </w:t>
       </w:r>
       <w:r>
         <w:rPr>
@@ -9514,8 +9770,8 @@
       </w:r>
     </w:p>
     <w:sectPr>
-      <w:headerReference w:type="default" r:id="rId26"/>
-      <w:footerReference w:type="default" r:id="rId27"/>
+      <w:headerReference w:type="default" r:id="rId27"/>
+      <w:footerReference w:type="default" r:id="rId28"/>
       <w:pgSz w:w="12240" w:h="15840"/>
       <w:pgMar w:top="1134" w:right="839" w:bottom="1338" w:left="1021" w:header="493" w:footer="1151" w:gutter="0"/>
       <w:cols w:space="720"/>
@@ -9671,7 +9927,7 @@
             </wp:anchor>
           </w:drawing>
         </mc:Choice>
-        <mc:Fallback xmlns:pic="http://schemas.openxmlformats.org/drawingml/2006/picture" xmlns:a="http://schemas.openxmlformats.org/drawingml/2006/main">
+        <mc:Fallback xmlns:a="http://schemas.openxmlformats.org/drawingml/2006/main" xmlns:pic="http://schemas.openxmlformats.org/drawingml/2006/picture">
           <w:pict>
             <v:shape id="Graphic 17" style="position:absolute;margin-left:42.5pt;margin-top:739.9pt;width:218.15pt;height:.1pt;z-index:-15813632;visibility:visible;mso-wrap-style:square;mso-wrap-distance-left:0;mso-wrap-distance-top:0;mso-wrap-distance-right:0;mso-wrap-distance-bottom:0;mso-position-horizontal:absolute;mso-position-horizontal-relative:page;mso-position-vertical:absolute;mso-position-vertical-relative:page;v-text-anchor:top" coordsize="2770505,1270" o:spid="_x0000_s1026" filled="f" strokecolor="#1d4b63" path="m,l2770204,e" o:gfxdata="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" w14:anchorId="0747A2B0">
               <v:path arrowok="t"/>
@@ -9751,7 +10007,7 @@
             </wp:anchor>
           </w:drawing>
         </mc:Choice>
-        <mc:Fallback xmlns:pic="http://schemas.openxmlformats.org/drawingml/2006/picture" xmlns:a="http://schemas.openxmlformats.org/drawingml/2006/main">
+        <mc:Fallback xmlns:a="http://schemas.openxmlformats.org/drawingml/2006/main" xmlns:pic="http://schemas.openxmlformats.org/drawingml/2006/picture">
           <w:pict>
             <v:shape id="Graphic 18" style="position:absolute;margin-left:371.35pt;margin-top:739.9pt;width:198.15pt;height:.1pt;z-index:-15813120;visibility:visible;mso-wrap-style:square;mso-wrap-distance-left:0;mso-wrap-distance-top:0;mso-wrap-distance-right:0;mso-wrap-distance-bottom:0;mso-position-horizontal:absolute;mso-position-horizontal-relative:page;mso-position-vertical:absolute;mso-position-vertical-relative:page;v-text-anchor:top" coordsize="2516505,1270" o:spid="_x0000_s1026" filled="f" strokecolor="#1d4b63" path="m,l2516399,e" o:gfxdata="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" w14:anchorId="3C0EE5FF">
               <v:path arrowok="t"/>
@@ -9896,7 +10152,7 @@
             </wp:anchor>
           </w:drawing>
         </mc:Choice>
-        <mc:Fallback xmlns:pic="http://schemas.openxmlformats.org/drawingml/2006/picture" xmlns:a="http://schemas.openxmlformats.org/drawingml/2006/main">
+        <mc:Fallback xmlns:a="http://schemas.openxmlformats.org/drawingml/2006/main" xmlns:pic="http://schemas.openxmlformats.org/drawingml/2006/picture">
           <w:pict>
             <v:group id="Group 12" style="position:absolute;margin-left:42.5pt;margin-top:37.85pt;width:527pt;height:9.1pt;z-index:-15815168;mso-wrap-distance-left:0;mso-wrap-distance-right:0;mso-position-horizontal-relative:page;mso-position-vertical-relative:page" coordsize="66929,1155" o:spid="_x0000_s1026" w14:anchorId="58BDBA3A" o:gfxdata="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">
               <v:shape id="Graphic 13" style="position:absolute;left:539;top:551;width:66390;height:13;visibility:visible;mso-wrap-style:square;v-text-anchor:top" coordsize="6638925,1270" o:spid="_x0000_s1027" filled="f" strokecolor="#1d4b63" path="m,l6638404,e" o:gfxdata="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">
@@ -12433,6 +12689,18 @@
       <w:lang w:eastAsia="es-CL"/>
     </w:rPr>
   </w:style>
+  <w:style w:type="character" w:styleId="Mencinsinresolver">
+    <w:name w:val="Unresolved Mention"/>
+    <w:basedOn w:val="Fuentedeprrafopredeter"/>
+    <w:uiPriority w:val="99"/>
+    <w:semiHidden/>
+    <w:unhideWhenUsed/>
+    <w:rsid w:val="00724E38"/>
+    <w:rPr>
+      <w:color w:val="605E5C"/>
+      <w:shd w:val="clear" w:color="auto" w:fill="E1DFDD"/>
+    </w:rPr>
+  </w:style>
 </w:styles>
 </file>
 
@@ -12720,12 +12988,7 @@
 </file>
 
 <file path=customXml/item1.xml><?xml version="1.0" encoding="utf-8"?>
-<?mso-contentType ?>
-<FormTemplates xmlns="http://schemas.microsoft.com/sharepoint/v3/contenttype/forms">
-  <Display>DocumentLibraryForm</Display>
-  <Edit>DocumentLibraryForm</Edit>
-  <New>DocumentLibraryForm</New>
-</FormTemplates>
+<b:Sources xmlns:b="http://schemas.openxmlformats.org/officeDocument/2006/bibliography" xmlns="http://schemas.openxmlformats.org/officeDocument/2006/bibliography" SelectedStyle="\APASixthEditionOfficeOnline.xsl" StyleName="APA" Version="6"/>
 </file>
 
 <file path=customXml/item2.xml><?xml version="1.0" encoding="utf-8"?>
@@ -12957,7 +13220,12 @@
 </file>
 
 <file path=customXml/item3.xml><?xml version="1.0" encoding="utf-8"?>
-<b:Sources xmlns:b="http://schemas.openxmlformats.org/officeDocument/2006/bibliography" xmlns="http://schemas.openxmlformats.org/officeDocument/2006/bibliography" SelectedStyle="\APASixthEditionOfficeOnline.xsl" StyleName="APA" Version="6"/>
+<?mso-contentType ?>
+<FormTemplates xmlns="http://schemas.microsoft.com/sharepoint/v3/contenttype/forms">
+  <Display>DocumentLibraryForm</Display>
+  <Edit>DocumentLibraryForm</Edit>
+  <New>DocumentLibraryForm</New>
+</FormTemplates>
 </file>
 
 <file path=customXml/item4.xml><?xml version="1.0" encoding="utf-8"?>
@@ -12983,9 +13251,9 @@
 </file>
 
 <file path=customXml/itemProps1.xml><?xml version="1.0" encoding="utf-8"?>
-<ds:datastoreItem xmlns:ds="http://schemas.openxmlformats.org/officeDocument/2006/customXml" ds:itemID="{084C26D9-49C9-4ADB-A387-DA6079798921}">
+<ds:datastoreItem xmlns:ds="http://schemas.openxmlformats.org/officeDocument/2006/customXml" ds:itemID="{5C04D8DA-B7F8-49F1-9D72-27DE5772F604}">
   <ds:schemaRefs>
-    <ds:schemaRef ds:uri="http://schemas.microsoft.com/sharepoint/v3/contenttype/forms"/>
+    <ds:schemaRef ds:uri="http://schemas.openxmlformats.org/officeDocument/2006/bibliography"/>
   </ds:schemaRefs>
 </ds:datastoreItem>
 </file>
@@ -13009,9 +13277,9 @@
 </file>
 
 <file path=customXml/itemProps3.xml><?xml version="1.0" encoding="utf-8"?>
-<ds:datastoreItem xmlns:ds="http://schemas.openxmlformats.org/officeDocument/2006/customXml" ds:itemID="{5C04D8DA-B7F8-49F1-9D72-27DE5772F604}">
+<ds:datastoreItem xmlns:ds="http://schemas.openxmlformats.org/officeDocument/2006/customXml" ds:itemID="{084C26D9-49C9-4ADB-A387-DA6079798921}">
   <ds:schemaRefs>
-    <ds:schemaRef ds:uri="http://schemas.openxmlformats.org/officeDocument/2006/bibliography"/>
+    <ds:schemaRef ds:uri="http://schemas.microsoft.com/sharepoint/v3/contenttype/forms"/>
   </ds:schemaRefs>
 </ds:datastoreItem>
 </file>

</xml_diff>